<commit_message>
docs: nomes e papéis dos quatro integrantes no GDD de entrega
Co-Authored-By: Claude Sonnet 5.5 <noreply@anthropic.com>
</commit_message>
<xml_diff>
--- a/docs/entrega/gdd_ankhor.docx
+++ b/docs/entrega/gdd_ankhor.docx
@@ -102,7 +102,7 @@
         <w:rPr>
           <w:rtl w:val="0"/>
         </w:rPr>
-        <w:t xml:space="preserve">[preencher nome]: programação de jogabilidade</w:t>
+        <w:t xml:space="preserve">Noah Urano: programação de jogabilidade</w:t>
       </w:r>
     </w:p>
     <w:p>
@@ -115,7 +115,7 @@
         <w:rPr>
           <w:rtl w:val="0"/>
         </w:rPr>
-        <w:t xml:space="preserve">[preencher nome]: roteiro e design de fases</w:t>
+        <w:t xml:space="preserve">Guilherme Nogueira: roteiro e design de fases</w:t>
       </w:r>
     </w:p>
     <w:p>
@@ -10255,7 +10255,7 @@
                 <w:szCs w:val="18"/>
                 <w:rtl w:val="0"/>
               </w:rPr>
-              <w:t xml:space="preserve">[preencher nome]</w:t>
+              <w:t xml:space="preserve">Noah Urano</w:t>
             </w:r>
           </w:p>
         </w:tc>
@@ -10379,7 +10379,7 @@
                 <w:szCs w:val="18"/>
                 <w:rtl w:val="0"/>
               </w:rPr>
-              <w:t xml:space="preserve">[preencher nome]</w:t>
+              <w:t xml:space="preserve">Guilherme Nogueira</w:t>
             </w:r>
           </w:p>
         </w:tc>

</xml_diff>

<commit_message>
docs: storyboard no GDD de entrega (seção 9)
Acrescenta 27 quadros com cena, enquadramento e ação: menu principal,
prólogo e despertar (cutscenes), capturas da Biblioteca, do Bloco de
salas, do Labirinto e do Bunker rodando no Godot, o elenco e os robôs.

Co-Authored-By: Claude Sonnet 5.5 <noreply@anthropic.com>
</commit_message>
<xml_diff>
--- a/docs/entrega/gdd_ankhor.docx
+++ b/docs/entrega/gdd_ankhor.docx
@@ -181,7 +181,7 @@
         <w:rPr>
           <w:rtl w:val="0"/>
         </w:rPr>
-        <w:t xml:space="preserve"> do repositório. Em caso de divergência valem, nesta ordem: o Enredo Principal (história, mundo e personagens), o registro de decisões (</w:t>
+        <w:t xml:space="preserve"> do repositório, e a seção 9 traz o storyboard. Em caso de divergência valem, nesta ordem: o Enredo Principal (história, mundo e personagens), o registro de decisões (</w:t>
       </w:r>
       <w:r>
         <w:rPr>
@@ -10409,6 +10409,4078 @@
           <w:rtl w:val="0"/>
         </w:rPr>
         <w:t xml:space="preserve"> sem custo de licença. O jogo usa só ferramentas gratuitas (Godot, Blender, Python e GitHub) e uma fonte de licença livre (OFL), e não usa assets pagos: a arte e o áudio são produzidos pelo próprio grupo.</w:t>
+      </w:r>
+    </w:p>
+    <w:p>
+      <w:pPr>
+        <w:keepNext w:val="1"/>
+        <w:pageBreakBefore w:val="1"/>
+        <w:spacing w:after="240" w:before="360" w:lineRule="auto"/>
+        <w:outlineLvl w:val="0"/>
+        <w:rPr>
+          <w:b w:val="1"/>
+        </w:rPr>
+      </w:pPr>
+      <w:r>
+        <w:rPr>
+          <w:b w:val="1"/>
+          <w:sz w:val="26"/>
+          <w:szCs w:val="26"/>
+          <w:rtl w:val="0"/>
+        </w:rPr>
+        <w:t xml:space="preserve">9. Storyboard</w:t>
+      </w:r>
+    </w:p>
+    <w:p>
+      <w:pPr>
+        <w:spacing w:after="120" w:before="0" w:lineRule="auto"/>
+        <w:ind w:left="720" w:firstLine="0"/>
+        <w:rPr/>
+      </w:pPr>
+      <w:r>
+        <w:rPr>
+          <w:rtl w:val="0"/>
+        </w:rPr>
+        <w:t xml:space="preserve">O storyboard mostra, em quadros, as principais sequências do jogo: as cenas, o enquadramento de cada uma e o que o jogador faz nela. Os quadros do prólogo e do despertar são as ilustrações e o vídeo das cutscenes; os demais são capturas do jogo rodando (Godot 4.7), com o HUD, a lanterna e as conversas como aparecem para o jogador. Os pontos que a história ainda não decidiu não têm quadro.</w:t>
+      </w:r>
+    </w:p>
+    <w:p>
+      <w:pPr>
+        <w:spacing w:after="120" w:before="0" w:lineRule="auto"/>
+        <w:ind w:left="720" w:firstLine="0"/>
+        <w:rPr/>
+      </w:pPr>
+      <w:r>
+        <w:rPr>
+          <w:b w:val="1"/>
+          <w:rtl w:val="0"/>
+        </w:rPr>
+        <w:t xml:space="preserve">Fluxo da experiência:</w:t>
+      </w:r>
+      <w:r>
+        <w:rPr>
+          <w:rtl w:val="0"/>
+        </w:rPr>
+        <w:t xml:space="preserve"> menu principal, prólogo (2026), despertar (3026), Biblioteca, Bloco de salas, Labirinto, Bunker (posição provisória) e as fases seguintes, ainda em aberto, até o final, que também está em aberto.</w:t>
+      </w:r>
+    </w:p>
+    <w:p>
+      <w:pPr>
+        <w:keepNext w:val="1"/>
+        <w:spacing w:after="80" w:before="120" w:lineRule="auto"/>
+        <w:ind w:left="720" w:firstLine="0"/>
+        <w:rPr/>
+      </w:pPr>
+      <w:r>
+        <w:rPr>
+          <w:b w:val="1"/>
+          <w:sz w:val="20"/>
+          <w:szCs w:val="20"/>
+          <w:rtl w:val="0"/>
+        </w:rPr>
+        <w:t xml:space="preserve">Sequência A. Abertura: do menu ao despertar em 3026</w:t>
+      </w:r>
+    </w:p>
+    <w:tbl>
+      <w:tblPr>
+        <w:tblW w:w="9029" w:type="dxa"/>
+        <w:tblBorders>
+          <w:top w:val="single" w:sz="4" w:space="0" w:color="BFBFBF"/>
+          <w:left w:val="single" w:sz="4" w:space="0" w:color="BFBFBF"/>
+          <w:bottom w:val="single" w:sz="4" w:space="0" w:color="BFBFBF"/>
+          <w:right w:val="single" w:sz="4" w:space="0" w:color="BFBFBF"/>
+          <w:insideH w:val="single" w:sz="4" w:space="0" w:color="BFBFBF"/>
+          <w:insideV w:val="single" w:sz="4" w:space="0" w:color="BFBFBF"/>
+        </w:tblBorders>
+        <w:tblLayout w:type="fixed"/>
+        <w:tblCellMar>
+          <w:top w:w="80" w:type="dxa"/>
+          <w:left w:w="100" w:type="dxa"/>
+          <w:bottom w:w="60" w:type="dxa"/>
+          <w:right w:w="100" w:type="dxa"/>
+        </w:tblCellMar>
+      </w:tblPr>
+      <w:tblGrid>
+        <w:gridCol w:w="4515"/>
+        <w:gridCol w:w="4514"/>
+      </w:tblGrid>
+      <w:tr>
+        <w:trPr>
+          <w:cantSplit/>
+        </w:trPr>
+        <w:tc>
+          <w:tcPr>
+            <w:tcW w:w="9029" w:type="dxa"/>
+            <w:gridSpan w:val="2"/>
+          </w:tcPr>
+          <w:p>
+            <w:pPr>
+              <w:spacing w:after="60" w:before="0" w:line="240" w:lineRule="auto"/>
+              <w:jc w:val="center"/>
+              <w:rPr/>
+            </w:pPr>
+            <w:r>
+              <w:rPr>
+                <w:noProof/>
+              </w:rPr>
+              <w:drawing>
+                <wp:inline distT="0" distB="0" distL="0" distR="0">
+                  <wp:extent cx="3937000" cy="2212594"/>
+                  <wp:docPr id="101" name="Imagem 101" descr="Quadro 1 · Menu principal"/>
+                  <wp:cNvGraphicFramePr>
+                    <a:graphicFrameLocks noChangeAspect="1"/>
+                  </wp:cNvGraphicFramePr>
+                  <a:graphic>
+                    <a:graphicData uri="http://schemas.openxmlformats.org/drawingml/2006/picture">
+                      <pic:pic>
+                        <pic:nvPicPr>
+                          <pic:cNvPr id="101" name="imagem1.png"/>
+                          <pic:cNvPicPr/>
+                        </pic:nvPicPr>
+                        <pic:blipFill>
+                          <a:blip r:embed="rIdImg1"/>
+                          <a:stretch>
+                            <a:fillRect/>
+                          </a:stretch>
+                        </pic:blipFill>
+                        <pic:spPr>
+                          <a:xfrm>
+                            <a:off x="0" y="0"/>
+                            <a:ext cx="3937000" cy="2212594"/>
+                          </a:xfrm>
+                          <a:prstGeom prst="rect">
+                            <a:avLst/>
+                          </a:prstGeom>
+                        </pic:spPr>
+                      </pic:pic>
+                    </a:graphicData>
+                  </a:graphic>
+                </wp:inline>
+              </w:drawing>
+            </w:r>
+          </w:p>
+          <w:p>
+            <w:pPr>
+              <w:spacing w:after="40" w:before="0" w:line="240" w:lineRule="auto"/>
+              <w:rPr/>
+            </w:pPr>
+            <w:r>
+              <w:rPr>
+                <w:b w:val="1"/>
+                <w:sz w:val="18"/>
+                <w:szCs w:val="18"/>
+                <w:rtl w:val="0"/>
+              </w:rPr>
+              <w:t xml:space="preserve">Quadro 1 · Menu principal</w:t>
+            </w:r>
+          </w:p>
+          <w:p>
+            <w:pPr>
+              <w:spacing w:after="30" w:before="0" w:line="240" w:lineRule="auto"/>
+              <w:rPr/>
+            </w:pPr>
+            <w:r>
+              <w:rPr>
+                <w:b w:val="1"/>
+                <w:sz w:val="17"/>
+                <w:szCs w:val="17"/>
+                <w:rtl w:val="0"/>
+              </w:rPr>
+              <w:t xml:space="preserve">Cena: </w:t>
+            </w:r>
+            <w:r>
+              <w:rPr>
+                <w:sz w:val="17"/>
+                <w:szCs w:val="17"/>
+                <w:rtl w:val="0"/>
+              </w:rPr>
+              <w:t xml:space="preserve">Monitor CRT na cabine da Biblioteca, à noite.</w:t>
+            </w:r>
+          </w:p>
+          <w:p>
+            <w:pPr>
+              <w:spacing w:after="30" w:before="0" w:line="240" w:lineRule="auto"/>
+              <w:rPr/>
+            </w:pPr>
+            <w:r>
+              <w:rPr>
+                <w:b w:val="1"/>
+                <w:sz w:val="17"/>
+                <w:szCs w:val="17"/>
+                <w:rtl w:val="0"/>
+              </w:rPr>
+              <w:t xml:space="preserve">Enquadramento: </w:t>
+            </w:r>
+            <w:r>
+              <w:rPr>
+                <w:sz w:val="17"/>
+                <w:szCs w:val="17"/>
+                <w:rtl w:val="0"/>
+              </w:rPr>
+              <w:t xml:space="preserve">Plano fechado e frontal no monitor.</w:t>
+            </w:r>
+          </w:p>
+          <w:p>
+            <w:pPr>
+              <w:spacing w:after="30" w:before="0" w:line="240" w:lineRule="auto"/>
+              <w:rPr/>
+            </w:pPr>
+            <w:r>
+              <w:rPr>
+                <w:b w:val="1"/>
+                <w:sz w:val="17"/>
+                <w:szCs w:val="17"/>
+                <w:rtl w:val="0"/>
+              </w:rPr>
+              <w:t xml:space="preserve">Ação: </w:t>
+            </w:r>
+            <w:r>
+              <w:rPr>
+                <w:sz w:val="17"/>
+                <w:szCs w:val="17"/>
+                <w:rtl w:val="0"/>
+              </w:rPr>
+              <w:t xml:space="preserve">O jogador escolhe Novo jogo, Fases, Opções ou Sair. Continuar fica desativado até existir salvamento em arquivo.</w:t>
+            </w:r>
+          </w:p>
+        </w:tc>
+      </w:tr>
+      <w:tr>
+        <w:trPr>
+          <w:cantSplit/>
+        </w:trPr>
+        <w:tc>
+          <w:tcPr>
+            <w:tcW w:w="4515" w:type="dxa"/>
+          </w:tcPr>
+          <w:p>
+            <w:pPr>
+              <w:spacing w:after="60" w:before="0" w:line="240" w:lineRule="auto"/>
+              <w:jc w:val="center"/>
+              <w:rPr/>
+            </w:pPr>
+            <w:r>
+              <w:rPr>
+                <w:noProof/>
+              </w:rPr>
+              <w:drawing>
+                <wp:inline distT="0" distB="0" distL="0" distR="0">
+                  <wp:extent cx="2740025" cy="1541264"/>
+                  <wp:docPr id="102" name="Imagem 102" descr="Quadro 2 · O alarme (06:15)"/>
+                  <wp:cNvGraphicFramePr>
+                    <a:graphicFrameLocks noChangeAspect="1"/>
+                  </wp:cNvGraphicFramePr>
+                  <a:graphic>
+                    <a:graphicData uri="http://schemas.openxmlformats.org/drawingml/2006/picture">
+                      <pic:pic>
+                        <pic:nvPicPr>
+                          <pic:cNvPr id="102" name="imagem2.png"/>
+                          <pic:cNvPicPr/>
+                        </pic:nvPicPr>
+                        <pic:blipFill>
+                          <a:blip r:embed="rIdImg2"/>
+                          <a:stretch>
+                            <a:fillRect/>
+                          </a:stretch>
+                        </pic:blipFill>
+                        <pic:spPr>
+                          <a:xfrm>
+                            <a:off x="0" y="0"/>
+                            <a:ext cx="2740025" cy="1541264"/>
+                          </a:xfrm>
+                          <a:prstGeom prst="rect">
+                            <a:avLst/>
+                          </a:prstGeom>
+                        </pic:spPr>
+                      </pic:pic>
+                    </a:graphicData>
+                  </a:graphic>
+                </wp:inline>
+              </w:drawing>
+            </w:r>
+          </w:p>
+          <w:p>
+            <w:pPr>
+              <w:spacing w:after="40" w:before="0" w:line="240" w:lineRule="auto"/>
+              <w:rPr/>
+            </w:pPr>
+            <w:r>
+              <w:rPr>
+                <w:b w:val="1"/>
+                <w:sz w:val="18"/>
+                <w:szCs w:val="18"/>
+                <w:rtl w:val="0"/>
+              </w:rPr>
+              <w:t xml:space="preserve">Quadro 2 · O alarme (06:15)</w:t>
+            </w:r>
+          </w:p>
+          <w:p>
+            <w:pPr>
+              <w:spacing w:after="30" w:before="0" w:line="240" w:lineRule="auto"/>
+              <w:rPr/>
+            </w:pPr>
+            <w:r>
+              <w:rPr>
+                <w:b w:val="1"/>
+                <w:sz w:val="17"/>
+                <w:szCs w:val="17"/>
+                <w:rtl w:val="0"/>
+              </w:rPr>
+              <w:t xml:space="preserve">Cena: </w:t>
+            </w:r>
+            <w:r>
+              <w:rPr>
+                <w:sz w:val="17"/>
+                <w:szCs w:val="17"/>
+                <w:rtl w:val="0"/>
+              </w:rPr>
+              <w:t xml:space="preserve">Quarto de Gabriel, madrugada de 2026.</w:t>
+            </w:r>
+          </w:p>
+          <w:p>
+            <w:pPr>
+              <w:spacing w:after="30" w:before="0" w:line="240" w:lineRule="auto"/>
+              <w:rPr/>
+            </w:pPr>
+            <w:r>
+              <w:rPr>
+                <w:b w:val="1"/>
+                <w:sz w:val="17"/>
+                <w:szCs w:val="17"/>
+                <w:rtl w:val="0"/>
+              </w:rPr>
+              <w:t xml:space="preserve">Enquadramento: </w:t>
+            </w:r>
+            <w:r>
+              <w:rPr>
+                <w:sz w:val="17"/>
+                <w:szCs w:val="17"/>
+                <w:rtl w:val="0"/>
+              </w:rPr>
+              <w:t xml:space="preserve">Close no criado-mudo: despertador, crachá e apostilas.</w:t>
+            </w:r>
+          </w:p>
+          <w:p>
+            <w:pPr>
+              <w:spacing w:after="30" w:before="0" w:line="240" w:lineRule="auto"/>
+              <w:rPr/>
+            </w:pPr>
+            <w:r>
+              <w:rPr>
+                <w:b w:val="1"/>
+                <w:sz w:val="17"/>
+                <w:szCs w:val="17"/>
+                <w:rtl w:val="0"/>
+              </w:rPr>
+              <w:t xml:space="preserve">Ação: </w:t>
+            </w:r>
+            <w:r>
+              <w:rPr>
+                <w:sz w:val="17"/>
+                <w:szCs w:val="17"/>
+                <w:rtl w:val="0"/>
+              </w:rPr>
+              <w:t xml:space="preserve">A mão de Gabriel cala o alarme. O dia começa igual aos outros.</w:t>
+            </w:r>
+          </w:p>
+        </w:tc>
+        <w:tc>
+          <w:tcPr>
+            <w:tcW w:w="4514" w:type="dxa"/>
+          </w:tcPr>
+          <w:p>
+            <w:pPr>
+              <w:spacing w:after="60" w:before="0" w:line="240" w:lineRule="auto"/>
+              <w:jc w:val="center"/>
+              <w:rPr/>
+            </w:pPr>
+            <w:r>
+              <w:rPr>
+                <w:noProof/>
+              </w:rPr>
+              <w:drawing>
+                <wp:inline distT="0" distB="0" distL="0" distR="0">
+                  <wp:extent cx="2739390" cy="1540906"/>
+                  <wp:docPr id="103" name="Imagem 103" descr="Quadro 3 · A partida"/>
+                  <wp:cNvGraphicFramePr>
+                    <a:graphicFrameLocks noChangeAspect="1"/>
+                  </wp:cNvGraphicFramePr>
+                  <a:graphic>
+                    <a:graphicData uri="http://schemas.openxmlformats.org/drawingml/2006/picture">
+                      <pic:pic>
+                        <pic:nvPicPr>
+                          <pic:cNvPr id="103" name="imagem3.png"/>
+                          <pic:cNvPicPr/>
+                        </pic:nvPicPr>
+                        <pic:blipFill>
+                          <a:blip r:embed="rIdImg3"/>
+                          <a:stretch>
+                            <a:fillRect/>
+                          </a:stretch>
+                        </pic:blipFill>
+                        <pic:spPr>
+                          <a:xfrm>
+                            <a:off x="0" y="0"/>
+                            <a:ext cx="2739390" cy="1540906"/>
+                          </a:xfrm>
+                          <a:prstGeom prst="rect">
+                            <a:avLst/>
+                          </a:prstGeom>
+                        </pic:spPr>
+                      </pic:pic>
+                    </a:graphicData>
+                  </a:graphic>
+                </wp:inline>
+              </w:drawing>
+            </w:r>
+          </w:p>
+          <w:p>
+            <w:pPr>
+              <w:spacing w:after="40" w:before="0" w:line="240" w:lineRule="auto"/>
+              <w:rPr/>
+            </w:pPr>
+            <w:r>
+              <w:rPr>
+                <w:b w:val="1"/>
+                <w:sz w:val="18"/>
+                <w:szCs w:val="18"/>
+                <w:rtl w:val="0"/>
+              </w:rPr>
+              <w:t xml:space="preserve">Quadro 3 · A partida</w:t>
+            </w:r>
+          </w:p>
+          <w:p>
+            <w:pPr>
+              <w:spacing w:after="30" w:before="0" w:line="240" w:lineRule="auto"/>
+              <w:rPr/>
+            </w:pPr>
+            <w:r>
+              <w:rPr>
+                <w:b w:val="1"/>
+                <w:sz w:val="17"/>
+                <w:szCs w:val="17"/>
+                <w:rtl w:val="0"/>
+              </w:rPr>
+              <w:t xml:space="preserve">Cena: </w:t>
+            </w:r>
+            <w:r>
+              <w:rPr>
+                <w:sz w:val="17"/>
+                <w:szCs w:val="17"/>
+                <w:rtl w:val="0"/>
+              </w:rPr>
+              <w:t xml:space="preserve">O quarto ao amanhecer.</w:t>
+            </w:r>
+          </w:p>
+          <w:p>
+            <w:pPr>
+              <w:spacing w:after="30" w:before="0" w:line="240" w:lineRule="auto"/>
+              <w:rPr/>
+            </w:pPr>
+            <w:r>
+              <w:rPr>
+                <w:b w:val="1"/>
+                <w:sz w:val="17"/>
+                <w:szCs w:val="17"/>
+                <w:rtl w:val="0"/>
+              </w:rPr>
+              <w:t xml:space="preserve">Enquadramento: </w:t>
+            </w:r>
+            <w:r>
+              <w:rPr>
+                <w:sz w:val="17"/>
+                <w:szCs w:val="17"/>
+                <w:rtl w:val="0"/>
+              </w:rPr>
+              <w:t xml:space="preserve">Plano médio, de costas, junto à janela.</w:t>
+            </w:r>
+          </w:p>
+          <w:p>
+            <w:pPr>
+              <w:spacing w:after="30" w:before="0" w:line="240" w:lineRule="auto"/>
+              <w:rPr/>
+            </w:pPr>
+            <w:r>
+              <w:rPr>
+                <w:b w:val="1"/>
+                <w:sz w:val="17"/>
+                <w:szCs w:val="17"/>
+                <w:rtl w:val="0"/>
+              </w:rPr>
+              <w:t xml:space="preserve">Ação: </w:t>
+            </w:r>
+            <w:r>
+              <w:rPr>
+                <w:sz w:val="17"/>
+                <w:szCs w:val="17"/>
+                <w:rtl w:val="0"/>
+              </w:rPr>
+              <w:t xml:space="preserve">Ele ajusta a mochila e põe no dedo o anel desgastado da avó.</w:t>
+            </w:r>
+          </w:p>
+        </w:tc>
+      </w:tr>
+      <w:tr>
+        <w:trPr>
+          <w:cantSplit/>
+        </w:trPr>
+        <w:tc>
+          <w:tcPr>
+            <w:tcW w:w="4515" w:type="dxa"/>
+          </w:tcPr>
+          <w:p>
+            <w:pPr>
+              <w:spacing w:after="60" w:before="0" w:line="240" w:lineRule="auto"/>
+              <w:jc w:val="center"/>
+              <w:rPr/>
+            </w:pPr>
+            <w:r>
+              <w:rPr>
+                <w:noProof/>
+              </w:rPr>
+              <w:drawing>
+                <wp:inline distT="0" distB="0" distL="0" distR="0">
+                  <wp:extent cx="2740025" cy="1541264"/>
+                  <wp:docPr id="104" name="Imagem 104" descr="Quadro 4 · O trajeto"/>
+                  <wp:cNvGraphicFramePr>
+                    <a:graphicFrameLocks noChangeAspect="1"/>
+                  </wp:cNvGraphicFramePr>
+                  <a:graphic>
+                    <a:graphicData uri="http://schemas.openxmlformats.org/drawingml/2006/picture">
+                      <pic:pic>
+                        <pic:nvPicPr>
+                          <pic:cNvPr id="104" name="imagem4.png"/>
+                          <pic:cNvPicPr/>
+                        </pic:nvPicPr>
+                        <pic:blipFill>
+                          <a:blip r:embed="rIdImg4"/>
+                          <a:stretch>
+                            <a:fillRect/>
+                          </a:stretch>
+                        </pic:blipFill>
+                        <pic:spPr>
+                          <a:xfrm>
+                            <a:off x="0" y="0"/>
+                            <a:ext cx="2740025" cy="1541264"/>
+                          </a:xfrm>
+                          <a:prstGeom prst="rect">
+                            <a:avLst/>
+                          </a:prstGeom>
+                        </pic:spPr>
+                      </pic:pic>
+                    </a:graphicData>
+                  </a:graphic>
+                </wp:inline>
+              </w:drawing>
+            </w:r>
+          </w:p>
+          <w:p>
+            <w:pPr>
+              <w:spacing w:after="40" w:before="0" w:line="240" w:lineRule="auto"/>
+              <w:rPr/>
+            </w:pPr>
+            <w:r>
+              <w:rPr>
+                <w:b w:val="1"/>
+                <w:sz w:val="18"/>
+                <w:szCs w:val="18"/>
+                <w:rtl w:val="0"/>
+              </w:rPr>
+              <w:t xml:space="preserve">Quadro 4 · O trajeto</w:t>
+            </w:r>
+          </w:p>
+          <w:p>
+            <w:pPr>
+              <w:spacing w:after="30" w:before="0" w:line="240" w:lineRule="auto"/>
+              <w:rPr/>
+            </w:pPr>
+            <w:r>
+              <w:rPr>
+                <w:b w:val="1"/>
+                <w:sz w:val="17"/>
+                <w:szCs w:val="17"/>
+                <w:rtl w:val="0"/>
+              </w:rPr>
+              <w:t xml:space="preserve">Cena: </w:t>
+            </w:r>
+            <w:r>
+              <w:rPr>
+                <w:sz w:val="17"/>
+                <w:szCs w:val="17"/>
+                <w:rtl w:val="0"/>
+              </w:rPr>
+              <w:t xml:space="preserve">Av. Washington Soares, de manhã.</w:t>
+            </w:r>
+          </w:p>
+          <w:p>
+            <w:pPr>
+              <w:spacing w:after="30" w:before="0" w:line="240" w:lineRule="auto"/>
+              <w:rPr/>
+            </w:pPr>
+            <w:r>
+              <w:rPr>
+                <w:b w:val="1"/>
+                <w:sz w:val="17"/>
+                <w:szCs w:val="17"/>
+                <w:rtl w:val="0"/>
+              </w:rPr>
+              <w:t xml:space="preserve">Enquadramento: </w:t>
+            </w:r>
+            <w:r>
+              <w:rPr>
+                <w:sz w:val="17"/>
+                <w:szCs w:val="17"/>
+                <w:rtl w:val="0"/>
+              </w:rPr>
+              <w:t xml:space="preserve">Plano aberto lateral, pela janela do ônibus.</w:t>
+            </w:r>
+          </w:p>
+          <w:p>
+            <w:pPr>
+              <w:spacing w:after="30" w:before="0" w:line="240" w:lineRule="auto"/>
+              <w:rPr/>
+            </w:pPr>
+            <w:r>
+              <w:rPr>
+                <w:b w:val="1"/>
+                <w:sz w:val="17"/>
+                <w:szCs w:val="17"/>
+                <w:rtl w:val="0"/>
+              </w:rPr>
+              <w:t xml:space="preserve">Ação: </w:t>
+            </w:r>
+            <w:r>
+              <w:rPr>
+                <w:sz w:val="17"/>
+                <w:szCs w:val="17"/>
+                <w:rtl w:val="0"/>
+              </w:rPr>
+              <w:t xml:space="preserve">Gabriel segue para a faculdade, de fones no pescoço.</w:t>
+            </w:r>
+          </w:p>
+        </w:tc>
+        <w:tc>
+          <w:tcPr>
+            <w:tcW w:w="4514" w:type="dxa"/>
+          </w:tcPr>
+          <w:p>
+            <w:pPr>
+              <w:spacing w:after="60" w:before="0" w:line="240" w:lineRule="auto"/>
+              <w:jc w:val="center"/>
+              <w:rPr/>
+            </w:pPr>
+            <w:r>
+              <w:rPr>
+                <w:noProof/>
+              </w:rPr>
+              <w:drawing>
+                <wp:inline distT="0" distB="0" distL="0" distR="0">
+                  <wp:extent cx="2739390" cy="1540906"/>
+                  <wp:docPr id="105" name="Imagem 105" descr="Quadro 5 · O campus vivo"/>
+                  <wp:cNvGraphicFramePr>
+                    <a:graphicFrameLocks noChangeAspect="1"/>
+                  </wp:cNvGraphicFramePr>
+                  <a:graphic>
+                    <a:graphicData uri="http://schemas.openxmlformats.org/drawingml/2006/picture">
+                      <pic:pic>
+                        <pic:nvPicPr>
+                          <pic:cNvPr id="105" name="imagem5.png"/>
+                          <pic:cNvPicPr/>
+                        </pic:nvPicPr>
+                        <pic:blipFill>
+                          <a:blip r:embed="rIdImg5"/>
+                          <a:stretch>
+                            <a:fillRect/>
+                          </a:stretch>
+                        </pic:blipFill>
+                        <pic:spPr>
+                          <a:xfrm>
+                            <a:off x="0" y="0"/>
+                            <a:ext cx="2739390" cy="1540906"/>
+                          </a:xfrm>
+                          <a:prstGeom prst="rect">
+                            <a:avLst/>
+                          </a:prstGeom>
+                        </pic:spPr>
+                      </pic:pic>
+                    </a:graphicData>
+                  </a:graphic>
+                </wp:inline>
+              </w:drawing>
+            </w:r>
+          </w:p>
+          <w:p>
+            <w:pPr>
+              <w:spacing w:after="40" w:before="0" w:line="240" w:lineRule="auto"/>
+              <w:rPr/>
+            </w:pPr>
+            <w:r>
+              <w:rPr>
+                <w:b w:val="1"/>
+                <w:sz w:val="18"/>
+                <w:szCs w:val="18"/>
+                <w:rtl w:val="0"/>
+              </w:rPr>
+              <w:t xml:space="preserve">Quadro 5 · O campus vivo</w:t>
+            </w:r>
+          </w:p>
+          <w:p>
+            <w:pPr>
+              <w:spacing w:after="30" w:before="0" w:line="240" w:lineRule="auto"/>
+              <w:rPr/>
+            </w:pPr>
+            <w:r>
+              <w:rPr>
+                <w:b w:val="1"/>
+                <w:sz w:val="17"/>
+                <w:szCs w:val="17"/>
+                <w:rtl w:val="0"/>
+              </w:rPr>
+              <w:t xml:space="preserve">Cena: </w:t>
+            </w:r>
+            <w:r>
+              <w:rPr>
+                <w:sz w:val="17"/>
+                <w:szCs w:val="17"/>
+                <w:rtl w:val="0"/>
+              </w:rPr>
+              <w:t xml:space="preserve">Pátio da Unifor em 2026, cheio de gente.</w:t>
+            </w:r>
+          </w:p>
+          <w:p>
+            <w:pPr>
+              <w:spacing w:after="30" w:before="0" w:line="240" w:lineRule="auto"/>
+              <w:rPr/>
+            </w:pPr>
+            <w:r>
+              <w:rPr>
+                <w:b w:val="1"/>
+                <w:sz w:val="17"/>
+                <w:szCs w:val="17"/>
+                <w:rtl w:val="0"/>
+              </w:rPr>
+              <w:t xml:space="preserve">Enquadramento: </w:t>
+            </w:r>
+            <w:r>
+              <w:rPr>
+                <w:sz w:val="17"/>
+                <w:szCs w:val="17"/>
+                <w:rtl w:val="0"/>
+              </w:rPr>
+              <w:t xml:space="preserve">Plano geral amplo.</w:t>
+            </w:r>
+          </w:p>
+          <w:p>
+            <w:pPr>
+              <w:spacing w:after="30" w:before="0" w:line="240" w:lineRule="auto"/>
+              <w:rPr/>
+            </w:pPr>
+            <w:r>
+              <w:rPr>
+                <w:b w:val="1"/>
+                <w:sz w:val="17"/>
+                <w:szCs w:val="17"/>
+                <w:rtl w:val="0"/>
+              </w:rPr>
+              <w:t xml:space="preserve">Ação: </w:t>
+            </w:r>
+            <w:r>
+              <w:rPr>
+                <w:sz w:val="17"/>
+                <w:szCs w:val="17"/>
+                <w:rtl w:val="0"/>
+              </w:rPr>
+              <w:t xml:space="preserve">Ele atravessa o campus, reservado, entre os estudantes. É o campus que o jogador vai ver em ruínas.</w:t>
+            </w:r>
+          </w:p>
+        </w:tc>
+      </w:tr>
+      <w:tr>
+        <w:trPr>
+          <w:cantSplit/>
+        </w:trPr>
+        <w:tc>
+          <w:tcPr>
+            <w:tcW w:w="4515" w:type="dxa"/>
+          </w:tcPr>
+          <w:p>
+            <w:pPr>
+              <w:spacing w:after="60" w:before="0" w:line="240" w:lineRule="auto"/>
+              <w:jc w:val="center"/>
+              <w:rPr/>
+            </w:pPr>
+            <w:r>
+              <w:rPr>
+                <w:noProof/>
+              </w:rPr>
+              <w:drawing>
+                <wp:inline distT="0" distB="0" distL="0" distR="0">
+                  <wp:extent cx="2740025" cy="1541264"/>
+                  <wp:docPr id="106" name="Imagem 106" descr="Quadro 6 · A aula e o caderno"/>
+                  <wp:cNvGraphicFramePr>
+                    <a:graphicFrameLocks noChangeAspect="1"/>
+                  </wp:cNvGraphicFramePr>
+                  <a:graphic>
+                    <a:graphicData uri="http://schemas.openxmlformats.org/drawingml/2006/picture">
+                      <pic:pic>
+                        <pic:nvPicPr>
+                          <pic:cNvPr id="106" name="imagem6.png"/>
+                          <pic:cNvPicPr/>
+                        </pic:nvPicPr>
+                        <pic:blipFill>
+                          <a:blip r:embed="rIdImg6"/>
+                          <a:stretch>
+                            <a:fillRect/>
+                          </a:stretch>
+                        </pic:blipFill>
+                        <pic:spPr>
+                          <a:xfrm>
+                            <a:off x="0" y="0"/>
+                            <a:ext cx="2740025" cy="1541264"/>
+                          </a:xfrm>
+                          <a:prstGeom prst="rect">
+                            <a:avLst/>
+                          </a:prstGeom>
+                        </pic:spPr>
+                      </pic:pic>
+                    </a:graphicData>
+                  </a:graphic>
+                </wp:inline>
+              </w:drawing>
+            </w:r>
+          </w:p>
+          <w:p>
+            <w:pPr>
+              <w:spacing w:after="40" w:before="0" w:line="240" w:lineRule="auto"/>
+              <w:rPr/>
+            </w:pPr>
+            <w:r>
+              <w:rPr>
+                <w:b w:val="1"/>
+                <w:sz w:val="18"/>
+                <w:szCs w:val="18"/>
+                <w:rtl w:val="0"/>
+              </w:rPr>
+              <w:t xml:space="preserve">Quadro 6 · A aula e o caderno</w:t>
+            </w:r>
+          </w:p>
+          <w:p>
+            <w:pPr>
+              <w:spacing w:after="30" w:before="0" w:line="240" w:lineRule="auto"/>
+              <w:rPr/>
+            </w:pPr>
+            <w:r>
+              <w:rPr>
+                <w:b w:val="1"/>
+                <w:sz w:val="17"/>
+                <w:szCs w:val="17"/>
+                <w:rtl w:val="0"/>
+              </w:rPr>
+              <w:t xml:space="preserve">Cena: </w:t>
+            </w:r>
+            <w:r>
+              <w:rPr>
+                <w:sz w:val="17"/>
+                <w:szCs w:val="17"/>
+                <w:rtl w:val="0"/>
+              </w:rPr>
+              <w:t xml:space="preserve">Sala de aula.</w:t>
+            </w:r>
+          </w:p>
+          <w:p>
+            <w:pPr>
+              <w:spacing w:after="30" w:before="0" w:line="240" w:lineRule="auto"/>
+              <w:rPr/>
+            </w:pPr>
+            <w:r>
+              <w:rPr>
+                <w:b w:val="1"/>
+                <w:sz w:val="17"/>
+                <w:szCs w:val="17"/>
+                <w:rtl w:val="0"/>
+              </w:rPr>
+              <w:t xml:space="preserve">Enquadramento: </w:t>
+            </w:r>
+            <w:r>
+              <w:rPr>
+                <w:sz w:val="17"/>
+                <w:szCs w:val="17"/>
+                <w:rtl w:val="0"/>
+              </w:rPr>
+              <w:t xml:space="preserve">Primeiro plano da carteira, com o caderno de equações.</w:t>
+            </w:r>
+          </w:p>
+          <w:p>
+            <w:pPr>
+              <w:spacing w:after="30" w:before="0" w:line="240" w:lineRule="auto"/>
+              <w:rPr/>
+            </w:pPr>
+            <w:r>
+              <w:rPr>
+                <w:b w:val="1"/>
+                <w:sz w:val="17"/>
+                <w:szCs w:val="17"/>
+                <w:rtl w:val="0"/>
+              </w:rPr>
+              <w:t xml:space="preserve">Ação: </w:t>
+            </w:r>
+            <w:r>
+              <w:rPr>
+                <w:sz w:val="17"/>
+                <w:szCs w:val="17"/>
+                <w:rtl w:val="0"/>
+              </w:rPr>
+              <w:t xml:space="preserve">Gabriel luta contra o sono enquanto o professor enche o quadro de fórmulas.</w:t>
+            </w:r>
+          </w:p>
+        </w:tc>
+        <w:tc>
+          <w:tcPr>
+            <w:tcW w:w="4514" w:type="dxa"/>
+          </w:tcPr>
+          <w:p>
+            <w:pPr>
+              <w:spacing w:after="60" w:before="0" w:line="240" w:lineRule="auto"/>
+              <w:jc w:val="center"/>
+              <w:rPr/>
+            </w:pPr>
+            <w:r>
+              <w:rPr>
+                <w:noProof/>
+              </w:rPr>
+              <w:drawing>
+                <wp:inline distT="0" distB="0" distL="0" distR="0">
+                  <wp:extent cx="2739390" cy="1540906"/>
+                  <wp:docPr id="107" name="Imagem 107" descr="Quadro 7 · Rumo à Biblioteca"/>
+                  <wp:cNvGraphicFramePr>
+                    <a:graphicFrameLocks noChangeAspect="1"/>
+                  </wp:cNvGraphicFramePr>
+                  <a:graphic>
+                    <a:graphicData uri="http://schemas.openxmlformats.org/drawingml/2006/picture">
+                      <pic:pic>
+                        <pic:nvPicPr>
+                          <pic:cNvPr id="107" name="imagem7.png"/>
+                          <pic:cNvPicPr/>
+                        </pic:nvPicPr>
+                        <pic:blipFill>
+                          <a:blip r:embed="rIdImg7"/>
+                          <a:stretch>
+                            <a:fillRect/>
+                          </a:stretch>
+                        </pic:blipFill>
+                        <pic:spPr>
+                          <a:xfrm>
+                            <a:off x="0" y="0"/>
+                            <a:ext cx="2739390" cy="1540906"/>
+                          </a:xfrm>
+                          <a:prstGeom prst="rect">
+                            <a:avLst/>
+                          </a:prstGeom>
+                        </pic:spPr>
+                      </pic:pic>
+                    </a:graphicData>
+                  </a:graphic>
+                </wp:inline>
+              </w:drawing>
+            </w:r>
+          </w:p>
+          <w:p>
+            <w:pPr>
+              <w:spacing w:after="40" w:before="0" w:line="240" w:lineRule="auto"/>
+              <w:rPr/>
+            </w:pPr>
+            <w:r>
+              <w:rPr>
+                <w:b w:val="1"/>
+                <w:sz w:val="18"/>
+                <w:szCs w:val="18"/>
+                <w:rtl w:val="0"/>
+              </w:rPr>
+              <w:t xml:space="preserve">Quadro 7 · Rumo à Biblioteca</w:t>
+            </w:r>
+          </w:p>
+          <w:p>
+            <w:pPr>
+              <w:spacing w:after="30" w:before="0" w:line="240" w:lineRule="auto"/>
+              <w:rPr/>
+            </w:pPr>
+            <w:r>
+              <w:rPr>
+                <w:b w:val="1"/>
+                <w:sz w:val="17"/>
+                <w:szCs w:val="17"/>
+                <w:rtl w:val="0"/>
+              </w:rPr>
+              <w:t xml:space="preserve">Cena: </w:t>
+            </w:r>
+            <w:r>
+              <w:rPr>
+                <w:sz w:val="17"/>
+                <w:szCs w:val="17"/>
+                <w:rtl w:val="0"/>
+              </w:rPr>
+              <w:t xml:space="preserve">Biblioteca Central ao entardecer.</w:t>
+            </w:r>
+          </w:p>
+          <w:p>
+            <w:pPr>
+              <w:spacing w:after="30" w:before="0" w:line="240" w:lineRule="auto"/>
+              <w:rPr/>
+            </w:pPr>
+            <w:r>
+              <w:rPr>
+                <w:b w:val="1"/>
+                <w:sz w:val="17"/>
+                <w:szCs w:val="17"/>
+                <w:rtl w:val="0"/>
+              </w:rPr>
+              <w:t xml:space="preserve">Enquadramento: </w:t>
+            </w:r>
+            <w:r>
+              <w:rPr>
+                <w:sz w:val="17"/>
+                <w:szCs w:val="17"/>
+                <w:rtl w:val="0"/>
+              </w:rPr>
+              <w:t xml:space="preserve">Plano médio exterior, com o prédio iluminado.</w:t>
+            </w:r>
+          </w:p>
+          <w:p>
+            <w:pPr>
+              <w:spacing w:after="30" w:before="0" w:line="240" w:lineRule="auto"/>
+              <w:rPr/>
+            </w:pPr>
+            <w:r>
+              <w:rPr>
+                <w:b w:val="1"/>
+                <w:sz w:val="17"/>
+                <w:szCs w:val="17"/>
+                <w:rtl w:val="0"/>
+              </w:rPr>
+              <w:t xml:space="preserve">Ação: </w:t>
+            </w:r>
+            <w:r>
+              <w:rPr>
+                <w:sz w:val="17"/>
+                <w:szCs w:val="17"/>
+                <w:rtl w:val="0"/>
+              </w:rPr>
+              <w:t xml:space="preserve">Gabriel sobe os degraus para estudar na Biblioteca.</w:t>
+            </w:r>
+          </w:p>
+        </w:tc>
+      </w:tr>
+      <w:tr>
+        <w:trPr>
+          <w:cantSplit/>
+        </w:trPr>
+        <w:tc>
+          <w:tcPr>
+            <w:tcW w:w="4515" w:type="dxa"/>
+          </w:tcPr>
+          <w:p>
+            <w:pPr>
+              <w:spacing w:after="60" w:before="0" w:line="240" w:lineRule="auto"/>
+              <w:jc w:val="center"/>
+              <w:rPr/>
+            </w:pPr>
+            <w:r>
+              <w:rPr>
+                <w:noProof/>
+              </w:rPr>
+              <w:drawing>
+                <wp:inline distT="0" distB="0" distL="0" distR="0">
+                  <wp:extent cx="2740025" cy="1541264"/>
+                  <wp:docPr id="108" name="Imagem 108" descr="Quadro 8 · A cabine (03:14)"/>
+                  <wp:cNvGraphicFramePr>
+                    <a:graphicFrameLocks noChangeAspect="1"/>
+                  </wp:cNvGraphicFramePr>
+                  <a:graphic>
+                    <a:graphicData uri="http://schemas.openxmlformats.org/drawingml/2006/picture">
+                      <pic:pic>
+                        <pic:nvPicPr>
+                          <pic:cNvPr id="108" name="imagem8.png"/>
+                          <pic:cNvPicPr/>
+                        </pic:nvPicPr>
+                        <pic:blipFill>
+                          <a:blip r:embed="rIdImg8"/>
+                          <a:stretch>
+                            <a:fillRect/>
+                          </a:stretch>
+                        </pic:blipFill>
+                        <pic:spPr>
+                          <a:xfrm>
+                            <a:off x="0" y="0"/>
+                            <a:ext cx="2740025" cy="1541264"/>
+                          </a:xfrm>
+                          <a:prstGeom prst="rect">
+                            <a:avLst/>
+                          </a:prstGeom>
+                        </pic:spPr>
+                      </pic:pic>
+                    </a:graphicData>
+                  </a:graphic>
+                </wp:inline>
+              </w:drawing>
+            </w:r>
+          </w:p>
+          <w:p>
+            <w:pPr>
+              <w:spacing w:after="40" w:before="0" w:line="240" w:lineRule="auto"/>
+              <w:rPr/>
+            </w:pPr>
+            <w:r>
+              <w:rPr>
+                <w:b w:val="1"/>
+                <w:sz w:val="18"/>
+                <w:szCs w:val="18"/>
+                <w:rtl w:val="0"/>
+              </w:rPr>
+              <w:t xml:space="preserve">Quadro 8 · A cabine (03:14)</w:t>
+            </w:r>
+          </w:p>
+          <w:p>
+            <w:pPr>
+              <w:spacing w:after="30" w:before="0" w:line="240" w:lineRule="auto"/>
+              <w:rPr/>
+            </w:pPr>
+            <w:r>
+              <w:rPr>
+                <w:b w:val="1"/>
+                <w:sz w:val="17"/>
+                <w:szCs w:val="17"/>
+                <w:rtl w:val="0"/>
+              </w:rPr>
+              <w:t xml:space="preserve">Cena: </w:t>
+            </w:r>
+            <w:r>
+              <w:rPr>
+                <w:sz w:val="17"/>
+                <w:szCs w:val="17"/>
+                <w:rtl w:val="0"/>
+              </w:rPr>
+              <w:t xml:space="preserve">Cabine de estudo, de madrugada.</w:t>
+            </w:r>
+          </w:p>
+          <w:p>
+            <w:pPr>
+              <w:spacing w:after="30" w:before="0" w:line="240" w:lineRule="auto"/>
+              <w:rPr/>
+            </w:pPr>
+            <w:r>
+              <w:rPr>
+                <w:b w:val="1"/>
+                <w:sz w:val="17"/>
+                <w:szCs w:val="17"/>
+                <w:rtl w:val="0"/>
+              </w:rPr>
+              <w:t xml:space="preserve">Enquadramento: </w:t>
+            </w:r>
+            <w:r>
+              <w:rPr>
+                <w:sz w:val="17"/>
+                <w:szCs w:val="17"/>
+                <w:rtl w:val="0"/>
+              </w:rPr>
+              <w:t xml:space="preserve">Plano fechado: luminária, caderno e relógio.</w:t>
+            </w:r>
+          </w:p>
+          <w:p>
+            <w:pPr>
+              <w:spacing w:after="30" w:before="0" w:line="240" w:lineRule="auto"/>
+              <w:rPr/>
+            </w:pPr>
+            <w:r>
+              <w:rPr>
+                <w:b w:val="1"/>
+                <w:sz w:val="17"/>
+                <w:szCs w:val="17"/>
+                <w:rtl w:val="0"/>
+              </w:rPr>
+              <w:t xml:space="preserve">Ação: </w:t>
+            </w:r>
+            <w:r>
+              <w:rPr>
+                <w:sz w:val="17"/>
+                <w:szCs w:val="17"/>
+                <w:rtl w:val="0"/>
+              </w:rPr>
+              <w:t xml:space="preserve">Gabriel adormece sobre os braços, com o caderno aberto.</w:t>
+            </w:r>
+          </w:p>
+        </w:tc>
+        <w:tc>
+          <w:tcPr>
+            <w:tcW w:w="4514" w:type="dxa"/>
+          </w:tcPr>
+          <w:p>
+            <w:pPr>
+              <w:spacing w:after="60" w:before="0" w:line="240" w:lineRule="auto"/>
+              <w:jc w:val="center"/>
+              <w:rPr/>
+            </w:pPr>
+            <w:r>
+              <w:rPr>
+                <w:noProof/>
+              </w:rPr>
+              <w:drawing>
+                <wp:inline distT="0" distB="0" distL="0" distR="0">
+                  <wp:extent cx="2739390" cy="1540906"/>
+                  <wp:docPr id="109" name="Imagem 109" descr="Quadro 9 · O pulso da fenda"/>
+                  <wp:cNvGraphicFramePr>
+                    <a:graphicFrameLocks noChangeAspect="1"/>
+                  </wp:cNvGraphicFramePr>
+                  <a:graphic>
+                    <a:graphicData uri="http://schemas.openxmlformats.org/drawingml/2006/picture">
+                      <pic:pic>
+                        <pic:nvPicPr>
+                          <pic:cNvPr id="109" name="imagem9.png"/>
+                          <pic:cNvPicPr/>
+                        </pic:nvPicPr>
+                        <pic:blipFill>
+                          <a:blip r:embed="rIdImg9"/>
+                          <a:stretch>
+                            <a:fillRect/>
+                          </a:stretch>
+                        </pic:blipFill>
+                        <pic:spPr>
+                          <a:xfrm>
+                            <a:off x="0" y="0"/>
+                            <a:ext cx="2739390" cy="1540906"/>
+                          </a:xfrm>
+                          <a:prstGeom prst="rect">
+                            <a:avLst/>
+                          </a:prstGeom>
+                        </pic:spPr>
+                      </pic:pic>
+                    </a:graphicData>
+                  </a:graphic>
+                </wp:inline>
+              </w:drawing>
+            </w:r>
+          </w:p>
+          <w:p>
+            <w:pPr>
+              <w:spacing w:after="40" w:before="0" w:line="240" w:lineRule="auto"/>
+              <w:rPr/>
+            </w:pPr>
+            <w:r>
+              <w:rPr>
+                <w:b w:val="1"/>
+                <w:sz w:val="18"/>
+                <w:szCs w:val="18"/>
+                <w:rtl w:val="0"/>
+              </w:rPr>
+              <w:t xml:space="preserve">Quadro 9 · O pulso da fenda</w:t>
+            </w:r>
+          </w:p>
+          <w:p>
+            <w:pPr>
+              <w:spacing w:after="30" w:before="0" w:line="240" w:lineRule="auto"/>
+              <w:rPr/>
+            </w:pPr>
+            <w:r>
+              <w:rPr>
+                <w:b w:val="1"/>
+                <w:sz w:val="17"/>
+                <w:szCs w:val="17"/>
+                <w:rtl w:val="0"/>
+              </w:rPr>
+              <w:t xml:space="preserve">Cena: </w:t>
+            </w:r>
+            <w:r>
+              <w:rPr>
+                <w:sz w:val="17"/>
+                <w:szCs w:val="17"/>
+                <w:rtl w:val="0"/>
+              </w:rPr>
+              <w:t xml:space="preserve">A mesma cabine, com a fenda abrindo no chão.</w:t>
+            </w:r>
+          </w:p>
+          <w:p>
+            <w:pPr>
+              <w:spacing w:after="30" w:before="0" w:line="240" w:lineRule="auto"/>
+              <w:rPr/>
+            </w:pPr>
+            <w:r>
+              <w:rPr>
+                <w:b w:val="1"/>
+                <w:sz w:val="17"/>
+                <w:szCs w:val="17"/>
+                <w:rtl w:val="0"/>
+              </w:rPr>
+              <w:t xml:space="preserve">Enquadramento: </w:t>
+            </w:r>
+            <w:r>
+              <w:rPr>
+                <w:sz w:val="17"/>
+                <w:szCs w:val="17"/>
+                <w:rtl w:val="0"/>
+              </w:rPr>
+              <w:t xml:space="preserve">Mesmo ângulo, com falha temporal e luz violeta.</w:t>
+            </w:r>
+          </w:p>
+          <w:p>
+            <w:pPr>
+              <w:spacing w:after="30" w:before="0" w:line="240" w:lineRule="auto"/>
+              <w:rPr/>
+            </w:pPr>
+            <w:r>
+              <w:rPr>
+                <w:b w:val="1"/>
+                <w:sz w:val="17"/>
+                <w:szCs w:val="17"/>
+                <w:rtl w:val="0"/>
+              </w:rPr>
+              <w:t xml:space="preserve">Ação: </w:t>
+            </w:r>
+            <w:r>
+              <w:rPr>
+                <w:sz w:val="17"/>
+                <w:szCs w:val="17"/>
+                <w:rtl w:val="0"/>
+              </w:rPr>
+              <w:t xml:space="preserve">A luminária pisca, as folhas flutuam e a fenda puxa Gabriel. Flash branco.</w:t>
+            </w:r>
+          </w:p>
+        </w:tc>
+      </w:tr>
+      <w:tr>
+        <w:trPr>
+          <w:cantSplit/>
+        </w:trPr>
+        <w:tc>
+          <w:tcPr>
+            <w:tcW w:w="4515" w:type="dxa"/>
+          </w:tcPr>
+          <w:p>
+            <w:pPr>
+              <w:spacing w:after="60" w:before="0" w:line="240" w:lineRule="auto"/>
+              <w:jc w:val="center"/>
+              <w:rPr/>
+            </w:pPr>
+            <w:r>
+              <w:rPr>
+                <w:noProof/>
+              </w:rPr>
+              <w:drawing>
+                <wp:inline distT="0" distB="0" distL="0" distR="0">
+                  <wp:extent cx="2740025" cy="1541264"/>
+                  <wp:docPr id="110" name="Imagem 110" descr="Quadro 10 · Mil anos depois"/>
+                  <wp:cNvGraphicFramePr>
+                    <a:graphicFrameLocks noChangeAspect="1"/>
+                  </wp:cNvGraphicFramePr>
+                  <a:graphic>
+                    <a:graphicData uri="http://schemas.openxmlformats.org/drawingml/2006/picture">
+                      <pic:pic>
+                        <pic:nvPicPr>
+                          <pic:cNvPr id="110" name="imagem10.png"/>
+                          <pic:cNvPicPr/>
+                        </pic:nvPicPr>
+                        <pic:blipFill>
+                          <a:blip r:embed="rIdImg10"/>
+                          <a:stretch>
+                            <a:fillRect/>
+                          </a:stretch>
+                        </pic:blipFill>
+                        <pic:spPr>
+                          <a:xfrm>
+                            <a:off x="0" y="0"/>
+                            <a:ext cx="2740025" cy="1541264"/>
+                          </a:xfrm>
+                          <a:prstGeom prst="rect">
+                            <a:avLst/>
+                          </a:prstGeom>
+                        </pic:spPr>
+                      </pic:pic>
+                    </a:graphicData>
+                  </a:graphic>
+                </wp:inline>
+              </w:drawing>
+            </w:r>
+          </w:p>
+          <w:p>
+            <w:pPr>
+              <w:spacing w:after="40" w:before="0" w:line="240" w:lineRule="auto"/>
+              <w:rPr/>
+            </w:pPr>
+            <w:r>
+              <w:rPr>
+                <w:b w:val="1"/>
+                <w:sz w:val="18"/>
+                <w:szCs w:val="18"/>
+                <w:rtl w:val="0"/>
+              </w:rPr>
+              <w:t xml:space="preserve">Quadro 10 · Mil anos depois</w:t>
+            </w:r>
+          </w:p>
+          <w:p>
+            <w:pPr>
+              <w:spacing w:after="30" w:before="0" w:line="240" w:lineRule="auto"/>
+              <w:rPr/>
+            </w:pPr>
+            <w:r>
+              <w:rPr>
+                <w:b w:val="1"/>
+                <w:sz w:val="17"/>
+                <w:szCs w:val="17"/>
+                <w:rtl w:val="0"/>
+              </w:rPr>
+              <w:t xml:space="preserve">Cena: </w:t>
+            </w:r>
+            <w:r>
+              <w:rPr>
+                <w:sz w:val="17"/>
+                <w:szCs w:val="17"/>
+                <w:rtl w:val="0"/>
+              </w:rPr>
+              <w:t xml:space="preserve">A mesma cabine em 3026, com painéis ciano e um holograma sobre o caderno.</w:t>
+            </w:r>
+          </w:p>
+          <w:p>
+            <w:pPr>
+              <w:spacing w:after="30" w:before="0" w:line="240" w:lineRule="auto"/>
+              <w:rPr/>
+            </w:pPr>
+            <w:r>
+              <w:rPr>
+                <w:b w:val="1"/>
+                <w:sz w:val="17"/>
+                <w:szCs w:val="17"/>
+                <w:rtl w:val="0"/>
+              </w:rPr>
+              <w:t xml:space="preserve">Enquadramento: </w:t>
+            </w:r>
+            <w:r>
+              <w:rPr>
+                <w:sz w:val="17"/>
+                <w:szCs w:val="17"/>
+                <w:rtl w:val="0"/>
+              </w:rPr>
+              <w:t xml:space="preserve">Mesmo enquadramento do quadro anterior.</w:t>
+            </w:r>
+          </w:p>
+          <w:p>
+            <w:pPr>
+              <w:spacing w:after="30" w:before="0" w:line="240" w:lineRule="auto"/>
+              <w:rPr/>
+            </w:pPr>
+            <w:r>
+              <w:rPr>
+                <w:b w:val="1"/>
+                <w:sz w:val="17"/>
+                <w:szCs w:val="17"/>
+                <w:rtl w:val="0"/>
+              </w:rPr>
+              <w:t xml:space="preserve">Ação: </w:t>
+            </w:r>
+            <w:r>
+              <w:rPr>
+                <w:sz w:val="17"/>
+                <w:szCs w:val="17"/>
+                <w:rtl w:val="0"/>
+              </w:rPr>
+              <w:t xml:space="preserve">Gabriel ainda dorme. Só o ambiente mostra que o tempo passou.</w:t>
+            </w:r>
+          </w:p>
+        </w:tc>
+        <w:tc>
+          <w:tcPr>
+            <w:tcW w:w="4514" w:type="dxa"/>
+          </w:tcPr>
+          <w:p>
+            <w:pPr>
+              <w:spacing w:after="60" w:before="0" w:line="240" w:lineRule="auto"/>
+              <w:jc w:val="center"/>
+              <w:rPr/>
+            </w:pPr>
+            <w:r>
+              <w:rPr>
+                <w:noProof/>
+              </w:rPr>
+              <w:drawing>
+                <wp:inline distT="0" distB="0" distL="0" distR="0">
+                  <wp:extent cx="2739390" cy="1540906"/>
+                  <wp:docPr id="111" name="Imagem 111" descr="Quadro 11 · O despertar"/>
+                  <wp:cNvGraphicFramePr>
+                    <a:graphicFrameLocks noChangeAspect="1"/>
+                  </wp:cNvGraphicFramePr>
+                  <a:graphic>
+                    <a:graphicData uri="http://schemas.openxmlformats.org/drawingml/2006/picture">
+                      <pic:pic>
+                        <pic:nvPicPr>
+                          <pic:cNvPr id="111" name="imagem11.png"/>
+                          <pic:cNvPicPr/>
+                        </pic:nvPicPr>
+                        <pic:blipFill>
+                          <a:blip r:embed="rIdImg11"/>
+                          <a:stretch>
+                            <a:fillRect/>
+                          </a:stretch>
+                        </pic:blipFill>
+                        <pic:spPr>
+                          <a:xfrm>
+                            <a:off x="0" y="0"/>
+                            <a:ext cx="2739390" cy="1540906"/>
+                          </a:xfrm>
+                          <a:prstGeom prst="rect">
+                            <a:avLst/>
+                          </a:prstGeom>
+                        </pic:spPr>
+                      </pic:pic>
+                    </a:graphicData>
+                  </a:graphic>
+                </wp:inline>
+              </w:drawing>
+            </w:r>
+          </w:p>
+          <w:p>
+            <w:pPr>
+              <w:spacing w:after="40" w:before="0" w:line="240" w:lineRule="auto"/>
+              <w:rPr/>
+            </w:pPr>
+            <w:r>
+              <w:rPr>
+                <w:b w:val="1"/>
+                <w:sz w:val="18"/>
+                <w:szCs w:val="18"/>
+                <w:rtl w:val="0"/>
+              </w:rPr>
+              <w:t xml:space="preserve">Quadro 11 · O despertar</w:t>
+            </w:r>
+          </w:p>
+          <w:p>
+            <w:pPr>
+              <w:spacing w:after="30" w:before="0" w:line="240" w:lineRule="auto"/>
+              <w:rPr/>
+            </w:pPr>
+            <w:r>
+              <w:rPr>
+                <w:b w:val="1"/>
+                <w:sz w:val="17"/>
+                <w:szCs w:val="17"/>
+                <w:rtl w:val="0"/>
+              </w:rPr>
+              <w:t xml:space="preserve">Cena: </w:t>
+            </w:r>
+            <w:r>
+              <w:rPr>
+                <w:sz w:val="17"/>
+                <w:szCs w:val="17"/>
+                <w:rtl w:val="0"/>
+              </w:rPr>
+              <w:t xml:space="preserve">A Biblioteca em volta, com torres de equipamentos.</w:t>
+            </w:r>
+          </w:p>
+          <w:p>
+            <w:pPr>
+              <w:spacing w:after="30" w:before="0" w:line="240" w:lineRule="auto"/>
+              <w:rPr/>
+            </w:pPr>
+            <w:r>
+              <w:rPr>
+                <w:b w:val="1"/>
+                <w:sz w:val="17"/>
+                <w:szCs w:val="17"/>
+                <w:rtl w:val="0"/>
+              </w:rPr>
+              <w:t xml:space="preserve">Enquadramento: </w:t>
+            </w:r>
+            <w:r>
+              <w:rPr>
+                <w:sz w:val="17"/>
+                <w:szCs w:val="17"/>
+                <w:rtl w:val="0"/>
+              </w:rPr>
+              <w:t xml:space="preserve">Primeiro plano em Gabriel, com a câmera se afastando.</w:t>
+            </w:r>
+          </w:p>
+          <w:p>
+            <w:pPr>
+              <w:spacing w:after="30" w:before="0" w:line="240" w:lineRule="auto"/>
+              <w:rPr/>
+            </w:pPr>
+            <w:r>
+              <w:rPr>
+                <w:b w:val="1"/>
+                <w:sz w:val="17"/>
+                <w:szCs w:val="17"/>
+                <w:rtl w:val="0"/>
+              </w:rPr>
+              <w:t xml:space="preserve">Ação: </w:t>
+            </w:r>
+            <w:r>
+              <w:rPr>
+                <w:sz w:val="17"/>
+                <w:szCs w:val="17"/>
+                <w:rtl w:val="0"/>
+              </w:rPr>
+              <w:t xml:space="preserve">Ele olha em volta sem entender onde está. Em seguida, o jogador assume o controle.</w:t>
+            </w:r>
+          </w:p>
+        </w:tc>
+      </w:tr>
+    </w:tbl>
+    <w:p>
+      <w:pPr>
+        <w:spacing w:after="160" w:before="0" w:lineRule="auto"/>
+        <w:rPr/>
+      </w:pPr>
+    </w:p>
+    <w:p>
+      <w:pPr>
+        <w:keepNext w:val="1"/>
+        <w:spacing w:after="80" w:before="120" w:lineRule="auto"/>
+        <w:ind w:left="720" w:firstLine="0"/>
+        <w:rPr/>
+      </w:pPr>
+      <w:r>
+        <w:rPr>
+          <w:b w:val="1"/>
+          <w:sz w:val="20"/>
+          <w:szCs w:val="20"/>
+          <w:rtl w:val="0"/>
+        </w:rPr>
+        <w:t xml:space="preserve">Sequência B. Biblioteca (fase 1)</w:t>
+      </w:r>
+    </w:p>
+    <w:tbl>
+      <w:tblPr>
+        <w:tblW w:w="9029" w:type="dxa"/>
+        <w:tblBorders>
+          <w:top w:val="single" w:sz="4" w:space="0" w:color="BFBFBF"/>
+          <w:left w:val="single" w:sz="4" w:space="0" w:color="BFBFBF"/>
+          <w:bottom w:val="single" w:sz="4" w:space="0" w:color="BFBFBF"/>
+          <w:right w:val="single" w:sz="4" w:space="0" w:color="BFBFBF"/>
+          <w:insideH w:val="single" w:sz="4" w:space="0" w:color="BFBFBF"/>
+          <w:insideV w:val="single" w:sz="4" w:space="0" w:color="BFBFBF"/>
+        </w:tblBorders>
+        <w:tblLayout w:type="fixed"/>
+        <w:tblCellMar>
+          <w:top w:w="80" w:type="dxa"/>
+          <w:left w:w="100" w:type="dxa"/>
+          <w:bottom w:w="60" w:type="dxa"/>
+          <w:right w:w="100" w:type="dxa"/>
+        </w:tblCellMar>
+      </w:tblPr>
+      <w:tblGrid>
+        <w:gridCol w:w="4515"/>
+        <w:gridCol w:w="4514"/>
+      </w:tblGrid>
+      <w:tr>
+        <w:trPr>
+          <w:cantSplit/>
+        </w:trPr>
+        <w:tc>
+          <w:tcPr>
+            <w:tcW w:w="4515" w:type="dxa"/>
+          </w:tcPr>
+          <w:p>
+            <w:pPr>
+              <w:spacing w:after="60" w:before="0" w:line="240" w:lineRule="auto"/>
+              <w:jc w:val="center"/>
+              <w:rPr/>
+            </w:pPr>
+            <w:r>
+              <w:rPr>
+                <w:noProof/>
+              </w:rPr>
+              <w:drawing>
+                <wp:inline distT="0" distB="0" distL="0" distR="0">
+                  <wp:extent cx="2740025" cy="1541264"/>
+                  <wp:docPr id="112" name="Imagem 112" descr="Quadro 12 · A cabine"/>
+                  <wp:cNvGraphicFramePr>
+                    <a:graphicFrameLocks noChangeAspect="1"/>
+                  </wp:cNvGraphicFramePr>
+                  <a:graphic>
+                    <a:graphicData uri="http://schemas.openxmlformats.org/drawingml/2006/picture">
+                      <pic:pic>
+                        <pic:nvPicPr>
+                          <pic:cNvPr id="112" name="imagem12.png"/>
+                          <pic:cNvPicPr/>
+                        </pic:nvPicPr>
+                        <pic:blipFill>
+                          <a:blip r:embed="rIdImg12"/>
+                          <a:stretch>
+                            <a:fillRect/>
+                          </a:stretch>
+                        </pic:blipFill>
+                        <pic:spPr>
+                          <a:xfrm>
+                            <a:off x="0" y="0"/>
+                            <a:ext cx="2740025" cy="1541264"/>
+                          </a:xfrm>
+                          <a:prstGeom prst="rect">
+                            <a:avLst/>
+                          </a:prstGeom>
+                        </pic:spPr>
+                      </pic:pic>
+                    </a:graphicData>
+                  </a:graphic>
+                </wp:inline>
+              </w:drawing>
+            </w:r>
+          </w:p>
+          <w:p>
+            <w:pPr>
+              <w:spacing w:after="40" w:before="0" w:line="240" w:lineRule="auto"/>
+              <w:rPr/>
+            </w:pPr>
+            <w:r>
+              <w:rPr>
+                <w:b w:val="1"/>
+                <w:sz w:val="18"/>
+                <w:szCs w:val="18"/>
+                <w:rtl w:val="0"/>
+              </w:rPr>
+              <w:t xml:space="preserve">Quadro 12 · A cabine</w:t>
+            </w:r>
+          </w:p>
+          <w:p>
+            <w:pPr>
+              <w:spacing w:after="30" w:before="0" w:line="240" w:lineRule="auto"/>
+              <w:rPr/>
+            </w:pPr>
+            <w:r>
+              <w:rPr>
+                <w:b w:val="1"/>
+                <w:sz w:val="17"/>
+                <w:szCs w:val="17"/>
+                <w:rtl w:val="0"/>
+              </w:rPr>
+              <w:t xml:space="preserve">Cena: </w:t>
+            </w:r>
+            <w:r>
+              <w:rPr>
+                <w:sz w:val="17"/>
+                <w:szCs w:val="17"/>
+                <w:rtl w:val="0"/>
+              </w:rPr>
+              <w:t xml:space="preserve">Primeira sala, escura, com a porta para o salão.</w:t>
+            </w:r>
+          </w:p>
+          <w:p>
+            <w:pPr>
+              <w:spacing w:after="30" w:before="0" w:line="240" w:lineRule="auto"/>
+              <w:rPr/>
+            </w:pPr>
+            <w:r>
+              <w:rPr>
+                <w:b w:val="1"/>
+                <w:sz w:val="17"/>
+                <w:szCs w:val="17"/>
+                <w:rtl w:val="0"/>
+              </w:rPr>
+              <w:t xml:space="preserve">Enquadramento: </w:t>
+            </w:r>
+            <w:r>
+              <w:rPr>
+                <w:sz w:val="17"/>
+                <w:szCs w:val="17"/>
+                <w:rtl w:val="0"/>
+              </w:rPr>
+              <w:t xml:space="preserve">Plano geral lateral 2.5D, com o HUD (3 corações e 3 espaços de gadget).</w:t>
+            </w:r>
+          </w:p>
+          <w:p>
+            <w:pPr>
+              <w:spacing w:after="30" w:before="0" w:line="240" w:lineRule="auto"/>
+              <w:rPr/>
+            </w:pPr>
+            <w:r>
+              <w:rPr>
+                <w:b w:val="1"/>
+                <w:sz w:val="17"/>
+                <w:szCs w:val="17"/>
+                <w:rtl w:val="0"/>
+              </w:rPr>
+              <w:t xml:space="preserve">Ação: </w:t>
+            </w:r>
+            <w:r>
+              <w:rPr>
+                <w:sz w:val="17"/>
+                <w:szCs w:val="17"/>
+                <w:rtl w:val="0"/>
+              </w:rPr>
+              <w:t xml:space="preserve">Gabriel anda, procura a lanterna e aprende os controles.</w:t>
+            </w:r>
+          </w:p>
+        </w:tc>
+        <w:tc>
+          <w:tcPr>
+            <w:tcW w:w="4514" w:type="dxa"/>
+          </w:tcPr>
+          <w:p>
+            <w:pPr>
+              <w:spacing w:after="60" w:before="0" w:line="240" w:lineRule="auto"/>
+              <w:jc w:val="center"/>
+              <w:rPr/>
+            </w:pPr>
+            <w:r>
+              <w:rPr>
+                <w:noProof/>
+              </w:rPr>
+              <w:drawing>
+                <wp:inline distT="0" distB="0" distL="0" distR="0">
+                  <wp:extent cx="2739390" cy="1540906"/>
+                  <wp:docPr id="113" name="Imagem 113" descr="Quadro 13 · O salão e a árvore"/>
+                  <wp:cNvGraphicFramePr>
+                    <a:graphicFrameLocks noChangeAspect="1"/>
+                  </wp:cNvGraphicFramePr>
+                  <a:graphic>
+                    <a:graphicData uri="http://schemas.openxmlformats.org/drawingml/2006/picture">
+                      <pic:pic>
+                        <pic:nvPicPr>
+                          <pic:cNvPr id="113" name="imagem13.png"/>
+                          <pic:cNvPicPr/>
+                        </pic:nvPicPr>
+                        <pic:blipFill>
+                          <a:blip r:embed="rIdImg13"/>
+                          <a:stretch>
+                            <a:fillRect/>
+                          </a:stretch>
+                        </pic:blipFill>
+                        <pic:spPr>
+                          <a:xfrm>
+                            <a:off x="0" y="0"/>
+                            <a:ext cx="2739390" cy="1540906"/>
+                          </a:xfrm>
+                          <a:prstGeom prst="rect">
+                            <a:avLst/>
+                          </a:prstGeom>
+                        </pic:spPr>
+                      </pic:pic>
+                    </a:graphicData>
+                  </a:graphic>
+                </wp:inline>
+              </w:drawing>
+            </w:r>
+          </w:p>
+          <w:p>
+            <w:pPr>
+              <w:spacing w:after="40" w:before="0" w:line="240" w:lineRule="auto"/>
+              <w:rPr/>
+            </w:pPr>
+            <w:r>
+              <w:rPr>
+                <w:b w:val="1"/>
+                <w:sz w:val="18"/>
+                <w:szCs w:val="18"/>
+                <w:rtl w:val="0"/>
+              </w:rPr>
+              <w:t xml:space="preserve">Quadro 13 · O salão e a árvore</w:t>
+            </w:r>
+          </w:p>
+          <w:p>
+            <w:pPr>
+              <w:spacing w:after="30" w:before="0" w:line="240" w:lineRule="auto"/>
+              <w:rPr/>
+            </w:pPr>
+            <w:r>
+              <w:rPr>
+                <w:b w:val="1"/>
+                <w:sz w:val="17"/>
+                <w:szCs w:val="17"/>
+                <w:rtl w:val="0"/>
+              </w:rPr>
+              <w:t xml:space="preserve">Cena: </w:t>
+            </w:r>
+            <w:r>
+              <w:rPr>
+                <w:sz w:val="17"/>
+                <w:szCs w:val="17"/>
+                <w:rtl w:val="0"/>
+              </w:rPr>
+              <w:t xml:space="preserve">Salão principal, com a árvore e o acampamento do Baltazar entre as raízes.</w:t>
+            </w:r>
+          </w:p>
+          <w:p>
+            <w:pPr>
+              <w:spacing w:after="30" w:before="0" w:line="240" w:lineRule="auto"/>
+              <w:rPr/>
+            </w:pPr>
+            <w:r>
+              <w:rPr>
+                <w:b w:val="1"/>
+                <w:sz w:val="17"/>
+                <w:szCs w:val="17"/>
+                <w:rtl w:val="0"/>
+              </w:rPr>
+              <w:t xml:space="preserve">Enquadramento: </w:t>
+            </w:r>
+            <w:r>
+              <w:rPr>
+                <w:sz w:val="17"/>
+                <w:szCs w:val="17"/>
+                <w:rtl w:val="0"/>
+              </w:rPr>
+              <w:t xml:space="preserve">Plano geral lateral, com o feixe da lanterna.</w:t>
+            </w:r>
+          </w:p>
+          <w:p>
+            <w:pPr>
+              <w:spacing w:after="30" w:before="0" w:line="240" w:lineRule="auto"/>
+              <w:rPr/>
+            </w:pPr>
+            <w:r>
+              <w:rPr>
+                <w:b w:val="1"/>
+                <w:sz w:val="17"/>
+                <w:szCs w:val="17"/>
+                <w:rtl w:val="0"/>
+              </w:rPr>
+              <w:t xml:space="preserve">Ação: </w:t>
+            </w:r>
+            <w:r>
+              <w:rPr>
+                <w:sz w:val="17"/>
+                <w:szCs w:val="17"/>
+                <w:rtl w:val="0"/>
+              </w:rPr>
+              <w:t xml:space="preserve">O jogador descobre o acampamento vazio e o diário. Uma Sentinela patrulha este salão.</w:t>
+            </w:r>
+          </w:p>
+        </w:tc>
+      </w:tr>
+      <w:tr>
+        <w:trPr>
+          <w:cantSplit/>
+        </w:trPr>
+        <w:tc>
+          <w:tcPr>
+            <w:tcW w:w="4515" w:type="dxa"/>
+          </w:tcPr>
+          <w:p>
+            <w:pPr>
+              <w:spacing w:after="60" w:before="0" w:line="240" w:lineRule="auto"/>
+              <w:jc w:val="center"/>
+              <w:rPr/>
+            </w:pPr>
+            <w:r>
+              <w:rPr>
+                <w:noProof/>
+              </w:rPr>
+              <w:drawing>
+                <wp:inline distT="0" distB="0" distL="0" distR="0">
+                  <wp:extent cx="2740025" cy="1541264"/>
+                  <wp:docPr id="114" name="Imagem 114" descr="Quadro 14 · O rádio"/>
+                  <wp:cNvGraphicFramePr>
+                    <a:graphicFrameLocks noChangeAspect="1"/>
+                  </wp:cNvGraphicFramePr>
+                  <a:graphic>
+                    <a:graphicData uri="http://schemas.openxmlformats.org/drawingml/2006/picture">
+                      <pic:pic>
+                        <pic:nvPicPr>
+                          <pic:cNvPr id="114" name="imagem14.png"/>
+                          <pic:cNvPicPr/>
+                        </pic:nvPicPr>
+                        <pic:blipFill>
+                          <a:blip r:embed="rIdImg14"/>
+                          <a:stretch>
+                            <a:fillRect/>
+                          </a:stretch>
+                        </pic:blipFill>
+                        <pic:spPr>
+                          <a:xfrm>
+                            <a:off x="0" y="0"/>
+                            <a:ext cx="2740025" cy="1541264"/>
+                          </a:xfrm>
+                          <a:prstGeom prst="rect">
+                            <a:avLst/>
+                          </a:prstGeom>
+                        </pic:spPr>
+                      </pic:pic>
+                    </a:graphicData>
+                  </a:graphic>
+                </wp:inline>
+              </w:drawing>
+            </w:r>
+          </w:p>
+          <w:p>
+            <w:pPr>
+              <w:spacing w:after="40" w:before="0" w:line="240" w:lineRule="auto"/>
+              <w:rPr/>
+            </w:pPr>
+            <w:r>
+              <w:rPr>
+                <w:b w:val="1"/>
+                <w:sz w:val="18"/>
+                <w:szCs w:val="18"/>
+                <w:rtl w:val="0"/>
+              </w:rPr>
+              <w:t xml:space="preserve">Quadro 14 · O rádio</w:t>
+            </w:r>
+          </w:p>
+          <w:p>
+            <w:pPr>
+              <w:spacing w:after="30" w:before="0" w:line="240" w:lineRule="auto"/>
+              <w:rPr/>
+            </w:pPr>
+            <w:r>
+              <w:rPr>
+                <w:b w:val="1"/>
+                <w:sz w:val="17"/>
+                <w:szCs w:val="17"/>
+                <w:rtl w:val="0"/>
+              </w:rPr>
+              <w:t xml:space="preserve">Cena: </w:t>
+            </w:r>
+            <w:r>
+              <w:rPr>
+                <w:sz w:val="17"/>
+                <w:szCs w:val="17"/>
+                <w:rtl w:val="0"/>
+              </w:rPr>
+              <w:t xml:space="preserve">Balcão de atendimento, com o rádio da segurança.</w:t>
+            </w:r>
+          </w:p>
+          <w:p>
+            <w:pPr>
+              <w:spacing w:after="30" w:before="0" w:line="240" w:lineRule="auto"/>
+              <w:rPr/>
+            </w:pPr>
+            <w:r>
+              <w:rPr>
+                <w:b w:val="1"/>
+                <w:sz w:val="17"/>
+                <w:szCs w:val="17"/>
+                <w:rtl w:val="0"/>
+              </w:rPr>
+              <w:t xml:space="preserve">Enquadramento: </w:t>
+            </w:r>
+            <w:r>
+              <w:rPr>
+                <w:sz w:val="17"/>
+                <w:szCs w:val="17"/>
+                <w:rtl w:val="0"/>
+              </w:rPr>
+              <w:t xml:space="preserve">Plano médio, com a legenda do rádio embaixo.</w:t>
+            </w:r>
+          </w:p>
+          <w:p>
+            <w:pPr>
+              <w:spacing w:after="30" w:before="0" w:line="240" w:lineRule="auto"/>
+              <w:rPr/>
+            </w:pPr>
+            <w:r>
+              <w:rPr>
+                <w:b w:val="1"/>
+                <w:sz w:val="17"/>
+                <w:szCs w:val="17"/>
+                <w:rtl w:val="0"/>
+              </w:rPr>
+              <w:t xml:space="preserve">Ação: </w:t>
+            </w:r>
+            <w:r>
+              <w:rPr>
+                <w:sz w:val="17"/>
+                <w:szCs w:val="17"/>
+                <w:rtl w:val="0"/>
+              </w:rPr>
+              <w:t xml:space="preserve">Gabriel pega o rádio e a voz da Clarice dá as primeiras dicas de ronda.</w:t>
+            </w:r>
+          </w:p>
+        </w:tc>
+        <w:tc>
+          <w:tcPr>
+            <w:tcW w:w="4514" w:type="dxa"/>
+          </w:tcPr>
+          <w:p>
+            <w:pPr>
+              <w:spacing w:after="60" w:before="0" w:line="240" w:lineRule="auto"/>
+              <w:jc w:val="center"/>
+              <w:rPr/>
+            </w:pPr>
+            <w:r>
+              <w:rPr>
+                <w:noProof/>
+              </w:rPr>
+              <w:drawing>
+                <wp:inline distT="0" distB="0" distL="0" distR="0">
+                  <wp:extent cx="2739390" cy="1540906"/>
+                  <wp:docPr id="115" name="Imagem 115" descr="Quadro 15 · O acervo"/>
+                  <wp:cNvGraphicFramePr>
+                    <a:graphicFrameLocks noChangeAspect="1"/>
+                  </wp:cNvGraphicFramePr>
+                  <a:graphic>
+                    <a:graphicData uri="http://schemas.openxmlformats.org/drawingml/2006/picture">
+                      <pic:pic>
+                        <pic:nvPicPr>
+                          <pic:cNvPr id="115" name="imagem15.png"/>
+                          <pic:cNvPicPr/>
+                        </pic:nvPicPr>
+                        <pic:blipFill>
+                          <a:blip r:embed="rIdImg15"/>
+                          <a:stretch>
+                            <a:fillRect/>
+                          </a:stretch>
+                        </pic:blipFill>
+                        <pic:spPr>
+                          <a:xfrm>
+                            <a:off x="0" y="0"/>
+                            <a:ext cx="2739390" cy="1540906"/>
+                          </a:xfrm>
+                          <a:prstGeom prst="rect">
+                            <a:avLst/>
+                          </a:prstGeom>
+                        </pic:spPr>
+                      </pic:pic>
+                    </a:graphicData>
+                  </a:graphic>
+                </wp:inline>
+              </w:drawing>
+            </w:r>
+          </w:p>
+          <w:p>
+            <w:pPr>
+              <w:spacing w:after="40" w:before="0" w:line="240" w:lineRule="auto"/>
+              <w:rPr/>
+            </w:pPr>
+            <w:r>
+              <w:rPr>
+                <w:b w:val="1"/>
+                <w:sz w:val="18"/>
+                <w:szCs w:val="18"/>
+                <w:rtl w:val="0"/>
+              </w:rPr>
+              <w:t xml:space="preserve">Quadro 15 · O acervo</w:t>
+            </w:r>
+          </w:p>
+          <w:p>
+            <w:pPr>
+              <w:spacing w:after="30" w:before="0" w:line="240" w:lineRule="auto"/>
+              <w:rPr/>
+            </w:pPr>
+            <w:r>
+              <w:rPr>
+                <w:b w:val="1"/>
+                <w:sz w:val="17"/>
+                <w:szCs w:val="17"/>
+                <w:rtl w:val="0"/>
+              </w:rPr>
+              <w:t xml:space="preserve">Cena: </w:t>
+            </w:r>
+            <w:r>
+              <w:rPr>
+                <w:sz w:val="17"/>
+                <w:szCs w:val="17"/>
+                <w:rtl w:val="0"/>
+              </w:rPr>
+              <w:t xml:space="preserve">Acervo sul, entre as estantes, com um lampião.</w:t>
+            </w:r>
+          </w:p>
+          <w:p>
+            <w:pPr>
+              <w:spacing w:after="30" w:before="0" w:line="240" w:lineRule="auto"/>
+              <w:rPr/>
+            </w:pPr>
+            <w:r>
+              <w:rPr>
+                <w:b w:val="1"/>
+                <w:sz w:val="17"/>
+                <w:szCs w:val="17"/>
+                <w:rtl w:val="0"/>
+              </w:rPr>
+              <w:t xml:space="preserve">Enquadramento: </w:t>
+            </w:r>
+            <w:r>
+              <w:rPr>
+                <w:sz w:val="17"/>
+                <w:szCs w:val="17"/>
+                <w:rtl w:val="0"/>
+              </w:rPr>
+              <w:t xml:space="preserve">Plano geral com o feixe iluminando o carrinho de devolução.</w:t>
+            </w:r>
+          </w:p>
+          <w:p>
+            <w:pPr>
+              <w:spacing w:after="30" w:before="0" w:line="240" w:lineRule="auto"/>
+              <w:rPr/>
+            </w:pPr>
+            <w:r>
+              <w:rPr>
+                <w:b w:val="1"/>
+                <w:sz w:val="17"/>
+                <w:szCs w:val="17"/>
+                <w:rtl w:val="0"/>
+              </w:rPr>
+              <w:t xml:space="preserve">Ação: </w:t>
+            </w:r>
+            <w:r>
+              <w:rPr>
+                <w:sz w:val="17"/>
+                <w:szCs w:val="17"/>
+                <w:rtl w:val="0"/>
+              </w:rPr>
+              <w:t xml:space="preserve">Ele procura a chave da manutenção enquanto o Rastreador escuta: é preciso andar, sem correr.</w:t>
+            </w:r>
+          </w:p>
+        </w:tc>
+      </w:tr>
+      <w:tr>
+        <w:trPr>
+          <w:cantSplit/>
+        </w:trPr>
+        <w:tc>
+          <w:tcPr>
+            <w:tcW w:w="4515" w:type="dxa"/>
+          </w:tcPr>
+          <w:p>
+            <w:pPr>
+              <w:spacing w:after="60" w:before="0" w:line="240" w:lineRule="auto"/>
+              <w:jc w:val="center"/>
+              <w:rPr/>
+            </w:pPr>
+            <w:r>
+              <w:rPr>
+                <w:noProof/>
+              </w:rPr>
+              <w:drawing>
+                <wp:inline distT="0" distB="0" distL="0" distR="0">
+                  <wp:extent cx="2740025" cy="1541264"/>
+                  <wp:docPr id="116" name="Imagem 116" descr="Quadro 16 · A sala segura"/>
+                  <wp:cNvGraphicFramePr>
+                    <a:graphicFrameLocks noChangeAspect="1"/>
+                  </wp:cNvGraphicFramePr>
+                  <a:graphic>
+                    <a:graphicData uri="http://schemas.openxmlformats.org/drawingml/2006/picture">
+                      <pic:pic>
+                        <pic:nvPicPr>
+                          <pic:cNvPr id="116" name="imagem16.png"/>
+                          <pic:cNvPicPr/>
+                        </pic:nvPicPr>
+                        <pic:blipFill>
+                          <a:blip r:embed="rIdImg16"/>
+                          <a:stretch>
+                            <a:fillRect/>
+                          </a:stretch>
+                        </pic:blipFill>
+                        <pic:spPr>
+                          <a:xfrm>
+                            <a:off x="0" y="0"/>
+                            <a:ext cx="2740025" cy="1541264"/>
+                          </a:xfrm>
+                          <a:prstGeom prst="rect">
+                            <a:avLst/>
+                          </a:prstGeom>
+                        </pic:spPr>
+                      </pic:pic>
+                    </a:graphicData>
+                  </a:graphic>
+                </wp:inline>
+              </w:drawing>
+            </w:r>
+          </w:p>
+          <w:p>
+            <w:pPr>
+              <w:spacing w:after="40" w:before="0" w:line="240" w:lineRule="auto"/>
+              <w:rPr/>
+            </w:pPr>
+            <w:r>
+              <w:rPr>
+                <w:b w:val="1"/>
+                <w:sz w:val="18"/>
+                <w:szCs w:val="18"/>
+                <w:rtl w:val="0"/>
+              </w:rPr>
+              <w:t xml:space="preserve">Quadro 16 · A sala segura</w:t>
+            </w:r>
+          </w:p>
+          <w:p>
+            <w:pPr>
+              <w:spacing w:after="30" w:before="0" w:line="240" w:lineRule="auto"/>
+              <w:rPr/>
+            </w:pPr>
+            <w:r>
+              <w:rPr>
+                <w:b w:val="1"/>
+                <w:sz w:val="17"/>
+                <w:szCs w:val="17"/>
+                <w:rtl w:val="0"/>
+              </w:rPr>
+              <w:t xml:space="preserve">Cena: </w:t>
+            </w:r>
+            <w:r>
+              <w:rPr>
+                <w:sz w:val="17"/>
+                <w:szCs w:val="17"/>
+                <w:rtl w:val="0"/>
+              </w:rPr>
+              <w:t xml:space="preserve">Sala de manutenção, fechada e escura, com o quadro de energia.</w:t>
+            </w:r>
+          </w:p>
+          <w:p>
+            <w:pPr>
+              <w:spacing w:after="30" w:before="0" w:line="240" w:lineRule="auto"/>
+              <w:rPr/>
+            </w:pPr>
+            <w:r>
+              <w:rPr>
+                <w:b w:val="1"/>
+                <w:sz w:val="17"/>
+                <w:szCs w:val="17"/>
+                <w:rtl w:val="0"/>
+              </w:rPr>
+              <w:t xml:space="preserve">Enquadramento: </w:t>
+            </w:r>
+            <w:r>
+              <w:rPr>
+                <w:sz w:val="17"/>
+                <w:szCs w:val="17"/>
+                <w:rtl w:val="0"/>
+              </w:rPr>
+              <w:t xml:space="preserve">Plano geral lateral, com o quadro ao fundo.</w:t>
+            </w:r>
+          </w:p>
+          <w:p>
+            <w:pPr>
+              <w:spacing w:after="30" w:before="0" w:line="240" w:lineRule="auto"/>
+              <w:rPr/>
+            </w:pPr>
+            <w:r>
+              <w:rPr>
+                <w:b w:val="1"/>
+                <w:sz w:val="17"/>
+                <w:szCs w:val="17"/>
+                <w:rtl w:val="0"/>
+              </w:rPr>
+              <w:t xml:space="preserve">Ação: </w:t>
+            </w:r>
+            <w:r>
+              <w:rPr>
+                <w:sz w:val="17"/>
+                <w:szCs w:val="17"/>
+                <w:rtl w:val="0"/>
+              </w:rPr>
+              <w:t xml:space="preserve">Gabriel religa os disjuntores na ordem certa (3, 1, 4, 2). Com a energia de volta, a grade da ala leste passa a pedir um código.</w:t>
+            </w:r>
+          </w:p>
+        </w:tc>
+        <w:tc>
+          <w:tcPr>
+            <w:tcW w:w="4514" w:type="dxa"/>
+          </w:tcPr>
+          <w:p>
+            <w:pPr>
+              <w:spacing w:after="60" w:before="0" w:line="240" w:lineRule="auto"/>
+              <w:jc w:val="center"/>
+              <w:rPr/>
+            </w:pPr>
+            <w:r>
+              <w:rPr>
+                <w:noProof/>
+              </w:rPr>
+              <w:drawing>
+                <wp:inline distT="0" distB="0" distL="0" distR="0">
+                  <wp:extent cx="2739390" cy="1540906"/>
+                  <wp:docPr id="117" name="Imagem 117" descr="Quadro 17 · Inventário e gadgets"/>
+                  <wp:cNvGraphicFramePr>
+                    <a:graphicFrameLocks noChangeAspect="1"/>
+                  </wp:cNvGraphicFramePr>
+                  <a:graphic>
+                    <a:graphicData uri="http://schemas.openxmlformats.org/drawingml/2006/picture">
+                      <pic:pic>
+                        <pic:nvPicPr>
+                          <pic:cNvPr id="117" name="imagem17.png"/>
+                          <pic:cNvPicPr/>
+                        </pic:nvPicPr>
+                        <pic:blipFill>
+                          <a:blip r:embed="rIdImg17"/>
+                          <a:stretch>
+                            <a:fillRect/>
+                          </a:stretch>
+                        </pic:blipFill>
+                        <pic:spPr>
+                          <a:xfrm>
+                            <a:off x="0" y="0"/>
+                            <a:ext cx="2739390" cy="1540906"/>
+                          </a:xfrm>
+                          <a:prstGeom prst="rect">
+                            <a:avLst/>
+                          </a:prstGeom>
+                        </pic:spPr>
+                      </pic:pic>
+                    </a:graphicData>
+                  </a:graphic>
+                </wp:inline>
+              </w:drawing>
+            </w:r>
+          </w:p>
+          <w:p>
+            <w:pPr>
+              <w:spacing w:after="40" w:before="0" w:line="240" w:lineRule="auto"/>
+              <w:rPr/>
+            </w:pPr>
+            <w:r>
+              <w:rPr>
+                <w:b w:val="1"/>
+                <w:sz w:val="18"/>
+                <w:szCs w:val="18"/>
+                <w:rtl w:val="0"/>
+              </w:rPr>
+              <w:t xml:space="preserve">Quadro 17 · Inventário e gadgets</w:t>
+            </w:r>
+          </w:p>
+          <w:p>
+            <w:pPr>
+              <w:spacing w:after="30" w:before="0" w:line="240" w:lineRule="auto"/>
+              <w:rPr/>
+            </w:pPr>
+            <w:r>
+              <w:rPr>
+                <w:b w:val="1"/>
+                <w:sz w:val="17"/>
+                <w:szCs w:val="17"/>
+                <w:rtl w:val="0"/>
+              </w:rPr>
+              <w:t xml:space="preserve">Cena: </w:t>
+            </w:r>
+            <w:r>
+              <w:rPr>
+                <w:sz w:val="17"/>
+                <w:szCs w:val="17"/>
+                <w:rtl w:val="0"/>
+              </w:rPr>
+              <w:t xml:space="preserve">Tela do inventário, com o jogo pausado.</w:t>
+            </w:r>
+          </w:p>
+          <w:p>
+            <w:pPr>
+              <w:spacing w:after="30" w:before="0" w:line="240" w:lineRule="auto"/>
+              <w:rPr/>
+            </w:pPr>
+            <w:r>
+              <w:rPr>
+                <w:b w:val="1"/>
+                <w:sz w:val="17"/>
+                <w:szCs w:val="17"/>
+                <w:rtl w:val="0"/>
+              </w:rPr>
+              <w:t xml:space="preserve">Enquadramento: </w:t>
+            </w:r>
+            <w:r>
+              <w:rPr>
+                <w:sz w:val="17"/>
+                <w:szCs w:val="17"/>
+                <w:rtl w:val="0"/>
+              </w:rPr>
+              <w:t xml:space="preserve">Interface em tela cheia: grade 3 × 4 e três espaços de gadget.</w:t>
+            </w:r>
+          </w:p>
+          <w:p>
+            <w:pPr>
+              <w:spacing w:after="30" w:before="0" w:line="240" w:lineRule="auto"/>
+              <w:rPr/>
+            </w:pPr>
+            <w:r>
+              <w:rPr>
+                <w:b w:val="1"/>
+                <w:sz w:val="17"/>
+                <w:szCs w:val="17"/>
+                <w:rtl w:val="0"/>
+              </w:rPr>
+              <w:t xml:space="preserve">Ação: </w:t>
+            </w:r>
+            <w:r>
+              <w:rPr>
+                <w:sz w:val="17"/>
+                <w:szCs w:val="17"/>
+                <w:rtl w:val="0"/>
+              </w:rPr>
+              <w:t xml:space="preserve">O jogador equipa a lanterna, a cápsula de clarão e o notebook nas teclas 1, 2 e 3 e lê o Caderno na aba Anotações. Captura com os gadgets previstos.</w:t>
+            </w:r>
+          </w:p>
+        </w:tc>
+      </w:tr>
+    </w:tbl>
+    <w:p>
+      <w:pPr>
+        <w:spacing w:after="160" w:before="0" w:lineRule="auto"/>
+        <w:rPr/>
+      </w:pPr>
+    </w:p>
+    <w:p>
+      <w:pPr>
+        <w:keepNext w:val="1"/>
+        <w:spacing w:after="80" w:before="120" w:lineRule="auto"/>
+        <w:ind w:left="720" w:firstLine="0"/>
+        <w:rPr/>
+      </w:pPr>
+      <w:r>
+        <w:rPr>
+          <w:b w:val="1"/>
+          <w:sz w:val="20"/>
+          <w:szCs w:val="20"/>
+          <w:rtl w:val="0"/>
+        </w:rPr>
+        <w:t xml:space="preserve">Sequência C. Bloco de salas (fase 2)</w:t>
+      </w:r>
+    </w:p>
+    <w:tbl>
+      <w:tblPr>
+        <w:tblW w:w="9029" w:type="dxa"/>
+        <w:tblBorders>
+          <w:top w:val="single" w:sz="4" w:space="0" w:color="BFBFBF"/>
+          <w:left w:val="single" w:sz="4" w:space="0" w:color="BFBFBF"/>
+          <w:bottom w:val="single" w:sz="4" w:space="0" w:color="BFBFBF"/>
+          <w:right w:val="single" w:sz="4" w:space="0" w:color="BFBFBF"/>
+          <w:insideH w:val="single" w:sz="4" w:space="0" w:color="BFBFBF"/>
+          <w:insideV w:val="single" w:sz="4" w:space="0" w:color="BFBFBF"/>
+        </w:tblBorders>
+        <w:tblLayout w:type="fixed"/>
+        <w:tblCellMar>
+          <w:top w:w="80" w:type="dxa"/>
+          <w:left w:w="100" w:type="dxa"/>
+          <w:bottom w:w="60" w:type="dxa"/>
+          <w:right w:w="100" w:type="dxa"/>
+        </w:tblCellMar>
+      </w:tblPr>
+      <w:tblGrid>
+        <w:gridCol w:w="4515"/>
+        <w:gridCol w:w="4514"/>
+      </w:tblGrid>
+      <w:tr>
+        <w:trPr>
+          <w:cantSplit/>
+        </w:trPr>
+        <w:tc>
+          <w:tcPr>
+            <w:tcW w:w="4515" w:type="dxa"/>
+          </w:tcPr>
+          <w:p>
+            <w:pPr>
+              <w:spacing w:after="60" w:before="0" w:line="240" w:lineRule="auto"/>
+              <w:jc w:val="center"/>
+              <w:rPr/>
+            </w:pPr>
+            <w:r>
+              <w:rPr>
+                <w:noProof/>
+              </w:rPr>
+              <w:drawing>
+                <wp:inline distT="0" distB="0" distL="0" distR="0">
+                  <wp:extent cx="2740025" cy="1541264"/>
+                  <wp:docPr id="118" name="Imagem 118" descr="Quadro 18 · Corredor do térreo"/>
+                  <wp:cNvGraphicFramePr>
+                    <a:graphicFrameLocks noChangeAspect="1"/>
+                  </wp:cNvGraphicFramePr>
+                  <a:graphic>
+                    <a:graphicData uri="http://schemas.openxmlformats.org/drawingml/2006/picture">
+                      <pic:pic>
+                        <pic:nvPicPr>
+                          <pic:cNvPr id="118" name="imagem18.png"/>
+                          <pic:cNvPicPr/>
+                        </pic:nvPicPr>
+                        <pic:blipFill>
+                          <a:blip r:embed="rIdImg18"/>
+                          <a:stretch>
+                            <a:fillRect/>
+                          </a:stretch>
+                        </pic:blipFill>
+                        <pic:spPr>
+                          <a:xfrm>
+                            <a:off x="0" y="0"/>
+                            <a:ext cx="2740025" cy="1541264"/>
+                          </a:xfrm>
+                          <a:prstGeom prst="rect">
+                            <a:avLst/>
+                          </a:prstGeom>
+                        </pic:spPr>
+                      </pic:pic>
+                    </a:graphicData>
+                  </a:graphic>
+                </wp:inline>
+              </w:drawing>
+            </w:r>
+          </w:p>
+          <w:p>
+            <w:pPr>
+              <w:spacing w:after="40" w:before="0" w:line="240" w:lineRule="auto"/>
+              <w:rPr/>
+            </w:pPr>
+            <w:r>
+              <w:rPr>
+                <w:b w:val="1"/>
+                <w:sz w:val="18"/>
+                <w:szCs w:val="18"/>
+                <w:rtl w:val="0"/>
+              </w:rPr>
+              <w:t xml:space="preserve">Quadro 18 · Corredor do térreo</w:t>
+            </w:r>
+          </w:p>
+          <w:p>
+            <w:pPr>
+              <w:spacing w:after="30" w:before="0" w:line="240" w:lineRule="auto"/>
+              <w:rPr/>
+            </w:pPr>
+            <w:r>
+              <w:rPr>
+                <w:b w:val="1"/>
+                <w:sz w:val="17"/>
+                <w:szCs w:val="17"/>
+                <w:rtl w:val="0"/>
+              </w:rPr>
+              <w:t xml:space="preserve">Cena: </w:t>
+            </w:r>
+            <w:r>
+              <w:rPr>
+                <w:sz w:val="17"/>
+                <w:szCs w:val="17"/>
+                <w:rtl w:val="0"/>
+              </w:rPr>
+              <w:t xml:space="preserve">Corredor meio enterrado na areia, à noite, com a porta da sala 101.</w:t>
+            </w:r>
+          </w:p>
+          <w:p>
+            <w:pPr>
+              <w:spacing w:after="30" w:before="0" w:line="240" w:lineRule="auto"/>
+              <w:rPr/>
+            </w:pPr>
+            <w:r>
+              <w:rPr>
+                <w:b w:val="1"/>
+                <w:sz w:val="17"/>
+                <w:szCs w:val="17"/>
+                <w:rtl w:val="0"/>
+              </w:rPr>
+              <w:t xml:space="preserve">Enquadramento: </w:t>
+            </w:r>
+            <w:r>
+              <w:rPr>
+                <w:sz w:val="17"/>
+                <w:szCs w:val="17"/>
+                <w:rtl w:val="0"/>
+              </w:rPr>
+              <w:t xml:space="preserve">Plano geral lateral, com a lanterna acesa.</w:t>
+            </w:r>
+          </w:p>
+          <w:p>
+            <w:pPr>
+              <w:spacing w:after="30" w:before="0" w:line="240" w:lineRule="auto"/>
+              <w:rPr/>
+            </w:pPr>
+            <w:r>
+              <w:rPr>
+                <w:b w:val="1"/>
+                <w:sz w:val="17"/>
+                <w:szCs w:val="17"/>
+                <w:rtl w:val="0"/>
+              </w:rPr>
+              <w:t xml:space="preserve">Ação: </w:t>
+            </w:r>
+            <w:r>
+              <w:rPr>
+                <w:sz w:val="17"/>
+                <w:szCs w:val="17"/>
+                <w:rtl w:val="0"/>
+              </w:rPr>
+              <w:t xml:space="preserve">O piso muda o alcance do barulho: a areia abafa os passos. O Rastreador ronda o corredor.</w:t>
+            </w:r>
+          </w:p>
+        </w:tc>
+        <w:tc>
+          <w:tcPr>
+            <w:tcW w:w="4514" w:type="dxa"/>
+          </w:tcPr>
+          <w:p>
+            <w:pPr>
+              <w:spacing w:after="60" w:before="0" w:line="240" w:lineRule="auto"/>
+              <w:jc w:val="center"/>
+              <w:rPr/>
+            </w:pPr>
+            <w:r>
+              <w:rPr>
+                <w:noProof/>
+              </w:rPr>
+              <w:drawing>
+                <wp:inline distT="0" distB="0" distL="0" distR="0">
+                  <wp:extent cx="2739390" cy="1540906"/>
+                  <wp:docPr id="119" name="Imagem 119" descr="Quadro 19 · A sala 103"/>
+                  <wp:cNvGraphicFramePr>
+                    <a:graphicFrameLocks noChangeAspect="1"/>
+                  </wp:cNvGraphicFramePr>
+                  <a:graphic>
+                    <a:graphicData uri="http://schemas.openxmlformats.org/drawingml/2006/picture">
+                      <pic:pic>
+                        <pic:nvPicPr>
+                          <pic:cNvPr id="119" name="imagem19.png"/>
+                          <pic:cNvPicPr/>
+                        </pic:nvPicPr>
+                        <pic:blipFill>
+                          <a:blip r:embed="rIdImg19"/>
+                          <a:stretch>
+                            <a:fillRect/>
+                          </a:stretch>
+                        </pic:blipFill>
+                        <pic:spPr>
+                          <a:xfrm>
+                            <a:off x="0" y="0"/>
+                            <a:ext cx="2739390" cy="1540906"/>
+                          </a:xfrm>
+                          <a:prstGeom prst="rect">
+                            <a:avLst/>
+                          </a:prstGeom>
+                        </pic:spPr>
+                      </pic:pic>
+                    </a:graphicData>
+                  </a:graphic>
+                </wp:inline>
+              </w:drawing>
+            </w:r>
+          </w:p>
+          <w:p>
+            <w:pPr>
+              <w:spacing w:after="40" w:before="0" w:line="240" w:lineRule="auto"/>
+              <w:rPr/>
+            </w:pPr>
+            <w:r>
+              <w:rPr>
+                <w:b w:val="1"/>
+                <w:sz w:val="18"/>
+                <w:szCs w:val="18"/>
+                <w:rtl w:val="0"/>
+              </w:rPr>
+              <w:t xml:space="preserve">Quadro 19 · A sala 103</w:t>
+            </w:r>
+          </w:p>
+          <w:p>
+            <w:pPr>
+              <w:spacing w:after="30" w:before="0" w:line="240" w:lineRule="auto"/>
+              <w:rPr/>
+            </w:pPr>
+            <w:r>
+              <w:rPr>
+                <w:b w:val="1"/>
+                <w:sz w:val="17"/>
+                <w:szCs w:val="17"/>
+                <w:rtl w:val="0"/>
+              </w:rPr>
+              <w:t xml:space="preserve">Cena: </w:t>
+            </w:r>
+            <w:r>
+              <w:rPr>
+                <w:sz w:val="17"/>
+                <w:szCs w:val="17"/>
+                <w:rtl w:val="0"/>
+              </w:rPr>
+              <w:t xml:space="preserve">O posto da Clarice, atrás da barricada, à luz de lampiões.</w:t>
+            </w:r>
+          </w:p>
+          <w:p>
+            <w:pPr>
+              <w:spacing w:after="30" w:before="0" w:line="240" w:lineRule="auto"/>
+              <w:rPr/>
+            </w:pPr>
+            <w:r>
+              <w:rPr>
+                <w:b w:val="1"/>
+                <w:sz w:val="17"/>
+                <w:szCs w:val="17"/>
+                <w:rtl w:val="0"/>
+              </w:rPr>
+              <w:t xml:space="preserve">Enquadramento: </w:t>
+            </w:r>
+            <w:r>
+              <w:rPr>
+                <w:sz w:val="17"/>
+                <w:szCs w:val="17"/>
+                <w:rtl w:val="0"/>
+              </w:rPr>
+              <w:t xml:space="preserve">Plano médio, com a caixa de diálogo no alto da tela.</w:t>
+            </w:r>
+          </w:p>
+          <w:p>
+            <w:pPr>
+              <w:spacing w:after="30" w:before="0" w:line="240" w:lineRule="auto"/>
+              <w:rPr/>
+            </w:pPr>
+            <w:r>
+              <w:rPr>
+                <w:b w:val="1"/>
+                <w:sz w:val="17"/>
+                <w:szCs w:val="17"/>
+                <w:rtl w:val="0"/>
+              </w:rPr>
+              <w:t xml:space="preserve">Ação: </w:t>
+            </w:r>
+            <w:r>
+              <w:rPr>
+                <w:sz w:val="17"/>
+                <w:szCs w:val="17"/>
+                <w:rtl w:val="0"/>
+              </w:rPr>
+              <w:t xml:space="preserve">Primeiro encontro em pessoa. A Clarice desconfia e propõe uma permuta: o molho de chaves dela em troca da chave da escada.</w:t>
+            </w:r>
+          </w:p>
+        </w:tc>
+      </w:tr>
+      <w:tr>
+        <w:trPr>
+          <w:cantSplit/>
+        </w:trPr>
+        <w:tc>
+          <w:tcPr>
+            <w:tcW w:w="4515" w:type="dxa"/>
+          </w:tcPr>
+          <w:p>
+            <w:pPr>
+              <w:spacing w:after="60" w:before="0" w:line="240" w:lineRule="auto"/>
+              <w:jc w:val="center"/>
+              <w:rPr/>
+            </w:pPr>
+            <w:r>
+              <w:rPr>
+                <w:noProof/>
+              </w:rPr>
+              <w:drawing>
+                <wp:inline distT="0" distB="0" distL="0" distR="0">
+                  <wp:extent cx="2740025" cy="1541264"/>
+                  <wp:docPr id="120" name="Imagem 120" descr="Quadro 20 · O 1º andar"/>
+                  <wp:cNvGraphicFramePr>
+                    <a:graphicFrameLocks noChangeAspect="1"/>
+                  </wp:cNvGraphicFramePr>
+                  <a:graphic>
+                    <a:graphicData uri="http://schemas.openxmlformats.org/drawingml/2006/picture">
+                      <pic:pic>
+                        <pic:nvPicPr>
+                          <pic:cNvPr id="120" name="imagem20.png"/>
+                          <pic:cNvPicPr/>
+                        </pic:nvPicPr>
+                        <pic:blipFill>
+                          <a:blip r:embed="rIdImg20"/>
+                          <a:stretch>
+                            <a:fillRect/>
+                          </a:stretch>
+                        </pic:blipFill>
+                        <pic:spPr>
+                          <a:xfrm>
+                            <a:off x="0" y="0"/>
+                            <a:ext cx="2740025" cy="1541264"/>
+                          </a:xfrm>
+                          <a:prstGeom prst="rect">
+                            <a:avLst/>
+                          </a:prstGeom>
+                        </pic:spPr>
+                      </pic:pic>
+                    </a:graphicData>
+                  </a:graphic>
+                </wp:inline>
+              </w:drawing>
+            </w:r>
+          </w:p>
+          <w:p>
+            <w:pPr>
+              <w:spacing w:after="40" w:before="0" w:line="240" w:lineRule="auto"/>
+              <w:rPr/>
+            </w:pPr>
+            <w:r>
+              <w:rPr>
+                <w:b w:val="1"/>
+                <w:sz w:val="18"/>
+                <w:szCs w:val="18"/>
+                <w:rtl w:val="0"/>
+              </w:rPr>
+              <w:t xml:space="preserve">Quadro 20 · O 1º andar</w:t>
+            </w:r>
+          </w:p>
+          <w:p>
+            <w:pPr>
+              <w:spacing w:after="30" w:before="0" w:line="240" w:lineRule="auto"/>
+              <w:rPr/>
+            </w:pPr>
+            <w:r>
+              <w:rPr>
+                <w:b w:val="1"/>
+                <w:sz w:val="17"/>
+                <w:szCs w:val="17"/>
+                <w:rtl w:val="0"/>
+              </w:rPr>
+              <w:t xml:space="preserve">Cena: </w:t>
+            </w:r>
+            <w:r>
+              <w:rPr>
+                <w:sz w:val="17"/>
+                <w:szCs w:val="17"/>
+                <w:rtl w:val="0"/>
+              </w:rPr>
+              <w:t xml:space="preserve">Corredor com o teto aberto: céu, mato e luar pelos buracos.</w:t>
+            </w:r>
+          </w:p>
+          <w:p>
+            <w:pPr>
+              <w:spacing w:after="30" w:before="0" w:line="240" w:lineRule="auto"/>
+              <w:rPr/>
+            </w:pPr>
+            <w:r>
+              <w:rPr>
+                <w:b w:val="1"/>
+                <w:sz w:val="17"/>
+                <w:szCs w:val="17"/>
+                <w:rtl w:val="0"/>
+              </w:rPr>
+              <w:t xml:space="preserve">Enquadramento: </w:t>
+            </w:r>
+            <w:r>
+              <w:rPr>
+                <w:sz w:val="17"/>
+                <w:szCs w:val="17"/>
+                <w:rtl w:val="0"/>
+              </w:rPr>
+              <w:t xml:space="preserve">Plano geral lateral.</w:t>
+            </w:r>
+          </w:p>
+          <w:p>
+            <w:pPr>
+              <w:spacing w:after="30" w:before="0" w:line="240" w:lineRule="auto"/>
+              <w:rPr/>
+            </w:pPr>
+            <w:r>
+              <w:rPr>
+                <w:b w:val="1"/>
+                <w:sz w:val="17"/>
+                <w:szCs w:val="17"/>
+                <w:rtl w:val="0"/>
+              </w:rPr>
+              <w:t xml:space="preserve">Ação: </w:t>
+            </w:r>
+            <w:r>
+              <w:rPr>
+                <w:sz w:val="17"/>
+                <w:szCs w:val="17"/>
+                <w:rtl w:val="0"/>
+              </w:rPr>
+              <w:t xml:space="preserve">O luar também denuncia: o Gabriel passa pelas sombras e pelo mato para fugir da Sentinela.</w:t>
+            </w:r>
+          </w:p>
+        </w:tc>
+        <w:tc>
+          <w:tcPr>
+            <w:tcW w:w="4514" w:type="dxa"/>
+          </w:tcPr>
+          <w:p>
+            <w:pPr>
+              <w:spacing w:after="60" w:before="0" w:line="240" w:lineRule="auto"/>
+              <w:jc w:val="center"/>
+              <w:rPr/>
+            </w:pPr>
+            <w:r>
+              <w:rPr>
+                <w:noProof/>
+              </w:rPr>
+              <w:drawing>
+                <wp:inline distT="0" distB="0" distL="0" distR="0">
+                  <wp:extent cx="2739390" cy="1540906"/>
+                  <wp:docPr id="121" name="Imagem 121" descr="Quadro 21 · A sala 204"/>
+                  <wp:cNvGraphicFramePr>
+                    <a:graphicFrameLocks noChangeAspect="1"/>
+                  </wp:cNvGraphicFramePr>
+                  <a:graphic>
+                    <a:graphicData uri="http://schemas.openxmlformats.org/drawingml/2006/picture">
+                      <pic:pic>
+                        <pic:nvPicPr>
+                          <pic:cNvPr id="121" name="imagem21.png"/>
+                          <pic:cNvPicPr/>
+                        </pic:nvPicPr>
+                        <pic:blipFill>
+                          <a:blip r:embed="rIdImg21"/>
+                          <a:stretch>
+                            <a:fillRect/>
+                          </a:stretch>
+                        </pic:blipFill>
+                        <pic:spPr>
+                          <a:xfrm>
+                            <a:off x="0" y="0"/>
+                            <a:ext cx="2739390" cy="1540906"/>
+                          </a:xfrm>
+                          <a:prstGeom prst="rect">
+                            <a:avLst/>
+                          </a:prstGeom>
+                        </pic:spPr>
+                      </pic:pic>
+                    </a:graphicData>
+                  </a:graphic>
+                </wp:inline>
+              </w:drawing>
+            </w:r>
+          </w:p>
+          <w:p>
+            <w:pPr>
+              <w:spacing w:after="40" w:before="0" w:line="240" w:lineRule="auto"/>
+              <w:rPr/>
+            </w:pPr>
+            <w:r>
+              <w:rPr>
+                <w:b w:val="1"/>
+                <w:sz w:val="18"/>
+                <w:szCs w:val="18"/>
+                <w:rtl w:val="0"/>
+              </w:rPr>
+              <w:t xml:space="preserve">Quadro 21 · A sala 204</w:t>
+            </w:r>
+          </w:p>
+          <w:p>
+            <w:pPr>
+              <w:spacing w:after="30" w:before="0" w:line="240" w:lineRule="auto"/>
+              <w:rPr/>
+            </w:pPr>
+            <w:r>
+              <w:rPr>
+                <w:b w:val="1"/>
+                <w:sz w:val="17"/>
+                <w:szCs w:val="17"/>
+                <w:rtl w:val="0"/>
+              </w:rPr>
+              <w:t xml:space="preserve">Cena: </w:t>
+            </w:r>
+            <w:r>
+              <w:rPr>
+                <w:sz w:val="17"/>
+                <w:szCs w:val="17"/>
+                <w:rtl w:val="0"/>
+              </w:rPr>
+              <w:t xml:space="preserve">Sala em que o chão cedeu, com entulho e um buraco no piso.</w:t>
+            </w:r>
+          </w:p>
+          <w:p>
+            <w:pPr>
+              <w:spacing w:after="30" w:before="0" w:line="240" w:lineRule="auto"/>
+              <w:rPr/>
+            </w:pPr>
+            <w:r>
+              <w:rPr>
+                <w:b w:val="1"/>
+                <w:sz w:val="17"/>
+                <w:szCs w:val="17"/>
+                <w:rtl w:val="0"/>
+              </w:rPr>
+              <w:t xml:space="preserve">Enquadramento: </w:t>
+            </w:r>
+            <w:r>
+              <w:rPr>
+                <w:sz w:val="17"/>
+                <w:szCs w:val="17"/>
+                <w:rtl w:val="0"/>
+              </w:rPr>
+              <w:t xml:space="preserve">Plano geral lateral, com o feixe da lanterna sobre o buraco.</w:t>
+            </w:r>
+          </w:p>
+          <w:p>
+            <w:pPr>
+              <w:spacing w:after="30" w:before="0" w:line="240" w:lineRule="auto"/>
+              <w:rPr/>
+            </w:pPr>
+            <w:r>
+              <w:rPr>
+                <w:b w:val="1"/>
+                <w:sz w:val="17"/>
+                <w:szCs w:val="17"/>
+                <w:rtl w:val="0"/>
+              </w:rPr>
+              <w:t xml:space="preserve">Ação: </w:t>
+            </w:r>
+            <w:r>
+              <w:rPr>
+                <w:sz w:val="17"/>
+                <w:szCs w:val="17"/>
+                <w:rtl w:val="0"/>
+              </w:rPr>
+              <w:t xml:space="preserve">O buraco desce para a sala 104: é um atalho de mão única entre os andares, longe da Sentinela e da escada.</w:t>
+            </w:r>
+          </w:p>
+        </w:tc>
+      </w:tr>
+    </w:tbl>
+    <w:p>
+      <w:pPr>
+        <w:spacing w:after="160" w:before="0" w:lineRule="auto"/>
+        <w:rPr/>
+      </w:pPr>
+    </w:p>
+    <w:p>
+      <w:pPr>
+        <w:keepNext w:val="1"/>
+        <w:spacing w:after="80" w:before="120" w:lineRule="auto"/>
+        <w:ind w:left="720" w:firstLine="0"/>
+        <w:rPr/>
+      </w:pPr>
+      <w:r>
+        <w:rPr>
+          <w:b w:val="1"/>
+          <w:sz w:val="20"/>
+          <w:szCs w:val="20"/>
+          <w:rtl w:val="0"/>
+        </w:rPr>
+        <w:t xml:space="preserve">Sequência D. Labirinto (fase 3)</w:t>
+      </w:r>
+    </w:p>
+    <w:tbl>
+      <w:tblPr>
+        <w:tblW w:w="9029" w:type="dxa"/>
+        <w:tblBorders>
+          <w:top w:val="single" w:sz="4" w:space="0" w:color="BFBFBF"/>
+          <w:left w:val="single" w:sz="4" w:space="0" w:color="BFBFBF"/>
+          <w:bottom w:val="single" w:sz="4" w:space="0" w:color="BFBFBF"/>
+          <w:right w:val="single" w:sz="4" w:space="0" w:color="BFBFBF"/>
+          <w:insideH w:val="single" w:sz="4" w:space="0" w:color="BFBFBF"/>
+          <w:insideV w:val="single" w:sz="4" w:space="0" w:color="BFBFBF"/>
+        </w:tblBorders>
+        <w:tblLayout w:type="fixed"/>
+        <w:tblCellMar>
+          <w:top w:w="80" w:type="dxa"/>
+          <w:left w:w="100" w:type="dxa"/>
+          <w:bottom w:w="60" w:type="dxa"/>
+          <w:right w:w="100" w:type="dxa"/>
+        </w:tblCellMar>
+      </w:tblPr>
+      <w:tblGrid>
+        <w:gridCol w:w="4515"/>
+        <w:gridCol w:w="4514"/>
+      </w:tblGrid>
+      <w:tr>
+        <w:trPr>
+          <w:cantSplit/>
+        </w:trPr>
+        <w:tc>
+          <w:tcPr>
+            <w:tcW w:w="4515" w:type="dxa"/>
+          </w:tcPr>
+          <w:p>
+            <w:pPr>
+              <w:spacing w:after="60" w:before="0" w:line="240" w:lineRule="auto"/>
+              <w:jc w:val="center"/>
+              <w:rPr/>
+            </w:pPr>
+            <w:r>
+              <w:rPr>
+                <w:noProof/>
+              </w:rPr>
+              <w:drawing>
+                <wp:inline distT="0" distB="0" distL="0" distR="0">
+                  <wp:extent cx="2740025" cy="1541264"/>
+                  <wp:docPr id="122" name="Imagem 122" descr="Quadro 22 · A Sentinela"/>
+                  <wp:cNvGraphicFramePr>
+                    <a:graphicFrameLocks noChangeAspect="1"/>
+                  </wp:cNvGraphicFramePr>
+                  <a:graphic>
+                    <a:graphicData uri="http://schemas.openxmlformats.org/drawingml/2006/picture">
+                      <pic:pic>
+                        <pic:nvPicPr>
+                          <pic:cNvPr id="122" name="imagem22.png"/>
+                          <pic:cNvPicPr/>
+                        </pic:nvPicPr>
+                        <pic:blipFill>
+                          <a:blip r:embed="rIdImg22"/>
+                          <a:stretch>
+                            <a:fillRect/>
+                          </a:stretch>
+                        </pic:blipFill>
+                        <pic:spPr>
+                          <a:xfrm>
+                            <a:off x="0" y="0"/>
+                            <a:ext cx="2740025" cy="1541264"/>
+                          </a:xfrm>
+                          <a:prstGeom prst="rect">
+                            <a:avLst/>
+                          </a:prstGeom>
+                        </pic:spPr>
+                      </pic:pic>
+                    </a:graphicData>
+                  </a:graphic>
+                </wp:inline>
+              </w:drawing>
+            </w:r>
+          </w:p>
+          <w:p>
+            <w:pPr>
+              <w:spacing w:after="40" w:before="0" w:line="240" w:lineRule="auto"/>
+              <w:rPr/>
+            </w:pPr>
+            <w:r>
+              <w:rPr>
+                <w:b w:val="1"/>
+                <w:sz w:val="18"/>
+                <w:szCs w:val="18"/>
+                <w:rtl w:val="0"/>
+              </w:rPr>
+              <w:t xml:space="preserve">Quadro 22 · A Sentinela</w:t>
+            </w:r>
+          </w:p>
+          <w:p>
+            <w:pPr>
+              <w:spacing w:after="30" w:before="0" w:line="240" w:lineRule="auto"/>
+              <w:rPr/>
+            </w:pPr>
+            <w:r>
+              <w:rPr>
+                <w:b w:val="1"/>
+                <w:sz w:val="17"/>
+                <w:szCs w:val="17"/>
+                <w:rtl w:val="0"/>
+              </w:rPr>
+              <w:t xml:space="preserve">Cena: </w:t>
+            </w:r>
+            <w:r>
+              <w:rPr>
+                <w:sz w:val="17"/>
+                <w:szCs w:val="17"/>
+                <w:rtl w:val="0"/>
+              </w:rPr>
+              <w:t xml:space="preserve">Subsolo do centro de pesquisa da Âncora, quase às escuras.</w:t>
+            </w:r>
+          </w:p>
+          <w:p>
+            <w:pPr>
+              <w:spacing w:after="30" w:before="0" w:line="240" w:lineRule="auto"/>
+              <w:rPr/>
+            </w:pPr>
+            <w:r>
+              <w:rPr>
+                <w:b w:val="1"/>
+                <w:sz w:val="17"/>
+                <w:szCs w:val="17"/>
+                <w:rtl w:val="0"/>
+              </w:rPr>
+              <w:t xml:space="preserve">Enquadramento: </w:t>
+            </w:r>
+            <w:r>
+              <w:rPr>
+                <w:sz w:val="17"/>
+                <w:szCs w:val="17"/>
+                <w:rtl w:val="0"/>
+              </w:rPr>
+              <w:t xml:space="preserve">Plano geral; o robô aparece como silhueta, com o farol vermelho.</w:t>
+            </w:r>
+          </w:p>
+          <w:p>
+            <w:pPr>
+              <w:spacing w:after="30" w:before="0" w:line="240" w:lineRule="auto"/>
+              <w:rPr/>
+            </w:pPr>
+            <w:r>
+              <w:rPr>
+                <w:b w:val="1"/>
+                <w:sz w:val="17"/>
+                <w:szCs w:val="17"/>
+                <w:rtl w:val="0"/>
+              </w:rPr>
+              <w:t xml:space="preserve">Ação: </w:t>
+            </w:r>
+            <w:r>
+              <w:rPr>
+                <w:sz w:val="17"/>
+                <w:szCs w:val="17"/>
+                <w:rtl w:val="0"/>
+              </w:rPr>
+              <w:t xml:space="preserve">A Sentinela varre o corredor. Hora de apagar a lanterna, sair do cone de visão e esperar a ronda passar.</w:t>
+            </w:r>
+          </w:p>
+        </w:tc>
+        <w:tc>
+          <w:tcPr>
+            <w:tcW w:w="4514" w:type="dxa"/>
+          </w:tcPr>
+          <w:p>
+            <w:pPr>
+              <w:spacing w:after="60" w:before="0" w:line="240" w:lineRule="auto"/>
+              <w:jc w:val="center"/>
+              <w:rPr/>
+            </w:pPr>
+            <w:r>
+              <w:rPr>
+                <w:noProof/>
+              </w:rPr>
+              <w:drawing>
+                <wp:inline distT="0" distB="0" distL="0" distR="0">
+                  <wp:extent cx="2739390" cy="1540906"/>
+                  <wp:docPr id="123" name="Imagem 123" descr="Quadro 23 · A oficina do Zane"/>
+                  <wp:cNvGraphicFramePr>
+                    <a:graphicFrameLocks noChangeAspect="1"/>
+                  </wp:cNvGraphicFramePr>
+                  <a:graphic>
+                    <a:graphicData uri="http://schemas.openxmlformats.org/drawingml/2006/picture">
+                      <pic:pic>
+                        <pic:nvPicPr>
+                          <pic:cNvPr id="123" name="imagem23.png"/>
+                          <pic:cNvPicPr/>
+                        </pic:nvPicPr>
+                        <pic:blipFill>
+                          <a:blip r:embed="rIdImg23"/>
+                          <a:stretch>
+                            <a:fillRect/>
+                          </a:stretch>
+                        </pic:blipFill>
+                        <pic:spPr>
+                          <a:xfrm>
+                            <a:off x="0" y="0"/>
+                            <a:ext cx="2739390" cy="1540906"/>
+                          </a:xfrm>
+                          <a:prstGeom prst="rect">
+                            <a:avLst/>
+                          </a:prstGeom>
+                        </pic:spPr>
+                      </pic:pic>
+                    </a:graphicData>
+                  </a:graphic>
+                </wp:inline>
+              </w:drawing>
+            </w:r>
+          </w:p>
+          <w:p>
+            <w:pPr>
+              <w:spacing w:after="40" w:before="0" w:line="240" w:lineRule="auto"/>
+              <w:rPr/>
+            </w:pPr>
+            <w:r>
+              <w:rPr>
+                <w:b w:val="1"/>
+                <w:sz w:val="18"/>
+                <w:szCs w:val="18"/>
+                <w:rtl w:val="0"/>
+              </w:rPr>
+              <w:t xml:space="preserve">Quadro 23 · A oficina do Zane</w:t>
+            </w:r>
+          </w:p>
+          <w:p>
+            <w:pPr>
+              <w:spacing w:after="30" w:before="0" w:line="240" w:lineRule="auto"/>
+              <w:rPr/>
+            </w:pPr>
+            <w:r>
+              <w:rPr>
+                <w:b w:val="1"/>
+                <w:sz w:val="17"/>
+                <w:szCs w:val="17"/>
+                <w:rtl w:val="0"/>
+              </w:rPr>
+              <w:t xml:space="preserve">Cena: </w:t>
+            </w:r>
+            <w:r>
+              <w:rPr>
+                <w:sz w:val="17"/>
+                <w:szCs w:val="17"/>
+                <w:rtl w:val="0"/>
+              </w:rPr>
+              <w:t xml:space="preserve">Oficina cheia de componentes eletrônicos, com telas holográficas.</w:t>
+            </w:r>
+          </w:p>
+          <w:p>
+            <w:pPr>
+              <w:spacing w:after="30" w:before="0" w:line="240" w:lineRule="auto"/>
+              <w:rPr/>
+            </w:pPr>
+            <w:r>
+              <w:rPr>
+                <w:b w:val="1"/>
+                <w:sz w:val="17"/>
+                <w:szCs w:val="17"/>
+                <w:rtl w:val="0"/>
+              </w:rPr>
+              <w:t xml:space="preserve">Enquadramento: </w:t>
+            </w:r>
+            <w:r>
+              <w:rPr>
+                <w:sz w:val="17"/>
+                <w:szCs w:val="17"/>
+                <w:rtl w:val="0"/>
+              </w:rPr>
+              <w:t xml:space="preserve">Plano médio, com a caixa de diálogo no alto da tela.</w:t>
+            </w:r>
+          </w:p>
+          <w:p>
+            <w:pPr>
+              <w:spacing w:after="30" w:before="0" w:line="240" w:lineRule="auto"/>
+              <w:rPr/>
+            </w:pPr>
+            <w:r>
+              <w:rPr>
+                <w:b w:val="1"/>
+                <w:sz w:val="17"/>
+                <w:szCs w:val="17"/>
+                <w:rtl w:val="0"/>
+              </w:rPr>
+              <w:t xml:space="preserve">Ação: </w:t>
+            </w:r>
+            <w:r>
+              <w:rPr>
+                <w:sz w:val="17"/>
+                <w:szCs w:val="17"/>
+                <w:rtl w:val="0"/>
+              </w:rPr>
+              <w:t xml:space="preserve">O Zane, que Gabriel só conhecia pelo telefone, entrega o notebook e pede que ele invada três nós de controle.</w:t>
+            </w:r>
+          </w:p>
+        </w:tc>
+      </w:tr>
+    </w:tbl>
+    <w:p>
+      <w:pPr>
+        <w:spacing w:after="160" w:before="0" w:lineRule="auto"/>
+        <w:rPr/>
+      </w:pPr>
+    </w:p>
+    <w:p>
+      <w:pPr>
+        <w:keepNext w:val="1"/>
+        <w:spacing w:after="80" w:before="120" w:lineRule="auto"/>
+        <w:ind w:left="720" w:firstLine="0"/>
+        <w:rPr/>
+      </w:pPr>
+      <w:r>
+        <w:rPr>
+          <w:b w:val="1"/>
+          <w:sz w:val="20"/>
+          <w:szCs w:val="20"/>
+          <w:rtl w:val="0"/>
+        </w:rPr>
+        <w:t xml:space="preserve">Sequência E. Bunker (posição na ordem das fases ainda provisória)</w:t>
+      </w:r>
+    </w:p>
+    <w:tbl>
+      <w:tblPr>
+        <w:tblW w:w="9029" w:type="dxa"/>
+        <w:tblBorders>
+          <w:top w:val="single" w:sz="4" w:space="0" w:color="BFBFBF"/>
+          <w:left w:val="single" w:sz="4" w:space="0" w:color="BFBFBF"/>
+          <w:bottom w:val="single" w:sz="4" w:space="0" w:color="BFBFBF"/>
+          <w:right w:val="single" w:sz="4" w:space="0" w:color="BFBFBF"/>
+          <w:insideH w:val="single" w:sz="4" w:space="0" w:color="BFBFBF"/>
+          <w:insideV w:val="single" w:sz="4" w:space="0" w:color="BFBFBF"/>
+        </w:tblBorders>
+        <w:tblLayout w:type="fixed"/>
+        <w:tblCellMar>
+          <w:top w:w="80" w:type="dxa"/>
+          <w:left w:w="100" w:type="dxa"/>
+          <w:bottom w:w="60" w:type="dxa"/>
+          <w:right w:w="100" w:type="dxa"/>
+        </w:tblCellMar>
+      </w:tblPr>
+      <w:tblGrid>
+        <w:gridCol w:w="4515"/>
+        <w:gridCol w:w="4514"/>
+      </w:tblGrid>
+      <w:tr>
+        <w:trPr>
+          <w:cantSplit/>
+        </w:trPr>
+        <w:tc>
+          <w:tcPr>
+            <w:tcW w:w="4515" w:type="dxa"/>
+          </w:tcPr>
+          <w:p>
+            <w:pPr>
+              <w:spacing w:after="60" w:before="0" w:line="240" w:lineRule="auto"/>
+              <w:jc w:val="center"/>
+              <w:rPr/>
+            </w:pPr>
+            <w:r>
+              <w:rPr>
+                <w:noProof/>
+              </w:rPr>
+              <w:drawing>
+                <wp:inline distT="0" distB="0" distL="0" distR="0">
+                  <wp:extent cx="2740025" cy="1541264"/>
+                  <wp:docPr id="124" name="Imagem 124" descr="Quadro 24 · A entrada do Bunker"/>
+                  <wp:cNvGraphicFramePr>
+                    <a:graphicFrameLocks noChangeAspect="1"/>
+                  </wp:cNvGraphicFramePr>
+                  <a:graphic>
+                    <a:graphicData uri="http://schemas.openxmlformats.org/drawingml/2006/picture">
+                      <pic:pic>
+                        <pic:nvPicPr>
+                          <pic:cNvPr id="124" name="imagem24.png"/>
+                          <pic:cNvPicPr/>
+                        </pic:nvPicPr>
+                        <pic:blipFill>
+                          <a:blip r:embed="rIdImg24"/>
+                          <a:stretch>
+                            <a:fillRect/>
+                          </a:stretch>
+                        </pic:blipFill>
+                        <pic:spPr>
+                          <a:xfrm>
+                            <a:off x="0" y="0"/>
+                            <a:ext cx="2740025" cy="1541264"/>
+                          </a:xfrm>
+                          <a:prstGeom prst="rect">
+                            <a:avLst/>
+                          </a:prstGeom>
+                        </pic:spPr>
+                      </pic:pic>
+                    </a:graphicData>
+                  </a:graphic>
+                </wp:inline>
+              </w:drawing>
+            </w:r>
+          </w:p>
+          <w:p>
+            <w:pPr>
+              <w:spacing w:after="40" w:before="0" w:line="240" w:lineRule="auto"/>
+              <w:rPr/>
+            </w:pPr>
+            <w:r>
+              <w:rPr>
+                <w:b w:val="1"/>
+                <w:sz w:val="18"/>
+                <w:szCs w:val="18"/>
+                <w:rtl w:val="0"/>
+              </w:rPr>
+              <w:t xml:space="preserve">Quadro 24 · A entrada do Bunker</w:t>
+            </w:r>
+          </w:p>
+          <w:p>
+            <w:pPr>
+              <w:spacing w:after="30" w:before="0" w:line="240" w:lineRule="auto"/>
+              <w:rPr/>
+            </w:pPr>
+            <w:r>
+              <w:rPr>
+                <w:b w:val="1"/>
+                <w:sz w:val="17"/>
+                <w:szCs w:val="17"/>
+                <w:rtl w:val="0"/>
+              </w:rPr>
+              <w:t xml:space="preserve">Cena: </w:t>
+            </w:r>
+            <w:r>
+              <w:rPr>
+                <w:sz w:val="17"/>
+                <w:szCs w:val="17"/>
+                <w:rtl w:val="0"/>
+              </w:rPr>
+              <w:t xml:space="preserve">Entrada do bunker de pesquisa (ÂNCORA-03), com faixas de perigo.</w:t>
+            </w:r>
+          </w:p>
+          <w:p>
+            <w:pPr>
+              <w:spacing w:after="30" w:before="0" w:line="240" w:lineRule="auto"/>
+              <w:rPr/>
+            </w:pPr>
+            <w:r>
+              <w:rPr>
+                <w:b w:val="1"/>
+                <w:sz w:val="17"/>
+                <w:szCs w:val="17"/>
+                <w:rtl w:val="0"/>
+              </w:rPr>
+              <w:t xml:space="preserve">Enquadramento: </w:t>
+            </w:r>
+            <w:r>
+              <w:rPr>
+                <w:sz w:val="17"/>
+                <w:szCs w:val="17"/>
+                <w:rtl w:val="0"/>
+              </w:rPr>
+              <w:t xml:space="preserve">Plano geral lateral, com o elevador lacrado à direita.</w:t>
+            </w:r>
+          </w:p>
+          <w:p>
+            <w:pPr>
+              <w:spacing w:after="30" w:before="0" w:line="240" w:lineRule="auto"/>
+              <w:rPr/>
+            </w:pPr>
+            <w:r>
+              <w:rPr>
+                <w:b w:val="1"/>
+                <w:sz w:val="17"/>
+                <w:szCs w:val="17"/>
+                <w:rtl w:val="0"/>
+              </w:rPr>
+              <w:t xml:space="preserve">Ação: </w:t>
+            </w:r>
+            <w:r>
+              <w:rPr>
+                <w:sz w:val="17"/>
+                <w:szCs w:val="17"/>
+                <w:rtl w:val="0"/>
+              </w:rPr>
+              <w:t xml:space="preserve">O lugar mais seguro do jogo: os robôs não descem. As portas lacradas são ganchos para as fases seguintes.</w:t>
+            </w:r>
+          </w:p>
+        </w:tc>
+        <w:tc>
+          <w:tcPr>
+            <w:tcW w:w="4514" w:type="dxa"/>
+          </w:tcPr>
+          <w:p>
+            <w:pPr>
+              <w:spacing w:after="60" w:before="0" w:line="240" w:lineRule="auto"/>
+              <w:jc w:val="center"/>
+              <w:rPr/>
+            </w:pPr>
+            <w:r>
+              <w:rPr>
+                <w:noProof/>
+              </w:rPr>
+              <w:drawing>
+                <wp:inline distT="0" distB="0" distL="0" distR="0">
+                  <wp:extent cx="2739390" cy="1540906"/>
+                  <wp:docPr id="125" name="Imagem 125" descr="Quadro 25 · A sala de dados"/>
+                  <wp:cNvGraphicFramePr>
+                    <a:graphicFrameLocks noChangeAspect="1"/>
+                  </wp:cNvGraphicFramePr>
+                  <a:graphic>
+                    <a:graphicData uri="http://schemas.openxmlformats.org/drawingml/2006/picture">
+                      <pic:pic>
+                        <pic:nvPicPr>
+                          <pic:cNvPr id="125" name="imagem25.png"/>
+                          <pic:cNvPicPr/>
+                        </pic:nvPicPr>
+                        <pic:blipFill>
+                          <a:blip r:embed="rIdImg25"/>
+                          <a:stretch>
+                            <a:fillRect/>
+                          </a:stretch>
+                        </pic:blipFill>
+                        <pic:spPr>
+                          <a:xfrm>
+                            <a:off x="0" y="0"/>
+                            <a:ext cx="2739390" cy="1540906"/>
+                          </a:xfrm>
+                          <a:prstGeom prst="rect">
+                            <a:avLst/>
+                          </a:prstGeom>
+                        </pic:spPr>
+                      </pic:pic>
+                    </a:graphicData>
+                  </a:graphic>
+                </wp:inline>
+              </w:drawing>
+            </w:r>
+          </w:p>
+          <w:p>
+            <w:pPr>
+              <w:spacing w:after="40" w:before="0" w:line="240" w:lineRule="auto"/>
+              <w:rPr/>
+            </w:pPr>
+            <w:r>
+              <w:rPr>
+                <w:b w:val="1"/>
+                <w:sz w:val="18"/>
+                <w:szCs w:val="18"/>
+                <w:rtl w:val="0"/>
+              </w:rPr>
+              <w:t xml:space="preserve">Quadro 25 · A sala de dados</w:t>
+            </w:r>
+          </w:p>
+          <w:p>
+            <w:pPr>
+              <w:spacing w:after="30" w:before="0" w:line="240" w:lineRule="auto"/>
+              <w:rPr/>
+            </w:pPr>
+            <w:r>
+              <w:rPr>
+                <w:b w:val="1"/>
+                <w:sz w:val="17"/>
+                <w:szCs w:val="17"/>
+                <w:rtl w:val="0"/>
+              </w:rPr>
+              <w:t xml:space="preserve">Cena: </w:t>
+            </w:r>
+            <w:r>
+              <w:rPr>
+                <w:sz w:val="17"/>
+                <w:szCs w:val="17"/>
+                <w:rtl w:val="0"/>
+              </w:rPr>
+              <w:t xml:space="preserve">Sala de dados do Bunker, com a estação e as câmeras do campus.</w:t>
+            </w:r>
+          </w:p>
+          <w:p>
+            <w:pPr>
+              <w:spacing w:after="30" w:before="0" w:line="240" w:lineRule="auto"/>
+              <w:rPr/>
+            </w:pPr>
+            <w:r>
+              <w:rPr>
+                <w:b w:val="1"/>
+                <w:sz w:val="17"/>
+                <w:szCs w:val="17"/>
+                <w:rtl w:val="0"/>
+              </w:rPr>
+              <w:t xml:space="preserve">Enquadramento: </w:t>
+            </w:r>
+            <w:r>
+              <w:rPr>
+                <w:sz w:val="17"/>
+                <w:szCs w:val="17"/>
+                <w:rtl w:val="0"/>
+              </w:rPr>
+              <w:t xml:space="preserve">Plano médio, com a caixa de diálogo no alto da tela.</w:t>
+            </w:r>
+          </w:p>
+          <w:p>
+            <w:pPr>
+              <w:spacing w:after="30" w:before="0" w:line="240" w:lineRule="auto"/>
+              <w:rPr/>
+            </w:pPr>
+            <w:r>
+              <w:rPr>
+                <w:b w:val="1"/>
+                <w:sz w:val="17"/>
+                <w:szCs w:val="17"/>
+                <w:rtl w:val="0"/>
+              </w:rPr>
+              <w:t xml:space="preserve">Ação: </w:t>
+            </w:r>
+            <w:r>
+              <w:rPr>
+                <w:sz w:val="17"/>
+                <w:szCs w:val="17"/>
+                <w:rtl w:val="0"/>
+              </w:rPr>
+              <w:t xml:space="preserve">Primeira conversa em pessoa com o Henrique, que diz ter visto Gabriel chegar pelas câmeras.</w:t>
+            </w:r>
+          </w:p>
+        </w:tc>
+      </w:tr>
+    </w:tbl>
+    <w:p>
+      <w:pPr>
+        <w:spacing w:after="160" w:before="0" w:lineRule="auto"/>
+        <w:rPr/>
+      </w:pPr>
+    </w:p>
+    <w:p>
+      <w:pPr>
+        <w:keepNext w:val="1"/>
+        <w:spacing w:after="80" w:before="120" w:lineRule="auto"/>
+        <w:ind w:left="720" w:firstLine="0"/>
+        <w:rPr/>
+      </w:pPr>
+      <w:r>
+        <w:rPr>
+          <w:b w:val="1"/>
+          <w:sz w:val="20"/>
+          <w:szCs w:val="20"/>
+          <w:rtl w:val="0"/>
+        </w:rPr>
+        <w:t xml:space="preserve">Sequência F. Elenco e inimigos</w:t>
+      </w:r>
+    </w:p>
+    <w:tbl>
+      <w:tblPr>
+        <w:tblW w:w="9029" w:type="dxa"/>
+        <w:tblBorders>
+          <w:top w:val="single" w:sz="4" w:space="0" w:color="BFBFBF"/>
+          <w:left w:val="single" w:sz="4" w:space="0" w:color="BFBFBF"/>
+          <w:bottom w:val="single" w:sz="4" w:space="0" w:color="BFBFBF"/>
+          <w:right w:val="single" w:sz="4" w:space="0" w:color="BFBFBF"/>
+          <w:insideH w:val="single" w:sz="4" w:space="0" w:color="BFBFBF"/>
+          <w:insideV w:val="single" w:sz="4" w:space="0" w:color="BFBFBF"/>
+        </w:tblBorders>
+        <w:tblLayout w:type="fixed"/>
+        <w:tblCellMar>
+          <w:top w:w="80" w:type="dxa"/>
+          <w:left w:w="100" w:type="dxa"/>
+          <w:bottom w:w="60" w:type="dxa"/>
+          <w:right w:w="100" w:type="dxa"/>
+        </w:tblCellMar>
+      </w:tblPr>
+      <w:tblGrid>
+        <w:gridCol w:w="4515"/>
+        <w:gridCol w:w="4514"/>
+      </w:tblGrid>
+      <w:tr>
+        <w:trPr>
+          <w:cantSplit/>
+        </w:trPr>
+        <w:tc>
+          <w:tcPr>
+            <w:tcW w:w="9029" w:type="dxa"/>
+            <w:gridSpan w:val="2"/>
+          </w:tcPr>
+          <w:p>
+            <w:pPr>
+              <w:spacing w:after="60" w:before="0" w:line="240" w:lineRule="auto"/>
+              <w:jc w:val="center"/>
+              <w:rPr/>
+            </w:pPr>
+            <w:r>
+              <w:rPr>
+                <w:noProof/>
+              </w:rPr>
+              <w:drawing>
+                <wp:inline distT="0" distB="0" distL="0" distR="0">
+                  <wp:extent cx="3937000" cy="822656"/>
+                  <wp:docPr id="126" name="Imagem 126" descr="Quadro 26 · O elenco"/>
+                  <wp:cNvGraphicFramePr>
+                    <a:graphicFrameLocks noChangeAspect="1"/>
+                  </wp:cNvGraphicFramePr>
+                  <a:graphic>
+                    <a:graphicData uri="http://schemas.openxmlformats.org/drawingml/2006/picture">
+                      <pic:pic>
+                        <pic:nvPicPr>
+                          <pic:cNvPr id="126" name="imagem26.png"/>
+                          <pic:cNvPicPr/>
+                        </pic:nvPicPr>
+                        <pic:blipFill>
+                          <a:blip r:embed="rIdImg26"/>
+                          <a:stretch>
+                            <a:fillRect/>
+                          </a:stretch>
+                        </pic:blipFill>
+                        <pic:spPr>
+                          <a:xfrm>
+                            <a:off x="0" y="0"/>
+                            <a:ext cx="3937000" cy="822656"/>
+                          </a:xfrm>
+                          <a:prstGeom prst="rect">
+                            <a:avLst/>
+                          </a:prstGeom>
+                        </pic:spPr>
+                      </pic:pic>
+                    </a:graphicData>
+                  </a:graphic>
+                </wp:inline>
+              </w:drawing>
+            </w:r>
+          </w:p>
+          <w:p>
+            <w:pPr>
+              <w:spacing w:after="40" w:before="0" w:line="240" w:lineRule="auto"/>
+              <w:rPr/>
+            </w:pPr>
+            <w:r>
+              <w:rPr>
+                <w:b w:val="1"/>
+                <w:sz w:val="18"/>
+                <w:szCs w:val="18"/>
+                <w:rtl w:val="0"/>
+              </w:rPr>
+              <w:t xml:space="preserve">Quadro 26 · O elenco</w:t>
+            </w:r>
+          </w:p>
+          <w:p>
+            <w:pPr>
+              <w:spacing w:after="30" w:before="0" w:line="240" w:lineRule="auto"/>
+              <w:rPr/>
+            </w:pPr>
+            <w:r>
+              <w:rPr>
+                <w:b w:val="1"/>
+                <w:sz w:val="17"/>
+                <w:szCs w:val="17"/>
+                <w:rtl w:val="0"/>
+              </w:rPr>
+              <w:t xml:space="preserve">Cena: </w:t>
+            </w:r>
+            <w:r>
+              <w:rPr>
+                <w:sz w:val="17"/>
+                <w:szCs w:val="17"/>
+                <w:rtl w:val="0"/>
+              </w:rPr>
+              <w:t xml:space="preserve">Retratos usados nas conversas, em ordem de época.</w:t>
+            </w:r>
+          </w:p>
+          <w:p>
+            <w:pPr>
+              <w:spacing w:after="30" w:before="0" w:line="240" w:lineRule="auto"/>
+              <w:rPr/>
+            </w:pPr>
+            <w:r>
+              <w:rPr>
+                <w:b w:val="1"/>
+                <w:sz w:val="17"/>
+                <w:szCs w:val="17"/>
+                <w:rtl w:val="0"/>
+              </w:rPr>
+              <w:t xml:space="preserve">Enquadramento: </w:t>
+            </w:r>
+            <w:r>
+              <w:rPr>
+                <w:sz w:val="17"/>
+                <w:szCs w:val="17"/>
+                <w:rtl w:val="0"/>
+              </w:rPr>
+              <w:t xml:space="preserve">Primeiro plano de cada rosto, em resolução dobrada.</w:t>
+            </w:r>
+          </w:p>
+          <w:p>
+            <w:pPr>
+              <w:spacing w:after="30" w:before="0" w:line="240" w:lineRule="auto"/>
+              <w:rPr/>
+            </w:pPr>
+            <w:r>
+              <w:rPr>
+                <w:b w:val="1"/>
+                <w:sz w:val="17"/>
+                <w:szCs w:val="17"/>
+                <w:rtl w:val="0"/>
+              </w:rPr>
+              <w:t xml:space="preserve">Ação: </w:t>
+            </w:r>
+            <w:r>
+              <w:rPr>
+                <w:sz w:val="17"/>
+                <w:szCs w:val="17"/>
+                <w:rtl w:val="0"/>
+              </w:rPr>
+              <w:t xml:space="preserve">Cada pessoa tem uma cor e uma silhueta próprias. A Diana ainda não tem visual definido.</w:t>
+            </w:r>
+          </w:p>
+        </w:tc>
+      </w:tr>
+      <w:tr>
+        <w:trPr>
+          <w:cantSplit/>
+        </w:trPr>
+        <w:tc>
+          <w:tcPr>
+            <w:tcW w:w="9029" w:type="dxa"/>
+            <w:gridSpan w:val="2"/>
+          </w:tcPr>
+          <w:p>
+            <w:pPr>
+              <w:spacing w:after="60" w:before="0" w:line="240" w:lineRule="auto"/>
+              <w:jc w:val="center"/>
+              <w:rPr/>
+            </w:pPr>
+            <w:r>
+              <w:rPr>
+                <w:noProof/>
+              </w:rPr>
+              <w:drawing>
+                <wp:inline distT="0" distB="0" distL="0" distR="0">
+                  <wp:extent cx="3937000" cy="2331442"/>
+                  <wp:docPr id="127" name="Imagem 127" descr="Quadro 27 · Os robôs"/>
+                  <wp:cNvGraphicFramePr>
+                    <a:graphicFrameLocks noChangeAspect="1"/>
+                  </wp:cNvGraphicFramePr>
+                  <a:graphic>
+                    <a:graphicData uri="http://schemas.openxmlformats.org/drawingml/2006/picture">
+                      <pic:pic>
+                        <pic:nvPicPr>
+                          <pic:cNvPr id="127" name="imagem27.png"/>
+                          <pic:cNvPicPr/>
+                        </pic:nvPicPr>
+                        <pic:blipFill>
+                          <a:blip r:embed="rIdImg27"/>
+                          <a:stretch>
+                            <a:fillRect/>
+                          </a:stretch>
+                        </pic:blipFill>
+                        <pic:spPr>
+                          <a:xfrm>
+                            <a:off x="0" y="0"/>
+                            <a:ext cx="3937000" cy="2331442"/>
+                          </a:xfrm>
+                          <a:prstGeom prst="rect">
+                            <a:avLst/>
+                          </a:prstGeom>
+                        </pic:spPr>
+                      </pic:pic>
+                    </a:graphicData>
+                  </a:graphic>
+                </wp:inline>
+              </w:drawing>
+            </w:r>
+          </w:p>
+          <w:p>
+            <w:pPr>
+              <w:spacing w:after="40" w:before="0" w:line="240" w:lineRule="auto"/>
+              <w:rPr/>
+            </w:pPr>
+            <w:r>
+              <w:rPr>
+                <w:b w:val="1"/>
+                <w:sz w:val="18"/>
+                <w:szCs w:val="18"/>
+                <w:rtl w:val="0"/>
+              </w:rPr>
+              <w:t xml:space="preserve">Quadro 27 · Os robôs</w:t>
+            </w:r>
+          </w:p>
+          <w:p>
+            <w:pPr>
+              <w:spacing w:after="30" w:before="0" w:line="240" w:lineRule="auto"/>
+              <w:rPr/>
+            </w:pPr>
+            <w:r>
+              <w:rPr>
+                <w:b w:val="1"/>
+                <w:sz w:val="17"/>
+                <w:szCs w:val="17"/>
+                <w:rtl w:val="0"/>
+              </w:rPr>
+              <w:t xml:space="preserve">Cena: </w:t>
+            </w:r>
+            <w:r>
+              <w:rPr>
+                <w:sz w:val="17"/>
+                <w:szCs w:val="17"/>
+                <w:rtl w:val="0"/>
+              </w:rPr>
+              <w:t xml:space="preserve">Folha de referência da Sentinela (em cima) e do Rastreador (embaixo).</w:t>
+            </w:r>
+          </w:p>
+          <w:p>
+            <w:pPr>
+              <w:spacing w:after="30" w:before="0" w:line="240" w:lineRule="auto"/>
+              <w:rPr/>
+            </w:pPr>
+            <w:r>
+              <w:rPr>
+                <w:b w:val="1"/>
+                <w:sz w:val="17"/>
+                <w:szCs w:val="17"/>
+                <w:rtl w:val="0"/>
+              </w:rPr>
+              <w:t xml:space="preserve">Enquadramento: </w:t>
+            </w:r>
+            <w:r>
+              <w:rPr>
+                <w:sz w:val="17"/>
+                <w:szCs w:val="17"/>
+                <w:rtl w:val="0"/>
+              </w:rPr>
+              <w:t xml:space="preserve">Frente, três quartos, perfil e costas de cada um.</w:t>
+            </w:r>
+          </w:p>
+          <w:p>
+            <w:pPr>
+              <w:spacing w:after="30" w:before="0" w:line="240" w:lineRule="auto"/>
+              <w:rPr/>
+            </w:pPr>
+            <w:r>
+              <w:rPr>
+                <w:b w:val="1"/>
+                <w:sz w:val="17"/>
+                <w:szCs w:val="17"/>
+                <w:rtl w:val="0"/>
+              </w:rPr>
+              <w:t xml:space="preserve">Ação: </w:t>
+            </w:r>
+            <w:r>
+              <w:rPr>
+                <w:sz w:val="17"/>
+                <w:szCs w:val="17"/>
+                <w:rtl w:val="0"/>
+              </w:rPr>
+              <w:t xml:space="preserve">A Sentinela enxerga; o Rastreador escuta. Os olhos vermelhos aparecem no escuro antes do robô.</w:t>
+            </w:r>
+          </w:p>
+        </w:tc>
+      </w:tr>
+    </w:tbl>
+    <w:p>
+      <w:pPr>
+        <w:spacing w:after="160" w:before="0" w:lineRule="auto"/>
+        <w:rPr/>
+      </w:pPr>
+    </w:p>
+    <w:p>
+      <w:pPr>
+        <w:spacing w:after="120" w:before="60" w:lineRule="auto"/>
+        <w:ind w:left="720" w:firstLine="0"/>
+        <w:rPr/>
+      </w:pPr>
+      <w:r>
+        <w:rPr>
+          <w:i w:val="1"/>
+          <w:rtl w:val="0"/>
+        </w:rPr>
+        <w:t xml:space="preserve">O final do jogo ainda não foi decidido pelo grupo e, por isso, não tem quadros (ver os pontos em aberto na seção 3).</w:t>
       </w:r>
     </w:p>
     <w:sectPr>

</xml_diff>

<commit_message>
docs: atualiza gdd_ankhor.docx de acordo com o enredo principal
</commit_message>
<xml_diff>
--- a/docs/entrega/gdd_ankhor.docx
+++ b/docs/entrega/gdd_ankhor.docx
@@ -1,6 +1,6 @@
 
 <file path=word/document.xml><?xml version="1.0" encoding="utf-8"?>
-<w:document xmlns:mc="http://schemas.openxmlformats.org/markup-compatibility/2006" xmlns:o="urn:schemas-microsoft-com:office:office" xmlns:r="http://schemas.openxmlformats.org/officeDocument/2006/relationships" xmlns:m="http://schemas.openxmlformats.org/officeDocument/2006/math" xmlns:v="urn:schemas-microsoft-com:vml" xmlns:wp="http://schemas.openxmlformats.org/drawingml/2006/wordprocessingDrawing" xmlns:w10="urn:schemas-microsoft-com:office:word" xmlns:w="http://schemas.openxmlformats.org/wordprocessingml/2006/main" xmlns:wne="http://schemas.microsoft.com/office/word/2006/wordml" xmlns:sl="http://schemas.openxmlformats.org/schemaLibrary/2006/main" xmlns:a="http://schemas.openxmlformats.org/drawingml/2006/main" xmlns:pic="http://schemas.openxmlformats.org/drawingml/2006/picture" xmlns:c="http://schemas.openxmlformats.org/drawingml/2006/chart" xmlns:lc="http://schemas.openxmlformats.org/drawingml/2006/lockedCanvas" xmlns:dgm="http://schemas.openxmlformats.org/drawingml/2006/diagram" xmlns:wps="http://schemas.microsoft.com/office/word/2010/wordprocessingShape" xmlns:wpg="http://schemas.microsoft.com/office/word/2010/wordprocessingGroup" xmlns:w14="http://schemas.microsoft.com/office/word/2010/wordml" xmlns:w15="http://schemas.microsoft.com/office/word/2012/wordml" xmlns:w16="http://schemas.microsoft.com/office/word/2018/wordml" xmlns:w16cex="http://schemas.microsoft.com/office/word/2018/wordml/cex" xmlns:w16cid="http://schemas.microsoft.com/office/word/2016/wordml/cid" xmlns="http://schemas.microsoft.com/office/tasks/2019/documenttasks" xmlns:cr="http://schemas.microsoft.com/office/comments/2020/reactions">
+<w:document xmlns:a="http://schemas.openxmlformats.org/drawingml/2006/main" xmlns:pic="http://schemas.openxmlformats.org/drawingml/2006/picture" xmlns:r="http://schemas.openxmlformats.org/officeDocument/2006/relationships" xmlns:w="http://schemas.openxmlformats.org/wordprocessingml/2006/main" xmlns:wp="http://schemas.openxmlformats.org/drawingml/2006/wordprocessingDrawing">
   <w:body>
     <w:p>
       <w:pPr>
@@ -148,7 +148,7 @@
         <w:rPr>
           <w:rtl w:val="0"/>
         </w:rPr>
-        <w:t xml:space="preserve"> projeto em 15 de outubro de 2026.</w:t>
+        <w:t xml:space="preserve"> projeto em 17 de outubro de 2026.</w:t>
       </w:r>
     </w:p>
     <w:p>
@@ -371,11 +371,51 @@
         <w:rPr>
           <w:rtl w:val="0"/>
         </w:rPr>
-        <w:t xml:space="preserve">, no mesmo lugar, agora uma ruína tomada pela natureza, com a tecnologia de 3026 em volta. A humanidade foi embora para outro planeta. Ficou o </w:t>
+        <w:t xml:space="preserve">, no mesmo lugar, agora uma ruína tomada pela natureza, com a tecnologia de 3026 em volta. A sociedade e o planeta ficaram tão ruins que a humanidade se dividiu: os </w:t>
       </w:r>
       <w:r>
         <w:rPr>
           <w:b w:val="1"/>
+          <w:i w:val="1"/>
+          <w:rtl w:val="0"/>
+        </w:rPr>
+        <w:t xml:space="preserve">Homo sideralis</w:t>
+      </w:r>
+      <w:r>
+        <w:rPr>
+          <w:rtl w:val="0"/>
+        </w:rPr>
+        <w:t xml:space="preserve">, uma espécie humana evoluída feita para o espaço, foram embora para outro planeta, e os poucos </w:t>
+      </w:r>
+      <w:r>
+        <w:rPr>
+          <w:i w:val="1"/>
+          <w:rtl w:val="0"/>
+        </w:rPr>
+        <w:t xml:space="preserve">sapiens</w:t>
+      </w:r>
+      <w:r>
+        <w:rPr>
+          <w:rtl w:val="0"/>
+        </w:rPr>
+        <w:t xml:space="preserve"> que ficaram formaram uma resistência que defende a Terra, os </w:t>
+      </w:r>
+      <w:r>
+        <w:rPr>
+          <w:b w:val="1"/>
+          <w:rtl w:val="0"/>
+        </w:rPr>
+        <w:t xml:space="preserve">Faroleiros</w:t>
+      </w:r>
+      <w:r>
+        <w:rPr>
+          <w:rtl w:val="0"/>
+        </w:rPr>
+        <w:t xml:space="preserve">. Um deles se afastou do grupo e se isolou na Unifor: </w:t>
+      </w:r>
+      <w:r>
+        <w:rPr>
+          <w:b w:val="1"/>
           <w:rtl w:val="0"/>
         </w:rPr>
         <w:t xml:space="preserve">Carlos</w:t>
@@ -384,20 +424,33 @@
         <w:rPr>
           <w:rtl w:val="0"/>
         </w:rPr>
-        <w:t xml:space="preserve">, um cientista obcecado pelos anos 80, que construiu uma máquina, a </w:t>
+        <w:t xml:space="preserve">, um cientista obcecado pelos anos 80, que construiu no </w:t>
       </w:r>
       <w:r>
         <w:rPr>
           <w:b w:val="1"/>
           <w:rtl w:val="0"/>
         </w:rPr>
+        <w:t xml:space="preserve">D-Tec</w:t>
+      </w:r>
+      <w:r>
+        <w:rPr>
+          <w:rtl w:val="0"/>
+        </w:rPr>
+        <w:t xml:space="preserve"> (no Bloco M) uma máquina, a </w:t>
+      </w:r>
+      <w:r>
+        <w:rPr>
+          <w:b w:val="1"/>
+          <w:rtl w:val="0"/>
+        </w:rPr>
         <w:t xml:space="preserve">Âncora</w:t>
       </w:r>
       <w:r>
         <w:rPr>
           <w:rtl w:val="0"/>
         </w:rPr>
-        <w:t xml:space="preserve">, para ir viver naquela época. A Âncora é imprecisa: a cada tentativa abre uma </w:t>
+        <w:t xml:space="preserve">, para ir viver naquela época. A Âncora é imprecisa: a cada tentativa do Carlos, abre uma </w:t>
       </w:r>
       <w:r>
         <w:rPr>
@@ -410,7 +463,7 @@
         <w:rPr>
           <w:rtl w:val="0"/>
         </w:rPr>
-        <w:t xml:space="preserve"> no tempo no chão da Biblioteca e puxa, por acaso, quem estiver ali, em alguma época. Gabriel não é o único: outros jovens de épocas diferentes caíram com dias de diferença, e cada um tenta sobreviver num canto do campus. Os robôs, controlados pelo Carlos, caçam qualquer humano. Gabriel precisa encontrar os outros, descobrir o que aconteceu e consertar a Âncora para que todos voltem às suas épocas.</w:t>
+        <w:t xml:space="preserve"> no tempo no chão da Biblioteca e puxa, por acaso, quem estiver ali, em alguma época. Gabriel não é o único: outros jovens de épocas diferentes caíram com dias de diferença, e cada um tenta sobreviver num canto do campus. Os robôs, controlados pelo Carlos, caçam qualquer humano. Gabriel precisa encontrar os outros, descobrir o que aconteceu — que um deles é seu antepassado, que outro mente para o grupo a serviço do Carlos e que por trás de tudo existe alguém — e consertar a Âncora para que todos voltem às suas épocas.</w:t>
       </w:r>
     </w:p>
     <w:p>
@@ -1509,7 +1562,7 @@
         <w:rPr>
           <w:rtl w:val="0"/>
         </w:rPr>
-        <w:t xml:space="preserve">Dentro de cada fase, o avanço é um cadeado de dependências. Na Biblioteca, por exemplo, a saída exige, nesta ordem: lanterna, rádio, chave da manutenção, energia, terminal ligado, código da grade, grade aberta, telefone e porta de saída. Esse encadeamento é um grafo de dependências, e a ordem de solução da fase é uma ordenação topológica dele. As partes que cada personagem traz para consertar a Âncora são: as estrelas do Baltazar, a investigação da Diana, o código da Clarice, a teoria do Henrique, a tecnologia do Zane e o caderno de equações do Gabriel.</w:t>
+        <w:t xml:space="preserve">Dentro de cada fase, o avanço é um cadeado de dependências. Na Biblioteca, por exemplo, a saída exige, nesta ordem: lanterna, rádio, chave da manutenção, energia, terminal ligado, código da grade, grade aberta, telefone e porta de saída. Esse encadeamento é um grafo de dependências, e a ordem de solução da fase é uma ordenação topológica dele. As partes que cada personagem traz para consertar a Âncora são: as estrelas do Baltazar, as plantas da obra de 1978 da Diana, o código da Clarice, a teoria do Henrique, a tecnologia do Zane e o caderno do Gabriel, onde as partes de todos se juntam.</w:t>
       </w:r>
     </w:p>
     <w:p>
@@ -1945,7 +1998,7 @@
                 <w:szCs w:val="18"/>
                 <w:rtl w:val="0"/>
               </w:rPr>
-              <w:t xml:space="preserve">Chega à oficina do Zane, recebe o notebook, invade três nós de controle em salões espalhados entre 6 robôs, volta ao Zane e desce pelo alçapão.</w:t>
+              <w:t xml:space="preserve">Chega à oficina do Zane (que desconfia do Henrique e tenta invadir o bunker), recebe o notebook, invade três nós de controle que guardam a trava do bunker entre 6 robôs, volta ao Zane e desce pelo alçapão.</w:t>
             </w:r>
           </w:p>
         </w:tc>
@@ -2046,7 +2099,7 @@
                 <w:szCs w:val="18"/>
                 <w:rtl w:val="0"/>
               </w:rPr>
-              <w:t xml:space="preserve">Esconderijo sob o núcleo da Âncora. O setor B está lacrado, e seis portas servem de gancho para as próximas fases. A posição dele na ordem é provisória.</w:t>
+              <w:t xml:space="preserve">Subterrâneo sob o núcleo da Âncora, patrulhado por robôs e com salas montadas como interiores dos séculos XIX e XX. O Henrique fica sozinho na sala de dados trancada; o setor B está lacrado. Posição provisória na ordem.</w:t>
             </w:r>
           </w:p>
         </w:tc>
@@ -2065,7 +2118,7 @@
                 <w:szCs w:val="18"/>
                 <w:rtl w:val="0"/>
               </w:rPr>
-              <w:t xml:space="preserve">Henrique (sala de dados)</w:t>
+              <w:t xml:space="preserve">Henrique (sozinho na sala de dados)</w:t>
             </w:r>
           </w:p>
         </w:tc>
@@ -3354,13 +3407,33 @@
         <w:rPr>
           <w:rtl w:val="0"/>
         </w:rPr>
-        <w:t xml:space="preserve"> </w:t>
-      </w:r>
-      <w:r>
-        <w:rPr>
-          <w:rtl w:val="0"/>
-        </w:rPr>
-        <w:t xml:space="preserve">o campus da Unifor, em Fortaleza, no ano de 3026. A Terra ficou tão ruim que o pouco que sobrou da humanidade foi embora para outro planeta, e em algum momento a Unifor virou um centro de pesquisa em física do tempo.</w:t>
+        <w:t xml:space="preserve"> o campus da Unifor, em Fortaleza, no ano de 3026. A sociedade e o planeta ficaram tão ruins que parte da humanidade evoluiu nos </w:t>
+      </w:r>
+      <w:r>
+        <w:rPr>
+          <w:i w:val="1"/>
+          <w:rtl w:val="0"/>
+        </w:rPr>
+        <w:t xml:space="preserve">Homo sideralis</w:t>
+      </w:r>
+      <w:r>
+        <w:rPr>
+          <w:rtl w:val="0"/>
+        </w:rPr>
+        <w:t xml:space="preserve"> (“o homem das estrelas”, adaptados a implantes e ao espaço) e partiu para outro planeta há menos de 100 anos. Os </w:t>
+      </w:r>
+      <w:r>
+        <w:rPr>
+          <w:i w:val="1"/>
+          <w:rtl w:val="0"/>
+        </w:rPr>
+        <w:t xml:space="preserve">sapiens</w:t>
+      </w:r>
+      <w:r>
+        <w:rPr>
+          <w:rtl w:val="0"/>
+        </w:rPr>
+        <w:t xml:space="preserve"> que ficaram formaram uma resistência para defender a Terra, os Faroleiros — dos quais o Carlos fazia parte antes de se isolar na Unifor, que em algum momento virou um centro de pesquisa em física do tempo.</w:t>
       </w:r>
     </w:p>
     <w:p>
@@ -3432,7 +3505,7 @@
         <w:rPr>
           <w:rtl w:val="0"/>
         </w:rPr>
-        <w:t xml:space="preserve"> painéis de luz ciano, hologramas e torres de equipamentos aparecem misturados às ruínas. A Âncora e o laboratório do Carlos ficam no D-Tec, a parte de tecnologia da Unifor, no Bloco M.</w:t>
+        <w:t xml:space="preserve"> painéis de luz ciano, hologramas e torres de equipamentos aparecem misturados às ruínas. A Âncora e o laboratório do Carlos ficam no D-Tec, a parte de tecnologia da Unifor, no Bloco M. A IA e a robótica são avançadas, mas a IA não tem consciência: é apenas uma ferramenta nas mãos do Carlos, que controla os robôs e os sistemas do campus. Pelo cenário também aparecem as marcas em âmbar dos Faroleiros (um farol de três traços: inteiro em lugares seguros, sem raios e riscado onde há perigo, ou com os raios riscados em vermelho, indicando a traição do Carlos).</w:t>
       </w:r>
     </w:p>
     <w:p>
@@ -3729,7 +3802,7 @@
                 <w:szCs w:val="18"/>
                 <w:rtl w:val="0"/>
               </w:rPr>
-              <w:t xml:space="preserve">Cada fase leva a uma pessoa e ao esconderijo dela. Gabriel ganha a confiança da Clarice na sala 103 e recebe a ajuda do Zane no Labirinto. Em algum ponto encontra o Baltazar e descobre o parentesco pelo anel.</w:t>
+              <w:t xml:space="preserve">Cada fase leva a uma pessoa e ao esconderijo dela. Gabriel ganha a confiança da Clarice na sala 103 (onde também está a Diana) e recebe a ajuda do Zane na oficina do Labirinto para destravar o acesso ao Bunker, pois o Zane desconfia do Henrique. Em algum ponto encontra o Baltazar e descobre o parentesco pelo anel.</w:t>
             </w:r>
           </w:p>
         </w:tc>
@@ -3806,7 +3879,7 @@
                 <w:szCs w:val="18"/>
                 <w:rtl w:val="0"/>
               </w:rPr>
-              <w:t xml:space="preserve">O maior e mais seguro esconderijo, sob o núcleo da Âncora, onde os robôs não descem. O Henrique fica na sala de dados, com as câmeras do campus.</w:t>
+              <w:t xml:space="preserve">Bunker de pesquisa sob o núcleo da Âncora, difícil de alcançar e também patrulhado pelos robôs, com salas montadas como interiores dos séculos XIX e XX (mostrando, sem explicar, a obsessão do Carlos pelo passado). O Henrique fica sozinho numa sala de dados trancada, com as câmeras do campus e o rádio, e Gabriel o reconhece pela lenda do aluno que sumiu em 2019.</w:t>
             </w:r>
           </w:p>
         </w:tc>
@@ -3883,7 +3956,7 @@
                 <w:szCs w:val="18"/>
                 <w:rtl w:val="0"/>
               </w:rPr>
-              <w:t xml:space="preserve">O Henrique esconde a ligação que tem com o Carlos. Quando o grupo descobre, todos vão atrás do Carlos, no D-Tec.</w:t>
+              <w:t xml:space="preserve">O Henrique trabalha para o Carlos: quando caiu (o primeiro de todos), o Carlos prometeu levá-lo para antes da morte da mãe, mas só o usa para atrasar e dividir o grupo. Ele finge consertar tudo enquanto usa a IA de 3026 na própria pesquisa. Quando o grupo descobre a mentira, todos vão atrás do Carlos, no D-Tec.</w:t>
             </w:r>
           </w:p>
         </w:tc>
@@ -3960,7 +4033,7 @@
                 <w:szCs w:val="18"/>
                 <w:rtl w:val="0"/>
               </w:rPr>
-              <w:t xml:space="preserve">Com as partes reunidas, o grupo tenta consertar a Âncora e mandar cada um à sua noite. O Baltazar quer ficar, mas Gabriel o convence a voltar para 1750. O Zane escolhe ficar em 3026, o que depende de a IA continuar existindo. Como o grupo enfrenta o Carlos sem lutar e como o jogo termina está em aberto.</w:t>
+              <w:t xml:space="preserve">Com as partes reunidas, o grupo tenta consertar a Âncora e mandar cada um à sua noite. O Baltazar quer ficar, mas Gabriel precisa convencê-lo a voltar para 1750. O final do Zane, como o grupo enfrenta o Carlos sem lutar e como o jogo termina estão em aberto.</w:t>
             </w:r>
           </w:p>
         </w:tc>
@@ -4236,7 +4309,7 @@
                 <w:szCs w:val="18"/>
                 <w:rtl w:val="0"/>
               </w:rPr>
-              <w:t xml:space="preserve">Fugir dos robôs e unir o grupo. Traz o caderno com as equações da cadeira.</w:t>
+              <w:t xml:space="preserve">Fugir dos robôs e unir o grupo. Traz o caderno (com as equações da cadeira de Modelagem e Simulação, originada da pesquisa de Henrique), onde as partes de todos se juntam.</w:t>
             </w:r>
           </w:p>
         </w:tc>
@@ -4255,7 +4328,7 @@
                 <w:szCs w:val="18"/>
                 <w:rtl w:val="0"/>
               </w:rPr>
-              <w:t xml:space="preserve">Cabine da Biblioteca</w:t>
+              <w:t xml:space="preserve">Passa por todos os esconderijos (acorda na Biblioteca)</w:t>
             </w:r>
           </w:p>
         </w:tc>
@@ -4417,7 +4490,7 @@
                 <w:szCs w:val="18"/>
                 <w:rtl w:val="0"/>
               </w:rPr>
-              <w:t xml:space="preserve">Recruta da polícia. Dramática, ansiosa e impulsiva; vive cada minuto como se fosse o último.</w:t>
+              <w:t xml:space="preserve">Estagiária de arquitetura na obra do campus em 1978, vigiando o canteiro à noite após um lote sumir sob sua responsabilidade. Dramática, ansiosa e impulsiva.</w:t>
             </w:r>
           </w:p>
         </w:tc>
@@ -4436,7 +4509,7 @@
                 <w:szCs w:val="18"/>
                 <w:rtl w:val="0"/>
               </w:rPr>
-              <w:t xml:space="preserve">Traz a investigação: onde fica o núcleo e as passagens até ele.</w:t>
+              <w:t xml:space="preserve">Traz as plantas: conhece as galerias de 1978 (que não aparecem nos mapas de 3026) e descobre onde fica o núcleo e as passagens até lá.</w:t>
             </w:r>
           </w:p>
         </w:tc>
@@ -4455,7 +4528,7 @@
                 <w:szCs w:val="18"/>
                 <w:rtl w:val="0"/>
               </w:rPr>
-              <w:t xml:space="preserve">Sala 103</w:t>
+              <w:t xml:space="preserve">Sala 103, com a Clarice</w:t>
             </w:r>
           </w:p>
         </w:tc>
@@ -4617,7 +4690,7 @@
                 <w:szCs w:val="18"/>
                 <w:rtl w:val="0"/>
               </w:rPr>
-              <w:t xml:space="preserve">Aluno de iniciação científica, o pesquisador. Introvertido e perfeccionista. Foi o primeiro a chegar.</w:t>
+              <w:t xml:space="preserve">Aluno de iniciação científica de 2019 (seu sumiço virou lenda em 2026). Introvertido e perfeccionista. Foi o primeiro a chegar.</w:t>
             </w:r>
           </w:p>
         </w:tc>
@@ -4636,7 +4709,7 @@
                 <w:szCs w:val="18"/>
                 <w:rtl w:val="0"/>
               </w:rPr>
-              <w:t xml:space="preserve">Vê o campus pelas câmeras e ajuda pelo rádio. Traz a teoria por trás das equações. Mente para o grupo.</w:t>
+              <w:t xml:space="preserve">Vê o campus pelas câmeras e passa dicas pelo rádio à Clarice e à Diana. Traz a teoria por trás das equações, mas trabalha para o Carlos (que prometeu levá-lo a antes da morte da mãe), atrasando o grupo.</w:t>
             </w:r>
           </w:p>
         </w:tc>
@@ -4655,7 +4728,7 @@
                 <w:szCs w:val="18"/>
                 <w:rtl w:val="0"/>
               </w:rPr>
-              <w:t xml:space="preserve">Sala de dados do Bunker</w:t>
+              <w:t xml:space="preserve">Sala de dados trancada do Bunker (sozinho)</w:t>
             </w:r>
           </w:p>
         </w:tc>
@@ -4717,7 +4790,7 @@
                 <w:szCs w:val="18"/>
                 <w:rtl w:val="0"/>
               </w:rPr>
-              <w:t xml:space="preserve">Jovem com implantes cibernéticos. Confiante e elétrico; confia demais na tecnologia e teme a IA.</w:t>
+              <w:t xml:space="preserve">Jovem com implantes cibernéticos. Confiante, elétrico e irreverente; confia demais na tecnologia e desconfia do Henrique.</w:t>
             </w:r>
           </w:p>
         </w:tc>
@@ -4736,7 +4809,7 @@
                 <w:szCs w:val="18"/>
                 <w:rtl w:val="0"/>
               </w:rPr>
-              <w:t xml:space="preserve">Faz as comunicações (rádio e telefones) e destranca portas. Traz a tecnologia mais próxima da Âncora.</w:t>
+              <w:t xml:space="preserve">Mantém a frequência de rádio do grupo, liga pelos telefones, entrega o notebook e destranca portas. Traz a tecnologia mais próxima da Âncora.</w:t>
             </w:r>
           </w:p>
         </w:tc>
@@ -4755,7 +4828,7 @@
                 <w:szCs w:val="18"/>
                 <w:rtl w:val="0"/>
               </w:rPr>
-              <w:t xml:space="preserve">Oficina do Labirinto e Bunker</w:t>
+              <w:t xml:space="preserve">Oficina do Labirinto (base) e depois Bunker</w:t>
             </w:r>
           </w:p>
         </w:tc>
@@ -4831,7 +4904,7 @@
                 <w:szCs w:val="18"/>
                 <w:rtl w:val="0"/>
               </w:rPr>
-              <w:t xml:space="preserve">Cientista que criou a Âncora e ficou na Terra. Obcecado pelos anos 80, egoísta e nostálgico.</w:t>
+              <w:t xml:space="preserve">Cientista sapiens que saiu dos Faroleiros e se isolou na Unifor para criar a Âncora. Obcecado pelos anos 80, egoísta e nostálgico.</w:t>
             </w:r>
           </w:p>
         </w:tc>
@@ -4850,7 +4923,7 @@
                 <w:szCs w:val="18"/>
                 <w:rtl w:val="0"/>
               </w:rPr>
-              <w:t xml:space="preserve">Controla os robôs. Nunca sai do laboratório.</w:t>
+              <w:t xml:space="preserve">Controla os robôs (com a IA como ferramenta) e usa o Henrique para atrasar o grupo. Nunca sai do laboratório.</w:t>
             </w:r>
           </w:p>
         </w:tc>
@@ -4869,7 +4942,7 @@
                 <w:szCs w:val="18"/>
                 <w:rtl w:val="0"/>
               </w:rPr>
-              <w:t xml:space="preserve">Laboratório do D-Tec</w:t>
+              <w:t xml:space="preserve">Laboratório do D-Tec (Bloco M)</w:t>
             </w:r>
           </w:p>
         </w:tc>
@@ -4969,7 +5042,7 @@
                 <w:szCs w:val="18"/>
                 <w:rtl w:val="0"/>
               </w:rPr>
-              <w:t xml:space="preserve">Todo o campus</w:t>
+              <w:t xml:space="preserve">Todo o campus e o Bunker</w:t>
             </w:r>
           </w:p>
         </w:tc>
@@ -4991,7 +5064,7 @@
         <w:rPr>
           <w:rtl w:val="0"/>
         </w:rPr>
-        <w:t xml:space="preserve">Todos os puxados têm cerca de 20 anos, estão vivos e têm alguma ligação com a região da Unifor. Chegaram com dias de diferença: o Henrique foi o primeiro e o Gabriel é o último. As fichas completas de cada personagem (personalidade, relações, arco) estão em </w:t>
+        <w:t xml:space="preserve">Todos os puxados têm cerca de 20 anos, estão vivos e têm alguma ligação com a região da Unifor. Chegaram com dias de diferença: o Henrique foi o primeiro, o Zane chegou antes da Clarice, a Diana chegou depois da Clarice e o Gabriel é o último (só a posição do Baltazar está em aberto). As fichas completas de cada personagem (personalidade, relações, arco) estão em </w:t>
       </w:r>
       <w:r>
         <w:rPr>
@@ -5155,7 +5228,33 @@
         <w:rPr>
           <w:rtl w:val="0"/>
         </w:rPr>
-        <w:t xml:space="preserve"> Âncora (a máquina; Ankhor é o nome do jogo), fenda (nunca “portal”), robôs (os inimigos), Caderno do Gabriel e cápsula de clarão.</w:t>
+        <w:t xml:space="preserve"> Âncora (a máquina; Ankhor é o nome do jogo), fenda (nunca “portal”), Carlos (o antagonista), D-Tec (no Bloco M, onde ficam a Âncora e o laboratório do Carlos), IA (ferramenta sem consciência; nunca falar dela como se pensasse ou quisesse algo), </w:t>
+      </w:r>
+      <w:r>
+        <w:rPr>
+          <w:i w:val="1"/>
+          <w:rtl w:val="0"/>
+        </w:rPr>
+        <w:t xml:space="preserve">Homo sideralis</w:t>
+      </w:r>
+      <w:r>
+        <w:rPr>
+          <w:rtl w:val="0"/>
+        </w:rPr>
+        <w:t xml:space="preserve"> (a espécie que foi embora), </w:t>
+      </w:r>
+      <w:r>
+        <w:rPr>
+          <w:i w:val="1"/>
+          <w:rtl w:val="0"/>
+        </w:rPr>
+        <w:t xml:space="preserve">sapiens</w:t>
+      </w:r>
+      <w:r>
+        <w:rPr>
+          <w:rtl w:val="0"/>
+        </w:rPr>
+        <w:t xml:space="preserve"> (os humanos não evoluídos), Faroleiros (a resistência que ficou na Terra), robôs (os inimigos; nunca “Insones”), antecessores (quem caiu antes de Gabriel), lanterna a pilha e luzes de emergência, cápsula de clarão e Caderno do Gabriel (nunca “diário”, que é o do Baltazar).</w:t>
       </w:r>
     </w:p>
     <w:p>
@@ -5193,7 +5292,20 @@
         <w:rPr>
           <w:rtl w:val="0"/>
         </w:rPr>
-        <w:t xml:space="preserve">Como o jogo termina e como cada um volta: todos de uma vez ou um por um; o final de Gabriel e Clarice.</w:t>
+        <w:t xml:space="preserve">O mundo de 3026: há quantos anos exatamente os </w:t>
+      </w:r>
+      <w:r>
+        <w:rPr>
+          <w:i w:val="1"/>
+          <w:rtl w:val="0"/>
+        </w:rPr>
+        <w:t xml:space="preserve">Homo sideralis</w:t>
+      </w:r>
+      <w:r>
+        <w:rPr>
+          <w:rtl w:val="0"/>
+        </w:rPr>
+        <w:t xml:space="preserve"> partiram e para onde foram; se os Faroleiros aparecem no jogo além das marcas no cenário; como a Unifor virou centro de pesquisa em física do tempo; por que a fenda abre na Biblioteca; por que a rede do subsolo é fechada para o Zane; e por que a sala 205 está intacta.</w:t>
       </w:r>
     </w:p>
     <w:p>
@@ -5210,7 +5322,7 @@
         <w:rPr>
           <w:rtl w:val="0"/>
         </w:rPr>
-        <w:t xml:space="preserve">O Carlos: como obtém o conhecimento que falta à Âncora, se existe uma IA e qual a relação dela com ele, por que os robôs caçam e quando o jogador descobre que ele existe.</w:t>
+        <w:t xml:space="preserve">O Carlos: como obtém o conhecimento que falta à Âncora, quantas ferramentas de IA usa, por que os robôs caçam humanos (capturar ou eliminar), por que saiu dos Faroleiros e há quantos anos está sozinho, quando o jogador descobre que ele existe e como o grupo o enfrenta sem lutar.</w:t>
       </w:r>
     </w:p>
     <w:p>
@@ -5227,7 +5339,7 @@
         <w:rPr>
           <w:rtl w:val="0"/>
         </w:rPr>
-        <w:t xml:space="preserve">A mentira do Henrique: se trabalha para o Carlos ou foi enganado por ele, o que esconde e como o grupo descobre.</w:t>
+        <w:t xml:space="preserve">O Henrique e a mentira: já está decidido que ele trabalha para o Carlos por causa da promessa sobre a mãe e finge consertar tudo; falta definir como e quando o grupo descobre a mentira, o que o Henrique faz depois, como a mãe morreu e onde a lenda de 2019 aparece.</w:t>
       </w:r>
     </w:p>
     <w:p>
@@ -5244,7 +5356,7 @@
         <w:rPr>
           <w:rtl w:val="0"/>
         </w:rPr>
-        <w:t xml:space="preserve">O que os sonhos mostram, já que a história não tem mais loops.</w:t>
+        <w:t xml:space="preserve">Os outros personagens: o que o Zane fazia quando foi puxado, o que teme e qual o seu final; a posição do Baltazar na ordem de chegada e qual sala da Biblioteca é o esconderijo dele; se Clarice e Diana saem da 103 mais tarde; se Gabriel sofre falha temporal enquanto Baltazar está fora de 1750; e quem fez as pichações do bunker.</w:t>
       </w:r>
     </w:p>
     <w:p>
@@ -5261,7 +5373,7 @@
         <w:rPr>
           <w:rtl w:val="0"/>
         </w:rPr>
-        <w:t xml:space="preserve">A ordem das fases depois do Labirinto (Bunker, Centro de Convivência, D-Tec) e a sala da Biblioteca onde o Baltazar se esconde.</w:t>
+        <w:t xml:space="preserve">A estrutura da história: a ordem das fases depois do Labirinto (Bunker, Centro de Convivência, D-Tec e outras áreas), o que acontece no Centro de Convivência, em que momento Gabriel encontra o Baltazar e o que os sonhos mostram.</w:t>
       </w:r>
     </w:p>
     <w:p>
@@ -5278,7 +5390,7 @@
         <w:rPr>
           <w:rtl w:val="0"/>
         </w:rPr>
-        <w:t xml:space="preserve">De onde vem a grade horária das rondas dos robôs.</w:t>
+        <w:t xml:space="preserve">A volta e o fim: se todos voltam de uma vez ou um por um, o final de Gabriel e Clarice, e o que acontece com o Carlos e com o Henrique no fim.</w:t>
       </w:r>
     </w:p>
     <w:p>
@@ -5865,7 +5977,7 @@
                 <w:szCs w:val="18"/>
                 <w:rtl w:val="0"/>
               </w:rPr>
-              <w:t xml:space="preserve">Dois setores ligados por escada, nove salas abertas e seis portas lacradas para as próximas fases.</w:t>
+              <w:t xml:space="preserve">Dois setores sob o núcleo da Âncora, salas montadas como interiores dos séculos XIX e XX, sala de dados trancada e seis portas lacradas.</w:t>
             </w:r>
           </w:p>
         </w:tc>
@@ -5884,7 +5996,7 @@
                 <w:szCs w:val="18"/>
                 <w:rtl w:val="0"/>
               </w:rPr>
-              <w:t xml:space="preserve">Nenhum: os robôs não descem</w:t>
+              <w:t xml:space="preserve">Patrulhado por robôs (previsto no enredo)</w:t>
             </w:r>
           </w:p>
         </w:tc>
@@ -5903,7 +6015,7 @@
                 <w:szCs w:val="18"/>
                 <w:rtl w:val="0"/>
               </w:rPr>
-              <w:t xml:space="preserve">Conversa e ritmo de respiro</w:t>
+              <w:t xml:space="preserve">Furtividade no subsolo e primeiro encontro com o Henrique</w:t>
             </w:r>
           </w:p>
         </w:tc>
@@ -6280,7 +6392,7 @@
                 <w:szCs w:val="18"/>
                 <w:rtl w:val="0"/>
               </w:rPr>
-              <w:t xml:space="preserve">Concreto aparente em cima e tinta verde-oliva embaixo, tubos fluorescentes frios, luzes de emergência vermelhas e o setor B alagado. Portas de aço de correr e faixas de perigo.</w:t>
+              <w:t xml:space="preserve">Concreto aparente em cima e tinta verde-oliva embaixo, tubos fluorescentes frios, luzes de emergência vermelhas, salas montadas como interiores dos séculos XIX e XX (obsessão do Carlos) e o setor B lacrado.</w:t>
             </w:r>
           </w:p>
         </w:tc>
@@ -6299,7 +6411,7 @@
                 <w:szCs w:val="18"/>
                 <w:rtl w:val="0"/>
               </w:rPr>
-              <w:t xml:space="preserve">O lugar mais seguro do jogo. Reúne conversas e deixa ganchos para fases futuras (a comporta do núcleo, o laboratório, o arquivo).</w:t>
+              <w:t xml:space="preserve">Difícil de alcançar e patrulhado por robôs. O Henrique fica sozinho na sala de dados trancada, e o local deixa ganchos para fases futuras (a comporta do núcleo, o laboratório, o arquivo).</w:t>
             </w:r>
           </w:p>
         </w:tc>
@@ -6999,7 +7111,7 @@
         <w:rPr>
           <w:rtl w:val="0"/>
         </w:rPr>
-        <w:t xml:space="preserve"> cinzas de concreto, marrons terrosos, verde-musgo e areia, com o âmbar quente das luzes de emergência. O verde fica para checkpoints e saídas; o vermelho, para os olhos dos robôs; o ciano, para a tecnologia de 3026.</w:t>
+        <w:t xml:space="preserve"> cinzas de concreto, marrons terrosos, verde-musgo e areia, com o âmbar quente das luzes de emergência e do símbolo dos Faroleiros. O verde fica para checkpoints e saídas; o vermelho, para o Carlos e os olhos dos robôs; o ciano, para a tecnologia de 3026.</w:t>
       </w:r>
     </w:p>
     <w:p>
@@ -7342,7 +7454,7 @@
                 <w:szCs w:val="18"/>
                 <w:rtl w:val="0"/>
               </w:rPr>
-              <w:t xml:space="preserve">Moletom vermelho de capuz, calça jeans e tênis cinza, sem mochila. Usa o anel da avó no dedo.</w:t>
+              <w:t xml:space="preserve">Moletom vermelho-tijolo de capuz, calça jeans, tênis claro e mochila nas costas. Usa o anel da avó no dedo.</w:t>
             </w:r>
           </w:p>
         </w:tc>
@@ -13980,9 +14092,9 @@
             </w:pPr>
             <w:r>
               <w:rPr>
+                <w:sz w:val="17"/>
+                <w:szCs w:val="17"/>
                 <w:b w:val="1"/>
-                <w:sz w:val="17"/>
-                <w:szCs w:val="17"/>
                 <w:rtl w:val="0"/>
               </w:rPr>
               <w:t xml:space="preserve">Ação: </w:t>
@@ -13993,7 +14105,7 @@
                 <w:szCs w:val="17"/>
                 <w:rtl w:val="0"/>
               </w:rPr>
-              <w:t xml:space="preserve">O lugar mais seguro do jogo: os robôs não descem. As portas lacradas são ganchos para as fases seguintes.</w:t>
+              <w:t xml:space="preserve">Difícil de alcançar e patrulhado pelos robôs no enredo (com salas dos séculos XIX e XX). O Henrique fica trancado na sala de dados, e as portas lacradas são ganchos para as fases seguintes.</w:t>
             </w:r>
           </w:p>
         </w:tc>

</xml_diff>

<commit_message>
docs: remove as imagens do gdd_ankhor.docx
Tira as 27 imagens do storyboard (seção 9). Todo o texto continua igual:
os quadros ficam só com cena, enquadramento e ação. O arquivo cai de
4,9 MB para 33 KB.

Co-Authored-By: Claude Sonnet 5.5 <noreply@anthropic.com>
</commit_message>
<xml_diff>
--- a/docs/entrega/gdd_ankhor.docx
+++ b/docs/entrega/gdd_ankhor.docx
@@ -10515,52 +10515,6 @@
           </w:tcPr>
           <w:p>
             <w:pPr>
-              <w:spacing w:after="60" w:before="0" w:line="240" w:lineRule="auto"/>
-              <w:jc w:val="center"/>
-              <w:rPr/>
-            </w:pPr>
-            <w:r>
-              <w:rPr>
-                <w:noProof/>
-              </w:rPr>
-              <w:drawing>
-                <wp:inline distT="0" distB="0" distL="0" distR="0">
-                  <wp:extent cx="3937000" cy="2212594"/>
-                  <wp:docPr id="101" name="Imagem 101" descr="Quadro 1 · Menu principal"/>
-                  <wp:cNvGraphicFramePr>
-                    <a:graphicFrameLocks noChangeAspect="1"/>
-                  </wp:cNvGraphicFramePr>
-                  <a:graphic>
-                    <a:graphicData uri="http://schemas.openxmlformats.org/drawingml/2006/picture">
-                      <pic:pic>
-                        <pic:nvPicPr>
-                          <pic:cNvPr id="101" name="imagem1.png"/>
-                          <pic:cNvPicPr/>
-                        </pic:nvPicPr>
-                        <pic:blipFill>
-                          <a:blip r:embed="rIdImg1"/>
-                          <a:stretch>
-                            <a:fillRect/>
-                          </a:stretch>
-                        </pic:blipFill>
-                        <pic:spPr>
-                          <a:xfrm>
-                            <a:off x="0" y="0"/>
-                            <a:ext cx="3937000" cy="2212594"/>
-                          </a:xfrm>
-                          <a:prstGeom prst="rect">
-                            <a:avLst/>
-                          </a:prstGeom>
-                        </pic:spPr>
-                      </pic:pic>
-                    </a:graphicData>
-                  </a:graphic>
-                </wp:inline>
-              </w:drawing>
-            </w:r>
-          </w:p>
-          <w:p>
-            <w:pPr>
               <w:spacing w:after="40" w:before="0" w:line="240" w:lineRule="auto"/>
               <w:rPr/>
             </w:pPr>
@@ -10655,52 +10609,6 @@
           </w:tcPr>
           <w:p>
             <w:pPr>
-              <w:spacing w:after="60" w:before="0" w:line="240" w:lineRule="auto"/>
-              <w:jc w:val="center"/>
-              <w:rPr/>
-            </w:pPr>
-            <w:r>
-              <w:rPr>
-                <w:noProof/>
-              </w:rPr>
-              <w:drawing>
-                <wp:inline distT="0" distB="0" distL="0" distR="0">
-                  <wp:extent cx="2740025" cy="1541264"/>
-                  <wp:docPr id="102" name="Imagem 102" descr="Quadro 2 · O alarme (06:15)"/>
-                  <wp:cNvGraphicFramePr>
-                    <a:graphicFrameLocks noChangeAspect="1"/>
-                  </wp:cNvGraphicFramePr>
-                  <a:graphic>
-                    <a:graphicData uri="http://schemas.openxmlformats.org/drawingml/2006/picture">
-                      <pic:pic>
-                        <pic:nvPicPr>
-                          <pic:cNvPr id="102" name="imagem2.png"/>
-                          <pic:cNvPicPr/>
-                        </pic:nvPicPr>
-                        <pic:blipFill>
-                          <a:blip r:embed="rIdImg2"/>
-                          <a:stretch>
-                            <a:fillRect/>
-                          </a:stretch>
-                        </pic:blipFill>
-                        <pic:spPr>
-                          <a:xfrm>
-                            <a:off x="0" y="0"/>
-                            <a:ext cx="2740025" cy="1541264"/>
-                          </a:xfrm>
-                          <a:prstGeom prst="rect">
-                            <a:avLst/>
-                          </a:prstGeom>
-                        </pic:spPr>
-                      </pic:pic>
-                    </a:graphicData>
-                  </a:graphic>
-                </wp:inline>
-              </w:drawing>
-            </w:r>
-          </w:p>
-          <w:p>
-            <w:pPr>
               <w:spacing w:after="40" w:before="0" w:line="240" w:lineRule="auto"/>
               <w:rPr/>
             </w:pPr>
@@ -10788,52 +10696,6 @@
           <w:tcPr>
             <w:tcW w:w="4514" w:type="dxa"/>
           </w:tcPr>
-          <w:p>
-            <w:pPr>
-              <w:spacing w:after="60" w:before="0" w:line="240" w:lineRule="auto"/>
-              <w:jc w:val="center"/>
-              <w:rPr/>
-            </w:pPr>
-            <w:r>
-              <w:rPr>
-                <w:noProof/>
-              </w:rPr>
-              <w:drawing>
-                <wp:inline distT="0" distB="0" distL="0" distR="0">
-                  <wp:extent cx="2739390" cy="1540906"/>
-                  <wp:docPr id="103" name="Imagem 103" descr="Quadro 3 · A partida"/>
-                  <wp:cNvGraphicFramePr>
-                    <a:graphicFrameLocks noChangeAspect="1"/>
-                  </wp:cNvGraphicFramePr>
-                  <a:graphic>
-                    <a:graphicData uri="http://schemas.openxmlformats.org/drawingml/2006/picture">
-                      <pic:pic>
-                        <pic:nvPicPr>
-                          <pic:cNvPr id="103" name="imagem3.png"/>
-                          <pic:cNvPicPr/>
-                        </pic:nvPicPr>
-                        <pic:blipFill>
-                          <a:blip r:embed="rIdImg3"/>
-                          <a:stretch>
-                            <a:fillRect/>
-                          </a:stretch>
-                        </pic:blipFill>
-                        <pic:spPr>
-                          <a:xfrm>
-                            <a:off x="0" y="0"/>
-                            <a:ext cx="2739390" cy="1540906"/>
-                          </a:xfrm>
-                          <a:prstGeom prst="rect">
-                            <a:avLst/>
-                          </a:prstGeom>
-                        </pic:spPr>
-                      </pic:pic>
-                    </a:graphicData>
-                  </a:graphic>
-                </wp:inline>
-              </w:drawing>
-            </w:r>
-          </w:p>
           <w:p>
             <w:pPr>
               <w:spacing w:after="40" w:before="0" w:line="240" w:lineRule="auto"/>
@@ -10930,52 +10792,6 @@
           </w:tcPr>
           <w:p>
             <w:pPr>
-              <w:spacing w:after="60" w:before="0" w:line="240" w:lineRule="auto"/>
-              <w:jc w:val="center"/>
-              <w:rPr/>
-            </w:pPr>
-            <w:r>
-              <w:rPr>
-                <w:noProof/>
-              </w:rPr>
-              <w:drawing>
-                <wp:inline distT="0" distB="0" distL="0" distR="0">
-                  <wp:extent cx="2740025" cy="1541264"/>
-                  <wp:docPr id="104" name="Imagem 104" descr="Quadro 4 · O trajeto"/>
-                  <wp:cNvGraphicFramePr>
-                    <a:graphicFrameLocks noChangeAspect="1"/>
-                  </wp:cNvGraphicFramePr>
-                  <a:graphic>
-                    <a:graphicData uri="http://schemas.openxmlformats.org/drawingml/2006/picture">
-                      <pic:pic>
-                        <pic:nvPicPr>
-                          <pic:cNvPr id="104" name="imagem4.png"/>
-                          <pic:cNvPicPr/>
-                        </pic:nvPicPr>
-                        <pic:blipFill>
-                          <a:blip r:embed="rIdImg4"/>
-                          <a:stretch>
-                            <a:fillRect/>
-                          </a:stretch>
-                        </pic:blipFill>
-                        <pic:spPr>
-                          <a:xfrm>
-                            <a:off x="0" y="0"/>
-                            <a:ext cx="2740025" cy="1541264"/>
-                          </a:xfrm>
-                          <a:prstGeom prst="rect">
-                            <a:avLst/>
-                          </a:prstGeom>
-                        </pic:spPr>
-                      </pic:pic>
-                    </a:graphicData>
-                  </a:graphic>
-                </wp:inline>
-              </w:drawing>
-            </w:r>
-          </w:p>
-          <w:p>
-            <w:pPr>
               <w:spacing w:after="40" w:before="0" w:line="240" w:lineRule="auto"/>
               <w:rPr/>
             </w:pPr>
@@ -11063,52 +10879,6 @@
           <w:tcPr>
             <w:tcW w:w="4514" w:type="dxa"/>
           </w:tcPr>
-          <w:p>
-            <w:pPr>
-              <w:spacing w:after="60" w:before="0" w:line="240" w:lineRule="auto"/>
-              <w:jc w:val="center"/>
-              <w:rPr/>
-            </w:pPr>
-            <w:r>
-              <w:rPr>
-                <w:noProof/>
-              </w:rPr>
-              <w:drawing>
-                <wp:inline distT="0" distB="0" distL="0" distR="0">
-                  <wp:extent cx="2739390" cy="1540906"/>
-                  <wp:docPr id="105" name="Imagem 105" descr="Quadro 5 · O campus vivo"/>
-                  <wp:cNvGraphicFramePr>
-                    <a:graphicFrameLocks noChangeAspect="1"/>
-                  </wp:cNvGraphicFramePr>
-                  <a:graphic>
-                    <a:graphicData uri="http://schemas.openxmlformats.org/drawingml/2006/picture">
-                      <pic:pic>
-                        <pic:nvPicPr>
-                          <pic:cNvPr id="105" name="imagem5.png"/>
-                          <pic:cNvPicPr/>
-                        </pic:nvPicPr>
-                        <pic:blipFill>
-                          <a:blip r:embed="rIdImg5"/>
-                          <a:stretch>
-                            <a:fillRect/>
-                          </a:stretch>
-                        </pic:blipFill>
-                        <pic:spPr>
-                          <a:xfrm>
-                            <a:off x="0" y="0"/>
-                            <a:ext cx="2739390" cy="1540906"/>
-                          </a:xfrm>
-                          <a:prstGeom prst="rect">
-                            <a:avLst/>
-                          </a:prstGeom>
-                        </pic:spPr>
-                      </pic:pic>
-                    </a:graphicData>
-                  </a:graphic>
-                </wp:inline>
-              </w:drawing>
-            </w:r>
-          </w:p>
           <w:p>
             <w:pPr>
               <w:spacing w:after="40" w:before="0" w:line="240" w:lineRule="auto"/>
@@ -11205,52 +10975,6 @@
           </w:tcPr>
           <w:p>
             <w:pPr>
-              <w:spacing w:after="60" w:before="0" w:line="240" w:lineRule="auto"/>
-              <w:jc w:val="center"/>
-              <w:rPr/>
-            </w:pPr>
-            <w:r>
-              <w:rPr>
-                <w:noProof/>
-              </w:rPr>
-              <w:drawing>
-                <wp:inline distT="0" distB="0" distL="0" distR="0">
-                  <wp:extent cx="2740025" cy="1541264"/>
-                  <wp:docPr id="106" name="Imagem 106" descr="Quadro 6 · A aula e o caderno"/>
-                  <wp:cNvGraphicFramePr>
-                    <a:graphicFrameLocks noChangeAspect="1"/>
-                  </wp:cNvGraphicFramePr>
-                  <a:graphic>
-                    <a:graphicData uri="http://schemas.openxmlformats.org/drawingml/2006/picture">
-                      <pic:pic>
-                        <pic:nvPicPr>
-                          <pic:cNvPr id="106" name="imagem6.png"/>
-                          <pic:cNvPicPr/>
-                        </pic:nvPicPr>
-                        <pic:blipFill>
-                          <a:blip r:embed="rIdImg6"/>
-                          <a:stretch>
-                            <a:fillRect/>
-                          </a:stretch>
-                        </pic:blipFill>
-                        <pic:spPr>
-                          <a:xfrm>
-                            <a:off x="0" y="0"/>
-                            <a:ext cx="2740025" cy="1541264"/>
-                          </a:xfrm>
-                          <a:prstGeom prst="rect">
-                            <a:avLst/>
-                          </a:prstGeom>
-                        </pic:spPr>
-                      </pic:pic>
-                    </a:graphicData>
-                  </a:graphic>
-                </wp:inline>
-              </w:drawing>
-            </w:r>
-          </w:p>
-          <w:p>
-            <w:pPr>
               <w:spacing w:after="40" w:before="0" w:line="240" w:lineRule="auto"/>
               <w:rPr/>
             </w:pPr>
@@ -11338,52 +11062,6 @@
           <w:tcPr>
             <w:tcW w:w="4514" w:type="dxa"/>
           </w:tcPr>
-          <w:p>
-            <w:pPr>
-              <w:spacing w:after="60" w:before="0" w:line="240" w:lineRule="auto"/>
-              <w:jc w:val="center"/>
-              <w:rPr/>
-            </w:pPr>
-            <w:r>
-              <w:rPr>
-                <w:noProof/>
-              </w:rPr>
-              <w:drawing>
-                <wp:inline distT="0" distB="0" distL="0" distR="0">
-                  <wp:extent cx="2739390" cy="1540906"/>
-                  <wp:docPr id="107" name="Imagem 107" descr="Quadro 7 · Rumo à Biblioteca"/>
-                  <wp:cNvGraphicFramePr>
-                    <a:graphicFrameLocks noChangeAspect="1"/>
-                  </wp:cNvGraphicFramePr>
-                  <a:graphic>
-                    <a:graphicData uri="http://schemas.openxmlformats.org/drawingml/2006/picture">
-                      <pic:pic>
-                        <pic:nvPicPr>
-                          <pic:cNvPr id="107" name="imagem7.png"/>
-                          <pic:cNvPicPr/>
-                        </pic:nvPicPr>
-                        <pic:blipFill>
-                          <a:blip r:embed="rIdImg7"/>
-                          <a:stretch>
-                            <a:fillRect/>
-                          </a:stretch>
-                        </pic:blipFill>
-                        <pic:spPr>
-                          <a:xfrm>
-                            <a:off x="0" y="0"/>
-                            <a:ext cx="2739390" cy="1540906"/>
-                          </a:xfrm>
-                          <a:prstGeom prst="rect">
-                            <a:avLst/>
-                          </a:prstGeom>
-                        </pic:spPr>
-                      </pic:pic>
-                    </a:graphicData>
-                  </a:graphic>
-                </wp:inline>
-              </w:drawing>
-            </w:r>
-          </w:p>
           <w:p>
             <w:pPr>
               <w:spacing w:after="40" w:before="0" w:line="240" w:lineRule="auto"/>
@@ -11480,52 +11158,6 @@
           </w:tcPr>
           <w:p>
             <w:pPr>
-              <w:spacing w:after="60" w:before="0" w:line="240" w:lineRule="auto"/>
-              <w:jc w:val="center"/>
-              <w:rPr/>
-            </w:pPr>
-            <w:r>
-              <w:rPr>
-                <w:noProof/>
-              </w:rPr>
-              <w:drawing>
-                <wp:inline distT="0" distB="0" distL="0" distR="0">
-                  <wp:extent cx="2740025" cy="1541264"/>
-                  <wp:docPr id="108" name="Imagem 108" descr="Quadro 8 · A cabine (03:14)"/>
-                  <wp:cNvGraphicFramePr>
-                    <a:graphicFrameLocks noChangeAspect="1"/>
-                  </wp:cNvGraphicFramePr>
-                  <a:graphic>
-                    <a:graphicData uri="http://schemas.openxmlformats.org/drawingml/2006/picture">
-                      <pic:pic>
-                        <pic:nvPicPr>
-                          <pic:cNvPr id="108" name="imagem8.png"/>
-                          <pic:cNvPicPr/>
-                        </pic:nvPicPr>
-                        <pic:blipFill>
-                          <a:blip r:embed="rIdImg8"/>
-                          <a:stretch>
-                            <a:fillRect/>
-                          </a:stretch>
-                        </pic:blipFill>
-                        <pic:spPr>
-                          <a:xfrm>
-                            <a:off x="0" y="0"/>
-                            <a:ext cx="2740025" cy="1541264"/>
-                          </a:xfrm>
-                          <a:prstGeom prst="rect">
-                            <a:avLst/>
-                          </a:prstGeom>
-                        </pic:spPr>
-                      </pic:pic>
-                    </a:graphicData>
-                  </a:graphic>
-                </wp:inline>
-              </w:drawing>
-            </w:r>
-          </w:p>
-          <w:p>
-            <w:pPr>
               <w:spacing w:after="40" w:before="0" w:line="240" w:lineRule="auto"/>
               <w:rPr/>
             </w:pPr>
@@ -11613,52 +11245,6 @@
           <w:tcPr>
             <w:tcW w:w="4514" w:type="dxa"/>
           </w:tcPr>
-          <w:p>
-            <w:pPr>
-              <w:spacing w:after="60" w:before="0" w:line="240" w:lineRule="auto"/>
-              <w:jc w:val="center"/>
-              <w:rPr/>
-            </w:pPr>
-            <w:r>
-              <w:rPr>
-                <w:noProof/>
-              </w:rPr>
-              <w:drawing>
-                <wp:inline distT="0" distB="0" distL="0" distR="0">
-                  <wp:extent cx="2739390" cy="1540906"/>
-                  <wp:docPr id="109" name="Imagem 109" descr="Quadro 9 · O pulso da fenda"/>
-                  <wp:cNvGraphicFramePr>
-                    <a:graphicFrameLocks noChangeAspect="1"/>
-                  </wp:cNvGraphicFramePr>
-                  <a:graphic>
-                    <a:graphicData uri="http://schemas.openxmlformats.org/drawingml/2006/picture">
-                      <pic:pic>
-                        <pic:nvPicPr>
-                          <pic:cNvPr id="109" name="imagem9.png"/>
-                          <pic:cNvPicPr/>
-                        </pic:nvPicPr>
-                        <pic:blipFill>
-                          <a:blip r:embed="rIdImg9"/>
-                          <a:stretch>
-                            <a:fillRect/>
-                          </a:stretch>
-                        </pic:blipFill>
-                        <pic:spPr>
-                          <a:xfrm>
-                            <a:off x="0" y="0"/>
-                            <a:ext cx="2739390" cy="1540906"/>
-                          </a:xfrm>
-                          <a:prstGeom prst="rect">
-                            <a:avLst/>
-                          </a:prstGeom>
-                        </pic:spPr>
-                      </pic:pic>
-                    </a:graphicData>
-                  </a:graphic>
-                </wp:inline>
-              </w:drawing>
-            </w:r>
-          </w:p>
           <w:p>
             <w:pPr>
               <w:spacing w:after="40" w:before="0" w:line="240" w:lineRule="auto"/>
@@ -11755,52 +11341,6 @@
           </w:tcPr>
           <w:p>
             <w:pPr>
-              <w:spacing w:after="60" w:before="0" w:line="240" w:lineRule="auto"/>
-              <w:jc w:val="center"/>
-              <w:rPr/>
-            </w:pPr>
-            <w:r>
-              <w:rPr>
-                <w:noProof/>
-              </w:rPr>
-              <w:drawing>
-                <wp:inline distT="0" distB="0" distL="0" distR="0">
-                  <wp:extent cx="2740025" cy="1541264"/>
-                  <wp:docPr id="110" name="Imagem 110" descr="Quadro 10 · Mil anos depois"/>
-                  <wp:cNvGraphicFramePr>
-                    <a:graphicFrameLocks noChangeAspect="1"/>
-                  </wp:cNvGraphicFramePr>
-                  <a:graphic>
-                    <a:graphicData uri="http://schemas.openxmlformats.org/drawingml/2006/picture">
-                      <pic:pic>
-                        <pic:nvPicPr>
-                          <pic:cNvPr id="110" name="imagem10.png"/>
-                          <pic:cNvPicPr/>
-                        </pic:nvPicPr>
-                        <pic:blipFill>
-                          <a:blip r:embed="rIdImg10"/>
-                          <a:stretch>
-                            <a:fillRect/>
-                          </a:stretch>
-                        </pic:blipFill>
-                        <pic:spPr>
-                          <a:xfrm>
-                            <a:off x="0" y="0"/>
-                            <a:ext cx="2740025" cy="1541264"/>
-                          </a:xfrm>
-                          <a:prstGeom prst="rect">
-                            <a:avLst/>
-                          </a:prstGeom>
-                        </pic:spPr>
-                      </pic:pic>
-                    </a:graphicData>
-                  </a:graphic>
-                </wp:inline>
-              </w:drawing>
-            </w:r>
-          </w:p>
-          <w:p>
-            <w:pPr>
               <w:spacing w:after="40" w:before="0" w:line="240" w:lineRule="auto"/>
               <w:rPr/>
             </w:pPr>
@@ -11888,52 +11428,6 @@
           <w:tcPr>
             <w:tcW w:w="4514" w:type="dxa"/>
           </w:tcPr>
-          <w:p>
-            <w:pPr>
-              <w:spacing w:after="60" w:before="0" w:line="240" w:lineRule="auto"/>
-              <w:jc w:val="center"/>
-              <w:rPr/>
-            </w:pPr>
-            <w:r>
-              <w:rPr>
-                <w:noProof/>
-              </w:rPr>
-              <w:drawing>
-                <wp:inline distT="0" distB="0" distL="0" distR="0">
-                  <wp:extent cx="2739390" cy="1540906"/>
-                  <wp:docPr id="111" name="Imagem 111" descr="Quadro 11 · O despertar"/>
-                  <wp:cNvGraphicFramePr>
-                    <a:graphicFrameLocks noChangeAspect="1"/>
-                  </wp:cNvGraphicFramePr>
-                  <a:graphic>
-                    <a:graphicData uri="http://schemas.openxmlformats.org/drawingml/2006/picture">
-                      <pic:pic>
-                        <pic:nvPicPr>
-                          <pic:cNvPr id="111" name="imagem11.png"/>
-                          <pic:cNvPicPr/>
-                        </pic:nvPicPr>
-                        <pic:blipFill>
-                          <a:blip r:embed="rIdImg11"/>
-                          <a:stretch>
-                            <a:fillRect/>
-                          </a:stretch>
-                        </pic:blipFill>
-                        <pic:spPr>
-                          <a:xfrm>
-                            <a:off x="0" y="0"/>
-                            <a:ext cx="2739390" cy="1540906"/>
-                          </a:xfrm>
-                          <a:prstGeom prst="rect">
-                            <a:avLst/>
-                          </a:prstGeom>
-                        </pic:spPr>
-                      </pic:pic>
-                    </a:graphicData>
-                  </a:graphic>
-                </wp:inline>
-              </w:drawing>
-            </w:r>
-          </w:p>
           <w:p>
             <w:pPr>
               <w:spacing w:after="40" w:before="0" w:line="240" w:lineRule="auto"/>
@@ -12077,52 +11571,6 @@
           </w:tcPr>
           <w:p>
             <w:pPr>
-              <w:spacing w:after="60" w:before="0" w:line="240" w:lineRule="auto"/>
-              <w:jc w:val="center"/>
-              <w:rPr/>
-            </w:pPr>
-            <w:r>
-              <w:rPr>
-                <w:noProof/>
-              </w:rPr>
-              <w:drawing>
-                <wp:inline distT="0" distB="0" distL="0" distR="0">
-                  <wp:extent cx="2740025" cy="1541264"/>
-                  <wp:docPr id="112" name="Imagem 112" descr="Quadro 12 · A cabine"/>
-                  <wp:cNvGraphicFramePr>
-                    <a:graphicFrameLocks noChangeAspect="1"/>
-                  </wp:cNvGraphicFramePr>
-                  <a:graphic>
-                    <a:graphicData uri="http://schemas.openxmlformats.org/drawingml/2006/picture">
-                      <pic:pic>
-                        <pic:nvPicPr>
-                          <pic:cNvPr id="112" name="imagem12.png"/>
-                          <pic:cNvPicPr/>
-                        </pic:nvPicPr>
-                        <pic:blipFill>
-                          <a:blip r:embed="rIdImg12"/>
-                          <a:stretch>
-                            <a:fillRect/>
-                          </a:stretch>
-                        </pic:blipFill>
-                        <pic:spPr>
-                          <a:xfrm>
-                            <a:off x="0" y="0"/>
-                            <a:ext cx="2740025" cy="1541264"/>
-                          </a:xfrm>
-                          <a:prstGeom prst="rect">
-                            <a:avLst/>
-                          </a:prstGeom>
-                        </pic:spPr>
-                      </pic:pic>
-                    </a:graphicData>
-                  </a:graphic>
-                </wp:inline>
-              </w:drawing>
-            </w:r>
-          </w:p>
-          <w:p>
-            <w:pPr>
               <w:spacing w:after="40" w:before="0" w:line="240" w:lineRule="auto"/>
               <w:rPr/>
             </w:pPr>
@@ -12210,52 +11658,6 @@
           <w:tcPr>
             <w:tcW w:w="4514" w:type="dxa"/>
           </w:tcPr>
-          <w:p>
-            <w:pPr>
-              <w:spacing w:after="60" w:before="0" w:line="240" w:lineRule="auto"/>
-              <w:jc w:val="center"/>
-              <w:rPr/>
-            </w:pPr>
-            <w:r>
-              <w:rPr>
-                <w:noProof/>
-              </w:rPr>
-              <w:drawing>
-                <wp:inline distT="0" distB="0" distL="0" distR="0">
-                  <wp:extent cx="2739390" cy="1540906"/>
-                  <wp:docPr id="113" name="Imagem 113" descr="Quadro 13 · O salão e a árvore"/>
-                  <wp:cNvGraphicFramePr>
-                    <a:graphicFrameLocks noChangeAspect="1"/>
-                  </wp:cNvGraphicFramePr>
-                  <a:graphic>
-                    <a:graphicData uri="http://schemas.openxmlformats.org/drawingml/2006/picture">
-                      <pic:pic>
-                        <pic:nvPicPr>
-                          <pic:cNvPr id="113" name="imagem13.png"/>
-                          <pic:cNvPicPr/>
-                        </pic:nvPicPr>
-                        <pic:blipFill>
-                          <a:blip r:embed="rIdImg13"/>
-                          <a:stretch>
-                            <a:fillRect/>
-                          </a:stretch>
-                        </pic:blipFill>
-                        <pic:spPr>
-                          <a:xfrm>
-                            <a:off x="0" y="0"/>
-                            <a:ext cx="2739390" cy="1540906"/>
-                          </a:xfrm>
-                          <a:prstGeom prst="rect">
-                            <a:avLst/>
-                          </a:prstGeom>
-                        </pic:spPr>
-                      </pic:pic>
-                    </a:graphicData>
-                  </a:graphic>
-                </wp:inline>
-              </w:drawing>
-            </w:r>
-          </w:p>
           <w:p>
             <w:pPr>
               <w:spacing w:after="40" w:before="0" w:line="240" w:lineRule="auto"/>
@@ -12352,52 +11754,6 @@
           </w:tcPr>
           <w:p>
             <w:pPr>
-              <w:spacing w:after="60" w:before="0" w:line="240" w:lineRule="auto"/>
-              <w:jc w:val="center"/>
-              <w:rPr/>
-            </w:pPr>
-            <w:r>
-              <w:rPr>
-                <w:noProof/>
-              </w:rPr>
-              <w:drawing>
-                <wp:inline distT="0" distB="0" distL="0" distR="0">
-                  <wp:extent cx="2740025" cy="1541264"/>
-                  <wp:docPr id="114" name="Imagem 114" descr="Quadro 14 · O rádio"/>
-                  <wp:cNvGraphicFramePr>
-                    <a:graphicFrameLocks noChangeAspect="1"/>
-                  </wp:cNvGraphicFramePr>
-                  <a:graphic>
-                    <a:graphicData uri="http://schemas.openxmlformats.org/drawingml/2006/picture">
-                      <pic:pic>
-                        <pic:nvPicPr>
-                          <pic:cNvPr id="114" name="imagem14.png"/>
-                          <pic:cNvPicPr/>
-                        </pic:nvPicPr>
-                        <pic:blipFill>
-                          <a:blip r:embed="rIdImg14"/>
-                          <a:stretch>
-                            <a:fillRect/>
-                          </a:stretch>
-                        </pic:blipFill>
-                        <pic:spPr>
-                          <a:xfrm>
-                            <a:off x="0" y="0"/>
-                            <a:ext cx="2740025" cy="1541264"/>
-                          </a:xfrm>
-                          <a:prstGeom prst="rect">
-                            <a:avLst/>
-                          </a:prstGeom>
-                        </pic:spPr>
-                      </pic:pic>
-                    </a:graphicData>
-                  </a:graphic>
-                </wp:inline>
-              </w:drawing>
-            </w:r>
-          </w:p>
-          <w:p>
-            <w:pPr>
               <w:spacing w:after="40" w:before="0" w:line="240" w:lineRule="auto"/>
               <w:rPr/>
             </w:pPr>
@@ -12485,52 +11841,6 @@
           <w:tcPr>
             <w:tcW w:w="4514" w:type="dxa"/>
           </w:tcPr>
-          <w:p>
-            <w:pPr>
-              <w:spacing w:after="60" w:before="0" w:line="240" w:lineRule="auto"/>
-              <w:jc w:val="center"/>
-              <w:rPr/>
-            </w:pPr>
-            <w:r>
-              <w:rPr>
-                <w:noProof/>
-              </w:rPr>
-              <w:drawing>
-                <wp:inline distT="0" distB="0" distL="0" distR="0">
-                  <wp:extent cx="2739390" cy="1540906"/>
-                  <wp:docPr id="115" name="Imagem 115" descr="Quadro 15 · O acervo"/>
-                  <wp:cNvGraphicFramePr>
-                    <a:graphicFrameLocks noChangeAspect="1"/>
-                  </wp:cNvGraphicFramePr>
-                  <a:graphic>
-                    <a:graphicData uri="http://schemas.openxmlformats.org/drawingml/2006/picture">
-                      <pic:pic>
-                        <pic:nvPicPr>
-                          <pic:cNvPr id="115" name="imagem15.png"/>
-                          <pic:cNvPicPr/>
-                        </pic:nvPicPr>
-                        <pic:blipFill>
-                          <a:blip r:embed="rIdImg15"/>
-                          <a:stretch>
-                            <a:fillRect/>
-                          </a:stretch>
-                        </pic:blipFill>
-                        <pic:spPr>
-                          <a:xfrm>
-                            <a:off x="0" y="0"/>
-                            <a:ext cx="2739390" cy="1540906"/>
-                          </a:xfrm>
-                          <a:prstGeom prst="rect">
-                            <a:avLst/>
-                          </a:prstGeom>
-                        </pic:spPr>
-                      </pic:pic>
-                    </a:graphicData>
-                  </a:graphic>
-                </wp:inline>
-              </w:drawing>
-            </w:r>
-          </w:p>
           <w:p>
             <w:pPr>
               <w:spacing w:after="40" w:before="0" w:line="240" w:lineRule="auto"/>
@@ -12627,52 +11937,6 @@
           </w:tcPr>
           <w:p>
             <w:pPr>
-              <w:spacing w:after="60" w:before="0" w:line="240" w:lineRule="auto"/>
-              <w:jc w:val="center"/>
-              <w:rPr/>
-            </w:pPr>
-            <w:r>
-              <w:rPr>
-                <w:noProof/>
-              </w:rPr>
-              <w:drawing>
-                <wp:inline distT="0" distB="0" distL="0" distR="0">
-                  <wp:extent cx="2740025" cy="1541264"/>
-                  <wp:docPr id="116" name="Imagem 116" descr="Quadro 16 · A sala segura"/>
-                  <wp:cNvGraphicFramePr>
-                    <a:graphicFrameLocks noChangeAspect="1"/>
-                  </wp:cNvGraphicFramePr>
-                  <a:graphic>
-                    <a:graphicData uri="http://schemas.openxmlformats.org/drawingml/2006/picture">
-                      <pic:pic>
-                        <pic:nvPicPr>
-                          <pic:cNvPr id="116" name="imagem16.png"/>
-                          <pic:cNvPicPr/>
-                        </pic:nvPicPr>
-                        <pic:blipFill>
-                          <a:blip r:embed="rIdImg16"/>
-                          <a:stretch>
-                            <a:fillRect/>
-                          </a:stretch>
-                        </pic:blipFill>
-                        <pic:spPr>
-                          <a:xfrm>
-                            <a:off x="0" y="0"/>
-                            <a:ext cx="2740025" cy="1541264"/>
-                          </a:xfrm>
-                          <a:prstGeom prst="rect">
-                            <a:avLst/>
-                          </a:prstGeom>
-                        </pic:spPr>
-                      </pic:pic>
-                    </a:graphicData>
-                  </a:graphic>
-                </wp:inline>
-              </w:drawing>
-            </w:r>
-          </w:p>
-          <w:p>
-            <w:pPr>
               <w:spacing w:after="40" w:before="0" w:line="240" w:lineRule="auto"/>
               <w:rPr/>
             </w:pPr>
@@ -12760,52 +12024,6 @@
           <w:tcPr>
             <w:tcW w:w="4514" w:type="dxa"/>
           </w:tcPr>
-          <w:p>
-            <w:pPr>
-              <w:spacing w:after="60" w:before="0" w:line="240" w:lineRule="auto"/>
-              <w:jc w:val="center"/>
-              <w:rPr/>
-            </w:pPr>
-            <w:r>
-              <w:rPr>
-                <w:noProof/>
-              </w:rPr>
-              <w:drawing>
-                <wp:inline distT="0" distB="0" distL="0" distR="0">
-                  <wp:extent cx="2739390" cy="1540906"/>
-                  <wp:docPr id="117" name="Imagem 117" descr="Quadro 17 · Inventário e gadgets"/>
-                  <wp:cNvGraphicFramePr>
-                    <a:graphicFrameLocks noChangeAspect="1"/>
-                  </wp:cNvGraphicFramePr>
-                  <a:graphic>
-                    <a:graphicData uri="http://schemas.openxmlformats.org/drawingml/2006/picture">
-                      <pic:pic>
-                        <pic:nvPicPr>
-                          <pic:cNvPr id="117" name="imagem17.png"/>
-                          <pic:cNvPicPr/>
-                        </pic:nvPicPr>
-                        <pic:blipFill>
-                          <a:blip r:embed="rIdImg17"/>
-                          <a:stretch>
-                            <a:fillRect/>
-                          </a:stretch>
-                        </pic:blipFill>
-                        <pic:spPr>
-                          <a:xfrm>
-                            <a:off x="0" y="0"/>
-                            <a:ext cx="2739390" cy="1540906"/>
-                          </a:xfrm>
-                          <a:prstGeom prst="rect">
-                            <a:avLst/>
-                          </a:prstGeom>
-                        </pic:spPr>
-                      </pic:pic>
-                    </a:graphicData>
-                  </a:graphic>
-                </wp:inline>
-              </w:drawing>
-            </w:r>
-          </w:p>
           <w:p>
             <w:pPr>
               <w:spacing w:after="40" w:before="0" w:line="240" w:lineRule="auto"/>
@@ -12949,52 +12167,6 @@
           </w:tcPr>
           <w:p>
             <w:pPr>
-              <w:spacing w:after="60" w:before="0" w:line="240" w:lineRule="auto"/>
-              <w:jc w:val="center"/>
-              <w:rPr/>
-            </w:pPr>
-            <w:r>
-              <w:rPr>
-                <w:noProof/>
-              </w:rPr>
-              <w:drawing>
-                <wp:inline distT="0" distB="0" distL="0" distR="0">
-                  <wp:extent cx="2740025" cy="1541264"/>
-                  <wp:docPr id="118" name="Imagem 118" descr="Quadro 18 · Corredor do térreo"/>
-                  <wp:cNvGraphicFramePr>
-                    <a:graphicFrameLocks noChangeAspect="1"/>
-                  </wp:cNvGraphicFramePr>
-                  <a:graphic>
-                    <a:graphicData uri="http://schemas.openxmlformats.org/drawingml/2006/picture">
-                      <pic:pic>
-                        <pic:nvPicPr>
-                          <pic:cNvPr id="118" name="imagem18.png"/>
-                          <pic:cNvPicPr/>
-                        </pic:nvPicPr>
-                        <pic:blipFill>
-                          <a:blip r:embed="rIdImg18"/>
-                          <a:stretch>
-                            <a:fillRect/>
-                          </a:stretch>
-                        </pic:blipFill>
-                        <pic:spPr>
-                          <a:xfrm>
-                            <a:off x="0" y="0"/>
-                            <a:ext cx="2740025" cy="1541264"/>
-                          </a:xfrm>
-                          <a:prstGeom prst="rect">
-                            <a:avLst/>
-                          </a:prstGeom>
-                        </pic:spPr>
-                      </pic:pic>
-                    </a:graphicData>
-                  </a:graphic>
-                </wp:inline>
-              </w:drawing>
-            </w:r>
-          </w:p>
-          <w:p>
-            <w:pPr>
               <w:spacing w:after="40" w:before="0" w:line="240" w:lineRule="auto"/>
               <w:rPr/>
             </w:pPr>
@@ -13082,52 +12254,6 @@
           <w:tcPr>
             <w:tcW w:w="4514" w:type="dxa"/>
           </w:tcPr>
-          <w:p>
-            <w:pPr>
-              <w:spacing w:after="60" w:before="0" w:line="240" w:lineRule="auto"/>
-              <w:jc w:val="center"/>
-              <w:rPr/>
-            </w:pPr>
-            <w:r>
-              <w:rPr>
-                <w:noProof/>
-              </w:rPr>
-              <w:drawing>
-                <wp:inline distT="0" distB="0" distL="0" distR="0">
-                  <wp:extent cx="2739390" cy="1540906"/>
-                  <wp:docPr id="119" name="Imagem 119" descr="Quadro 19 · A sala 103"/>
-                  <wp:cNvGraphicFramePr>
-                    <a:graphicFrameLocks noChangeAspect="1"/>
-                  </wp:cNvGraphicFramePr>
-                  <a:graphic>
-                    <a:graphicData uri="http://schemas.openxmlformats.org/drawingml/2006/picture">
-                      <pic:pic>
-                        <pic:nvPicPr>
-                          <pic:cNvPr id="119" name="imagem19.png"/>
-                          <pic:cNvPicPr/>
-                        </pic:nvPicPr>
-                        <pic:blipFill>
-                          <a:blip r:embed="rIdImg19"/>
-                          <a:stretch>
-                            <a:fillRect/>
-                          </a:stretch>
-                        </pic:blipFill>
-                        <pic:spPr>
-                          <a:xfrm>
-                            <a:off x="0" y="0"/>
-                            <a:ext cx="2739390" cy="1540906"/>
-                          </a:xfrm>
-                          <a:prstGeom prst="rect">
-                            <a:avLst/>
-                          </a:prstGeom>
-                        </pic:spPr>
-                      </pic:pic>
-                    </a:graphicData>
-                  </a:graphic>
-                </wp:inline>
-              </w:drawing>
-            </w:r>
-          </w:p>
           <w:p>
             <w:pPr>
               <w:spacing w:after="40" w:before="0" w:line="240" w:lineRule="auto"/>
@@ -13224,52 +12350,6 @@
           </w:tcPr>
           <w:p>
             <w:pPr>
-              <w:spacing w:after="60" w:before="0" w:line="240" w:lineRule="auto"/>
-              <w:jc w:val="center"/>
-              <w:rPr/>
-            </w:pPr>
-            <w:r>
-              <w:rPr>
-                <w:noProof/>
-              </w:rPr>
-              <w:drawing>
-                <wp:inline distT="0" distB="0" distL="0" distR="0">
-                  <wp:extent cx="2740025" cy="1541264"/>
-                  <wp:docPr id="120" name="Imagem 120" descr="Quadro 20 · O 1º andar"/>
-                  <wp:cNvGraphicFramePr>
-                    <a:graphicFrameLocks noChangeAspect="1"/>
-                  </wp:cNvGraphicFramePr>
-                  <a:graphic>
-                    <a:graphicData uri="http://schemas.openxmlformats.org/drawingml/2006/picture">
-                      <pic:pic>
-                        <pic:nvPicPr>
-                          <pic:cNvPr id="120" name="imagem20.png"/>
-                          <pic:cNvPicPr/>
-                        </pic:nvPicPr>
-                        <pic:blipFill>
-                          <a:blip r:embed="rIdImg20"/>
-                          <a:stretch>
-                            <a:fillRect/>
-                          </a:stretch>
-                        </pic:blipFill>
-                        <pic:spPr>
-                          <a:xfrm>
-                            <a:off x="0" y="0"/>
-                            <a:ext cx="2740025" cy="1541264"/>
-                          </a:xfrm>
-                          <a:prstGeom prst="rect">
-                            <a:avLst/>
-                          </a:prstGeom>
-                        </pic:spPr>
-                      </pic:pic>
-                    </a:graphicData>
-                  </a:graphic>
-                </wp:inline>
-              </w:drawing>
-            </w:r>
-          </w:p>
-          <w:p>
-            <w:pPr>
               <w:spacing w:after="40" w:before="0" w:line="240" w:lineRule="auto"/>
               <w:rPr/>
             </w:pPr>
@@ -13357,52 +12437,6 @@
           <w:tcPr>
             <w:tcW w:w="4514" w:type="dxa"/>
           </w:tcPr>
-          <w:p>
-            <w:pPr>
-              <w:spacing w:after="60" w:before="0" w:line="240" w:lineRule="auto"/>
-              <w:jc w:val="center"/>
-              <w:rPr/>
-            </w:pPr>
-            <w:r>
-              <w:rPr>
-                <w:noProof/>
-              </w:rPr>
-              <w:drawing>
-                <wp:inline distT="0" distB="0" distL="0" distR="0">
-                  <wp:extent cx="2739390" cy="1540906"/>
-                  <wp:docPr id="121" name="Imagem 121" descr="Quadro 21 · A sala 204"/>
-                  <wp:cNvGraphicFramePr>
-                    <a:graphicFrameLocks noChangeAspect="1"/>
-                  </wp:cNvGraphicFramePr>
-                  <a:graphic>
-                    <a:graphicData uri="http://schemas.openxmlformats.org/drawingml/2006/picture">
-                      <pic:pic>
-                        <pic:nvPicPr>
-                          <pic:cNvPr id="121" name="imagem21.png"/>
-                          <pic:cNvPicPr/>
-                        </pic:nvPicPr>
-                        <pic:blipFill>
-                          <a:blip r:embed="rIdImg21"/>
-                          <a:stretch>
-                            <a:fillRect/>
-                          </a:stretch>
-                        </pic:blipFill>
-                        <pic:spPr>
-                          <a:xfrm>
-                            <a:off x="0" y="0"/>
-                            <a:ext cx="2739390" cy="1540906"/>
-                          </a:xfrm>
-                          <a:prstGeom prst="rect">
-                            <a:avLst/>
-                          </a:prstGeom>
-                        </pic:spPr>
-                      </pic:pic>
-                    </a:graphicData>
-                  </a:graphic>
-                </wp:inline>
-              </w:drawing>
-            </w:r>
-          </w:p>
           <w:p>
             <w:pPr>
               <w:spacing w:after="40" w:before="0" w:line="240" w:lineRule="auto"/>
@@ -13546,52 +12580,6 @@
           </w:tcPr>
           <w:p>
             <w:pPr>
-              <w:spacing w:after="60" w:before="0" w:line="240" w:lineRule="auto"/>
-              <w:jc w:val="center"/>
-              <w:rPr/>
-            </w:pPr>
-            <w:r>
-              <w:rPr>
-                <w:noProof/>
-              </w:rPr>
-              <w:drawing>
-                <wp:inline distT="0" distB="0" distL="0" distR="0">
-                  <wp:extent cx="2740025" cy="1541264"/>
-                  <wp:docPr id="122" name="Imagem 122" descr="Quadro 22 · A Sentinela"/>
-                  <wp:cNvGraphicFramePr>
-                    <a:graphicFrameLocks noChangeAspect="1"/>
-                  </wp:cNvGraphicFramePr>
-                  <a:graphic>
-                    <a:graphicData uri="http://schemas.openxmlformats.org/drawingml/2006/picture">
-                      <pic:pic>
-                        <pic:nvPicPr>
-                          <pic:cNvPr id="122" name="imagem22.png"/>
-                          <pic:cNvPicPr/>
-                        </pic:nvPicPr>
-                        <pic:blipFill>
-                          <a:blip r:embed="rIdImg22"/>
-                          <a:stretch>
-                            <a:fillRect/>
-                          </a:stretch>
-                        </pic:blipFill>
-                        <pic:spPr>
-                          <a:xfrm>
-                            <a:off x="0" y="0"/>
-                            <a:ext cx="2740025" cy="1541264"/>
-                          </a:xfrm>
-                          <a:prstGeom prst="rect">
-                            <a:avLst/>
-                          </a:prstGeom>
-                        </pic:spPr>
-                      </pic:pic>
-                    </a:graphicData>
-                  </a:graphic>
-                </wp:inline>
-              </w:drawing>
-            </w:r>
-          </w:p>
-          <w:p>
-            <w:pPr>
               <w:spacing w:after="40" w:before="0" w:line="240" w:lineRule="auto"/>
               <w:rPr/>
             </w:pPr>
@@ -13679,52 +12667,6 @@
           <w:tcPr>
             <w:tcW w:w="4514" w:type="dxa"/>
           </w:tcPr>
-          <w:p>
-            <w:pPr>
-              <w:spacing w:after="60" w:before="0" w:line="240" w:lineRule="auto"/>
-              <w:jc w:val="center"/>
-              <w:rPr/>
-            </w:pPr>
-            <w:r>
-              <w:rPr>
-                <w:noProof/>
-              </w:rPr>
-              <w:drawing>
-                <wp:inline distT="0" distB="0" distL="0" distR="0">
-                  <wp:extent cx="2739390" cy="1540906"/>
-                  <wp:docPr id="123" name="Imagem 123" descr="Quadro 23 · A oficina do Zane"/>
-                  <wp:cNvGraphicFramePr>
-                    <a:graphicFrameLocks noChangeAspect="1"/>
-                  </wp:cNvGraphicFramePr>
-                  <a:graphic>
-                    <a:graphicData uri="http://schemas.openxmlformats.org/drawingml/2006/picture">
-                      <pic:pic>
-                        <pic:nvPicPr>
-                          <pic:cNvPr id="123" name="imagem23.png"/>
-                          <pic:cNvPicPr/>
-                        </pic:nvPicPr>
-                        <pic:blipFill>
-                          <a:blip r:embed="rIdImg23"/>
-                          <a:stretch>
-                            <a:fillRect/>
-                          </a:stretch>
-                        </pic:blipFill>
-                        <pic:spPr>
-                          <a:xfrm>
-                            <a:off x="0" y="0"/>
-                            <a:ext cx="2739390" cy="1540906"/>
-                          </a:xfrm>
-                          <a:prstGeom prst="rect">
-                            <a:avLst/>
-                          </a:prstGeom>
-                        </pic:spPr>
-                      </pic:pic>
-                    </a:graphicData>
-                  </a:graphic>
-                </wp:inline>
-              </w:drawing>
-            </w:r>
-          </w:p>
           <w:p>
             <w:pPr>
               <w:spacing w:after="40" w:before="0" w:line="240" w:lineRule="auto"/>
@@ -13868,52 +12810,6 @@
           </w:tcPr>
           <w:p>
             <w:pPr>
-              <w:spacing w:after="60" w:before="0" w:line="240" w:lineRule="auto"/>
-              <w:jc w:val="center"/>
-              <w:rPr/>
-            </w:pPr>
-            <w:r>
-              <w:rPr>
-                <w:noProof/>
-              </w:rPr>
-              <w:drawing>
-                <wp:inline distT="0" distB="0" distL="0" distR="0">
-                  <wp:extent cx="2740025" cy="1541264"/>
-                  <wp:docPr id="124" name="Imagem 124" descr="Quadro 24 · A entrada do Bunker"/>
-                  <wp:cNvGraphicFramePr>
-                    <a:graphicFrameLocks noChangeAspect="1"/>
-                  </wp:cNvGraphicFramePr>
-                  <a:graphic>
-                    <a:graphicData uri="http://schemas.openxmlformats.org/drawingml/2006/picture">
-                      <pic:pic>
-                        <pic:nvPicPr>
-                          <pic:cNvPr id="124" name="imagem24.png"/>
-                          <pic:cNvPicPr/>
-                        </pic:nvPicPr>
-                        <pic:blipFill>
-                          <a:blip r:embed="rIdImg24"/>
-                          <a:stretch>
-                            <a:fillRect/>
-                          </a:stretch>
-                        </pic:blipFill>
-                        <pic:spPr>
-                          <a:xfrm>
-                            <a:off x="0" y="0"/>
-                            <a:ext cx="2740025" cy="1541264"/>
-                          </a:xfrm>
-                          <a:prstGeom prst="rect">
-                            <a:avLst/>
-                          </a:prstGeom>
-                        </pic:spPr>
-                      </pic:pic>
-                    </a:graphicData>
-                  </a:graphic>
-                </wp:inline>
-              </w:drawing>
-            </w:r>
-          </w:p>
-          <w:p>
-            <w:pPr>
               <w:spacing w:after="40" w:before="0" w:line="240" w:lineRule="auto"/>
               <w:rPr/>
             </w:pPr>
@@ -14001,52 +12897,6 @@
           <w:tcPr>
             <w:tcW w:w="4514" w:type="dxa"/>
           </w:tcPr>
-          <w:p>
-            <w:pPr>
-              <w:spacing w:after="60" w:before="0" w:line="240" w:lineRule="auto"/>
-              <w:jc w:val="center"/>
-              <w:rPr/>
-            </w:pPr>
-            <w:r>
-              <w:rPr>
-                <w:noProof/>
-              </w:rPr>
-              <w:drawing>
-                <wp:inline distT="0" distB="0" distL="0" distR="0">
-                  <wp:extent cx="2739390" cy="1540906"/>
-                  <wp:docPr id="125" name="Imagem 125" descr="Quadro 25 · A sala de dados"/>
-                  <wp:cNvGraphicFramePr>
-                    <a:graphicFrameLocks noChangeAspect="1"/>
-                  </wp:cNvGraphicFramePr>
-                  <a:graphic>
-                    <a:graphicData uri="http://schemas.openxmlformats.org/drawingml/2006/picture">
-                      <pic:pic>
-                        <pic:nvPicPr>
-                          <pic:cNvPr id="125" name="imagem25.png"/>
-                          <pic:cNvPicPr/>
-                        </pic:nvPicPr>
-                        <pic:blipFill>
-                          <a:blip r:embed="rIdImg25"/>
-                          <a:stretch>
-                            <a:fillRect/>
-                          </a:stretch>
-                        </pic:blipFill>
-                        <pic:spPr>
-                          <a:xfrm>
-                            <a:off x="0" y="0"/>
-                            <a:ext cx="2739390" cy="1540906"/>
-                          </a:xfrm>
-                          <a:prstGeom prst="rect">
-                            <a:avLst/>
-                          </a:prstGeom>
-                        </pic:spPr>
-                      </pic:pic>
-                    </a:graphicData>
-                  </a:graphic>
-                </wp:inline>
-              </w:drawing>
-            </w:r>
-          </w:p>
           <w:p>
             <w:pPr>
               <w:spacing w:after="40" w:before="0" w:line="240" w:lineRule="auto"/>
@@ -14191,52 +13041,6 @@
           </w:tcPr>
           <w:p>
             <w:pPr>
-              <w:spacing w:after="60" w:before="0" w:line="240" w:lineRule="auto"/>
-              <w:jc w:val="center"/>
-              <w:rPr/>
-            </w:pPr>
-            <w:r>
-              <w:rPr>
-                <w:noProof/>
-              </w:rPr>
-              <w:drawing>
-                <wp:inline distT="0" distB="0" distL="0" distR="0">
-                  <wp:extent cx="3937000" cy="822656"/>
-                  <wp:docPr id="126" name="Imagem 126" descr="Quadro 26 · O elenco"/>
-                  <wp:cNvGraphicFramePr>
-                    <a:graphicFrameLocks noChangeAspect="1"/>
-                  </wp:cNvGraphicFramePr>
-                  <a:graphic>
-                    <a:graphicData uri="http://schemas.openxmlformats.org/drawingml/2006/picture">
-                      <pic:pic>
-                        <pic:nvPicPr>
-                          <pic:cNvPr id="126" name="imagem26.png"/>
-                          <pic:cNvPicPr/>
-                        </pic:nvPicPr>
-                        <pic:blipFill>
-                          <a:blip r:embed="rIdImg26"/>
-                          <a:stretch>
-                            <a:fillRect/>
-                          </a:stretch>
-                        </pic:blipFill>
-                        <pic:spPr>
-                          <a:xfrm>
-                            <a:off x="0" y="0"/>
-                            <a:ext cx="3937000" cy="822656"/>
-                          </a:xfrm>
-                          <a:prstGeom prst="rect">
-                            <a:avLst/>
-                          </a:prstGeom>
-                        </pic:spPr>
-                      </pic:pic>
-                    </a:graphicData>
-                  </a:graphic>
-                </wp:inline>
-              </w:drawing>
-            </w:r>
-          </w:p>
-          <w:p>
-            <w:pPr>
               <w:spacing w:after="40" w:before="0" w:line="240" w:lineRule="auto"/>
               <w:rPr/>
             </w:pPr>
@@ -14330,52 +13134,6 @@
             <w:tcW w:w="9029" w:type="dxa"/>
             <w:gridSpan w:val="2"/>
           </w:tcPr>
-          <w:p>
-            <w:pPr>
-              <w:spacing w:after="60" w:before="0" w:line="240" w:lineRule="auto"/>
-              <w:jc w:val="center"/>
-              <w:rPr/>
-            </w:pPr>
-            <w:r>
-              <w:rPr>
-                <w:noProof/>
-              </w:rPr>
-              <w:drawing>
-                <wp:inline distT="0" distB="0" distL="0" distR="0">
-                  <wp:extent cx="3937000" cy="2331442"/>
-                  <wp:docPr id="127" name="Imagem 127" descr="Quadro 27 · Os robôs"/>
-                  <wp:cNvGraphicFramePr>
-                    <a:graphicFrameLocks noChangeAspect="1"/>
-                  </wp:cNvGraphicFramePr>
-                  <a:graphic>
-                    <a:graphicData uri="http://schemas.openxmlformats.org/drawingml/2006/picture">
-                      <pic:pic>
-                        <pic:nvPicPr>
-                          <pic:cNvPr id="127" name="imagem27.png"/>
-                          <pic:cNvPicPr/>
-                        </pic:nvPicPr>
-                        <pic:blipFill>
-                          <a:blip r:embed="rIdImg27"/>
-                          <a:stretch>
-                            <a:fillRect/>
-                          </a:stretch>
-                        </pic:blipFill>
-                        <pic:spPr>
-                          <a:xfrm>
-                            <a:off x="0" y="0"/>
-                            <a:ext cx="3937000" cy="2331442"/>
-                          </a:xfrm>
-                          <a:prstGeom prst="rect">
-                            <a:avLst/>
-                          </a:prstGeom>
-                        </pic:spPr>
-                      </pic:pic>
-                    </a:graphicData>
-                  </a:graphic>
-                </wp:inline>
-              </w:drawing>
-            </w:r>
-          </w:p>
           <w:p>
             <w:pPr>
               <w:spacing w:after="40" w:before="0" w:line="240" w:lineRule="auto"/>

</xml_diff>

<commit_message>
docs: alinha o GDD com a História Completa
Corrige o que contradizia a História Completa: Clarice de 1990, Diana
estagiária de arquitetura, Zane sem medo da IA e sem final decidido, robôs
patrulhando o bunker, 3 dias entre as chegadas, a ordem das fases
(Convivência, Bunker e D-Tec) e os pontos em aberto. O arquivo da história
passa a ser citado como História Completa.

Co-Authored-By: Claude Sonnet 5.5 <noreply@anthropic.com>
</commit_message>
<xml_diff>
--- a/docs/entrega/gdd_ankhor.docx
+++ b/docs/entrega/gdd_ankhor.docx
@@ -148,7 +148,7 @@
         <w:rPr>
           <w:rtl w:val="0"/>
         </w:rPr>
-        <w:t xml:space="preserve"> projeto em 15 de outubro de 2026.</w:t>
+        <w:t xml:space="preserve"> projeto em 19 de outubro de 2026.</w:t>
       </w:r>
     </w:p>
     <w:p>
@@ -181,7 +181,7 @@
         <w:rPr>
           <w:rtl w:val="0"/>
         </w:rPr>
-        <w:t xml:space="preserve"> do repositório, e a seção 9 traz o storyboard. Em caso de divergência valem, nesta ordem: o Enredo Principal (história, mundo e personagens), o registro de decisões (</w:t>
+        <w:t xml:space="preserve"> do repositório, e a seção 9 traz o storyboard. Em caso de divergência valem, nesta ordem: a História Completa (história, mundo e personagens), o registro de decisões (</w:t>
       </w:r>
       <w:r>
         <w:rPr>
@@ -371,7 +371,33 @@
         <w:rPr>
           <w:rtl w:val="0"/>
         </w:rPr>
-        <w:t xml:space="preserve">, no mesmo lugar, agora uma ruína tomada pela natureza, com a tecnologia de 3026 em volta. A humanidade foi embora para outro planeta. Ficou o </w:t>
+        <w:t xml:space="preserve">, no mesmo lugar, agora uma ruína tomada pela natureza, com a tecnologia de 3026 em volta. Os </w:t>
+      </w:r>
+      <w:r>
+        <w:rPr>
+          <w:rtl w:val="0"/>
+          <w:i/>
+        </w:rPr>
+        <w:t xml:space="preserve">Homo sideralis</w:t>
+      </w:r>
+      <w:r>
+        <w:rPr>
+          <w:rtl w:val="0"/>
+        </w:rPr>
+        <w:t xml:space="preserve">, uma espécie humana evoluída, foram embora para outro planeta, e os poucos </w:t>
+      </w:r>
+      <w:r>
+        <w:rPr>
+          <w:rtl w:val="0"/>
+          <w:i/>
+        </w:rPr>
+        <w:t xml:space="preserve">sapiens</w:t>
+      </w:r>
+      <w:r>
+        <w:rPr>
+          <w:rtl w:val="0"/>
+        </w:rPr>
+        <w:t xml:space="preserve"> que ficaram formaram uma resistência, os Faroleiros. Um deles se isolou na Unifor: o </w:t>
       </w:r>
       <w:r>
         <w:rPr>
@@ -410,7 +436,7 @@
         <w:rPr>
           <w:rtl w:val="0"/>
         </w:rPr>
-        <w:t xml:space="preserve"> no tempo no chão da Biblioteca e puxa, por acaso, quem estiver ali, em alguma época. Gabriel não é o único: outros jovens de épocas diferentes caíram com dias de diferença, e cada um tenta sobreviver num canto do campus. Os robôs, controlados pelo Carlos, caçam qualquer humano. Gabriel precisa encontrar os outros, descobrir o que aconteceu e consertar a Âncora para que todos voltem às suas épocas.</w:t>
+        <w:t xml:space="preserve"> no tempo no chão da Biblioteca e puxa, por acaso, quem estiver ali, em alguma época. Gabriel não é o único: outros jovens de épocas diferentes caíram com 3 dias de intervalo entre uma chegada e a seguinte, e cada um tenta sobreviver num canto do campus. Os robôs, controlados pelo Carlos, caçam qualquer humano. Gabriel precisa encontrar os outros, descobrir o que aconteceu e consertar a Âncora para que todos voltem às suas épocas.</w:t>
       </w:r>
     </w:p>
     <w:p>
@@ -597,13 +623,7 @@
         <w:rPr>
           <w:rtl w:val="0"/>
         </w:rPr>
-        <w:t xml:space="preserve"> </w:t>
-      </w:r>
-      <w:r>
-        <w:rPr>
-          <w:rtl w:val="0"/>
-        </w:rPr>
-        <w:t xml:space="preserve">o jogador explora as ruínas sala por sala, atrás de passagens, chaves, códigos e pistas, enquanto evita os robôs que patrulham. Andar devagar, apagar a luz e usar o cenário vale mais do que correr. O ciclo se repete em cada fase: </w:t>
+        <w:t xml:space="preserve"> o jogador explora as ruínas sala por sala, atrás de passagens, chaves, códigos e pistas, enquanto evita os robôs que patrulham. Andar devagar, apagar a luz e usar o cenário vale mais do que correr. O ciclo se repete em cada fase: </w:t>
       </w:r>
       <w:r>
         <w:rPr>
@@ -1423,7 +1443,7 @@
                 <w:szCs w:val="18"/>
                 <w:rtl w:val="0"/>
               </w:rPr>
-              <w:t xml:space="preserve">Em salas seguras, dormir salvaria o jogo em arquivo e levaria a um sonho. O salvamento em arquivo ainda não existe, e o que os sonhos mostram está em aberto no Enredo Principal.</w:t>
+              <w:t xml:space="preserve">Em salas seguras, dormir salvaria o jogo em arquivo e levaria a um sonho. O salvamento em arquivo ainda não existe, e o que os sonhos mostram está em aberto na História Completa.</w:t>
             </w:r>
           </w:p>
         </w:tc>
@@ -1477,13 +1497,7 @@
         <w:rPr>
           <w:rtl w:val="0"/>
         </w:rPr>
-        <w:t xml:space="preserve"> </w:t>
-      </w:r>
-      <w:r>
-        <w:rPr>
-          <w:rtl w:val="0"/>
-        </w:rPr>
-        <w:t xml:space="preserve">o objetivo geral é encontrar os outros que caíram na fenda, descobrir o que aconteceu e consertar a Âncora para que todos voltem às suas épocas. Para consertá-la, cada pessoa traz uma parte, e por isso toda fase tem a mesma estrutura: </w:t>
+        <w:t xml:space="preserve"> o objetivo geral é encontrar os outros que caíram na fenda, descobrir o que aconteceu e consertar a Âncora para que todos voltem às suas épocas. Para consertá-la, cada pessoa traz uma parte, e por isso toda fase tem a mesma estrutura: </w:t>
       </w:r>
       <w:r>
         <w:rPr>
@@ -1509,7 +1523,7 @@
         <w:rPr>
           <w:rtl w:val="0"/>
         </w:rPr>
-        <w:t xml:space="preserve">Dentro de cada fase, o avanço é um cadeado de dependências. Na Biblioteca, por exemplo, a saída exige, nesta ordem: lanterna, rádio, chave da manutenção, energia, terminal ligado, código da grade, grade aberta, telefone e porta de saída. Esse encadeamento é um grafo de dependências, e a ordem de solução da fase é uma ordenação topológica dele. As partes que cada personagem traz para consertar a Âncora são: as estrelas do Baltazar, a investigação da Diana, o código da Clarice, a teoria do Henrique, a tecnologia do Zane e o caderno de equações do Gabriel.</w:t>
+        <w:t xml:space="preserve">Dentro de cada fase, o avanço é um cadeado de dependências. Na Biblioteca, por exemplo, a saída exige, nesta ordem: lanterna, rádio, chave da manutenção, energia, terminal ligado, código da grade, grade aberta, telefone e porta de saída. Esse encadeamento é um grafo de dependências, e a ordem de solução da fase é uma ordenação topológica dele. As partes que cada personagem traz para consertar a Âncora são: as estrelas do Baltazar, as plantas da Diana, o código da Clarice, a teoria do Henrique, a tecnologia do Zane e o caderno de equações do Gabriel.</w:t>
       </w:r>
     </w:p>
     <w:p>
@@ -2007,27 +2021,27 @@
                 <w:szCs w:val="18"/>
                 <w:rtl w:val="0"/>
               </w:rPr>
-              <w:t xml:space="preserve">Bunker</w:t>
+              <w:t xml:space="preserve">Centro de Convivência</w:t>
             </w:r>
           </w:p>
         </w:tc>
         <w:tc>
           <w:tcPr>
             <w:tcW w:w="1900" w:type="dxa"/>
-            <w:shd w:val="clear" w:color="auto" w:fill="FFF2CC"/>
-          </w:tcPr>
-          <w:p>
-            <w:pPr>
-              <w:spacing w:after="40" w:before="0" w:line="240" w:lineRule="auto"/>
-              <w:rPr/>
-            </w:pPr>
-            <w:r>
-              <w:rPr>
-                <w:sz w:val="18"/>
-                <w:szCs w:val="18"/>
-                <w:rtl w:val="0"/>
-              </w:rPr>
-              <w:t xml:space="preserve">Em desenvolvimento</w:t>
+            <w:shd w:val="clear" w:color="auto" w:fill="E2EFDA"/>
+          </w:tcPr>
+          <w:p>
+            <w:pPr>
+              <w:spacing w:after="40" w:before="0" w:line="240" w:lineRule="auto"/>
+              <w:rPr/>
+            </w:pPr>
+            <w:r>
+              <w:rPr>
+                <w:sz w:val="18"/>
+                <w:szCs w:val="18"/>
+                <w:rtl w:val="0"/>
+              </w:rPr>
+              <w:t xml:space="preserve">Jogável</w:t>
             </w:r>
           </w:p>
         </w:tc>
@@ -2046,7 +2060,7 @@
                 <w:szCs w:val="18"/>
                 <w:rtl w:val="0"/>
               </w:rPr>
-              <w:t xml:space="preserve">Esconderijo sob o núcleo da Âncora. O setor B está lacrado, e seis portas servem de gancho para as próximas fases. A posição dele na ordem é provisória.</w:t>
+              <w:t xml:space="preserve">Atravessa a praça de alimentação sob a cúpula de vidro, acha a célula de energia na câmara fria, resolve o puzzle de coloração de grafos na cozinha e usa o elevador de carga que desce para o Bunker.</w:t>
             </w:r>
           </w:p>
         </w:tc>
@@ -2065,7 +2079,7 @@
                 <w:szCs w:val="18"/>
                 <w:rtl w:val="0"/>
               </w:rPr>
-              <w:t xml:space="preserve">Henrique (sala de dados)</w:t>
+              <w:t xml:space="preserve">Zane (pelo rádio)</w:t>
             </w:r>
           </w:p>
         </w:tc>
@@ -2089,7 +2103,7 @@
                 <w:szCs w:val="18"/>
                 <w:rtl w:val="0"/>
               </w:rPr>
-              <w:t xml:space="preserve">—</w:t>
+              <w:t xml:space="preserve">5</w:t>
             </w:r>
           </w:p>
         </w:tc>
@@ -2108,27 +2122,27 @@
                 <w:szCs w:val="18"/>
                 <w:rtl w:val="0"/>
               </w:rPr>
-              <w:t xml:space="preserve">Centro de Convivência, D-Tec</w:t>
+              <w:t xml:space="preserve">Bunker</w:t>
             </w:r>
           </w:p>
         </w:tc>
         <w:tc>
           <w:tcPr>
             <w:tcW w:w="1900" w:type="dxa"/>
-            <w:shd w:val="clear" w:color="auto" w:fill="FCE4D6"/>
-          </w:tcPr>
-          <w:p>
-            <w:pPr>
-              <w:spacing w:after="40" w:before="0" w:line="240" w:lineRule="auto"/>
-              <w:rPr/>
-            </w:pPr>
-            <w:r>
-              <w:rPr>
-                <w:sz w:val="18"/>
-                <w:szCs w:val="18"/>
-                <w:rtl w:val="0"/>
-              </w:rPr>
-              <w:t xml:space="preserve">Em aberto</w:t>
+            <w:shd w:val="clear" w:color="auto" w:fill="FFF2CC"/>
+          </w:tcPr>
+          <w:p>
+            <w:pPr>
+              <w:spacing w:after="40" w:before="0" w:line="240" w:lineRule="auto"/>
+              <w:rPr/>
+            </w:pPr>
+            <w:r>
+              <w:rPr>
+                <w:sz w:val="18"/>
+                <w:szCs w:val="18"/>
+                <w:rtl w:val="0"/>
+              </w:rPr>
+              <w:t xml:space="preserve">Em desenvolvimento</w:t>
             </w:r>
           </w:p>
         </w:tc>
@@ -2147,7 +2161,108 @@
                 <w:szCs w:val="18"/>
                 <w:rtl w:val="0"/>
               </w:rPr>
-              <w:t xml:space="preserve">Sem lugar na ordem das fases e sem objetivo definido. O D-Tec é onde fica o Carlos e a Âncora; como o grupo o enfrenta sem lutar está em aberto.</w:t>
+              <w:t xml:space="preserve">Esconderijo sob o núcleo da Âncora. O setor B está lacrado, e a comporta do núcleo, no fim dele, leva ao Laboratório (D-Tec).</w:t>
+            </w:r>
+          </w:p>
+        </w:tc>
+        <w:tc>
+          <w:tcPr>
+            <w:tcW w:w="1900" w:type="dxa"/>
+          </w:tcPr>
+          <w:p>
+            <w:pPr>
+              <w:spacing w:after="40" w:before="0" w:line="240" w:lineRule="auto"/>
+              <w:rPr/>
+            </w:pPr>
+            <w:r>
+              <w:rPr>
+                <w:sz w:val="18"/>
+                <w:szCs w:val="18"/>
+                <w:rtl w:val="0"/>
+              </w:rPr>
+              <w:t xml:space="preserve">Henrique (sala de dados)</w:t>
+            </w:r>
+          </w:p>
+        </w:tc>
+      </w:tr>
+      <w:tr>
+        <w:trPr>
+          <w:cantSplit/>
+        </w:trPr>
+        <w:tc>
+          <w:tcPr>
+            <w:tcW w:w="600" w:type="dxa"/>
+          </w:tcPr>
+          <w:p>
+            <w:pPr>
+              <w:spacing w:after="40" w:before="0" w:line="240" w:lineRule="auto"/>
+              <w:rPr/>
+            </w:pPr>
+            <w:r>
+              <w:rPr>
+                <w:sz w:val="18"/>
+                <w:szCs w:val="18"/>
+                <w:rtl w:val="0"/>
+              </w:rPr>
+              <w:t xml:space="preserve">6</w:t>
+            </w:r>
+          </w:p>
+        </w:tc>
+        <w:tc>
+          <w:tcPr>
+            <w:tcW w:w="1500" w:type="dxa"/>
+          </w:tcPr>
+          <w:p>
+            <w:pPr>
+              <w:spacing w:after="40" w:before="0" w:line="240" w:lineRule="auto"/>
+              <w:rPr/>
+            </w:pPr>
+            <w:r>
+              <w:rPr>
+                <w:sz w:val="18"/>
+                <w:szCs w:val="18"/>
+                <w:rtl w:val="0"/>
+              </w:rPr>
+              <w:t xml:space="preserve">Laboratório (D-Tec)</w:t>
+            </w:r>
+          </w:p>
+        </w:tc>
+        <w:tc>
+          <w:tcPr>
+            <w:tcW w:w="1900" w:type="dxa"/>
+            <w:shd w:val="clear" w:color="auto" w:fill="FFF2CC"/>
+          </w:tcPr>
+          <w:p>
+            <w:pPr>
+              <w:spacing w:after="40" w:before="0" w:line="240" w:lineRule="auto"/>
+              <w:rPr/>
+            </w:pPr>
+            <w:r>
+              <w:rPr>
+                <w:sz w:val="18"/>
+                <w:szCs w:val="18"/>
+                <w:rtl w:val="0"/>
+              </w:rPr>
+              <w:t xml:space="preserve">Em desenvolvimento</w:t>
+            </w:r>
+          </w:p>
+        </w:tc>
+        <w:tc>
+          <w:tcPr>
+            <w:tcW w:w="3129" w:type="dxa"/>
+          </w:tcPr>
+          <w:p>
+            <w:pPr>
+              <w:spacing w:after="40" w:before="0" w:line="240" w:lineRule="auto"/>
+              <w:rPr/>
+            </w:pPr>
+            <w:r>
+              <w:rPr>
+                <w:sz w:val="18"/>
+                <w:szCs w:val="18"/>
+                <w:rtl w:val="0"/>
+              </w:rPr>
+              <w:t xml:space="preserve">Laboratório de tecnologia, com a máquina central: a Âncora. É onde fica o Carlos. Como o grupo o enfrenta sem lutar está em aberto.</w:t>
             </w:r>
           </w:p>
         </w:tc>
@@ -2200,13 +2315,7 @@
         <w:rPr>
           <w:rtl w:val="0"/>
         </w:rPr>
-        <w:t xml:space="preserve"> </w:t>
-      </w:r>
-      <w:r>
-        <w:rPr>
-          <w:rtl w:val="0"/>
-        </w:rPr>
-        <w:t xml:space="preserve">o jogador não ganha pontos; ganha acesso, recursos e verdade.</w:t>
+        <w:t xml:space="preserve"> o jogador não ganha pontos; ganha acesso, recursos e verdade.</w:t>
       </w:r>
     </w:p>
     <w:p>
@@ -3203,7 +3312,7 @@
                 <w:szCs w:val="18"/>
                 <w:rtl w:val="0"/>
               </w:rPr>
-              <w:t xml:space="preserve">Previsto para gerar a grade horária das rondas (turmas que dividem sala ou professor não podem ter o mesmo horário). Hoje a patrulha usa só a cadeia de Markov, e a origem da grade está em aberto no Enredo Principal.</w:t>
+              <w:t xml:space="preserve">Puzzle do Centro de Convivência: o quadro de comutação da cozinha pede colorir um grafo de quatro setores com três fases, sem que setores vizinhos repitam a fase. Previsto também para gerar a grade horária das rondas (turmas que dividem sala ou professor não podem ter o mesmo horário); hoje a patrulha usa só a cadeia de Markov, e a origem da grade ainda não está decidida.</w:t>
             </w:r>
           </w:p>
         </w:tc>
@@ -3223,7 +3332,7 @@
                 <w:szCs w:val="18"/>
                 <w:rtl w:val="0"/>
               </w:rPr>
-              <w:t xml:space="preserve">Em aberto</w:t>
+              <w:t xml:space="preserve">Parcial</w:t>
             </w:r>
           </w:p>
         </w:tc>
@@ -3354,13 +3463,33 @@
         <w:rPr>
           <w:rtl w:val="0"/>
         </w:rPr>
-        <w:t xml:space="preserve"> </w:t>
-      </w:r>
-      <w:r>
-        <w:rPr>
-          <w:rtl w:val="0"/>
-        </w:rPr>
-        <w:t xml:space="preserve">o campus da Unifor, em Fortaleza, no ano de 3026. A Terra ficou tão ruim que o pouco que sobrou da humanidade foi embora para outro planeta, e em algum momento a Unifor virou um centro de pesquisa em física do tempo.</w:t>
+        <w:t xml:space="preserve"> o campus da Unifor, em Fortaleza, no ano de 3026. A Terra ficou tão ruim que a humanidade se dividiu: os </w:t>
+      </w:r>
+      <w:r>
+        <w:rPr>
+          <w:rtl w:val="0"/>
+          <w:i/>
+        </w:rPr>
+        <w:t xml:space="preserve">Homo sideralis</w:t>
+      </w:r>
+      <w:r>
+        <w:rPr>
+          <w:rtl w:val="0"/>
+        </w:rPr>
+        <w:t xml:space="preserve">, uma espécie humana evoluída, foram embora para outro planeta, e os poucos </w:t>
+      </w:r>
+      <w:r>
+        <w:rPr>
+          <w:rtl w:val="0"/>
+          <w:i/>
+        </w:rPr>
+        <w:t xml:space="preserve">sapiens</w:t>
+      </w:r>
+      <w:r>
+        <w:rPr>
+          <w:rtl w:val="0"/>
+        </w:rPr>
+        <w:t xml:space="preserve"> que ficaram formaram os Faroleiros, uma resistência que defende a Terra, longe do campus. Em algum momento a Unifor virou um centro de pesquisa em física do tempo.</w:t>
       </w:r>
     </w:p>
     <w:p>
@@ -3481,13 +3610,7 @@
         <w:rPr>
           <w:rtl w:val="0"/>
         </w:rPr>
-        <w:t xml:space="preserve"> </w:t>
-      </w:r>
-      <w:r>
-        <w:rPr>
-          <w:rtl w:val="0"/>
-        </w:rPr>
-        <w:t xml:space="preserve">Gabriel acorda em 3026, descobre que não está sozinho e passa o jogo encontrando, uma a uma, as pessoas puxadas pela fenda. No caminho descobre que um deles é seu antepassado, que outro mente para o grupo e que, por trás da Âncora, existe alguém. A história se conta em atos.</w:t>
+        <w:t xml:space="preserve"> Gabriel acorda em 3026, descobre que não está sozinho e passa o jogo encontrando, uma a uma, as pessoas puxadas pela fenda. No caminho descobre que um deles é seu antepassado, que outro mente para o grupo e que, por trás da Âncora, existe alguém. A história se conta em atos.</w:t>
       </w:r>
     </w:p>
     <w:p>
@@ -3710,7 +3833,7 @@
                 <w:szCs w:val="18"/>
                 <w:rtl w:val="0"/>
               </w:rPr>
-              <w:t xml:space="preserve">(Bloco de salas, Labirinto e outras áreas)</w:t>
+              <w:t xml:space="preserve">(Bloco de salas, Labirinto e Centro de Convivência)</w:t>
             </w:r>
           </w:p>
         </w:tc>
@@ -3729,7 +3852,7 @@
                 <w:szCs w:val="18"/>
                 <w:rtl w:val="0"/>
               </w:rPr>
-              <w:t xml:space="preserve">Cada fase leva a uma pessoa e ao esconderijo dela. Gabriel ganha a confiança da Clarice na sala 103 e recebe a ajuda do Zane no Labirinto. Em algum ponto encontra o Baltazar e descobre o parentesco pelo anel.</w:t>
+              <w:t xml:space="preserve">Cada fase leva a uma pessoa e ao esconderijo dela. Gabriel ganha a confiança da Clarice na sala 103 e recebe a ajuda do Zane no Labirinto e, depois, pelo rádio no Centro de Convivência. Em algum ponto encontra o Baltazar e descobre o parentesco pelo anel.</w:t>
             </w:r>
           </w:p>
         </w:tc>
@@ -3806,7 +3929,7 @@
                 <w:szCs w:val="18"/>
                 <w:rtl w:val="0"/>
               </w:rPr>
-              <w:t xml:space="preserve">O maior e mais seguro esconderijo, sob o núcleo da Âncora, onde os robôs não descem. O Henrique fica na sala de dados, com as câmeras do campus.</w:t>
+              <w:t xml:space="preserve">Esconderijo sob o núcleo da Âncora, difícil de alcançar, onde os robôs também patrulham. O Henrique fica sozinho numa sala de dados trancada, com as câmeras do campus.</w:t>
             </w:r>
           </w:p>
         </w:tc>
@@ -3883,7 +4006,7 @@
                 <w:szCs w:val="18"/>
                 <w:rtl w:val="0"/>
               </w:rPr>
-              <w:t xml:space="preserve">O Henrique esconde a ligação que tem com o Carlos. Quando o grupo descobre, todos vão atrás do Carlos, no D-Tec.</w:t>
+              <w:t xml:space="preserve">O Henrique trabalha para o Carlos, que prometeu levá-lo para antes da morte da mãe dele, e atrasa os outros enquanto finge consertar tudo. Ele esconde essa ligação. Quando o grupo descobre, todos vão atrás do Carlos, no D-Tec.</w:t>
             </w:r>
           </w:p>
         </w:tc>
@@ -3960,7 +4083,7 @@
                 <w:szCs w:val="18"/>
                 <w:rtl w:val="0"/>
               </w:rPr>
-              <w:t xml:space="preserve">Com as partes reunidas, o grupo tenta consertar a Âncora e mandar cada um à sua noite. O Baltazar quer ficar, mas Gabriel o convence a voltar para 1750. O Zane escolhe ficar em 3026, o que depende de a IA continuar existindo. Como o grupo enfrenta o Carlos sem lutar e como o jogo termina está em aberto.</w:t>
+              <w:t xml:space="preserve">Com as partes reunidas, o grupo tenta consertar a Âncora e mandar cada um à sua noite. O Baltazar quer ficar, mas Gabriel o convence a voltar para 1750. O final do Zane está em aberto. Como o grupo enfrenta o Carlos sem lutar e como o jogo termina está em aberto.</w:t>
             </w:r>
           </w:p>
         </w:tc>
@@ -4417,7 +4540,7 @@
                 <w:szCs w:val="18"/>
                 <w:rtl w:val="0"/>
               </w:rPr>
-              <w:t xml:space="preserve">Recruta da polícia. Dramática, ansiosa e impulsiva; vive cada minuto como se fosse o último.</w:t>
+              <w:t xml:space="preserve">Estagiária de arquitetura na obra do campus. Dramática, ansiosa e impulsiva; vive cada minuto como se fosse o último.</w:t>
             </w:r>
           </w:p>
         </w:tc>
@@ -4436,7 +4559,7 @@
                 <w:szCs w:val="18"/>
                 <w:rtl w:val="0"/>
               </w:rPr>
-              <w:t xml:space="preserve">Traz a investigação: onde fica o núcleo e as passagens até ele.</w:t>
+              <w:t xml:space="preserve">Traz as plantas: conhece as galerias de 1978, que não aparecem nos mapas de 3026, e descobre por elas onde fica o núcleo e as passagens até ele.</w:t>
             </w:r>
           </w:p>
         </w:tc>
@@ -4479,7 +4602,7 @@
                 <w:szCs w:val="18"/>
                 <w:rtl w:val="0"/>
               </w:rPr>
-              <w:t xml:space="preserve">1994</w:t>
+              <w:t xml:space="preserve">1990</w:t>
             </w:r>
           </w:p>
         </w:tc>
@@ -4717,7 +4840,7 @@
                 <w:szCs w:val="18"/>
                 <w:rtl w:val="0"/>
               </w:rPr>
-              <w:t xml:space="preserve">Jovem com implantes cibernéticos. Confiante e elétrico; confia demais na tecnologia e teme a IA.</w:t>
+              <w:t xml:space="preserve">Jovem com implantes cibernéticos. Confiante e elétrico; confia demais na tecnologia.</w:t>
             </w:r>
           </w:p>
         </w:tc>
@@ -4991,7 +5114,7 @@
         <w:rPr>
           <w:rtl w:val="0"/>
         </w:rPr>
-        <w:t xml:space="preserve">Todos os puxados têm cerca de 20 anos, estão vivos e têm alguma ligação com a região da Unifor. Chegaram com dias de diferença: o Henrique foi o primeiro e o Gabriel é o último. As fichas completas de cada personagem (personalidade, relações, arco) estão em </w:t>
+        <w:t xml:space="preserve">Todos os puxados têm cerca de 20 anos, estão vivos e têm alguma ligação com a região da Unifor. Chegaram com 3 dias de intervalo entre uma chegada e a seguinte: o Henrique foi o primeiro e o Gabriel é o último. As fichas completas de cada personagem (personalidade, relações, arco) estão em </w:t>
       </w:r>
       <w:r>
         <w:rPr>
@@ -5029,13 +5152,7 @@
         <w:rPr>
           <w:rtl w:val="0"/>
         </w:rPr>
-        <w:t xml:space="preserve"> </w:t>
-      </w:r>
-      <w:r>
-        <w:rPr>
-          <w:rtl w:val="0"/>
-        </w:rPr>
-        <w:t xml:space="preserve">o mundo de Ankhor se explica por poucas peças, descobertas aos poucos.</w:t>
+        <w:t xml:space="preserve"> o mundo de Ankhor se explica por poucas peças, descobertas aos poucos.</w:t>
       </w:r>
     </w:p>
     <w:p>
@@ -5083,7 +5200,7 @@
         <w:rPr>
           <w:rtl w:val="0"/>
         </w:rPr>
-        <w:t xml:space="preserve"> abre sempre no mesmo ponto, o chão onde fica a Biblioteca. Pulsa a cada tentativa do Carlos, encosta numa época diferente e puxa quem estiver ali. É acaso: as pessoas estavam no lugar errado na noite errada. A cada pulso fica maior.</w:t>
+        <w:t xml:space="preserve"> abre sempre no mesmo ponto, o chão onde fica a Biblioteca. Pulsa a cada tentativa do Carlos, a cada 3 dias, encosta numa época diferente e puxa quem estiver ali. É acaso: as pessoas estavam no lugar errado na noite errada. A cada pulso fica maior.</w:t>
       </w:r>
     </w:p>
     <w:p>
@@ -5210,7 +5327,7 @@
         <w:rPr>
           <w:rtl w:val="0"/>
         </w:rPr>
-        <w:t xml:space="preserve">O Carlos: como obtém o conhecimento que falta à Âncora, se existe uma IA e qual a relação dela com ele, por que os robôs caçam e quando o jogador descobre que ele existe.</w:t>
+        <w:t xml:space="preserve">O Carlos: como obtém o conhecimento que falta à Âncora, quantas ferramentas de IA ele usa e o que cada uma faz, por que os robôs caçam e quando o jogador descobre que ele existe.</w:t>
       </w:r>
     </w:p>
     <w:p>
@@ -5227,7 +5344,7 @@
         <w:rPr>
           <w:rtl w:val="0"/>
         </w:rPr>
-        <w:t xml:space="preserve">A mentira do Henrique: se trabalha para o Carlos ou foi enganado por ele, o que esconde e como o grupo descobre.</w:t>
+        <w:t xml:space="preserve">A mentira do Henrique: como e quando o grupo a descobre e o que ele faz depois (já está decidido que ele trabalha para o Carlos).</w:t>
       </w:r>
     </w:p>
     <w:p>
@@ -5261,7 +5378,7 @@
         <w:rPr>
           <w:rtl w:val="0"/>
         </w:rPr>
-        <w:t xml:space="preserve">A ordem das fases depois do Labirinto (Bunker, Centro de Convivência, D-Tec) e a sala da Biblioteca onde o Baltazar se esconde.</w:t>
+        <w:t xml:space="preserve">A posição do Baltazar na ordem de chegada e a sala da Biblioteca onde ele se esconde.</w:t>
       </w:r>
     </w:p>
     <w:p>
@@ -5328,13 +5445,7 @@
         <w:rPr>
           <w:rtl w:val="0"/>
         </w:rPr>
-        <w:t xml:space="preserve"> </w:t>
-      </w:r>
-      <w:r>
-        <w:rPr>
-          <w:rtl w:val="0"/>
-        </w:rPr>
-        <w:t xml:space="preserve">o jogo é um campus contínuo modelado como um grafo. Cada fase é um conjunto de salas (uma cena por sala) ligadas por portas, e cada porta é uma aresta que pode ter condição: chave, energia, código ou hack. Áreas já visitadas continuam acessíveis, e voltar a elas faz parte do jogo, como em Resident Evil.</w:t>
+        <w:t xml:space="preserve"> o jogo é um campus contínuo modelado como um grafo. Cada fase é um conjunto de salas (uma cena por sala) ligadas por portas, e cada porta é uma aresta que pode ter condição: chave, energia, código ou hack. Áreas já visitadas continuam acessíveis, e voltar a elas faz parte do jogo, como em Resident Evil.</w:t>
       </w:r>
     </w:p>
     <w:p>
@@ -5826,6 +5937,107 @@
                 <w:szCs w:val="18"/>
                 <w:rtl w:val="0"/>
               </w:rPr>
+              <w:t xml:space="preserve">Centro de Convivência</w:t>
+            </w:r>
+          </w:p>
+        </w:tc>
+        <w:tc>
+          <w:tcPr>
+            <w:tcW w:w="1900" w:type="dxa"/>
+            <w:shd w:val="clear" w:color="auto" w:fill="E2EFDA"/>
+          </w:tcPr>
+          <w:p>
+            <w:pPr>
+              <w:spacing w:after="40" w:before="0" w:line="240" w:lineRule="auto"/>
+              <w:rPr/>
+            </w:pPr>
+            <w:r>
+              <w:rPr>
+                <w:sz w:val="18"/>
+                <w:szCs w:val="18"/>
+                <w:rtl w:val="0"/>
+              </w:rPr>
+              <w:t xml:space="preserve">Jogável</w:t>
+            </w:r>
+          </w:p>
+        </w:tc>
+        <w:tc>
+          <w:tcPr>
+            <w:tcW w:w="2629" w:type="dxa"/>
+          </w:tcPr>
+          <w:p>
+            <w:pPr>
+              <w:spacing w:after="40" w:before="0" w:line="240" w:lineRule="auto"/>
+              <w:rPr/>
+            </w:pPr>
+            <w:r>
+              <w:rPr>
+                <w:sz w:val="18"/>
+                <w:szCs w:val="18"/>
+                <w:rtl w:val="0"/>
+              </w:rPr>
+              <w:t xml:space="preserve">Praça de alimentação em arco, com quatro restaurantes, e um mezanino opcional com gráfica, loja da universidade e cinema (12 salas).</w:t>
+            </w:r>
+          </w:p>
+        </w:tc>
+        <w:tc>
+          <w:tcPr>
+            <w:tcW w:w="1500" w:type="dxa"/>
+          </w:tcPr>
+          <w:p>
+            <w:pPr>
+              <w:spacing w:after="40" w:before="0" w:line="240" w:lineRule="auto"/>
+              <w:rPr/>
+            </w:pPr>
+            <w:r>
+              <w:rPr>
+                <w:sz w:val="18"/>
+                <w:szCs w:val="18"/>
+                <w:rtl w:val="0"/>
+              </w:rPr>
+              <w:t xml:space="preserve">Sentinelas e Rastreadores</w:t>
+            </w:r>
+          </w:p>
+        </w:tc>
+        <w:tc>
+          <w:tcPr>
+            <w:tcW w:w="1500" w:type="dxa"/>
+          </w:tcPr>
+          <w:p>
+            <w:pPr>
+              <w:spacing w:after="40" w:before="0" w:line="240" w:lineRule="auto"/>
+              <w:rPr/>
+            </w:pPr>
+            <w:r>
+              <w:rPr>
+                <w:sz w:val="18"/>
+                <w:szCs w:val="18"/>
+                <w:rtl w:val="0"/>
+              </w:rPr>
+              <w:t xml:space="preserve">Cobertura no cenário e coloração de grafos</w:t>
+            </w:r>
+          </w:p>
+        </w:tc>
+      </w:tr>
+      <w:tr>
+        <w:trPr>
+          <w:cantSplit/>
+        </w:trPr>
+        <w:tc>
+          <w:tcPr>
+            <w:tcW w:w="1500" w:type="dxa"/>
+          </w:tcPr>
+          <w:p>
+            <w:pPr>
+              <w:spacing w:after="40" w:before="0" w:line="240" w:lineRule="auto"/>
+              <w:rPr/>
+            </w:pPr>
+            <w:r>
+              <w:rPr>
+                <w:sz w:val="18"/>
+                <w:szCs w:val="18"/>
+                <w:rtl w:val="0"/>
+              </w:rPr>
               <w:t xml:space="preserve">Bunker</w:t>
             </w:r>
           </w:p>
@@ -5884,7 +6096,7 @@
                 <w:szCs w:val="18"/>
                 <w:rtl w:val="0"/>
               </w:rPr>
-              <w:t xml:space="preserve">Nenhum: os robôs não descem</w:t>
+              <w:t xml:space="preserve">Nenhum ainda: a história decidiu que os robôs patrulham o bunker, mas eles não estão no jogo</w:t>
             </w:r>
           </w:p>
         </w:tc>
@@ -5904,6 +6116,107 @@
                 <w:rtl w:val="0"/>
               </w:rPr>
               <w:t xml:space="preserve">Conversa e ritmo de respiro</w:t>
+            </w:r>
+          </w:p>
+        </w:tc>
+      </w:tr>
+      <w:tr>
+        <w:trPr>
+          <w:cantSplit/>
+        </w:trPr>
+        <w:tc>
+          <w:tcPr>
+            <w:tcW w:w="1500" w:type="dxa"/>
+          </w:tcPr>
+          <w:p>
+            <w:pPr>
+              <w:spacing w:after="40" w:before="0" w:line="240" w:lineRule="auto"/>
+              <w:rPr/>
+            </w:pPr>
+            <w:r>
+              <w:rPr>
+                <w:sz w:val="18"/>
+                <w:szCs w:val="18"/>
+                <w:rtl w:val="0"/>
+              </w:rPr>
+              <w:t xml:space="preserve">Laboratório (D-Tec)</w:t>
+            </w:r>
+          </w:p>
+        </w:tc>
+        <w:tc>
+          <w:tcPr>
+            <w:tcW w:w="1900" w:type="dxa"/>
+            <w:shd w:val="clear" w:color="auto" w:fill="FFF2CC"/>
+          </w:tcPr>
+          <w:p>
+            <w:pPr>
+              <w:spacing w:after="40" w:before="0" w:line="240" w:lineRule="auto"/>
+              <w:rPr/>
+            </w:pPr>
+            <w:r>
+              <w:rPr>
+                <w:sz w:val="18"/>
+                <w:szCs w:val="18"/>
+                <w:rtl w:val="0"/>
+              </w:rPr>
+              <w:t xml:space="preserve">Em desenvolvimento</w:t>
+            </w:r>
+          </w:p>
+        </w:tc>
+        <w:tc>
+          <w:tcPr>
+            <w:tcW w:w="2629" w:type="dxa"/>
+          </w:tcPr>
+          <w:p>
+            <w:pPr>
+              <w:spacing w:after="40" w:before="0" w:line="240" w:lineRule="auto"/>
+              <w:rPr/>
+            </w:pPr>
+            <w:r>
+              <w:rPr>
+                <w:sz w:val="18"/>
+                <w:szCs w:val="18"/>
+                <w:rtl w:val="0"/>
+              </w:rPr>
+              <w:t xml:space="preserve">Laboratório com corredores, salas de laboratório e a máquina central (a Âncora).</w:t>
+            </w:r>
+          </w:p>
+        </w:tc>
+        <w:tc>
+          <w:tcPr>
+            <w:tcW w:w="1500" w:type="dxa"/>
+          </w:tcPr>
+          <w:p>
+            <w:pPr>
+              <w:spacing w:after="40" w:before="0" w:line="240" w:lineRule="auto"/>
+              <w:rPr/>
+            </w:pPr>
+            <w:r>
+              <w:rPr>
+                <w:sz w:val="18"/>
+                <w:szCs w:val="18"/>
+                <w:rtl w:val="0"/>
+              </w:rPr>
+              <w:t xml:space="preserve">A definir</w:t>
+            </w:r>
+          </w:p>
+        </w:tc>
+        <w:tc>
+          <w:tcPr>
+            <w:tcW w:w="1500" w:type="dxa"/>
+          </w:tcPr>
+          <w:p>
+            <w:pPr>
+              <w:spacing w:after="40" w:before="0" w:line="240" w:lineRule="auto"/>
+              <w:rPr/>
+            </w:pPr>
+            <w:r>
+              <w:rPr>
+                <w:sz w:val="18"/>
+                <w:szCs w:val="18"/>
+                <w:rtl w:val="0"/>
+              </w:rPr>
+              <w:t xml:space="preserve">A definir</w:t>
             </w:r>
           </w:p>
         </w:tc>
@@ -5937,13 +6250,7 @@
         <w:rPr>
           <w:rtl w:val="0"/>
         </w:rPr>
-        <w:t xml:space="preserve"> </w:t>
-      </w:r>
-      <w:r>
-        <w:rPr>
-          <w:rtl w:val="0"/>
-        </w:rPr>
-        <w:t xml:space="preserve">cada ambiente tem uma ideia própria, para não repetir, e um papel claro no ritmo do jogo.</w:t>
+        <w:t xml:space="preserve"> cada ambiente tem uma ideia própria, para não repetir, e um papel claro no ritmo do jogo.</w:t>
       </w:r>
     </w:p>
     <w:p>
@@ -6261,7 +6568,7 @@
                 <w:szCs w:val="18"/>
                 <w:rtl w:val="0"/>
               </w:rPr>
-              <w:t xml:space="preserve">Bunker</w:t>
+              <w:t xml:space="preserve">Centro de Convivência</w:t>
             </w:r>
           </w:p>
         </w:tc>
@@ -6280,7 +6587,7 @@
                 <w:szCs w:val="18"/>
                 <w:rtl w:val="0"/>
               </w:rPr>
-              <w:t xml:space="preserve">Concreto aparente em cima e tinta verde-oliva embaixo, tubos fluorescentes frios, luzes de emergência vermelhas e o setor B alagado. Portas de aço de correr e faixas de perigo.</w:t>
+              <w:t xml:space="preserve">Praça de alimentação em arco, sob uma cúpula de vidro quebrada, com quatro restaurantes, mesas, árvores e luar. O segundo andar é um mezanino com gráfica, loja da universidade e cinema.</w:t>
             </w:r>
           </w:p>
         </w:tc>
@@ -6299,7 +6606,7 @@
                 <w:szCs w:val="18"/>
                 <w:rtl w:val="0"/>
               </w:rPr>
-              <w:t xml:space="preserve">O lugar mais seguro do jogo. Reúne conversas e deixa ganchos para fases futuras (a comporta do núcleo, o laboratório, o arquivo).</w:t>
+              <w:t xml:space="preserve">Atravessar a praça à vista das Sentinelas, usando mesas, árvores e nichos como cobertura, com o Zane guiando pelo rádio. Termina no elevador de carga que desce para o Bunker.</w:t>
             </w:r>
           </w:p>
         </w:tc>
@@ -6323,7 +6630,7 @@
                 <w:szCs w:val="18"/>
                 <w:rtl w:val="0"/>
               </w:rPr>
-              <w:t xml:space="preserve">Centro de Convivência e DTEC</w:t>
+              <w:t xml:space="preserve">Bunker</w:t>
             </w:r>
           </w:p>
         </w:tc>
@@ -6342,7 +6649,7 @@
                 <w:szCs w:val="18"/>
                 <w:rtl w:val="0"/>
               </w:rPr>
-              <w:t xml:space="preserve">O Centro seria uma estrutura aberta tomada pelo mato (esboço). O DTEC é um laboratório com corredores, oito salas e uma máquina grande e brilhante no salão central.</w:t>
+              <w:t xml:space="preserve">Concreto aparente em cima e tinta verde-oliva embaixo, tubos fluorescentes frios, luzes de emergência vermelhas e o setor B alagado. Portas de aço de correr e faixas de perigo.</w:t>
             </w:r>
           </w:p>
         </w:tc>
@@ -6361,7 +6668,69 @@
                 <w:szCs w:val="18"/>
                 <w:rtl w:val="0"/>
               </w:rPr>
-              <w:t xml:space="preserve">Sem lugar na história ainda. O mapa do DTEC está pronto como fase solta; se ele vira o D-Tec do Carlos está em aberto.</w:t>
+              <w:t xml:space="preserve">Esconderijo difícil de alcançar, onde o Henrique fica sozinho numa sala de dados trancada. Reúne conversas e deixa ganchos (a comporta do núcleo, o laboratório, o arquivo). Os robôs patrulham aqui também, mas ainda não estão no jogo.</w:t>
+            </w:r>
+          </w:p>
+        </w:tc>
+      </w:tr>
+      <w:tr>
+        <w:trPr>
+          <w:cantSplit/>
+        </w:trPr>
+        <w:tc>
+          <w:tcPr>
+            <w:tcW w:w="1500" w:type="dxa"/>
+          </w:tcPr>
+          <w:p>
+            <w:pPr>
+              <w:spacing w:after="40" w:before="0" w:line="240" w:lineRule="auto"/>
+              <w:rPr/>
+            </w:pPr>
+            <w:r>
+              <w:rPr>
+                <w:sz w:val="18"/>
+                <w:szCs w:val="18"/>
+                <w:rtl w:val="0"/>
+              </w:rPr>
+              <w:t xml:space="preserve">Laboratório (D-Tec)</w:t>
+            </w:r>
+          </w:p>
+        </w:tc>
+        <w:tc>
+          <w:tcPr>
+            <w:tcW w:w="4329" w:type="dxa"/>
+          </w:tcPr>
+          <w:p>
+            <w:pPr>
+              <w:spacing w:after="40" w:before="0" w:line="240" w:lineRule="auto"/>
+              <w:rPr/>
+            </w:pPr>
+            <w:r>
+              <w:rPr>
+                <w:sz w:val="18"/>
+                <w:szCs w:val="18"/>
+                <w:rtl w:val="0"/>
+              </w:rPr>
+              <w:t xml:space="preserve">Laboratório lacrado, mais inteiro que a Biblioteca, mas com mil anos de poeira: azulejo branco embaixo, painel cinza em cima e a faixa azul do DTEC. Fluorescentes frias que piscam e, no salão central, a luz ciano pulsante da máquina.</w:t>
+            </w:r>
+          </w:p>
+        </w:tc>
+        <w:tc>
+          <w:tcPr>
+            <w:tcW w:w="3200" w:type="dxa"/>
+          </w:tcPr>
+          <w:p>
+            <w:pPr>
+              <w:spacing w:after="40" w:before="0" w:line="240" w:lineRule="auto"/>
+              <w:rPr/>
+            </w:pPr>
+            <w:r>
+              <w:rPr>
+                <w:sz w:val="18"/>
+                <w:szCs w:val="18"/>
+                <w:rtl w:val="0"/>
+              </w:rPr>
+              <w:t xml:space="preserve">Onde ficam a Âncora, a máquina grande e brilhante do salão central, e o Carlos. Como o grupo o enfrenta sem lutar está em aberto.</w:t>
             </w:r>
           </w:p>
         </w:tc>
@@ -6395,13 +6764,7 @@
         <w:rPr>
           <w:rtl w:val="0"/>
         </w:rPr>
-        <w:t xml:space="preserve"> </w:t>
-      </w:r>
-      <w:r>
-        <w:rPr>
-          <w:rtl w:val="0"/>
-        </w:rPr>
-        <w:t xml:space="preserve">o jogador enfrenta inimigos que seguem rotina, o próprio lugar e a escassez.</w:t>
+        <w:t xml:space="preserve"> o jogador enfrenta inimigos que seguem rotina, o próprio lugar e a escassez.</w:t>
       </w:r>
     </w:p>
     <w:p>
@@ -6945,13 +7308,7 @@
         <w:rPr>
           <w:rtl w:val="0"/>
         </w:rPr>
-        <w:t xml:space="preserve"> </w:t>
-      </w:r>
-      <w:r>
-        <w:rPr>
-          <w:rtl w:val="0"/>
-        </w:rPr>
-        <w:t xml:space="preserve">pixel art em vista lateral 2.5D. Duas ideias guiam a imagem: o contraste entre a ruína e a tecnologia de 3026, e a luz como recurso e como perigo.</w:t>
+        <w:t xml:space="preserve"> pixel art em vista lateral 2.5D. Duas ideias guiam a imagem: o contraste entre a ruína e a tecnologia de 3026, e a luz como recurso e como perigo.</w:t>
       </w:r>
     </w:p>
     <w:p>
@@ -7144,13 +7501,7 @@
         <w:rPr>
           <w:rtl w:val="0"/>
         </w:rPr>
-        <w:t xml:space="preserve"> </w:t>
-      </w:r>
-      <w:r>
-        <w:rPr>
-          <w:rtl w:val="0"/>
-        </w:rPr>
-        <w:t xml:space="preserve">cada personagem tem uma cor de identificação e uma silhueta própria, para o jogador reconhecê-lo de longe. Os humanos compartilham o mesmo conjunto de sprites (cinco vistas, caminhada de 12 quadros, respiração de 8 e retratos de 80 × 80 px para os diálogos).</w:t>
+        <w:t xml:space="preserve"> cada personagem tem uma cor de identificação e uma silhueta própria, para o jogador reconhecê-lo de longe. Os humanos compartilham o mesmo conjunto de sprites (cinco vistas, caminhada de 12 quadros, respiração de 8 e retratos de 80 × 80 px para os diálogos).</w:t>
       </w:r>
     </w:p>
     <w:p>
@@ -7962,13 +8313,7 @@
         <w:rPr>
           <w:rtl w:val="0"/>
         </w:rPr>
-        <w:t xml:space="preserve"> </w:t>
-      </w:r>
-      <w:r>
-        <w:rPr>
-          <w:rtl w:val="0"/>
-        </w:rPr>
-        <w:t xml:space="preserve">o som carrega parte da tensão e da informação. Toda a música e quase todos os efeitos são compostos por script (NumPy), sem gravação e sem problema de licença.</w:t>
+        <w:t xml:space="preserve"> o som carrega parte da tensão e da informação. Toda a música e quase todos os efeitos são compostos por script (NumPy), sem gravação e sem problema de licença.</w:t>
       </w:r>
     </w:p>
     <w:p>
@@ -8108,13 +8453,7 @@
         <w:rPr>
           <w:rtl w:val="0"/>
         </w:rPr>
-        <w:t xml:space="preserve"> </w:t>
-      </w:r>
-      <w:r>
-        <w:rPr>
-          <w:rtl w:val="0"/>
-        </w:rPr>
-        <w:t xml:space="preserve">a interface é desenhada em 320 × 180 px, com a mesma fonte pixelada e o mesmo tema em todas as telas, para parecer parte do mundo. Nada de ícones soltos: o que não precisa estar na tela, não está.</w:t>
+        <w:t xml:space="preserve"> a interface é desenhada em 320 × 180 px, com a mesma fonte pixelada e o mesmo tema em todas as telas, para parecer parte do mundo. Nada de ícones soltos: o que não precisa estar na tela, não está.</w:t>
       </w:r>
     </w:p>
     <w:p>
@@ -8235,13 +8574,7 @@
         <w:rPr>
           <w:rtl w:val="0"/>
         </w:rPr>
-        <w:t xml:space="preserve"> </w:t>
-      </w:r>
-      <w:r>
-        <w:rPr>
-          <w:rtl w:val="0"/>
-        </w:rPr>
-        <w:t xml:space="preserve">o jogo se joga com teclado. A tabela lista os controles; o jogo pausa sozinho ao abrir o inventário, um documento ou uma conversa, mas não pausa com o rádio.</w:t>
+        <w:t xml:space="preserve"> o jogo se joga com teclado. A tabela lista os controles; o jogo pausa sozinho ao abrir o inventário, um documento ou uma conversa, mas não pausa com o rádio.</w:t>
       </w:r>
     </w:p>
     <w:p>
@@ -8748,13 +9081,7 @@
         <w:rPr>
           <w:rtl w:val="0"/>
         </w:rPr>
-        <w:t xml:space="preserve"> </w:t>
-      </w:r>
-      <w:r>
-        <w:rPr>
-          <w:rtl w:val="0"/>
-        </w:rPr>
-        <w:t xml:space="preserve">o que já existe e o que ainda falta.</w:t>
+        <w:t xml:space="preserve"> o que já existe e o que ainda falta.</w:t>
       </w:r>
     </w:p>
     <w:p>
@@ -8846,13 +9173,7 @@
         <w:rPr>
           <w:rtl w:val="0"/>
         </w:rPr>
-        <w:t xml:space="preserve"> </w:t>
-      </w:r>
-      <w:r>
-        <w:rPr>
-          <w:rtl w:val="0"/>
-        </w:rPr>
-        <w:t xml:space="preserve">Godot 4.7.x, com GDScript e renderizador GL Compatibility, em 2D. A escolha cabe no tamanho do grupo e dá recursos prontos para o que o jogo precisa: luzes 2D com sombras, A* em grade, sinais, cenas reutilizáveis e shaders.</w:t>
+        <w:t xml:space="preserve"> Godot 4.7.x, com GDScript e renderizador GL Compatibility, em 2D. A escolha cabe no tamanho do grupo e dá recursos prontos para o que o jogo precisa: luzes 2D com sombras, A* em grade, sinais, cenas reutilizáveis e shaders.</w:t>
       </w:r>
     </w:p>
     <w:p>
@@ -9012,13 +9333,7 @@
         <w:rPr>
           <w:rtl w:val="0"/>
         </w:rPr>
-        <w:t xml:space="preserve"> </w:t>
-      </w:r>
-      <w:r>
-        <w:rPr>
-          <w:rtl w:val="0"/>
-        </w:rPr>
-        <w:t xml:space="preserve">o custo do jogo é baixo por construção, e os algoritmos foram escolhidos para custar pouco.</w:t>
+        <w:t xml:space="preserve"> o custo do jogo é baixo por construção, e os algoritmos foram escolhidos para custar pouco.</w:t>
       </w:r>
     </w:p>
     <w:p>
@@ -9165,13 +9480,7 @@
         <w:rPr>
           <w:rtl w:val="0"/>
         </w:rPr>
-        <w:t xml:space="preserve"> </w:t>
-      </w:r>
-      <w:r>
-        <w:rPr>
-          <w:rtl w:val="0"/>
-        </w:rPr>
-        <w:t xml:space="preserve">combinados que valem para todos, para o trabalho de quatro pessoas não virar conflito.</w:t>
+        <w:t xml:space="preserve"> combinados que valem para todos, para o trabalho de quatro pessoas não virar conflito.</w:t>
       </w:r>
     </w:p>
     <w:p>
@@ -9195,7 +9504,7 @@
         <w:rPr>
           <w:rtl w:val="0"/>
         </w:rPr>
-        <w:t xml:space="preserve"> o Enredo Principal vale para história, mundo e personagens; o registro de decisões vale para mecânicas e técnica; depois vêm os documentos de cada módulo e, por último, o GDD. Toda mudança de design é registrada em </w:t>
+        <w:t xml:space="preserve"> a História Completa vale para história, mundo e personagens; o registro de decisões vale para mecânicas e técnica; depois vêm os documentos de cada módulo e, por último, o GDD. Toda mudança de design é registrada em </w:t>
       </w:r>
       <w:r>
         <w:rPr>
@@ -9208,7 +9517,7 @@
         <w:rPr>
           <w:rtl w:val="0"/>
         </w:rPr>
-        <w:t xml:space="preserve">, e as de história entram no mesmo PR no Enredo Principal.</w:t>
+        <w:t xml:space="preserve">, e as de história entram no mesmo PR na História Completa.</w:t>
       </w:r>
     </w:p>
     <w:p>
@@ -9495,13 +9804,7 @@
         <w:rPr>
           <w:rtl w:val="0"/>
         </w:rPr>
-        <w:t xml:space="preserve"> </w:t>
-      </w:r>
-      <w:r>
-        <w:rPr>
-          <w:rtl w:val="0"/>
-        </w:rPr>
-        <w:t xml:space="preserve">o projeto começou em 24 de setembro de 2026. A tabela mostra os marcos já entregues, tirados do registro de decisões, e os próximos.</w:t>
+        <w:t xml:space="preserve"> o projeto começou em 24 de setembro de 2026. A tabela mostra os marcos já entregues, tirados do registro de decisões, e os próximos.</w:t>
       </w:r>
     </w:p>
     <w:p>
@@ -9778,7 +10081,7 @@
                 <w:szCs w:val="18"/>
                 <w:rtl w:val="0"/>
               </w:rPr>
-              <w:t xml:space="preserve">Biblioteca em oito salas com cadeados, hackeamento com minigames, tela de pausa e a história reescrita (a fenda como acaso, o Carlos como antagonista e o Enredo Principal como lei).</w:t>
+              <w:t xml:space="preserve">Biblioteca em oito salas com cadeados, hackeamento com minigames, tela de pausa e a história reescrita (a fenda como acaso, o Carlos como antagonista e a História Completa como lei).</w:t>
             </w:r>
           </w:p>
         </w:tc>
@@ -9904,7 +10207,7 @@
                 <w:szCs w:val="18"/>
                 <w:rtl w:val="0"/>
               </w:rPr>
-              <w:t xml:space="preserve">Completar o Bunker (Zane, Henrique e o setor B); fechar a ordem das fases seguintes (Centro de Convivência e D-Tec); salvamento em arquivo e sonhos; esconderijos com microgames; final; vozes.</w:t>
+              <w:t xml:space="preserve">Completar o Bunker (Zane, Henrique e o setor B) e o Laboratório (D-Tec); salvamento em arquivo e sonhos; esconderijos com microgames; final; vozes.</w:t>
             </w:r>
           </w:p>
         </w:tc>
@@ -10017,13 +10320,7 @@
         <w:rPr>
           <w:rtl w:val="0"/>
         </w:rPr>
-        <w:t xml:space="preserve"> </w:t>
-      </w:r>
-      <w:r>
-        <w:rPr>
-          <w:rtl w:val="0"/>
-        </w:rPr>
-        <w:t xml:space="preserve">quatro pessoas em quatro papéis. Os papéis ficam; as tarefas mudam a cada sprint.</w:t>
+        <w:t xml:space="preserve"> quatro pessoas em quatro papéis. Os papéis ficam; as tarefas mudam a cada sprint.</w:t>
       </w:r>
     </w:p>
     <w:p>
@@ -10441,7 +10738,7 @@
         <w:rPr>
           <w:rtl w:val="0"/>
         </w:rPr>
-        <w:t xml:space="preserve">O storyboard mostra, em quadros, as principais sequências do jogo: as cenas, o enquadramento de cada uma e o que o jogador faz nela. Os quadros do prólogo e do despertar são as ilustrações e o vídeo das cutscenes; os demais são capturas do jogo rodando (Godot 4.7), com o HUD, a lanterna e as conversas como aparecem para o jogador. Os pontos que a história ainda não decidiu não têm quadro.</w:t>
+        <w:t xml:space="preserve">O storyboard mostra, em quadros, as principais sequências do jogo: as cenas, o enquadramento de cada uma e o que o jogador faz nela. As imagens dos quadros não estão neste documento: vão no arquivo STORY BOARD, entregue junto. Os pontos que a história ainda não decidiu não têm quadro.</w:t>
       </w:r>
     </w:p>
     <w:p>
@@ -10461,7 +10758,7 @@
         <w:rPr>
           <w:rtl w:val="0"/>
         </w:rPr>
-        <w:t xml:space="preserve"> menu principal, prólogo (2026), despertar (3026), Biblioteca, Bloco de salas, Labirinto, Bunker (posição provisória) e as fases seguintes, ainda em aberto, até o final, que também está em aberto.</w:t>
+        <w:t xml:space="preserve"> menu principal, prólogo (2026), despertar (3026), Biblioteca, Bloco de salas, Labirinto, Centro de Convivência, Bunker e Laboratório (D-Tec), até o final, que está em aberto.</w:t>
       </w:r>
     </w:p>
     <w:p>
@@ -11787,7 +12084,7 @@
                 <w:szCs w:val="17"/>
                 <w:rtl w:val="0"/>
               </w:rPr>
-              <w:t xml:space="preserve">Balcão de atendimento, com o rádio da segurança.</w:t>
+              <w:t xml:space="preserve">Balcão de atendimento, com o rádio sintonizado na frequência do grupo.</w:t>
             </w:r>
           </w:p>
           <w:p>
@@ -12774,7 +13071,7 @@
           <w:szCs w:val="20"/>
           <w:rtl w:val="0"/>
         </w:rPr>
-        <w:t xml:space="preserve">Sequência E. Bunker (posição na ordem das fases ainda provisória)</w:t>
+        <w:t xml:space="preserve">Sequência E. Bunker (fase 5)</w:t>
       </w:r>
     </w:p>
     <w:tbl>
@@ -12889,7 +13186,7 @@
                 <w:szCs w:val="17"/>
                 <w:rtl w:val="0"/>
               </w:rPr>
-              <w:t xml:space="preserve">O lugar mais seguro do jogo: os robôs não descem. As portas lacradas são ganchos para as fases seguintes.</w:t>
+              <w:t xml:space="preserve">Esconderijo lacrado sob o núcleo da Âncora, difícil de alcançar. As portas lacradas são ganchos para as fases seguintes.</w:t>
             </w:r>
           </w:p>
         </w:tc>

</xml_diff>

<commit_message>
docs: remove as imagens do GDD e alinha o texto com a História Completa (#135)
* docs: remove as imagens do gdd_ankhor.docx

Tira as 27 imagens do storyboard (seção 9). Todo o texto continua igual:
os quadros ficam só com cena, enquadramento e ação. O arquivo cai de
4,9 MB para 33 KB.

Co-Authored-By: Claude Sonnet 5.5 <noreply@anthropic.com>

* docs: alinha o GDD com a História Completa

Corrige o que contradizia a História Completa: Clarice de 1990, Diana
estagiária de arquitetura, Zane sem medo da IA e sem final decidido, robôs
patrulhando o bunker, 3 dias entre as chegadas, a ordem das fases
(Convivência, Bunker e D-Tec) e os pontos em aberto. O arquivo da história
passa a ser citado como História Completa.

Co-Authored-By: Claude Sonnet 5.5 <noreply@anthropic.com>

* docs: corrige a cor do estado da coloração de grafos no GDD

Co-Authored-By: Claude Sonnet 5.5 <noreply@anthropic.com>

---------

Co-authored-by: Claude Sonnet 5.5 <noreply@anthropic.com>
</commit_message>
<xml_diff>
--- a/docs/entrega/gdd_ankhor.docx
+++ b/docs/entrega/gdd_ankhor.docx
@@ -148,7 +148,7 @@
         <w:rPr>
           <w:rtl w:val="0"/>
         </w:rPr>
-        <w:t xml:space="preserve"> projeto em 15 de outubro de 2026.</w:t>
+        <w:t xml:space="preserve"> projeto em 19 de outubro de 2026.</w:t>
       </w:r>
     </w:p>
     <w:p>
@@ -181,7 +181,7 @@
         <w:rPr>
           <w:rtl w:val="0"/>
         </w:rPr>
-        <w:t xml:space="preserve"> do repositório, e a seção 9 traz o storyboard. Em caso de divergência valem, nesta ordem: o Enredo Principal (história, mundo e personagens), o registro de decisões (</w:t>
+        <w:t xml:space="preserve"> do repositório, e a seção 9 traz o storyboard. Em caso de divergência valem, nesta ordem: a História Completa (história, mundo e personagens), o registro de decisões (</w:t>
       </w:r>
       <w:r>
         <w:rPr>
@@ -371,7 +371,33 @@
         <w:rPr>
           <w:rtl w:val="0"/>
         </w:rPr>
-        <w:t xml:space="preserve">, no mesmo lugar, agora uma ruína tomada pela natureza, com a tecnologia de 3026 em volta. A humanidade foi embora para outro planeta. Ficou o </w:t>
+        <w:t xml:space="preserve">, no mesmo lugar, agora uma ruína tomada pela natureza, com a tecnologia de 3026 em volta. Os </w:t>
+      </w:r>
+      <w:r>
+        <w:rPr>
+          <w:rtl w:val="0"/>
+          <w:i/>
+        </w:rPr>
+        <w:t xml:space="preserve">Homo sideralis</w:t>
+      </w:r>
+      <w:r>
+        <w:rPr>
+          <w:rtl w:val="0"/>
+        </w:rPr>
+        <w:t xml:space="preserve">, uma espécie humana evoluída, foram embora para outro planeta, e os poucos </w:t>
+      </w:r>
+      <w:r>
+        <w:rPr>
+          <w:rtl w:val="0"/>
+          <w:i/>
+        </w:rPr>
+        <w:t xml:space="preserve">sapiens</w:t>
+      </w:r>
+      <w:r>
+        <w:rPr>
+          <w:rtl w:val="0"/>
+        </w:rPr>
+        <w:t xml:space="preserve"> que ficaram formaram uma resistência, os Faroleiros. Um deles se isolou na Unifor: o </w:t>
       </w:r>
       <w:r>
         <w:rPr>
@@ -410,7 +436,7 @@
         <w:rPr>
           <w:rtl w:val="0"/>
         </w:rPr>
-        <w:t xml:space="preserve"> no tempo no chão da Biblioteca e puxa, por acaso, quem estiver ali, em alguma época. Gabriel não é o único: outros jovens de épocas diferentes caíram com dias de diferença, e cada um tenta sobreviver num canto do campus. Os robôs, controlados pelo Carlos, caçam qualquer humano. Gabriel precisa encontrar os outros, descobrir o que aconteceu e consertar a Âncora para que todos voltem às suas épocas.</w:t>
+        <w:t xml:space="preserve"> no tempo no chão da Biblioteca e puxa, por acaso, quem estiver ali, em alguma época. Gabriel não é o único: outros jovens de épocas diferentes caíram com 3 dias de intervalo entre uma chegada e a seguinte, e cada um tenta sobreviver num canto do campus. Os robôs, controlados pelo Carlos, caçam qualquer humano. Gabriel precisa encontrar os outros, descobrir o que aconteceu e consertar a Âncora para que todos voltem às suas épocas.</w:t>
       </w:r>
     </w:p>
     <w:p>
@@ -597,13 +623,7 @@
         <w:rPr>
           <w:rtl w:val="0"/>
         </w:rPr>
-        <w:t xml:space="preserve"> </w:t>
-      </w:r>
-      <w:r>
-        <w:rPr>
-          <w:rtl w:val="0"/>
-        </w:rPr>
-        <w:t xml:space="preserve">o jogador explora as ruínas sala por sala, atrás de passagens, chaves, códigos e pistas, enquanto evita os robôs que patrulham. Andar devagar, apagar a luz e usar o cenário vale mais do que correr. O ciclo se repete em cada fase: </w:t>
+        <w:t xml:space="preserve"> o jogador explora as ruínas sala por sala, atrás de passagens, chaves, códigos e pistas, enquanto evita os robôs que patrulham. Andar devagar, apagar a luz e usar o cenário vale mais do que correr. O ciclo se repete em cada fase: </w:t>
       </w:r>
       <w:r>
         <w:rPr>
@@ -1423,7 +1443,7 @@
                 <w:szCs w:val="18"/>
                 <w:rtl w:val="0"/>
               </w:rPr>
-              <w:t xml:space="preserve">Em salas seguras, dormir salvaria o jogo em arquivo e levaria a um sonho. O salvamento em arquivo ainda não existe, e o que os sonhos mostram está em aberto no Enredo Principal.</w:t>
+              <w:t xml:space="preserve">Em salas seguras, dormir salvaria o jogo em arquivo e levaria a um sonho. O salvamento em arquivo ainda não existe, e o que os sonhos mostram está em aberto na História Completa.</w:t>
             </w:r>
           </w:p>
         </w:tc>
@@ -1477,13 +1497,7 @@
         <w:rPr>
           <w:rtl w:val="0"/>
         </w:rPr>
-        <w:t xml:space="preserve"> </w:t>
-      </w:r>
-      <w:r>
-        <w:rPr>
-          <w:rtl w:val="0"/>
-        </w:rPr>
-        <w:t xml:space="preserve">o objetivo geral é encontrar os outros que caíram na fenda, descobrir o que aconteceu e consertar a Âncora para que todos voltem às suas épocas. Para consertá-la, cada pessoa traz uma parte, e por isso toda fase tem a mesma estrutura: </w:t>
+        <w:t xml:space="preserve"> o objetivo geral é encontrar os outros que caíram na fenda, descobrir o que aconteceu e consertar a Âncora para que todos voltem às suas épocas. Para consertá-la, cada pessoa traz uma parte, e por isso toda fase tem a mesma estrutura: </w:t>
       </w:r>
       <w:r>
         <w:rPr>
@@ -1509,7 +1523,7 @@
         <w:rPr>
           <w:rtl w:val="0"/>
         </w:rPr>
-        <w:t xml:space="preserve">Dentro de cada fase, o avanço é um cadeado de dependências. Na Biblioteca, por exemplo, a saída exige, nesta ordem: lanterna, rádio, chave da manutenção, energia, terminal ligado, código da grade, grade aberta, telefone e porta de saída. Esse encadeamento é um grafo de dependências, e a ordem de solução da fase é uma ordenação topológica dele. As partes que cada personagem traz para consertar a Âncora são: as estrelas do Baltazar, a investigação da Diana, o código da Clarice, a teoria do Henrique, a tecnologia do Zane e o caderno de equações do Gabriel.</w:t>
+        <w:t xml:space="preserve">Dentro de cada fase, o avanço é um cadeado de dependências. Na Biblioteca, por exemplo, a saída exige, nesta ordem: lanterna, rádio, chave da manutenção, energia, terminal ligado, código da grade, grade aberta, telefone e porta de saída. Esse encadeamento é um grafo de dependências, e a ordem de solução da fase é uma ordenação topológica dele. As partes que cada personagem traz para consertar a Âncora são: as estrelas do Baltazar, as plantas da Diana, o código da Clarice, a teoria do Henrique, a tecnologia do Zane e o caderno de equações do Gabriel.</w:t>
       </w:r>
     </w:p>
     <w:p>
@@ -2007,27 +2021,27 @@
                 <w:szCs w:val="18"/>
                 <w:rtl w:val="0"/>
               </w:rPr>
-              <w:t xml:space="preserve">Bunker</w:t>
+              <w:t xml:space="preserve">Centro de Convivência</w:t>
             </w:r>
           </w:p>
         </w:tc>
         <w:tc>
           <w:tcPr>
             <w:tcW w:w="1900" w:type="dxa"/>
-            <w:shd w:val="clear" w:color="auto" w:fill="FFF2CC"/>
-          </w:tcPr>
-          <w:p>
-            <w:pPr>
-              <w:spacing w:after="40" w:before="0" w:line="240" w:lineRule="auto"/>
-              <w:rPr/>
-            </w:pPr>
-            <w:r>
-              <w:rPr>
-                <w:sz w:val="18"/>
-                <w:szCs w:val="18"/>
-                <w:rtl w:val="0"/>
-              </w:rPr>
-              <w:t xml:space="preserve">Em desenvolvimento</w:t>
+            <w:shd w:val="clear" w:color="auto" w:fill="E2EFDA"/>
+          </w:tcPr>
+          <w:p>
+            <w:pPr>
+              <w:spacing w:after="40" w:before="0" w:line="240" w:lineRule="auto"/>
+              <w:rPr/>
+            </w:pPr>
+            <w:r>
+              <w:rPr>
+                <w:sz w:val="18"/>
+                <w:szCs w:val="18"/>
+                <w:rtl w:val="0"/>
+              </w:rPr>
+              <w:t xml:space="preserve">Jogável</w:t>
             </w:r>
           </w:p>
         </w:tc>
@@ -2046,7 +2060,7 @@
                 <w:szCs w:val="18"/>
                 <w:rtl w:val="0"/>
               </w:rPr>
-              <w:t xml:space="preserve">Esconderijo sob o núcleo da Âncora. O setor B está lacrado, e seis portas servem de gancho para as próximas fases. A posição dele na ordem é provisória.</w:t>
+              <w:t xml:space="preserve">Atravessa a praça de alimentação sob a cúpula de vidro, acha a célula de energia na câmara fria, resolve o puzzle de coloração de grafos na cozinha e usa o elevador de carga que desce para o Bunker.</w:t>
             </w:r>
           </w:p>
         </w:tc>
@@ -2065,7 +2079,7 @@
                 <w:szCs w:val="18"/>
                 <w:rtl w:val="0"/>
               </w:rPr>
-              <w:t xml:space="preserve">Henrique (sala de dados)</w:t>
+              <w:t xml:space="preserve">Zane (pelo rádio)</w:t>
             </w:r>
           </w:p>
         </w:tc>
@@ -2089,7 +2103,7 @@
                 <w:szCs w:val="18"/>
                 <w:rtl w:val="0"/>
               </w:rPr>
-              <w:t xml:space="preserve">—</w:t>
+              <w:t xml:space="preserve">5</w:t>
             </w:r>
           </w:p>
         </w:tc>
@@ -2108,27 +2122,27 @@
                 <w:szCs w:val="18"/>
                 <w:rtl w:val="0"/>
               </w:rPr>
-              <w:t xml:space="preserve">Centro de Convivência, D-Tec</w:t>
+              <w:t xml:space="preserve">Bunker</w:t>
             </w:r>
           </w:p>
         </w:tc>
         <w:tc>
           <w:tcPr>
             <w:tcW w:w="1900" w:type="dxa"/>
-            <w:shd w:val="clear" w:color="auto" w:fill="FCE4D6"/>
-          </w:tcPr>
-          <w:p>
-            <w:pPr>
-              <w:spacing w:after="40" w:before="0" w:line="240" w:lineRule="auto"/>
-              <w:rPr/>
-            </w:pPr>
-            <w:r>
-              <w:rPr>
-                <w:sz w:val="18"/>
-                <w:szCs w:val="18"/>
-                <w:rtl w:val="0"/>
-              </w:rPr>
-              <w:t xml:space="preserve">Em aberto</w:t>
+            <w:shd w:val="clear" w:color="auto" w:fill="FFF2CC"/>
+          </w:tcPr>
+          <w:p>
+            <w:pPr>
+              <w:spacing w:after="40" w:before="0" w:line="240" w:lineRule="auto"/>
+              <w:rPr/>
+            </w:pPr>
+            <w:r>
+              <w:rPr>
+                <w:sz w:val="18"/>
+                <w:szCs w:val="18"/>
+                <w:rtl w:val="0"/>
+              </w:rPr>
+              <w:t xml:space="preserve">Em desenvolvimento</w:t>
             </w:r>
           </w:p>
         </w:tc>
@@ -2147,7 +2161,108 @@
                 <w:szCs w:val="18"/>
                 <w:rtl w:val="0"/>
               </w:rPr>
-              <w:t xml:space="preserve">Sem lugar na ordem das fases e sem objetivo definido. O D-Tec é onde fica o Carlos e a Âncora; como o grupo o enfrenta sem lutar está em aberto.</w:t>
+              <w:t xml:space="preserve">Esconderijo sob o núcleo da Âncora. O setor B está lacrado, e a comporta do núcleo, no fim dele, leva ao Laboratório (D-Tec).</w:t>
+            </w:r>
+          </w:p>
+        </w:tc>
+        <w:tc>
+          <w:tcPr>
+            <w:tcW w:w="1900" w:type="dxa"/>
+          </w:tcPr>
+          <w:p>
+            <w:pPr>
+              <w:spacing w:after="40" w:before="0" w:line="240" w:lineRule="auto"/>
+              <w:rPr/>
+            </w:pPr>
+            <w:r>
+              <w:rPr>
+                <w:sz w:val="18"/>
+                <w:szCs w:val="18"/>
+                <w:rtl w:val="0"/>
+              </w:rPr>
+              <w:t xml:space="preserve">Henrique (sala de dados)</w:t>
+            </w:r>
+          </w:p>
+        </w:tc>
+      </w:tr>
+      <w:tr>
+        <w:trPr>
+          <w:cantSplit/>
+        </w:trPr>
+        <w:tc>
+          <w:tcPr>
+            <w:tcW w:w="600" w:type="dxa"/>
+          </w:tcPr>
+          <w:p>
+            <w:pPr>
+              <w:spacing w:after="40" w:before="0" w:line="240" w:lineRule="auto"/>
+              <w:rPr/>
+            </w:pPr>
+            <w:r>
+              <w:rPr>
+                <w:sz w:val="18"/>
+                <w:szCs w:val="18"/>
+                <w:rtl w:val="0"/>
+              </w:rPr>
+              <w:t xml:space="preserve">6</w:t>
+            </w:r>
+          </w:p>
+        </w:tc>
+        <w:tc>
+          <w:tcPr>
+            <w:tcW w:w="1500" w:type="dxa"/>
+          </w:tcPr>
+          <w:p>
+            <w:pPr>
+              <w:spacing w:after="40" w:before="0" w:line="240" w:lineRule="auto"/>
+              <w:rPr/>
+            </w:pPr>
+            <w:r>
+              <w:rPr>
+                <w:sz w:val="18"/>
+                <w:szCs w:val="18"/>
+                <w:rtl w:val="0"/>
+              </w:rPr>
+              <w:t xml:space="preserve">Laboratório (D-Tec)</w:t>
+            </w:r>
+          </w:p>
+        </w:tc>
+        <w:tc>
+          <w:tcPr>
+            <w:tcW w:w="1900" w:type="dxa"/>
+            <w:shd w:val="clear" w:color="auto" w:fill="FFF2CC"/>
+          </w:tcPr>
+          <w:p>
+            <w:pPr>
+              <w:spacing w:after="40" w:before="0" w:line="240" w:lineRule="auto"/>
+              <w:rPr/>
+            </w:pPr>
+            <w:r>
+              <w:rPr>
+                <w:sz w:val="18"/>
+                <w:szCs w:val="18"/>
+                <w:rtl w:val="0"/>
+              </w:rPr>
+              <w:t xml:space="preserve">Em desenvolvimento</w:t>
+            </w:r>
+          </w:p>
+        </w:tc>
+        <w:tc>
+          <w:tcPr>
+            <w:tcW w:w="3129" w:type="dxa"/>
+          </w:tcPr>
+          <w:p>
+            <w:pPr>
+              <w:spacing w:after="40" w:before="0" w:line="240" w:lineRule="auto"/>
+              <w:rPr/>
+            </w:pPr>
+            <w:r>
+              <w:rPr>
+                <w:sz w:val="18"/>
+                <w:szCs w:val="18"/>
+                <w:rtl w:val="0"/>
+              </w:rPr>
+              <w:t xml:space="preserve">Laboratório de tecnologia, com a máquina central: a Âncora. É onde fica o Carlos. Como o grupo o enfrenta sem lutar está em aberto.</w:t>
             </w:r>
           </w:p>
         </w:tc>
@@ -2200,13 +2315,7 @@
         <w:rPr>
           <w:rtl w:val="0"/>
         </w:rPr>
-        <w:t xml:space="preserve"> </w:t>
-      </w:r>
-      <w:r>
-        <w:rPr>
-          <w:rtl w:val="0"/>
-        </w:rPr>
-        <w:t xml:space="preserve">o jogador não ganha pontos; ganha acesso, recursos e verdade.</w:t>
+        <w:t xml:space="preserve"> o jogador não ganha pontos; ganha acesso, recursos e verdade.</w:t>
       </w:r>
     </w:p>
     <w:p>
@@ -3203,27 +3312,27 @@
                 <w:szCs w:val="18"/>
                 <w:rtl w:val="0"/>
               </w:rPr>
-              <w:t xml:space="preserve">Previsto para gerar a grade horária das rondas (turmas que dividem sala ou professor não podem ter o mesmo horário). Hoje a patrulha usa só a cadeia de Markov, e a origem da grade está em aberto no Enredo Principal.</w:t>
+              <w:t xml:space="preserve">Puzzle do Centro de Convivência: o quadro de comutação da cozinha pede colorir um grafo de quatro setores com três fases, sem que setores vizinhos repitam a fase. Previsto também para gerar a grade horária das rondas (turmas que dividem sala ou professor não podem ter o mesmo horário); hoje a patrulha usa só a cadeia de Markov, e a origem da grade ainda não está decidida.</w:t>
             </w:r>
           </w:p>
         </w:tc>
         <w:tc>
           <w:tcPr>
             <w:tcW w:w="1500" w:type="dxa"/>
-            <w:shd w:val="clear" w:color="auto" w:fill="FCE4D6"/>
-          </w:tcPr>
-          <w:p>
-            <w:pPr>
-              <w:spacing w:after="40" w:before="0" w:line="240" w:lineRule="auto"/>
-              <w:rPr/>
-            </w:pPr>
-            <w:r>
-              <w:rPr>
-                <w:sz w:val="18"/>
-                <w:szCs w:val="18"/>
-                <w:rtl w:val="0"/>
-              </w:rPr>
-              <w:t xml:space="preserve">Em aberto</w:t>
+            <w:shd w:val="clear" w:color="auto" w:fill="FFF2CC"/>
+          </w:tcPr>
+          <w:p>
+            <w:pPr>
+              <w:spacing w:after="40" w:before="0" w:line="240" w:lineRule="auto"/>
+              <w:rPr/>
+            </w:pPr>
+            <w:r>
+              <w:rPr>
+                <w:sz w:val="18"/>
+                <w:szCs w:val="18"/>
+                <w:rtl w:val="0"/>
+              </w:rPr>
+              <w:t xml:space="preserve">Parcial</w:t>
             </w:r>
           </w:p>
         </w:tc>
@@ -3354,13 +3463,33 @@
         <w:rPr>
           <w:rtl w:val="0"/>
         </w:rPr>
-        <w:t xml:space="preserve"> </w:t>
-      </w:r>
-      <w:r>
-        <w:rPr>
-          <w:rtl w:val="0"/>
-        </w:rPr>
-        <w:t xml:space="preserve">o campus da Unifor, em Fortaleza, no ano de 3026. A Terra ficou tão ruim que o pouco que sobrou da humanidade foi embora para outro planeta, e em algum momento a Unifor virou um centro de pesquisa em física do tempo.</w:t>
+        <w:t xml:space="preserve"> o campus da Unifor, em Fortaleza, no ano de 3026. A Terra ficou tão ruim que a humanidade se dividiu: os </w:t>
+      </w:r>
+      <w:r>
+        <w:rPr>
+          <w:rtl w:val="0"/>
+          <w:i/>
+        </w:rPr>
+        <w:t xml:space="preserve">Homo sideralis</w:t>
+      </w:r>
+      <w:r>
+        <w:rPr>
+          <w:rtl w:val="0"/>
+        </w:rPr>
+        <w:t xml:space="preserve">, uma espécie humana evoluída, foram embora para outro planeta, e os poucos </w:t>
+      </w:r>
+      <w:r>
+        <w:rPr>
+          <w:rtl w:val="0"/>
+          <w:i/>
+        </w:rPr>
+        <w:t xml:space="preserve">sapiens</w:t>
+      </w:r>
+      <w:r>
+        <w:rPr>
+          <w:rtl w:val="0"/>
+        </w:rPr>
+        <w:t xml:space="preserve"> que ficaram formaram os Faroleiros, uma resistência que defende a Terra, longe do campus. Em algum momento a Unifor virou um centro de pesquisa em física do tempo.</w:t>
       </w:r>
     </w:p>
     <w:p>
@@ -3481,13 +3610,7 @@
         <w:rPr>
           <w:rtl w:val="0"/>
         </w:rPr>
-        <w:t xml:space="preserve"> </w:t>
-      </w:r>
-      <w:r>
-        <w:rPr>
-          <w:rtl w:val="0"/>
-        </w:rPr>
-        <w:t xml:space="preserve">Gabriel acorda em 3026, descobre que não está sozinho e passa o jogo encontrando, uma a uma, as pessoas puxadas pela fenda. No caminho descobre que um deles é seu antepassado, que outro mente para o grupo e que, por trás da Âncora, existe alguém. A história se conta em atos.</w:t>
+        <w:t xml:space="preserve"> Gabriel acorda em 3026, descobre que não está sozinho e passa o jogo encontrando, uma a uma, as pessoas puxadas pela fenda. No caminho descobre que um deles é seu antepassado, que outro mente para o grupo e que, por trás da Âncora, existe alguém. A história se conta em atos.</w:t>
       </w:r>
     </w:p>
     <w:p>
@@ -3710,7 +3833,7 @@
                 <w:szCs w:val="18"/>
                 <w:rtl w:val="0"/>
               </w:rPr>
-              <w:t xml:space="preserve">(Bloco de salas, Labirinto e outras áreas)</w:t>
+              <w:t xml:space="preserve">(Bloco de salas, Labirinto e Centro de Convivência)</w:t>
             </w:r>
           </w:p>
         </w:tc>
@@ -3729,7 +3852,7 @@
                 <w:szCs w:val="18"/>
                 <w:rtl w:val="0"/>
               </w:rPr>
-              <w:t xml:space="preserve">Cada fase leva a uma pessoa e ao esconderijo dela. Gabriel ganha a confiança da Clarice na sala 103 e recebe a ajuda do Zane no Labirinto. Em algum ponto encontra o Baltazar e descobre o parentesco pelo anel.</w:t>
+              <w:t xml:space="preserve">Cada fase leva a uma pessoa e ao esconderijo dela. Gabriel ganha a confiança da Clarice na sala 103 e recebe a ajuda do Zane no Labirinto e, depois, pelo rádio no Centro de Convivência. Em algum ponto encontra o Baltazar e descobre o parentesco pelo anel.</w:t>
             </w:r>
           </w:p>
         </w:tc>
@@ -3806,7 +3929,7 @@
                 <w:szCs w:val="18"/>
                 <w:rtl w:val="0"/>
               </w:rPr>
-              <w:t xml:space="preserve">O maior e mais seguro esconderijo, sob o núcleo da Âncora, onde os robôs não descem. O Henrique fica na sala de dados, com as câmeras do campus.</w:t>
+              <w:t xml:space="preserve">Esconderijo sob o núcleo da Âncora, difícil de alcançar, onde os robôs também patrulham. O Henrique fica sozinho numa sala de dados trancada, com as câmeras do campus.</w:t>
             </w:r>
           </w:p>
         </w:tc>
@@ -3883,7 +4006,7 @@
                 <w:szCs w:val="18"/>
                 <w:rtl w:val="0"/>
               </w:rPr>
-              <w:t xml:space="preserve">O Henrique esconde a ligação que tem com o Carlos. Quando o grupo descobre, todos vão atrás do Carlos, no D-Tec.</w:t>
+              <w:t xml:space="preserve">O Henrique trabalha para o Carlos, que prometeu levá-lo para antes da morte da mãe dele, e atrasa os outros enquanto finge consertar tudo. Ele esconde essa ligação. Quando o grupo descobre, todos vão atrás do Carlos, no D-Tec.</w:t>
             </w:r>
           </w:p>
         </w:tc>
@@ -3960,7 +4083,7 @@
                 <w:szCs w:val="18"/>
                 <w:rtl w:val="0"/>
               </w:rPr>
-              <w:t xml:space="preserve">Com as partes reunidas, o grupo tenta consertar a Âncora e mandar cada um à sua noite. O Baltazar quer ficar, mas Gabriel o convence a voltar para 1750. O Zane escolhe ficar em 3026, o que depende de a IA continuar existindo. Como o grupo enfrenta o Carlos sem lutar e como o jogo termina está em aberto.</w:t>
+              <w:t xml:space="preserve">Com as partes reunidas, o grupo tenta consertar a Âncora e mandar cada um à sua noite. O Baltazar quer ficar, mas Gabriel o convence a voltar para 1750. O final do Zane está em aberto. Como o grupo enfrenta o Carlos sem lutar e como o jogo termina está em aberto.</w:t>
             </w:r>
           </w:p>
         </w:tc>
@@ -4417,7 +4540,7 @@
                 <w:szCs w:val="18"/>
                 <w:rtl w:val="0"/>
               </w:rPr>
-              <w:t xml:space="preserve">Recruta da polícia. Dramática, ansiosa e impulsiva; vive cada minuto como se fosse o último.</w:t>
+              <w:t xml:space="preserve">Estagiária de arquitetura na obra do campus. Dramática, ansiosa e impulsiva; vive cada minuto como se fosse o último.</w:t>
             </w:r>
           </w:p>
         </w:tc>
@@ -4436,7 +4559,7 @@
                 <w:szCs w:val="18"/>
                 <w:rtl w:val="0"/>
               </w:rPr>
-              <w:t xml:space="preserve">Traz a investigação: onde fica o núcleo e as passagens até ele.</w:t>
+              <w:t xml:space="preserve">Traz as plantas: conhece as galerias de 1978, que não aparecem nos mapas de 3026, e descobre por elas onde fica o núcleo e as passagens até ele.</w:t>
             </w:r>
           </w:p>
         </w:tc>
@@ -4479,7 +4602,7 @@
                 <w:szCs w:val="18"/>
                 <w:rtl w:val="0"/>
               </w:rPr>
-              <w:t xml:space="preserve">1994</w:t>
+              <w:t xml:space="preserve">1990</w:t>
             </w:r>
           </w:p>
         </w:tc>
@@ -4717,7 +4840,7 @@
                 <w:szCs w:val="18"/>
                 <w:rtl w:val="0"/>
               </w:rPr>
-              <w:t xml:space="preserve">Jovem com implantes cibernéticos. Confiante e elétrico; confia demais na tecnologia e teme a IA.</w:t>
+              <w:t xml:space="preserve">Jovem com implantes cibernéticos. Confiante e elétrico; confia demais na tecnologia.</w:t>
             </w:r>
           </w:p>
         </w:tc>
@@ -4991,7 +5114,7 @@
         <w:rPr>
           <w:rtl w:val="0"/>
         </w:rPr>
-        <w:t xml:space="preserve">Todos os puxados têm cerca de 20 anos, estão vivos e têm alguma ligação com a região da Unifor. Chegaram com dias de diferença: o Henrique foi o primeiro e o Gabriel é o último. As fichas completas de cada personagem (personalidade, relações, arco) estão em </w:t>
+        <w:t xml:space="preserve">Todos os puxados têm cerca de 20 anos, estão vivos e têm alguma ligação com a região da Unifor. Chegaram com 3 dias de intervalo entre uma chegada e a seguinte: o Henrique foi o primeiro e o Gabriel é o último. As fichas completas de cada personagem (personalidade, relações, arco) estão em </w:t>
       </w:r>
       <w:r>
         <w:rPr>
@@ -5029,13 +5152,7 @@
         <w:rPr>
           <w:rtl w:val="0"/>
         </w:rPr>
-        <w:t xml:space="preserve"> </w:t>
-      </w:r>
-      <w:r>
-        <w:rPr>
-          <w:rtl w:val="0"/>
-        </w:rPr>
-        <w:t xml:space="preserve">o mundo de Ankhor se explica por poucas peças, descobertas aos poucos.</w:t>
+        <w:t xml:space="preserve"> o mundo de Ankhor se explica por poucas peças, descobertas aos poucos.</w:t>
       </w:r>
     </w:p>
     <w:p>
@@ -5083,7 +5200,7 @@
         <w:rPr>
           <w:rtl w:val="0"/>
         </w:rPr>
-        <w:t xml:space="preserve"> abre sempre no mesmo ponto, o chão onde fica a Biblioteca. Pulsa a cada tentativa do Carlos, encosta numa época diferente e puxa quem estiver ali. É acaso: as pessoas estavam no lugar errado na noite errada. A cada pulso fica maior.</w:t>
+        <w:t xml:space="preserve"> abre sempre no mesmo ponto, o chão onde fica a Biblioteca. Pulsa a cada tentativa do Carlos, a cada 3 dias, encosta numa época diferente e puxa quem estiver ali. É acaso: as pessoas estavam no lugar errado na noite errada. A cada pulso fica maior.</w:t>
       </w:r>
     </w:p>
     <w:p>
@@ -5210,7 +5327,7 @@
         <w:rPr>
           <w:rtl w:val="0"/>
         </w:rPr>
-        <w:t xml:space="preserve">O Carlos: como obtém o conhecimento que falta à Âncora, se existe uma IA e qual a relação dela com ele, por que os robôs caçam e quando o jogador descobre que ele existe.</w:t>
+        <w:t xml:space="preserve">O Carlos: como obtém o conhecimento que falta à Âncora, quantas ferramentas de IA ele usa e o que cada uma faz, por que os robôs caçam e quando o jogador descobre que ele existe.</w:t>
       </w:r>
     </w:p>
     <w:p>
@@ -5227,7 +5344,7 @@
         <w:rPr>
           <w:rtl w:val="0"/>
         </w:rPr>
-        <w:t xml:space="preserve">A mentira do Henrique: se trabalha para o Carlos ou foi enganado por ele, o que esconde e como o grupo descobre.</w:t>
+        <w:t xml:space="preserve">A mentira do Henrique: como e quando o grupo a descobre e o que ele faz depois (já está decidido que ele trabalha para o Carlos).</w:t>
       </w:r>
     </w:p>
     <w:p>
@@ -5261,7 +5378,7 @@
         <w:rPr>
           <w:rtl w:val="0"/>
         </w:rPr>
-        <w:t xml:space="preserve">A ordem das fases depois do Labirinto (Bunker, Centro de Convivência, D-Tec) e a sala da Biblioteca onde o Baltazar se esconde.</w:t>
+        <w:t xml:space="preserve">A posição do Baltazar na ordem de chegada e a sala da Biblioteca onde ele se esconde.</w:t>
       </w:r>
     </w:p>
     <w:p>
@@ -5328,13 +5445,7 @@
         <w:rPr>
           <w:rtl w:val="0"/>
         </w:rPr>
-        <w:t xml:space="preserve"> </w:t>
-      </w:r>
-      <w:r>
-        <w:rPr>
-          <w:rtl w:val="0"/>
-        </w:rPr>
-        <w:t xml:space="preserve">o jogo é um campus contínuo modelado como um grafo. Cada fase é um conjunto de salas (uma cena por sala) ligadas por portas, e cada porta é uma aresta que pode ter condição: chave, energia, código ou hack. Áreas já visitadas continuam acessíveis, e voltar a elas faz parte do jogo, como em Resident Evil.</w:t>
+        <w:t xml:space="preserve"> o jogo é um campus contínuo modelado como um grafo. Cada fase é um conjunto de salas (uma cena por sala) ligadas por portas, e cada porta é uma aresta que pode ter condição: chave, energia, código ou hack. Áreas já visitadas continuam acessíveis, e voltar a elas faz parte do jogo, como em Resident Evil.</w:t>
       </w:r>
     </w:p>
     <w:p>
@@ -5826,6 +5937,107 @@
                 <w:szCs w:val="18"/>
                 <w:rtl w:val="0"/>
               </w:rPr>
+              <w:t xml:space="preserve">Centro de Convivência</w:t>
+            </w:r>
+          </w:p>
+        </w:tc>
+        <w:tc>
+          <w:tcPr>
+            <w:tcW w:w="1900" w:type="dxa"/>
+            <w:shd w:val="clear" w:color="auto" w:fill="E2EFDA"/>
+          </w:tcPr>
+          <w:p>
+            <w:pPr>
+              <w:spacing w:after="40" w:before="0" w:line="240" w:lineRule="auto"/>
+              <w:rPr/>
+            </w:pPr>
+            <w:r>
+              <w:rPr>
+                <w:sz w:val="18"/>
+                <w:szCs w:val="18"/>
+                <w:rtl w:val="0"/>
+              </w:rPr>
+              <w:t xml:space="preserve">Jogável</w:t>
+            </w:r>
+          </w:p>
+        </w:tc>
+        <w:tc>
+          <w:tcPr>
+            <w:tcW w:w="2629" w:type="dxa"/>
+          </w:tcPr>
+          <w:p>
+            <w:pPr>
+              <w:spacing w:after="40" w:before="0" w:line="240" w:lineRule="auto"/>
+              <w:rPr/>
+            </w:pPr>
+            <w:r>
+              <w:rPr>
+                <w:sz w:val="18"/>
+                <w:szCs w:val="18"/>
+                <w:rtl w:val="0"/>
+              </w:rPr>
+              <w:t xml:space="preserve">Praça de alimentação em arco, com quatro restaurantes, e um mezanino opcional com gráfica, loja da universidade e cinema (12 salas).</w:t>
+            </w:r>
+          </w:p>
+        </w:tc>
+        <w:tc>
+          <w:tcPr>
+            <w:tcW w:w="1500" w:type="dxa"/>
+          </w:tcPr>
+          <w:p>
+            <w:pPr>
+              <w:spacing w:after="40" w:before="0" w:line="240" w:lineRule="auto"/>
+              <w:rPr/>
+            </w:pPr>
+            <w:r>
+              <w:rPr>
+                <w:sz w:val="18"/>
+                <w:szCs w:val="18"/>
+                <w:rtl w:val="0"/>
+              </w:rPr>
+              <w:t xml:space="preserve">Sentinelas e Rastreadores</w:t>
+            </w:r>
+          </w:p>
+        </w:tc>
+        <w:tc>
+          <w:tcPr>
+            <w:tcW w:w="1500" w:type="dxa"/>
+          </w:tcPr>
+          <w:p>
+            <w:pPr>
+              <w:spacing w:after="40" w:before="0" w:line="240" w:lineRule="auto"/>
+              <w:rPr/>
+            </w:pPr>
+            <w:r>
+              <w:rPr>
+                <w:sz w:val="18"/>
+                <w:szCs w:val="18"/>
+                <w:rtl w:val="0"/>
+              </w:rPr>
+              <w:t xml:space="preserve">Cobertura no cenário e coloração de grafos</w:t>
+            </w:r>
+          </w:p>
+        </w:tc>
+      </w:tr>
+      <w:tr>
+        <w:trPr>
+          <w:cantSplit/>
+        </w:trPr>
+        <w:tc>
+          <w:tcPr>
+            <w:tcW w:w="1500" w:type="dxa"/>
+          </w:tcPr>
+          <w:p>
+            <w:pPr>
+              <w:spacing w:after="40" w:before="0" w:line="240" w:lineRule="auto"/>
+              <w:rPr/>
+            </w:pPr>
+            <w:r>
+              <w:rPr>
+                <w:sz w:val="18"/>
+                <w:szCs w:val="18"/>
+                <w:rtl w:val="0"/>
+              </w:rPr>
               <w:t xml:space="preserve">Bunker</w:t>
             </w:r>
           </w:p>
@@ -5884,7 +6096,7 @@
                 <w:szCs w:val="18"/>
                 <w:rtl w:val="0"/>
               </w:rPr>
-              <w:t xml:space="preserve">Nenhum: os robôs não descem</w:t>
+              <w:t xml:space="preserve">Nenhum ainda: a história decidiu que os robôs patrulham o bunker, mas eles não estão no jogo</w:t>
             </w:r>
           </w:p>
         </w:tc>
@@ -5904,6 +6116,107 @@
                 <w:rtl w:val="0"/>
               </w:rPr>
               <w:t xml:space="preserve">Conversa e ritmo de respiro</w:t>
+            </w:r>
+          </w:p>
+        </w:tc>
+      </w:tr>
+      <w:tr>
+        <w:trPr>
+          <w:cantSplit/>
+        </w:trPr>
+        <w:tc>
+          <w:tcPr>
+            <w:tcW w:w="1500" w:type="dxa"/>
+          </w:tcPr>
+          <w:p>
+            <w:pPr>
+              <w:spacing w:after="40" w:before="0" w:line="240" w:lineRule="auto"/>
+              <w:rPr/>
+            </w:pPr>
+            <w:r>
+              <w:rPr>
+                <w:sz w:val="18"/>
+                <w:szCs w:val="18"/>
+                <w:rtl w:val="0"/>
+              </w:rPr>
+              <w:t xml:space="preserve">Laboratório (D-Tec)</w:t>
+            </w:r>
+          </w:p>
+        </w:tc>
+        <w:tc>
+          <w:tcPr>
+            <w:tcW w:w="1900" w:type="dxa"/>
+            <w:shd w:val="clear" w:color="auto" w:fill="FFF2CC"/>
+          </w:tcPr>
+          <w:p>
+            <w:pPr>
+              <w:spacing w:after="40" w:before="0" w:line="240" w:lineRule="auto"/>
+              <w:rPr/>
+            </w:pPr>
+            <w:r>
+              <w:rPr>
+                <w:sz w:val="18"/>
+                <w:szCs w:val="18"/>
+                <w:rtl w:val="0"/>
+              </w:rPr>
+              <w:t xml:space="preserve">Em desenvolvimento</w:t>
+            </w:r>
+          </w:p>
+        </w:tc>
+        <w:tc>
+          <w:tcPr>
+            <w:tcW w:w="2629" w:type="dxa"/>
+          </w:tcPr>
+          <w:p>
+            <w:pPr>
+              <w:spacing w:after="40" w:before="0" w:line="240" w:lineRule="auto"/>
+              <w:rPr/>
+            </w:pPr>
+            <w:r>
+              <w:rPr>
+                <w:sz w:val="18"/>
+                <w:szCs w:val="18"/>
+                <w:rtl w:val="0"/>
+              </w:rPr>
+              <w:t xml:space="preserve">Laboratório com corredores, salas de laboratório e a máquina central (a Âncora).</w:t>
+            </w:r>
+          </w:p>
+        </w:tc>
+        <w:tc>
+          <w:tcPr>
+            <w:tcW w:w="1500" w:type="dxa"/>
+          </w:tcPr>
+          <w:p>
+            <w:pPr>
+              <w:spacing w:after="40" w:before="0" w:line="240" w:lineRule="auto"/>
+              <w:rPr/>
+            </w:pPr>
+            <w:r>
+              <w:rPr>
+                <w:sz w:val="18"/>
+                <w:szCs w:val="18"/>
+                <w:rtl w:val="0"/>
+              </w:rPr>
+              <w:t xml:space="preserve">A definir</w:t>
+            </w:r>
+          </w:p>
+        </w:tc>
+        <w:tc>
+          <w:tcPr>
+            <w:tcW w:w="1500" w:type="dxa"/>
+          </w:tcPr>
+          <w:p>
+            <w:pPr>
+              <w:spacing w:after="40" w:before="0" w:line="240" w:lineRule="auto"/>
+              <w:rPr/>
+            </w:pPr>
+            <w:r>
+              <w:rPr>
+                <w:sz w:val="18"/>
+                <w:szCs w:val="18"/>
+                <w:rtl w:val="0"/>
+              </w:rPr>
+              <w:t xml:space="preserve">A definir</w:t>
             </w:r>
           </w:p>
         </w:tc>
@@ -5937,13 +6250,7 @@
         <w:rPr>
           <w:rtl w:val="0"/>
         </w:rPr>
-        <w:t xml:space="preserve"> </w:t>
-      </w:r>
-      <w:r>
-        <w:rPr>
-          <w:rtl w:val="0"/>
-        </w:rPr>
-        <w:t xml:space="preserve">cada ambiente tem uma ideia própria, para não repetir, e um papel claro no ritmo do jogo.</w:t>
+        <w:t xml:space="preserve"> cada ambiente tem uma ideia própria, para não repetir, e um papel claro no ritmo do jogo.</w:t>
       </w:r>
     </w:p>
     <w:p>
@@ -6261,7 +6568,7 @@
                 <w:szCs w:val="18"/>
                 <w:rtl w:val="0"/>
               </w:rPr>
-              <w:t xml:space="preserve">Bunker</w:t>
+              <w:t xml:space="preserve">Centro de Convivência</w:t>
             </w:r>
           </w:p>
         </w:tc>
@@ -6280,7 +6587,7 @@
                 <w:szCs w:val="18"/>
                 <w:rtl w:val="0"/>
               </w:rPr>
-              <w:t xml:space="preserve">Concreto aparente em cima e tinta verde-oliva embaixo, tubos fluorescentes frios, luzes de emergência vermelhas e o setor B alagado. Portas de aço de correr e faixas de perigo.</w:t>
+              <w:t xml:space="preserve">Praça de alimentação em arco, sob uma cúpula de vidro quebrada, com quatro restaurantes, mesas, árvores e luar. O segundo andar é um mezanino com gráfica, loja da universidade e cinema.</w:t>
             </w:r>
           </w:p>
         </w:tc>
@@ -6299,7 +6606,7 @@
                 <w:szCs w:val="18"/>
                 <w:rtl w:val="0"/>
               </w:rPr>
-              <w:t xml:space="preserve">O lugar mais seguro do jogo. Reúne conversas e deixa ganchos para fases futuras (a comporta do núcleo, o laboratório, o arquivo).</w:t>
+              <w:t xml:space="preserve">Atravessar a praça à vista das Sentinelas, usando mesas, árvores e nichos como cobertura, com o Zane guiando pelo rádio. Termina no elevador de carga que desce para o Bunker.</w:t>
             </w:r>
           </w:p>
         </w:tc>
@@ -6323,7 +6630,7 @@
                 <w:szCs w:val="18"/>
                 <w:rtl w:val="0"/>
               </w:rPr>
-              <w:t xml:space="preserve">Centro de Convivência e DTEC</w:t>
+              <w:t xml:space="preserve">Bunker</w:t>
             </w:r>
           </w:p>
         </w:tc>
@@ -6342,7 +6649,7 @@
                 <w:szCs w:val="18"/>
                 <w:rtl w:val="0"/>
               </w:rPr>
-              <w:t xml:space="preserve">O Centro seria uma estrutura aberta tomada pelo mato (esboço). O DTEC é um laboratório com corredores, oito salas e uma máquina grande e brilhante no salão central.</w:t>
+              <w:t xml:space="preserve">Concreto aparente em cima e tinta verde-oliva embaixo, tubos fluorescentes frios, luzes de emergência vermelhas e o setor B alagado. Portas de aço de correr e faixas de perigo.</w:t>
             </w:r>
           </w:p>
         </w:tc>
@@ -6361,7 +6668,69 @@
                 <w:szCs w:val="18"/>
                 <w:rtl w:val="0"/>
               </w:rPr>
-              <w:t xml:space="preserve">Sem lugar na história ainda. O mapa do DTEC está pronto como fase solta; se ele vira o D-Tec do Carlos está em aberto.</w:t>
+              <w:t xml:space="preserve">Esconderijo difícil de alcançar, onde o Henrique fica sozinho numa sala de dados trancada. Reúne conversas e deixa ganchos (a comporta do núcleo, o laboratório, o arquivo). Os robôs patrulham aqui também, mas ainda não estão no jogo.</w:t>
+            </w:r>
+          </w:p>
+        </w:tc>
+      </w:tr>
+      <w:tr>
+        <w:trPr>
+          <w:cantSplit/>
+        </w:trPr>
+        <w:tc>
+          <w:tcPr>
+            <w:tcW w:w="1500" w:type="dxa"/>
+          </w:tcPr>
+          <w:p>
+            <w:pPr>
+              <w:spacing w:after="40" w:before="0" w:line="240" w:lineRule="auto"/>
+              <w:rPr/>
+            </w:pPr>
+            <w:r>
+              <w:rPr>
+                <w:sz w:val="18"/>
+                <w:szCs w:val="18"/>
+                <w:rtl w:val="0"/>
+              </w:rPr>
+              <w:t xml:space="preserve">Laboratório (D-Tec)</w:t>
+            </w:r>
+          </w:p>
+        </w:tc>
+        <w:tc>
+          <w:tcPr>
+            <w:tcW w:w="4329" w:type="dxa"/>
+          </w:tcPr>
+          <w:p>
+            <w:pPr>
+              <w:spacing w:after="40" w:before="0" w:line="240" w:lineRule="auto"/>
+              <w:rPr/>
+            </w:pPr>
+            <w:r>
+              <w:rPr>
+                <w:sz w:val="18"/>
+                <w:szCs w:val="18"/>
+                <w:rtl w:val="0"/>
+              </w:rPr>
+              <w:t xml:space="preserve">Laboratório lacrado, mais inteiro que a Biblioteca, mas com mil anos de poeira: azulejo branco embaixo, painel cinza em cima e a faixa azul do DTEC. Fluorescentes frias que piscam e, no salão central, a luz ciano pulsante da máquina.</w:t>
+            </w:r>
+          </w:p>
+        </w:tc>
+        <w:tc>
+          <w:tcPr>
+            <w:tcW w:w="3200" w:type="dxa"/>
+          </w:tcPr>
+          <w:p>
+            <w:pPr>
+              <w:spacing w:after="40" w:before="0" w:line="240" w:lineRule="auto"/>
+              <w:rPr/>
+            </w:pPr>
+            <w:r>
+              <w:rPr>
+                <w:sz w:val="18"/>
+                <w:szCs w:val="18"/>
+                <w:rtl w:val="0"/>
+              </w:rPr>
+              <w:t xml:space="preserve">Onde ficam a Âncora, a máquina grande e brilhante do salão central, e o Carlos. Como o grupo o enfrenta sem lutar está em aberto.</w:t>
             </w:r>
           </w:p>
         </w:tc>
@@ -6395,13 +6764,7 @@
         <w:rPr>
           <w:rtl w:val="0"/>
         </w:rPr>
-        <w:t xml:space="preserve"> </w:t>
-      </w:r>
-      <w:r>
-        <w:rPr>
-          <w:rtl w:val="0"/>
-        </w:rPr>
-        <w:t xml:space="preserve">o jogador enfrenta inimigos que seguem rotina, o próprio lugar e a escassez.</w:t>
+        <w:t xml:space="preserve"> o jogador enfrenta inimigos que seguem rotina, o próprio lugar e a escassez.</w:t>
       </w:r>
     </w:p>
     <w:p>
@@ -6945,13 +7308,7 @@
         <w:rPr>
           <w:rtl w:val="0"/>
         </w:rPr>
-        <w:t xml:space="preserve"> </w:t>
-      </w:r>
-      <w:r>
-        <w:rPr>
-          <w:rtl w:val="0"/>
-        </w:rPr>
-        <w:t xml:space="preserve">pixel art em vista lateral 2.5D. Duas ideias guiam a imagem: o contraste entre a ruína e a tecnologia de 3026, e a luz como recurso e como perigo.</w:t>
+        <w:t xml:space="preserve"> pixel art em vista lateral 2.5D. Duas ideias guiam a imagem: o contraste entre a ruína e a tecnologia de 3026, e a luz como recurso e como perigo.</w:t>
       </w:r>
     </w:p>
     <w:p>
@@ -7144,13 +7501,7 @@
         <w:rPr>
           <w:rtl w:val="0"/>
         </w:rPr>
-        <w:t xml:space="preserve"> </w:t>
-      </w:r>
-      <w:r>
-        <w:rPr>
-          <w:rtl w:val="0"/>
-        </w:rPr>
-        <w:t xml:space="preserve">cada personagem tem uma cor de identificação e uma silhueta própria, para o jogador reconhecê-lo de longe. Os humanos compartilham o mesmo conjunto de sprites (cinco vistas, caminhada de 12 quadros, respiração de 8 e retratos de 80 × 80 px para os diálogos).</w:t>
+        <w:t xml:space="preserve"> cada personagem tem uma cor de identificação e uma silhueta própria, para o jogador reconhecê-lo de longe. Os humanos compartilham o mesmo conjunto de sprites (cinco vistas, caminhada de 12 quadros, respiração de 8 e retratos de 80 × 80 px para os diálogos).</w:t>
       </w:r>
     </w:p>
     <w:p>
@@ -7962,13 +8313,7 @@
         <w:rPr>
           <w:rtl w:val="0"/>
         </w:rPr>
-        <w:t xml:space="preserve"> </w:t>
-      </w:r>
-      <w:r>
-        <w:rPr>
-          <w:rtl w:val="0"/>
-        </w:rPr>
-        <w:t xml:space="preserve">o som carrega parte da tensão e da informação. Toda a música e quase todos os efeitos são compostos por script (NumPy), sem gravação e sem problema de licença.</w:t>
+        <w:t xml:space="preserve"> o som carrega parte da tensão e da informação. Toda a música e quase todos os efeitos são compostos por script (NumPy), sem gravação e sem problema de licença.</w:t>
       </w:r>
     </w:p>
     <w:p>
@@ -8108,13 +8453,7 @@
         <w:rPr>
           <w:rtl w:val="0"/>
         </w:rPr>
-        <w:t xml:space="preserve"> </w:t>
-      </w:r>
-      <w:r>
-        <w:rPr>
-          <w:rtl w:val="0"/>
-        </w:rPr>
-        <w:t xml:space="preserve">a interface é desenhada em 320 × 180 px, com a mesma fonte pixelada e o mesmo tema em todas as telas, para parecer parte do mundo. Nada de ícones soltos: o que não precisa estar na tela, não está.</w:t>
+        <w:t xml:space="preserve"> a interface é desenhada em 320 × 180 px, com a mesma fonte pixelada e o mesmo tema em todas as telas, para parecer parte do mundo. Nada de ícones soltos: o que não precisa estar na tela, não está.</w:t>
       </w:r>
     </w:p>
     <w:p>
@@ -8235,13 +8574,7 @@
         <w:rPr>
           <w:rtl w:val="0"/>
         </w:rPr>
-        <w:t xml:space="preserve"> </w:t>
-      </w:r>
-      <w:r>
-        <w:rPr>
-          <w:rtl w:val="0"/>
-        </w:rPr>
-        <w:t xml:space="preserve">o jogo se joga com teclado. A tabela lista os controles; o jogo pausa sozinho ao abrir o inventário, um documento ou uma conversa, mas não pausa com o rádio.</w:t>
+        <w:t xml:space="preserve"> o jogo se joga com teclado. A tabela lista os controles; o jogo pausa sozinho ao abrir o inventário, um documento ou uma conversa, mas não pausa com o rádio.</w:t>
       </w:r>
     </w:p>
     <w:p>
@@ -8748,13 +9081,7 @@
         <w:rPr>
           <w:rtl w:val="0"/>
         </w:rPr>
-        <w:t xml:space="preserve"> </w:t>
-      </w:r>
-      <w:r>
-        <w:rPr>
-          <w:rtl w:val="0"/>
-        </w:rPr>
-        <w:t xml:space="preserve">o que já existe e o que ainda falta.</w:t>
+        <w:t xml:space="preserve"> o que já existe e o que ainda falta.</w:t>
       </w:r>
     </w:p>
     <w:p>
@@ -8846,13 +9173,7 @@
         <w:rPr>
           <w:rtl w:val="0"/>
         </w:rPr>
-        <w:t xml:space="preserve"> </w:t>
-      </w:r>
-      <w:r>
-        <w:rPr>
-          <w:rtl w:val="0"/>
-        </w:rPr>
-        <w:t xml:space="preserve">Godot 4.7.x, com GDScript e renderizador GL Compatibility, em 2D. A escolha cabe no tamanho do grupo e dá recursos prontos para o que o jogo precisa: luzes 2D com sombras, A* em grade, sinais, cenas reutilizáveis e shaders.</w:t>
+        <w:t xml:space="preserve"> Godot 4.7.x, com GDScript e renderizador GL Compatibility, em 2D. A escolha cabe no tamanho do grupo e dá recursos prontos para o que o jogo precisa: luzes 2D com sombras, A* em grade, sinais, cenas reutilizáveis e shaders.</w:t>
       </w:r>
     </w:p>
     <w:p>
@@ -9012,13 +9333,7 @@
         <w:rPr>
           <w:rtl w:val="0"/>
         </w:rPr>
-        <w:t xml:space="preserve"> </w:t>
-      </w:r>
-      <w:r>
-        <w:rPr>
-          <w:rtl w:val="0"/>
-        </w:rPr>
-        <w:t xml:space="preserve">o custo do jogo é baixo por construção, e os algoritmos foram escolhidos para custar pouco.</w:t>
+        <w:t xml:space="preserve"> o custo do jogo é baixo por construção, e os algoritmos foram escolhidos para custar pouco.</w:t>
       </w:r>
     </w:p>
     <w:p>
@@ -9165,13 +9480,7 @@
         <w:rPr>
           <w:rtl w:val="0"/>
         </w:rPr>
-        <w:t xml:space="preserve"> </w:t>
-      </w:r>
-      <w:r>
-        <w:rPr>
-          <w:rtl w:val="0"/>
-        </w:rPr>
-        <w:t xml:space="preserve">combinados que valem para todos, para o trabalho de quatro pessoas não virar conflito.</w:t>
+        <w:t xml:space="preserve"> combinados que valem para todos, para o trabalho de quatro pessoas não virar conflito.</w:t>
       </w:r>
     </w:p>
     <w:p>
@@ -9195,7 +9504,7 @@
         <w:rPr>
           <w:rtl w:val="0"/>
         </w:rPr>
-        <w:t xml:space="preserve"> o Enredo Principal vale para história, mundo e personagens; o registro de decisões vale para mecânicas e técnica; depois vêm os documentos de cada módulo e, por último, o GDD. Toda mudança de design é registrada em </w:t>
+        <w:t xml:space="preserve"> a História Completa vale para história, mundo e personagens; o registro de decisões vale para mecânicas e técnica; depois vêm os documentos de cada módulo e, por último, o GDD. Toda mudança de design é registrada em </w:t>
       </w:r>
       <w:r>
         <w:rPr>
@@ -9208,7 +9517,7 @@
         <w:rPr>
           <w:rtl w:val="0"/>
         </w:rPr>
-        <w:t xml:space="preserve">, e as de história entram no mesmo PR no Enredo Principal.</w:t>
+        <w:t xml:space="preserve">, e as de história entram no mesmo PR na História Completa.</w:t>
       </w:r>
     </w:p>
     <w:p>
@@ -9495,13 +9804,7 @@
         <w:rPr>
           <w:rtl w:val="0"/>
         </w:rPr>
-        <w:t xml:space="preserve"> </w:t>
-      </w:r>
-      <w:r>
-        <w:rPr>
-          <w:rtl w:val="0"/>
-        </w:rPr>
-        <w:t xml:space="preserve">o projeto começou em 24 de setembro de 2026. A tabela mostra os marcos já entregues, tirados do registro de decisões, e os próximos.</w:t>
+        <w:t xml:space="preserve"> o projeto começou em 24 de setembro de 2026. A tabela mostra os marcos já entregues, tirados do registro de decisões, e os próximos.</w:t>
       </w:r>
     </w:p>
     <w:p>
@@ -9778,7 +10081,7 @@
                 <w:szCs w:val="18"/>
                 <w:rtl w:val="0"/>
               </w:rPr>
-              <w:t xml:space="preserve">Biblioteca em oito salas com cadeados, hackeamento com minigames, tela de pausa e a história reescrita (a fenda como acaso, o Carlos como antagonista e o Enredo Principal como lei).</w:t>
+              <w:t xml:space="preserve">Biblioteca em oito salas com cadeados, hackeamento com minigames, tela de pausa e a história reescrita (a fenda como acaso, o Carlos como antagonista e a História Completa como lei).</w:t>
             </w:r>
           </w:p>
         </w:tc>
@@ -9904,7 +10207,7 @@
                 <w:szCs w:val="18"/>
                 <w:rtl w:val="0"/>
               </w:rPr>
-              <w:t xml:space="preserve">Completar o Bunker (Zane, Henrique e o setor B); fechar a ordem das fases seguintes (Centro de Convivência e D-Tec); salvamento em arquivo e sonhos; esconderijos com microgames; final; vozes.</w:t>
+              <w:t xml:space="preserve">Completar o Bunker (Zane, Henrique e o setor B) e o Laboratório (D-Tec); salvamento em arquivo e sonhos; esconderijos com microgames; final; vozes.</w:t>
             </w:r>
           </w:p>
         </w:tc>
@@ -10017,13 +10320,7 @@
         <w:rPr>
           <w:rtl w:val="0"/>
         </w:rPr>
-        <w:t xml:space="preserve"> </w:t>
-      </w:r>
-      <w:r>
-        <w:rPr>
-          <w:rtl w:val="0"/>
-        </w:rPr>
-        <w:t xml:space="preserve">quatro pessoas em quatro papéis. Os papéis ficam; as tarefas mudam a cada sprint.</w:t>
+        <w:t xml:space="preserve"> quatro pessoas em quatro papéis. Os papéis ficam; as tarefas mudam a cada sprint.</w:t>
       </w:r>
     </w:p>
     <w:p>
@@ -10441,7 +10738,7 @@
         <w:rPr>
           <w:rtl w:val="0"/>
         </w:rPr>
-        <w:t xml:space="preserve">O storyboard mostra, em quadros, as principais sequências do jogo: as cenas, o enquadramento de cada uma e o que o jogador faz nela. Os quadros do prólogo e do despertar são as ilustrações e o vídeo das cutscenes; os demais são capturas do jogo rodando (Godot 4.7), com o HUD, a lanterna e as conversas como aparecem para o jogador. Os pontos que a história ainda não decidiu não têm quadro.</w:t>
+        <w:t xml:space="preserve">O storyboard mostra, em quadros, as principais sequências do jogo: as cenas, o enquadramento de cada uma e o que o jogador faz nela. As imagens dos quadros não estão neste documento: vão no arquivo STORY BOARD, entregue junto. Os pontos que a história ainda não decidiu não têm quadro.</w:t>
       </w:r>
     </w:p>
     <w:p>
@@ -10461,7 +10758,7 @@
         <w:rPr>
           <w:rtl w:val="0"/>
         </w:rPr>
-        <w:t xml:space="preserve"> menu principal, prólogo (2026), despertar (3026), Biblioteca, Bloco de salas, Labirinto, Bunker (posição provisória) e as fases seguintes, ainda em aberto, até o final, que também está em aberto.</w:t>
+        <w:t xml:space="preserve"> menu principal, prólogo (2026), despertar (3026), Biblioteca, Bloco de salas, Labirinto, Centro de Convivência, Bunker e Laboratório (D-Tec), até o final, que está em aberto.</w:t>
       </w:r>
     </w:p>
     <w:p>
@@ -10515,52 +10812,6 @@
           </w:tcPr>
           <w:p>
             <w:pPr>
-              <w:spacing w:after="60" w:before="0" w:line="240" w:lineRule="auto"/>
-              <w:jc w:val="center"/>
-              <w:rPr/>
-            </w:pPr>
-            <w:r>
-              <w:rPr>
-                <w:noProof/>
-              </w:rPr>
-              <w:drawing>
-                <wp:inline distT="0" distB="0" distL="0" distR="0">
-                  <wp:extent cx="3937000" cy="2212594"/>
-                  <wp:docPr id="101" name="Imagem 101" descr="Quadro 1 · Menu principal"/>
-                  <wp:cNvGraphicFramePr>
-                    <a:graphicFrameLocks noChangeAspect="1"/>
-                  </wp:cNvGraphicFramePr>
-                  <a:graphic>
-                    <a:graphicData uri="http://schemas.openxmlformats.org/drawingml/2006/picture">
-                      <pic:pic>
-                        <pic:nvPicPr>
-                          <pic:cNvPr id="101" name="imagem1.png"/>
-                          <pic:cNvPicPr/>
-                        </pic:nvPicPr>
-                        <pic:blipFill>
-                          <a:blip r:embed="rIdImg1"/>
-                          <a:stretch>
-                            <a:fillRect/>
-                          </a:stretch>
-                        </pic:blipFill>
-                        <pic:spPr>
-                          <a:xfrm>
-                            <a:off x="0" y="0"/>
-                            <a:ext cx="3937000" cy="2212594"/>
-                          </a:xfrm>
-                          <a:prstGeom prst="rect">
-                            <a:avLst/>
-                          </a:prstGeom>
-                        </pic:spPr>
-                      </pic:pic>
-                    </a:graphicData>
-                  </a:graphic>
-                </wp:inline>
-              </w:drawing>
-            </w:r>
-          </w:p>
-          <w:p>
-            <w:pPr>
               <w:spacing w:after="40" w:before="0" w:line="240" w:lineRule="auto"/>
               <w:rPr/>
             </w:pPr>
@@ -10655,52 +10906,6 @@
           </w:tcPr>
           <w:p>
             <w:pPr>
-              <w:spacing w:after="60" w:before="0" w:line="240" w:lineRule="auto"/>
-              <w:jc w:val="center"/>
-              <w:rPr/>
-            </w:pPr>
-            <w:r>
-              <w:rPr>
-                <w:noProof/>
-              </w:rPr>
-              <w:drawing>
-                <wp:inline distT="0" distB="0" distL="0" distR="0">
-                  <wp:extent cx="2740025" cy="1541264"/>
-                  <wp:docPr id="102" name="Imagem 102" descr="Quadro 2 · O alarme (06:15)"/>
-                  <wp:cNvGraphicFramePr>
-                    <a:graphicFrameLocks noChangeAspect="1"/>
-                  </wp:cNvGraphicFramePr>
-                  <a:graphic>
-                    <a:graphicData uri="http://schemas.openxmlformats.org/drawingml/2006/picture">
-                      <pic:pic>
-                        <pic:nvPicPr>
-                          <pic:cNvPr id="102" name="imagem2.png"/>
-                          <pic:cNvPicPr/>
-                        </pic:nvPicPr>
-                        <pic:blipFill>
-                          <a:blip r:embed="rIdImg2"/>
-                          <a:stretch>
-                            <a:fillRect/>
-                          </a:stretch>
-                        </pic:blipFill>
-                        <pic:spPr>
-                          <a:xfrm>
-                            <a:off x="0" y="0"/>
-                            <a:ext cx="2740025" cy="1541264"/>
-                          </a:xfrm>
-                          <a:prstGeom prst="rect">
-                            <a:avLst/>
-                          </a:prstGeom>
-                        </pic:spPr>
-                      </pic:pic>
-                    </a:graphicData>
-                  </a:graphic>
-                </wp:inline>
-              </w:drawing>
-            </w:r>
-          </w:p>
-          <w:p>
-            <w:pPr>
               <w:spacing w:after="40" w:before="0" w:line="240" w:lineRule="auto"/>
               <w:rPr/>
             </w:pPr>
@@ -10788,52 +10993,6 @@
           <w:tcPr>
             <w:tcW w:w="4514" w:type="dxa"/>
           </w:tcPr>
-          <w:p>
-            <w:pPr>
-              <w:spacing w:after="60" w:before="0" w:line="240" w:lineRule="auto"/>
-              <w:jc w:val="center"/>
-              <w:rPr/>
-            </w:pPr>
-            <w:r>
-              <w:rPr>
-                <w:noProof/>
-              </w:rPr>
-              <w:drawing>
-                <wp:inline distT="0" distB="0" distL="0" distR="0">
-                  <wp:extent cx="2739390" cy="1540906"/>
-                  <wp:docPr id="103" name="Imagem 103" descr="Quadro 3 · A partida"/>
-                  <wp:cNvGraphicFramePr>
-                    <a:graphicFrameLocks noChangeAspect="1"/>
-                  </wp:cNvGraphicFramePr>
-                  <a:graphic>
-                    <a:graphicData uri="http://schemas.openxmlformats.org/drawingml/2006/picture">
-                      <pic:pic>
-                        <pic:nvPicPr>
-                          <pic:cNvPr id="103" name="imagem3.png"/>
-                          <pic:cNvPicPr/>
-                        </pic:nvPicPr>
-                        <pic:blipFill>
-                          <a:blip r:embed="rIdImg3"/>
-                          <a:stretch>
-                            <a:fillRect/>
-                          </a:stretch>
-                        </pic:blipFill>
-                        <pic:spPr>
-                          <a:xfrm>
-                            <a:off x="0" y="0"/>
-                            <a:ext cx="2739390" cy="1540906"/>
-                          </a:xfrm>
-                          <a:prstGeom prst="rect">
-                            <a:avLst/>
-                          </a:prstGeom>
-                        </pic:spPr>
-                      </pic:pic>
-                    </a:graphicData>
-                  </a:graphic>
-                </wp:inline>
-              </w:drawing>
-            </w:r>
-          </w:p>
           <w:p>
             <w:pPr>
               <w:spacing w:after="40" w:before="0" w:line="240" w:lineRule="auto"/>
@@ -10930,52 +11089,6 @@
           </w:tcPr>
           <w:p>
             <w:pPr>
-              <w:spacing w:after="60" w:before="0" w:line="240" w:lineRule="auto"/>
-              <w:jc w:val="center"/>
-              <w:rPr/>
-            </w:pPr>
-            <w:r>
-              <w:rPr>
-                <w:noProof/>
-              </w:rPr>
-              <w:drawing>
-                <wp:inline distT="0" distB="0" distL="0" distR="0">
-                  <wp:extent cx="2740025" cy="1541264"/>
-                  <wp:docPr id="104" name="Imagem 104" descr="Quadro 4 · O trajeto"/>
-                  <wp:cNvGraphicFramePr>
-                    <a:graphicFrameLocks noChangeAspect="1"/>
-                  </wp:cNvGraphicFramePr>
-                  <a:graphic>
-                    <a:graphicData uri="http://schemas.openxmlformats.org/drawingml/2006/picture">
-                      <pic:pic>
-                        <pic:nvPicPr>
-                          <pic:cNvPr id="104" name="imagem4.png"/>
-                          <pic:cNvPicPr/>
-                        </pic:nvPicPr>
-                        <pic:blipFill>
-                          <a:blip r:embed="rIdImg4"/>
-                          <a:stretch>
-                            <a:fillRect/>
-                          </a:stretch>
-                        </pic:blipFill>
-                        <pic:spPr>
-                          <a:xfrm>
-                            <a:off x="0" y="0"/>
-                            <a:ext cx="2740025" cy="1541264"/>
-                          </a:xfrm>
-                          <a:prstGeom prst="rect">
-                            <a:avLst/>
-                          </a:prstGeom>
-                        </pic:spPr>
-                      </pic:pic>
-                    </a:graphicData>
-                  </a:graphic>
-                </wp:inline>
-              </w:drawing>
-            </w:r>
-          </w:p>
-          <w:p>
-            <w:pPr>
               <w:spacing w:after="40" w:before="0" w:line="240" w:lineRule="auto"/>
               <w:rPr/>
             </w:pPr>
@@ -11063,52 +11176,6 @@
           <w:tcPr>
             <w:tcW w:w="4514" w:type="dxa"/>
           </w:tcPr>
-          <w:p>
-            <w:pPr>
-              <w:spacing w:after="60" w:before="0" w:line="240" w:lineRule="auto"/>
-              <w:jc w:val="center"/>
-              <w:rPr/>
-            </w:pPr>
-            <w:r>
-              <w:rPr>
-                <w:noProof/>
-              </w:rPr>
-              <w:drawing>
-                <wp:inline distT="0" distB="0" distL="0" distR="0">
-                  <wp:extent cx="2739390" cy="1540906"/>
-                  <wp:docPr id="105" name="Imagem 105" descr="Quadro 5 · O campus vivo"/>
-                  <wp:cNvGraphicFramePr>
-                    <a:graphicFrameLocks noChangeAspect="1"/>
-                  </wp:cNvGraphicFramePr>
-                  <a:graphic>
-                    <a:graphicData uri="http://schemas.openxmlformats.org/drawingml/2006/picture">
-                      <pic:pic>
-                        <pic:nvPicPr>
-                          <pic:cNvPr id="105" name="imagem5.png"/>
-                          <pic:cNvPicPr/>
-                        </pic:nvPicPr>
-                        <pic:blipFill>
-                          <a:blip r:embed="rIdImg5"/>
-                          <a:stretch>
-                            <a:fillRect/>
-                          </a:stretch>
-                        </pic:blipFill>
-                        <pic:spPr>
-                          <a:xfrm>
-                            <a:off x="0" y="0"/>
-                            <a:ext cx="2739390" cy="1540906"/>
-                          </a:xfrm>
-                          <a:prstGeom prst="rect">
-                            <a:avLst/>
-                          </a:prstGeom>
-                        </pic:spPr>
-                      </pic:pic>
-                    </a:graphicData>
-                  </a:graphic>
-                </wp:inline>
-              </w:drawing>
-            </w:r>
-          </w:p>
           <w:p>
             <w:pPr>
               <w:spacing w:after="40" w:before="0" w:line="240" w:lineRule="auto"/>
@@ -11205,52 +11272,6 @@
           </w:tcPr>
           <w:p>
             <w:pPr>
-              <w:spacing w:after="60" w:before="0" w:line="240" w:lineRule="auto"/>
-              <w:jc w:val="center"/>
-              <w:rPr/>
-            </w:pPr>
-            <w:r>
-              <w:rPr>
-                <w:noProof/>
-              </w:rPr>
-              <w:drawing>
-                <wp:inline distT="0" distB="0" distL="0" distR="0">
-                  <wp:extent cx="2740025" cy="1541264"/>
-                  <wp:docPr id="106" name="Imagem 106" descr="Quadro 6 · A aula e o caderno"/>
-                  <wp:cNvGraphicFramePr>
-                    <a:graphicFrameLocks noChangeAspect="1"/>
-                  </wp:cNvGraphicFramePr>
-                  <a:graphic>
-                    <a:graphicData uri="http://schemas.openxmlformats.org/drawingml/2006/picture">
-                      <pic:pic>
-                        <pic:nvPicPr>
-                          <pic:cNvPr id="106" name="imagem6.png"/>
-                          <pic:cNvPicPr/>
-                        </pic:nvPicPr>
-                        <pic:blipFill>
-                          <a:blip r:embed="rIdImg6"/>
-                          <a:stretch>
-                            <a:fillRect/>
-                          </a:stretch>
-                        </pic:blipFill>
-                        <pic:spPr>
-                          <a:xfrm>
-                            <a:off x="0" y="0"/>
-                            <a:ext cx="2740025" cy="1541264"/>
-                          </a:xfrm>
-                          <a:prstGeom prst="rect">
-                            <a:avLst/>
-                          </a:prstGeom>
-                        </pic:spPr>
-                      </pic:pic>
-                    </a:graphicData>
-                  </a:graphic>
-                </wp:inline>
-              </w:drawing>
-            </w:r>
-          </w:p>
-          <w:p>
-            <w:pPr>
               <w:spacing w:after="40" w:before="0" w:line="240" w:lineRule="auto"/>
               <w:rPr/>
             </w:pPr>
@@ -11338,52 +11359,6 @@
           <w:tcPr>
             <w:tcW w:w="4514" w:type="dxa"/>
           </w:tcPr>
-          <w:p>
-            <w:pPr>
-              <w:spacing w:after="60" w:before="0" w:line="240" w:lineRule="auto"/>
-              <w:jc w:val="center"/>
-              <w:rPr/>
-            </w:pPr>
-            <w:r>
-              <w:rPr>
-                <w:noProof/>
-              </w:rPr>
-              <w:drawing>
-                <wp:inline distT="0" distB="0" distL="0" distR="0">
-                  <wp:extent cx="2739390" cy="1540906"/>
-                  <wp:docPr id="107" name="Imagem 107" descr="Quadro 7 · Rumo à Biblioteca"/>
-                  <wp:cNvGraphicFramePr>
-                    <a:graphicFrameLocks noChangeAspect="1"/>
-                  </wp:cNvGraphicFramePr>
-                  <a:graphic>
-                    <a:graphicData uri="http://schemas.openxmlformats.org/drawingml/2006/picture">
-                      <pic:pic>
-                        <pic:nvPicPr>
-                          <pic:cNvPr id="107" name="imagem7.png"/>
-                          <pic:cNvPicPr/>
-                        </pic:nvPicPr>
-                        <pic:blipFill>
-                          <a:blip r:embed="rIdImg7"/>
-                          <a:stretch>
-                            <a:fillRect/>
-                          </a:stretch>
-                        </pic:blipFill>
-                        <pic:spPr>
-                          <a:xfrm>
-                            <a:off x="0" y="0"/>
-                            <a:ext cx="2739390" cy="1540906"/>
-                          </a:xfrm>
-                          <a:prstGeom prst="rect">
-                            <a:avLst/>
-                          </a:prstGeom>
-                        </pic:spPr>
-                      </pic:pic>
-                    </a:graphicData>
-                  </a:graphic>
-                </wp:inline>
-              </w:drawing>
-            </w:r>
-          </w:p>
           <w:p>
             <w:pPr>
               <w:spacing w:after="40" w:before="0" w:line="240" w:lineRule="auto"/>
@@ -11480,52 +11455,6 @@
           </w:tcPr>
           <w:p>
             <w:pPr>
-              <w:spacing w:after="60" w:before="0" w:line="240" w:lineRule="auto"/>
-              <w:jc w:val="center"/>
-              <w:rPr/>
-            </w:pPr>
-            <w:r>
-              <w:rPr>
-                <w:noProof/>
-              </w:rPr>
-              <w:drawing>
-                <wp:inline distT="0" distB="0" distL="0" distR="0">
-                  <wp:extent cx="2740025" cy="1541264"/>
-                  <wp:docPr id="108" name="Imagem 108" descr="Quadro 8 · A cabine (03:14)"/>
-                  <wp:cNvGraphicFramePr>
-                    <a:graphicFrameLocks noChangeAspect="1"/>
-                  </wp:cNvGraphicFramePr>
-                  <a:graphic>
-                    <a:graphicData uri="http://schemas.openxmlformats.org/drawingml/2006/picture">
-                      <pic:pic>
-                        <pic:nvPicPr>
-                          <pic:cNvPr id="108" name="imagem8.png"/>
-                          <pic:cNvPicPr/>
-                        </pic:nvPicPr>
-                        <pic:blipFill>
-                          <a:blip r:embed="rIdImg8"/>
-                          <a:stretch>
-                            <a:fillRect/>
-                          </a:stretch>
-                        </pic:blipFill>
-                        <pic:spPr>
-                          <a:xfrm>
-                            <a:off x="0" y="0"/>
-                            <a:ext cx="2740025" cy="1541264"/>
-                          </a:xfrm>
-                          <a:prstGeom prst="rect">
-                            <a:avLst/>
-                          </a:prstGeom>
-                        </pic:spPr>
-                      </pic:pic>
-                    </a:graphicData>
-                  </a:graphic>
-                </wp:inline>
-              </w:drawing>
-            </w:r>
-          </w:p>
-          <w:p>
-            <w:pPr>
               <w:spacing w:after="40" w:before="0" w:line="240" w:lineRule="auto"/>
               <w:rPr/>
             </w:pPr>
@@ -11613,52 +11542,6 @@
           <w:tcPr>
             <w:tcW w:w="4514" w:type="dxa"/>
           </w:tcPr>
-          <w:p>
-            <w:pPr>
-              <w:spacing w:after="60" w:before="0" w:line="240" w:lineRule="auto"/>
-              <w:jc w:val="center"/>
-              <w:rPr/>
-            </w:pPr>
-            <w:r>
-              <w:rPr>
-                <w:noProof/>
-              </w:rPr>
-              <w:drawing>
-                <wp:inline distT="0" distB="0" distL="0" distR="0">
-                  <wp:extent cx="2739390" cy="1540906"/>
-                  <wp:docPr id="109" name="Imagem 109" descr="Quadro 9 · O pulso da fenda"/>
-                  <wp:cNvGraphicFramePr>
-                    <a:graphicFrameLocks noChangeAspect="1"/>
-                  </wp:cNvGraphicFramePr>
-                  <a:graphic>
-                    <a:graphicData uri="http://schemas.openxmlformats.org/drawingml/2006/picture">
-                      <pic:pic>
-                        <pic:nvPicPr>
-                          <pic:cNvPr id="109" name="imagem9.png"/>
-                          <pic:cNvPicPr/>
-                        </pic:nvPicPr>
-                        <pic:blipFill>
-                          <a:blip r:embed="rIdImg9"/>
-                          <a:stretch>
-                            <a:fillRect/>
-                          </a:stretch>
-                        </pic:blipFill>
-                        <pic:spPr>
-                          <a:xfrm>
-                            <a:off x="0" y="0"/>
-                            <a:ext cx="2739390" cy="1540906"/>
-                          </a:xfrm>
-                          <a:prstGeom prst="rect">
-                            <a:avLst/>
-                          </a:prstGeom>
-                        </pic:spPr>
-                      </pic:pic>
-                    </a:graphicData>
-                  </a:graphic>
-                </wp:inline>
-              </w:drawing>
-            </w:r>
-          </w:p>
           <w:p>
             <w:pPr>
               <w:spacing w:after="40" w:before="0" w:line="240" w:lineRule="auto"/>
@@ -11755,52 +11638,6 @@
           </w:tcPr>
           <w:p>
             <w:pPr>
-              <w:spacing w:after="60" w:before="0" w:line="240" w:lineRule="auto"/>
-              <w:jc w:val="center"/>
-              <w:rPr/>
-            </w:pPr>
-            <w:r>
-              <w:rPr>
-                <w:noProof/>
-              </w:rPr>
-              <w:drawing>
-                <wp:inline distT="0" distB="0" distL="0" distR="0">
-                  <wp:extent cx="2740025" cy="1541264"/>
-                  <wp:docPr id="110" name="Imagem 110" descr="Quadro 10 · Mil anos depois"/>
-                  <wp:cNvGraphicFramePr>
-                    <a:graphicFrameLocks noChangeAspect="1"/>
-                  </wp:cNvGraphicFramePr>
-                  <a:graphic>
-                    <a:graphicData uri="http://schemas.openxmlformats.org/drawingml/2006/picture">
-                      <pic:pic>
-                        <pic:nvPicPr>
-                          <pic:cNvPr id="110" name="imagem10.png"/>
-                          <pic:cNvPicPr/>
-                        </pic:nvPicPr>
-                        <pic:blipFill>
-                          <a:blip r:embed="rIdImg10"/>
-                          <a:stretch>
-                            <a:fillRect/>
-                          </a:stretch>
-                        </pic:blipFill>
-                        <pic:spPr>
-                          <a:xfrm>
-                            <a:off x="0" y="0"/>
-                            <a:ext cx="2740025" cy="1541264"/>
-                          </a:xfrm>
-                          <a:prstGeom prst="rect">
-                            <a:avLst/>
-                          </a:prstGeom>
-                        </pic:spPr>
-                      </pic:pic>
-                    </a:graphicData>
-                  </a:graphic>
-                </wp:inline>
-              </w:drawing>
-            </w:r>
-          </w:p>
-          <w:p>
-            <w:pPr>
               <w:spacing w:after="40" w:before="0" w:line="240" w:lineRule="auto"/>
               <w:rPr/>
             </w:pPr>
@@ -11888,52 +11725,6 @@
           <w:tcPr>
             <w:tcW w:w="4514" w:type="dxa"/>
           </w:tcPr>
-          <w:p>
-            <w:pPr>
-              <w:spacing w:after="60" w:before="0" w:line="240" w:lineRule="auto"/>
-              <w:jc w:val="center"/>
-              <w:rPr/>
-            </w:pPr>
-            <w:r>
-              <w:rPr>
-                <w:noProof/>
-              </w:rPr>
-              <w:drawing>
-                <wp:inline distT="0" distB="0" distL="0" distR="0">
-                  <wp:extent cx="2739390" cy="1540906"/>
-                  <wp:docPr id="111" name="Imagem 111" descr="Quadro 11 · O despertar"/>
-                  <wp:cNvGraphicFramePr>
-                    <a:graphicFrameLocks noChangeAspect="1"/>
-                  </wp:cNvGraphicFramePr>
-                  <a:graphic>
-                    <a:graphicData uri="http://schemas.openxmlformats.org/drawingml/2006/picture">
-                      <pic:pic>
-                        <pic:nvPicPr>
-                          <pic:cNvPr id="111" name="imagem11.png"/>
-                          <pic:cNvPicPr/>
-                        </pic:nvPicPr>
-                        <pic:blipFill>
-                          <a:blip r:embed="rIdImg11"/>
-                          <a:stretch>
-                            <a:fillRect/>
-                          </a:stretch>
-                        </pic:blipFill>
-                        <pic:spPr>
-                          <a:xfrm>
-                            <a:off x="0" y="0"/>
-                            <a:ext cx="2739390" cy="1540906"/>
-                          </a:xfrm>
-                          <a:prstGeom prst="rect">
-                            <a:avLst/>
-                          </a:prstGeom>
-                        </pic:spPr>
-                      </pic:pic>
-                    </a:graphicData>
-                  </a:graphic>
-                </wp:inline>
-              </w:drawing>
-            </w:r>
-          </w:p>
           <w:p>
             <w:pPr>
               <w:spacing w:after="40" w:before="0" w:line="240" w:lineRule="auto"/>
@@ -12077,52 +11868,6 @@
           </w:tcPr>
           <w:p>
             <w:pPr>
-              <w:spacing w:after="60" w:before="0" w:line="240" w:lineRule="auto"/>
-              <w:jc w:val="center"/>
-              <w:rPr/>
-            </w:pPr>
-            <w:r>
-              <w:rPr>
-                <w:noProof/>
-              </w:rPr>
-              <w:drawing>
-                <wp:inline distT="0" distB="0" distL="0" distR="0">
-                  <wp:extent cx="2740025" cy="1541264"/>
-                  <wp:docPr id="112" name="Imagem 112" descr="Quadro 12 · A cabine"/>
-                  <wp:cNvGraphicFramePr>
-                    <a:graphicFrameLocks noChangeAspect="1"/>
-                  </wp:cNvGraphicFramePr>
-                  <a:graphic>
-                    <a:graphicData uri="http://schemas.openxmlformats.org/drawingml/2006/picture">
-                      <pic:pic>
-                        <pic:nvPicPr>
-                          <pic:cNvPr id="112" name="imagem12.png"/>
-                          <pic:cNvPicPr/>
-                        </pic:nvPicPr>
-                        <pic:blipFill>
-                          <a:blip r:embed="rIdImg12"/>
-                          <a:stretch>
-                            <a:fillRect/>
-                          </a:stretch>
-                        </pic:blipFill>
-                        <pic:spPr>
-                          <a:xfrm>
-                            <a:off x="0" y="0"/>
-                            <a:ext cx="2740025" cy="1541264"/>
-                          </a:xfrm>
-                          <a:prstGeom prst="rect">
-                            <a:avLst/>
-                          </a:prstGeom>
-                        </pic:spPr>
-                      </pic:pic>
-                    </a:graphicData>
-                  </a:graphic>
-                </wp:inline>
-              </w:drawing>
-            </w:r>
-          </w:p>
-          <w:p>
-            <w:pPr>
               <w:spacing w:after="40" w:before="0" w:line="240" w:lineRule="auto"/>
               <w:rPr/>
             </w:pPr>
@@ -12210,52 +11955,6 @@
           <w:tcPr>
             <w:tcW w:w="4514" w:type="dxa"/>
           </w:tcPr>
-          <w:p>
-            <w:pPr>
-              <w:spacing w:after="60" w:before="0" w:line="240" w:lineRule="auto"/>
-              <w:jc w:val="center"/>
-              <w:rPr/>
-            </w:pPr>
-            <w:r>
-              <w:rPr>
-                <w:noProof/>
-              </w:rPr>
-              <w:drawing>
-                <wp:inline distT="0" distB="0" distL="0" distR="0">
-                  <wp:extent cx="2739390" cy="1540906"/>
-                  <wp:docPr id="113" name="Imagem 113" descr="Quadro 13 · O salão e a árvore"/>
-                  <wp:cNvGraphicFramePr>
-                    <a:graphicFrameLocks noChangeAspect="1"/>
-                  </wp:cNvGraphicFramePr>
-                  <a:graphic>
-                    <a:graphicData uri="http://schemas.openxmlformats.org/drawingml/2006/picture">
-                      <pic:pic>
-                        <pic:nvPicPr>
-                          <pic:cNvPr id="113" name="imagem13.png"/>
-                          <pic:cNvPicPr/>
-                        </pic:nvPicPr>
-                        <pic:blipFill>
-                          <a:blip r:embed="rIdImg13"/>
-                          <a:stretch>
-                            <a:fillRect/>
-                          </a:stretch>
-                        </pic:blipFill>
-                        <pic:spPr>
-                          <a:xfrm>
-                            <a:off x="0" y="0"/>
-                            <a:ext cx="2739390" cy="1540906"/>
-                          </a:xfrm>
-                          <a:prstGeom prst="rect">
-                            <a:avLst/>
-                          </a:prstGeom>
-                        </pic:spPr>
-                      </pic:pic>
-                    </a:graphicData>
-                  </a:graphic>
-                </wp:inline>
-              </w:drawing>
-            </w:r>
-          </w:p>
           <w:p>
             <w:pPr>
               <w:spacing w:after="40" w:before="0" w:line="240" w:lineRule="auto"/>
@@ -12352,52 +12051,6 @@
           </w:tcPr>
           <w:p>
             <w:pPr>
-              <w:spacing w:after="60" w:before="0" w:line="240" w:lineRule="auto"/>
-              <w:jc w:val="center"/>
-              <w:rPr/>
-            </w:pPr>
-            <w:r>
-              <w:rPr>
-                <w:noProof/>
-              </w:rPr>
-              <w:drawing>
-                <wp:inline distT="0" distB="0" distL="0" distR="0">
-                  <wp:extent cx="2740025" cy="1541264"/>
-                  <wp:docPr id="114" name="Imagem 114" descr="Quadro 14 · O rádio"/>
-                  <wp:cNvGraphicFramePr>
-                    <a:graphicFrameLocks noChangeAspect="1"/>
-                  </wp:cNvGraphicFramePr>
-                  <a:graphic>
-                    <a:graphicData uri="http://schemas.openxmlformats.org/drawingml/2006/picture">
-                      <pic:pic>
-                        <pic:nvPicPr>
-                          <pic:cNvPr id="114" name="imagem14.png"/>
-                          <pic:cNvPicPr/>
-                        </pic:nvPicPr>
-                        <pic:blipFill>
-                          <a:blip r:embed="rIdImg14"/>
-                          <a:stretch>
-                            <a:fillRect/>
-                          </a:stretch>
-                        </pic:blipFill>
-                        <pic:spPr>
-                          <a:xfrm>
-                            <a:off x="0" y="0"/>
-                            <a:ext cx="2740025" cy="1541264"/>
-                          </a:xfrm>
-                          <a:prstGeom prst="rect">
-                            <a:avLst/>
-                          </a:prstGeom>
-                        </pic:spPr>
-                      </pic:pic>
-                    </a:graphicData>
-                  </a:graphic>
-                </wp:inline>
-              </w:drawing>
-            </w:r>
-          </w:p>
-          <w:p>
-            <w:pPr>
               <w:spacing w:after="40" w:before="0" w:line="240" w:lineRule="auto"/>
               <w:rPr/>
             </w:pPr>
@@ -12431,7 +12084,7 @@
                 <w:szCs w:val="17"/>
                 <w:rtl w:val="0"/>
               </w:rPr>
-              <w:t xml:space="preserve">Balcão de atendimento, com o rádio da segurança.</w:t>
+              <w:t xml:space="preserve">Balcão de atendimento, com o rádio sintonizado na frequência do grupo.</w:t>
             </w:r>
           </w:p>
           <w:p>
@@ -12485,52 +12138,6 @@
           <w:tcPr>
             <w:tcW w:w="4514" w:type="dxa"/>
           </w:tcPr>
-          <w:p>
-            <w:pPr>
-              <w:spacing w:after="60" w:before="0" w:line="240" w:lineRule="auto"/>
-              <w:jc w:val="center"/>
-              <w:rPr/>
-            </w:pPr>
-            <w:r>
-              <w:rPr>
-                <w:noProof/>
-              </w:rPr>
-              <w:drawing>
-                <wp:inline distT="0" distB="0" distL="0" distR="0">
-                  <wp:extent cx="2739390" cy="1540906"/>
-                  <wp:docPr id="115" name="Imagem 115" descr="Quadro 15 · O acervo"/>
-                  <wp:cNvGraphicFramePr>
-                    <a:graphicFrameLocks noChangeAspect="1"/>
-                  </wp:cNvGraphicFramePr>
-                  <a:graphic>
-                    <a:graphicData uri="http://schemas.openxmlformats.org/drawingml/2006/picture">
-                      <pic:pic>
-                        <pic:nvPicPr>
-                          <pic:cNvPr id="115" name="imagem15.png"/>
-                          <pic:cNvPicPr/>
-                        </pic:nvPicPr>
-                        <pic:blipFill>
-                          <a:blip r:embed="rIdImg15"/>
-                          <a:stretch>
-                            <a:fillRect/>
-                          </a:stretch>
-                        </pic:blipFill>
-                        <pic:spPr>
-                          <a:xfrm>
-                            <a:off x="0" y="0"/>
-                            <a:ext cx="2739390" cy="1540906"/>
-                          </a:xfrm>
-                          <a:prstGeom prst="rect">
-                            <a:avLst/>
-                          </a:prstGeom>
-                        </pic:spPr>
-                      </pic:pic>
-                    </a:graphicData>
-                  </a:graphic>
-                </wp:inline>
-              </w:drawing>
-            </w:r>
-          </w:p>
           <w:p>
             <w:pPr>
               <w:spacing w:after="40" w:before="0" w:line="240" w:lineRule="auto"/>
@@ -12627,52 +12234,6 @@
           </w:tcPr>
           <w:p>
             <w:pPr>
-              <w:spacing w:after="60" w:before="0" w:line="240" w:lineRule="auto"/>
-              <w:jc w:val="center"/>
-              <w:rPr/>
-            </w:pPr>
-            <w:r>
-              <w:rPr>
-                <w:noProof/>
-              </w:rPr>
-              <w:drawing>
-                <wp:inline distT="0" distB="0" distL="0" distR="0">
-                  <wp:extent cx="2740025" cy="1541264"/>
-                  <wp:docPr id="116" name="Imagem 116" descr="Quadro 16 · A sala segura"/>
-                  <wp:cNvGraphicFramePr>
-                    <a:graphicFrameLocks noChangeAspect="1"/>
-                  </wp:cNvGraphicFramePr>
-                  <a:graphic>
-                    <a:graphicData uri="http://schemas.openxmlformats.org/drawingml/2006/picture">
-                      <pic:pic>
-                        <pic:nvPicPr>
-                          <pic:cNvPr id="116" name="imagem16.png"/>
-                          <pic:cNvPicPr/>
-                        </pic:nvPicPr>
-                        <pic:blipFill>
-                          <a:blip r:embed="rIdImg16"/>
-                          <a:stretch>
-                            <a:fillRect/>
-                          </a:stretch>
-                        </pic:blipFill>
-                        <pic:spPr>
-                          <a:xfrm>
-                            <a:off x="0" y="0"/>
-                            <a:ext cx="2740025" cy="1541264"/>
-                          </a:xfrm>
-                          <a:prstGeom prst="rect">
-                            <a:avLst/>
-                          </a:prstGeom>
-                        </pic:spPr>
-                      </pic:pic>
-                    </a:graphicData>
-                  </a:graphic>
-                </wp:inline>
-              </w:drawing>
-            </w:r>
-          </w:p>
-          <w:p>
-            <w:pPr>
               <w:spacing w:after="40" w:before="0" w:line="240" w:lineRule="auto"/>
               <w:rPr/>
             </w:pPr>
@@ -12760,52 +12321,6 @@
           <w:tcPr>
             <w:tcW w:w="4514" w:type="dxa"/>
           </w:tcPr>
-          <w:p>
-            <w:pPr>
-              <w:spacing w:after="60" w:before="0" w:line="240" w:lineRule="auto"/>
-              <w:jc w:val="center"/>
-              <w:rPr/>
-            </w:pPr>
-            <w:r>
-              <w:rPr>
-                <w:noProof/>
-              </w:rPr>
-              <w:drawing>
-                <wp:inline distT="0" distB="0" distL="0" distR="0">
-                  <wp:extent cx="2739390" cy="1540906"/>
-                  <wp:docPr id="117" name="Imagem 117" descr="Quadro 17 · Inventário e gadgets"/>
-                  <wp:cNvGraphicFramePr>
-                    <a:graphicFrameLocks noChangeAspect="1"/>
-                  </wp:cNvGraphicFramePr>
-                  <a:graphic>
-                    <a:graphicData uri="http://schemas.openxmlformats.org/drawingml/2006/picture">
-                      <pic:pic>
-                        <pic:nvPicPr>
-                          <pic:cNvPr id="117" name="imagem17.png"/>
-                          <pic:cNvPicPr/>
-                        </pic:nvPicPr>
-                        <pic:blipFill>
-                          <a:blip r:embed="rIdImg17"/>
-                          <a:stretch>
-                            <a:fillRect/>
-                          </a:stretch>
-                        </pic:blipFill>
-                        <pic:spPr>
-                          <a:xfrm>
-                            <a:off x="0" y="0"/>
-                            <a:ext cx="2739390" cy="1540906"/>
-                          </a:xfrm>
-                          <a:prstGeom prst="rect">
-                            <a:avLst/>
-                          </a:prstGeom>
-                        </pic:spPr>
-                      </pic:pic>
-                    </a:graphicData>
-                  </a:graphic>
-                </wp:inline>
-              </w:drawing>
-            </w:r>
-          </w:p>
           <w:p>
             <w:pPr>
               <w:spacing w:after="40" w:before="0" w:line="240" w:lineRule="auto"/>
@@ -12949,52 +12464,6 @@
           </w:tcPr>
           <w:p>
             <w:pPr>
-              <w:spacing w:after="60" w:before="0" w:line="240" w:lineRule="auto"/>
-              <w:jc w:val="center"/>
-              <w:rPr/>
-            </w:pPr>
-            <w:r>
-              <w:rPr>
-                <w:noProof/>
-              </w:rPr>
-              <w:drawing>
-                <wp:inline distT="0" distB="0" distL="0" distR="0">
-                  <wp:extent cx="2740025" cy="1541264"/>
-                  <wp:docPr id="118" name="Imagem 118" descr="Quadro 18 · Corredor do térreo"/>
-                  <wp:cNvGraphicFramePr>
-                    <a:graphicFrameLocks noChangeAspect="1"/>
-                  </wp:cNvGraphicFramePr>
-                  <a:graphic>
-                    <a:graphicData uri="http://schemas.openxmlformats.org/drawingml/2006/picture">
-                      <pic:pic>
-                        <pic:nvPicPr>
-                          <pic:cNvPr id="118" name="imagem18.png"/>
-                          <pic:cNvPicPr/>
-                        </pic:nvPicPr>
-                        <pic:blipFill>
-                          <a:blip r:embed="rIdImg18"/>
-                          <a:stretch>
-                            <a:fillRect/>
-                          </a:stretch>
-                        </pic:blipFill>
-                        <pic:spPr>
-                          <a:xfrm>
-                            <a:off x="0" y="0"/>
-                            <a:ext cx="2740025" cy="1541264"/>
-                          </a:xfrm>
-                          <a:prstGeom prst="rect">
-                            <a:avLst/>
-                          </a:prstGeom>
-                        </pic:spPr>
-                      </pic:pic>
-                    </a:graphicData>
-                  </a:graphic>
-                </wp:inline>
-              </w:drawing>
-            </w:r>
-          </w:p>
-          <w:p>
-            <w:pPr>
               <w:spacing w:after="40" w:before="0" w:line="240" w:lineRule="auto"/>
               <w:rPr/>
             </w:pPr>
@@ -13082,52 +12551,6 @@
           <w:tcPr>
             <w:tcW w:w="4514" w:type="dxa"/>
           </w:tcPr>
-          <w:p>
-            <w:pPr>
-              <w:spacing w:after="60" w:before="0" w:line="240" w:lineRule="auto"/>
-              <w:jc w:val="center"/>
-              <w:rPr/>
-            </w:pPr>
-            <w:r>
-              <w:rPr>
-                <w:noProof/>
-              </w:rPr>
-              <w:drawing>
-                <wp:inline distT="0" distB="0" distL="0" distR="0">
-                  <wp:extent cx="2739390" cy="1540906"/>
-                  <wp:docPr id="119" name="Imagem 119" descr="Quadro 19 · A sala 103"/>
-                  <wp:cNvGraphicFramePr>
-                    <a:graphicFrameLocks noChangeAspect="1"/>
-                  </wp:cNvGraphicFramePr>
-                  <a:graphic>
-                    <a:graphicData uri="http://schemas.openxmlformats.org/drawingml/2006/picture">
-                      <pic:pic>
-                        <pic:nvPicPr>
-                          <pic:cNvPr id="119" name="imagem19.png"/>
-                          <pic:cNvPicPr/>
-                        </pic:nvPicPr>
-                        <pic:blipFill>
-                          <a:blip r:embed="rIdImg19"/>
-                          <a:stretch>
-                            <a:fillRect/>
-                          </a:stretch>
-                        </pic:blipFill>
-                        <pic:spPr>
-                          <a:xfrm>
-                            <a:off x="0" y="0"/>
-                            <a:ext cx="2739390" cy="1540906"/>
-                          </a:xfrm>
-                          <a:prstGeom prst="rect">
-                            <a:avLst/>
-                          </a:prstGeom>
-                        </pic:spPr>
-                      </pic:pic>
-                    </a:graphicData>
-                  </a:graphic>
-                </wp:inline>
-              </w:drawing>
-            </w:r>
-          </w:p>
           <w:p>
             <w:pPr>
               <w:spacing w:after="40" w:before="0" w:line="240" w:lineRule="auto"/>
@@ -13224,52 +12647,6 @@
           </w:tcPr>
           <w:p>
             <w:pPr>
-              <w:spacing w:after="60" w:before="0" w:line="240" w:lineRule="auto"/>
-              <w:jc w:val="center"/>
-              <w:rPr/>
-            </w:pPr>
-            <w:r>
-              <w:rPr>
-                <w:noProof/>
-              </w:rPr>
-              <w:drawing>
-                <wp:inline distT="0" distB="0" distL="0" distR="0">
-                  <wp:extent cx="2740025" cy="1541264"/>
-                  <wp:docPr id="120" name="Imagem 120" descr="Quadro 20 · O 1º andar"/>
-                  <wp:cNvGraphicFramePr>
-                    <a:graphicFrameLocks noChangeAspect="1"/>
-                  </wp:cNvGraphicFramePr>
-                  <a:graphic>
-                    <a:graphicData uri="http://schemas.openxmlformats.org/drawingml/2006/picture">
-                      <pic:pic>
-                        <pic:nvPicPr>
-                          <pic:cNvPr id="120" name="imagem20.png"/>
-                          <pic:cNvPicPr/>
-                        </pic:nvPicPr>
-                        <pic:blipFill>
-                          <a:blip r:embed="rIdImg20"/>
-                          <a:stretch>
-                            <a:fillRect/>
-                          </a:stretch>
-                        </pic:blipFill>
-                        <pic:spPr>
-                          <a:xfrm>
-                            <a:off x="0" y="0"/>
-                            <a:ext cx="2740025" cy="1541264"/>
-                          </a:xfrm>
-                          <a:prstGeom prst="rect">
-                            <a:avLst/>
-                          </a:prstGeom>
-                        </pic:spPr>
-                      </pic:pic>
-                    </a:graphicData>
-                  </a:graphic>
-                </wp:inline>
-              </w:drawing>
-            </w:r>
-          </w:p>
-          <w:p>
-            <w:pPr>
               <w:spacing w:after="40" w:before="0" w:line="240" w:lineRule="auto"/>
               <w:rPr/>
             </w:pPr>
@@ -13357,52 +12734,6 @@
           <w:tcPr>
             <w:tcW w:w="4514" w:type="dxa"/>
           </w:tcPr>
-          <w:p>
-            <w:pPr>
-              <w:spacing w:after="60" w:before="0" w:line="240" w:lineRule="auto"/>
-              <w:jc w:val="center"/>
-              <w:rPr/>
-            </w:pPr>
-            <w:r>
-              <w:rPr>
-                <w:noProof/>
-              </w:rPr>
-              <w:drawing>
-                <wp:inline distT="0" distB="0" distL="0" distR="0">
-                  <wp:extent cx="2739390" cy="1540906"/>
-                  <wp:docPr id="121" name="Imagem 121" descr="Quadro 21 · A sala 204"/>
-                  <wp:cNvGraphicFramePr>
-                    <a:graphicFrameLocks noChangeAspect="1"/>
-                  </wp:cNvGraphicFramePr>
-                  <a:graphic>
-                    <a:graphicData uri="http://schemas.openxmlformats.org/drawingml/2006/picture">
-                      <pic:pic>
-                        <pic:nvPicPr>
-                          <pic:cNvPr id="121" name="imagem21.png"/>
-                          <pic:cNvPicPr/>
-                        </pic:nvPicPr>
-                        <pic:blipFill>
-                          <a:blip r:embed="rIdImg21"/>
-                          <a:stretch>
-                            <a:fillRect/>
-                          </a:stretch>
-                        </pic:blipFill>
-                        <pic:spPr>
-                          <a:xfrm>
-                            <a:off x="0" y="0"/>
-                            <a:ext cx="2739390" cy="1540906"/>
-                          </a:xfrm>
-                          <a:prstGeom prst="rect">
-                            <a:avLst/>
-                          </a:prstGeom>
-                        </pic:spPr>
-                      </pic:pic>
-                    </a:graphicData>
-                  </a:graphic>
-                </wp:inline>
-              </w:drawing>
-            </w:r>
-          </w:p>
           <w:p>
             <w:pPr>
               <w:spacing w:after="40" w:before="0" w:line="240" w:lineRule="auto"/>
@@ -13546,52 +12877,6 @@
           </w:tcPr>
           <w:p>
             <w:pPr>
-              <w:spacing w:after="60" w:before="0" w:line="240" w:lineRule="auto"/>
-              <w:jc w:val="center"/>
-              <w:rPr/>
-            </w:pPr>
-            <w:r>
-              <w:rPr>
-                <w:noProof/>
-              </w:rPr>
-              <w:drawing>
-                <wp:inline distT="0" distB="0" distL="0" distR="0">
-                  <wp:extent cx="2740025" cy="1541264"/>
-                  <wp:docPr id="122" name="Imagem 122" descr="Quadro 22 · A Sentinela"/>
-                  <wp:cNvGraphicFramePr>
-                    <a:graphicFrameLocks noChangeAspect="1"/>
-                  </wp:cNvGraphicFramePr>
-                  <a:graphic>
-                    <a:graphicData uri="http://schemas.openxmlformats.org/drawingml/2006/picture">
-                      <pic:pic>
-                        <pic:nvPicPr>
-                          <pic:cNvPr id="122" name="imagem22.png"/>
-                          <pic:cNvPicPr/>
-                        </pic:nvPicPr>
-                        <pic:blipFill>
-                          <a:blip r:embed="rIdImg22"/>
-                          <a:stretch>
-                            <a:fillRect/>
-                          </a:stretch>
-                        </pic:blipFill>
-                        <pic:spPr>
-                          <a:xfrm>
-                            <a:off x="0" y="0"/>
-                            <a:ext cx="2740025" cy="1541264"/>
-                          </a:xfrm>
-                          <a:prstGeom prst="rect">
-                            <a:avLst/>
-                          </a:prstGeom>
-                        </pic:spPr>
-                      </pic:pic>
-                    </a:graphicData>
-                  </a:graphic>
-                </wp:inline>
-              </w:drawing>
-            </w:r>
-          </w:p>
-          <w:p>
-            <w:pPr>
               <w:spacing w:after="40" w:before="0" w:line="240" w:lineRule="auto"/>
               <w:rPr/>
             </w:pPr>
@@ -13679,52 +12964,6 @@
           <w:tcPr>
             <w:tcW w:w="4514" w:type="dxa"/>
           </w:tcPr>
-          <w:p>
-            <w:pPr>
-              <w:spacing w:after="60" w:before="0" w:line="240" w:lineRule="auto"/>
-              <w:jc w:val="center"/>
-              <w:rPr/>
-            </w:pPr>
-            <w:r>
-              <w:rPr>
-                <w:noProof/>
-              </w:rPr>
-              <w:drawing>
-                <wp:inline distT="0" distB="0" distL="0" distR="0">
-                  <wp:extent cx="2739390" cy="1540906"/>
-                  <wp:docPr id="123" name="Imagem 123" descr="Quadro 23 · A oficina do Zane"/>
-                  <wp:cNvGraphicFramePr>
-                    <a:graphicFrameLocks noChangeAspect="1"/>
-                  </wp:cNvGraphicFramePr>
-                  <a:graphic>
-                    <a:graphicData uri="http://schemas.openxmlformats.org/drawingml/2006/picture">
-                      <pic:pic>
-                        <pic:nvPicPr>
-                          <pic:cNvPr id="123" name="imagem23.png"/>
-                          <pic:cNvPicPr/>
-                        </pic:nvPicPr>
-                        <pic:blipFill>
-                          <a:blip r:embed="rIdImg23"/>
-                          <a:stretch>
-                            <a:fillRect/>
-                          </a:stretch>
-                        </pic:blipFill>
-                        <pic:spPr>
-                          <a:xfrm>
-                            <a:off x="0" y="0"/>
-                            <a:ext cx="2739390" cy="1540906"/>
-                          </a:xfrm>
-                          <a:prstGeom prst="rect">
-                            <a:avLst/>
-                          </a:prstGeom>
-                        </pic:spPr>
-                      </pic:pic>
-                    </a:graphicData>
-                  </a:graphic>
-                </wp:inline>
-              </w:drawing>
-            </w:r>
-          </w:p>
           <w:p>
             <w:pPr>
               <w:spacing w:after="40" w:before="0" w:line="240" w:lineRule="auto"/>
@@ -13832,7 +13071,7 @@
           <w:szCs w:val="20"/>
           <w:rtl w:val="0"/>
         </w:rPr>
-        <w:t xml:space="preserve">Sequência E. Bunker (posição na ordem das fases ainda provisória)</w:t>
+        <w:t xml:space="preserve">Sequência E. Bunker (fase 5)</w:t>
       </w:r>
     </w:p>
     <w:tbl>
@@ -13868,52 +13107,6 @@
           </w:tcPr>
           <w:p>
             <w:pPr>
-              <w:spacing w:after="60" w:before="0" w:line="240" w:lineRule="auto"/>
-              <w:jc w:val="center"/>
-              <w:rPr/>
-            </w:pPr>
-            <w:r>
-              <w:rPr>
-                <w:noProof/>
-              </w:rPr>
-              <w:drawing>
-                <wp:inline distT="0" distB="0" distL="0" distR="0">
-                  <wp:extent cx="2740025" cy="1541264"/>
-                  <wp:docPr id="124" name="Imagem 124" descr="Quadro 24 · A entrada do Bunker"/>
-                  <wp:cNvGraphicFramePr>
-                    <a:graphicFrameLocks noChangeAspect="1"/>
-                  </wp:cNvGraphicFramePr>
-                  <a:graphic>
-                    <a:graphicData uri="http://schemas.openxmlformats.org/drawingml/2006/picture">
-                      <pic:pic>
-                        <pic:nvPicPr>
-                          <pic:cNvPr id="124" name="imagem24.png"/>
-                          <pic:cNvPicPr/>
-                        </pic:nvPicPr>
-                        <pic:blipFill>
-                          <a:blip r:embed="rIdImg24"/>
-                          <a:stretch>
-                            <a:fillRect/>
-                          </a:stretch>
-                        </pic:blipFill>
-                        <pic:spPr>
-                          <a:xfrm>
-                            <a:off x="0" y="0"/>
-                            <a:ext cx="2740025" cy="1541264"/>
-                          </a:xfrm>
-                          <a:prstGeom prst="rect">
-                            <a:avLst/>
-                          </a:prstGeom>
-                        </pic:spPr>
-                      </pic:pic>
-                    </a:graphicData>
-                  </a:graphic>
-                </wp:inline>
-              </w:drawing>
-            </w:r>
-          </w:p>
-          <w:p>
-            <w:pPr>
               <w:spacing w:after="40" w:before="0" w:line="240" w:lineRule="auto"/>
               <w:rPr/>
             </w:pPr>
@@ -13993,7 +13186,7 @@
                 <w:szCs w:val="17"/>
                 <w:rtl w:val="0"/>
               </w:rPr>
-              <w:t xml:space="preserve">O lugar mais seguro do jogo: os robôs não descem. As portas lacradas são ganchos para as fases seguintes.</w:t>
+              <w:t xml:space="preserve">Esconderijo lacrado sob o núcleo da Âncora, difícil de alcançar. As portas lacradas são ganchos para as fases seguintes.</w:t>
             </w:r>
           </w:p>
         </w:tc>
@@ -14001,52 +13194,6 @@
           <w:tcPr>
             <w:tcW w:w="4514" w:type="dxa"/>
           </w:tcPr>
-          <w:p>
-            <w:pPr>
-              <w:spacing w:after="60" w:before="0" w:line="240" w:lineRule="auto"/>
-              <w:jc w:val="center"/>
-              <w:rPr/>
-            </w:pPr>
-            <w:r>
-              <w:rPr>
-                <w:noProof/>
-              </w:rPr>
-              <w:drawing>
-                <wp:inline distT="0" distB="0" distL="0" distR="0">
-                  <wp:extent cx="2739390" cy="1540906"/>
-                  <wp:docPr id="125" name="Imagem 125" descr="Quadro 25 · A sala de dados"/>
-                  <wp:cNvGraphicFramePr>
-                    <a:graphicFrameLocks noChangeAspect="1"/>
-                  </wp:cNvGraphicFramePr>
-                  <a:graphic>
-                    <a:graphicData uri="http://schemas.openxmlformats.org/drawingml/2006/picture">
-                      <pic:pic>
-                        <pic:nvPicPr>
-                          <pic:cNvPr id="125" name="imagem25.png"/>
-                          <pic:cNvPicPr/>
-                        </pic:nvPicPr>
-                        <pic:blipFill>
-                          <a:blip r:embed="rIdImg25"/>
-                          <a:stretch>
-                            <a:fillRect/>
-                          </a:stretch>
-                        </pic:blipFill>
-                        <pic:spPr>
-                          <a:xfrm>
-                            <a:off x="0" y="0"/>
-                            <a:ext cx="2739390" cy="1540906"/>
-                          </a:xfrm>
-                          <a:prstGeom prst="rect">
-                            <a:avLst/>
-                          </a:prstGeom>
-                        </pic:spPr>
-                      </pic:pic>
-                    </a:graphicData>
-                  </a:graphic>
-                </wp:inline>
-              </w:drawing>
-            </w:r>
-          </w:p>
           <w:p>
             <w:pPr>
               <w:spacing w:after="40" w:before="0" w:line="240" w:lineRule="auto"/>
@@ -14191,52 +13338,6 @@
           </w:tcPr>
           <w:p>
             <w:pPr>
-              <w:spacing w:after="60" w:before="0" w:line="240" w:lineRule="auto"/>
-              <w:jc w:val="center"/>
-              <w:rPr/>
-            </w:pPr>
-            <w:r>
-              <w:rPr>
-                <w:noProof/>
-              </w:rPr>
-              <w:drawing>
-                <wp:inline distT="0" distB="0" distL="0" distR="0">
-                  <wp:extent cx="3937000" cy="822656"/>
-                  <wp:docPr id="126" name="Imagem 126" descr="Quadro 26 · O elenco"/>
-                  <wp:cNvGraphicFramePr>
-                    <a:graphicFrameLocks noChangeAspect="1"/>
-                  </wp:cNvGraphicFramePr>
-                  <a:graphic>
-                    <a:graphicData uri="http://schemas.openxmlformats.org/drawingml/2006/picture">
-                      <pic:pic>
-                        <pic:nvPicPr>
-                          <pic:cNvPr id="126" name="imagem26.png"/>
-                          <pic:cNvPicPr/>
-                        </pic:nvPicPr>
-                        <pic:blipFill>
-                          <a:blip r:embed="rIdImg26"/>
-                          <a:stretch>
-                            <a:fillRect/>
-                          </a:stretch>
-                        </pic:blipFill>
-                        <pic:spPr>
-                          <a:xfrm>
-                            <a:off x="0" y="0"/>
-                            <a:ext cx="3937000" cy="822656"/>
-                          </a:xfrm>
-                          <a:prstGeom prst="rect">
-                            <a:avLst/>
-                          </a:prstGeom>
-                        </pic:spPr>
-                      </pic:pic>
-                    </a:graphicData>
-                  </a:graphic>
-                </wp:inline>
-              </w:drawing>
-            </w:r>
-          </w:p>
-          <w:p>
-            <w:pPr>
               <w:spacing w:after="40" w:before="0" w:line="240" w:lineRule="auto"/>
               <w:rPr/>
             </w:pPr>
@@ -14330,52 +13431,6 @@
             <w:tcW w:w="9029" w:type="dxa"/>
             <w:gridSpan w:val="2"/>
           </w:tcPr>
-          <w:p>
-            <w:pPr>
-              <w:spacing w:after="60" w:before="0" w:line="240" w:lineRule="auto"/>
-              <w:jc w:val="center"/>
-              <w:rPr/>
-            </w:pPr>
-            <w:r>
-              <w:rPr>
-                <w:noProof/>
-              </w:rPr>
-              <w:drawing>
-                <wp:inline distT="0" distB="0" distL="0" distR="0">
-                  <wp:extent cx="3937000" cy="2331442"/>
-                  <wp:docPr id="127" name="Imagem 127" descr="Quadro 27 · Os robôs"/>
-                  <wp:cNvGraphicFramePr>
-                    <a:graphicFrameLocks noChangeAspect="1"/>
-                  </wp:cNvGraphicFramePr>
-                  <a:graphic>
-                    <a:graphicData uri="http://schemas.openxmlformats.org/drawingml/2006/picture">
-                      <pic:pic>
-                        <pic:nvPicPr>
-                          <pic:cNvPr id="127" name="imagem27.png"/>
-                          <pic:cNvPicPr/>
-                        </pic:nvPicPr>
-                        <pic:blipFill>
-                          <a:blip r:embed="rIdImg27"/>
-                          <a:stretch>
-                            <a:fillRect/>
-                          </a:stretch>
-                        </pic:blipFill>
-                        <pic:spPr>
-                          <a:xfrm>
-                            <a:off x="0" y="0"/>
-                            <a:ext cx="3937000" cy="2331442"/>
-                          </a:xfrm>
-                          <a:prstGeom prst="rect">
-                            <a:avLst/>
-                          </a:prstGeom>
-                        </pic:spPr>
-                      </pic:pic>
-                    </a:graphicData>
-                  </a:graphic>
-                </wp:inline>
-              </w:drawing>
-            </w:r>
-          </w:p>
           <w:p>
             <w:pPr>
               <w:spacing w:after="40" w:before="0" w:line="240" w:lineRule="auto"/>

</xml_diff>